<commit_message>
Overwrite Draft_080 with current fixes; remove 081–083
Stylistic/margin/title/footer changes stay on Draft_080. Do not
increment draft numbers for formatting-only passes.
</commit_message>
<xml_diff>
--- a/thesis/003_ThesisProposal_Draft_080.docx
+++ b/thesis/003_ThesisProposal_Draft_080.docx
@@ -15,11 +15,6 @@
     <w:p>
       <w:pPr>
         <w:spacing w:before="0" w:after="0" w:line="360" w:lineRule="auto"/>
-      </w:pPr>
-    </w:p>
-    <w:p>
-      <w:pPr>
-        <w:spacing w:before="0" w:after="0" w:line="360" w:lineRule="auto"/>
         <w:jc w:val="center"/>
       </w:pPr>
       <w:r>
@@ -62,7 +57,16 @@
     <w:p>
       <w:pPr>
         <w:spacing w:before="0" w:after="0" w:line="360" w:lineRule="auto"/>
-      </w:pPr>
+        <w:jc w:val="center"/>
+      </w:pPr>
+      <w:r>
+        <w:rPr>
+          <w:rFonts w:ascii="Georgia" w:hAnsi="Georgia" w:cs="Georgia" w:eastAsia="Georgia"/>
+          <w:sz w:val="24"/>
+          <w:szCs w:val="24"/>
+        </w:rPr>
+        <w:t xml:space="preserve">A Thesis</w:t>
+      </w:r>
     </w:p>
     <w:p>
       <w:pPr>
@@ -75,7 +79,7 @@
           <w:sz w:val="24"/>
           <w:szCs w:val="24"/>
         </w:rPr>
-        <w:t xml:space="preserve">A Thesis</w:t>
+        <w:t xml:space="preserve">Presented to the Faculty of</w:t>
       </w:r>
     </w:p>
     <w:p>
@@ -89,7 +93,7 @@
           <w:sz w:val="24"/>
           <w:szCs w:val="24"/>
         </w:rPr>
-        <w:t xml:space="preserve">Presented to the Faculty of</w:t>
+        <w:t xml:space="preserve">Department of English</w:t>
       </w:r>
     </w:p>
     <w:p>
@@ -103,7 +107,7 @@
           <w:sz w:val="24"/>
           <w:szCs w:val="24"/>
         </w:rPr>
-        <w:t xml:space="preserve">Department of English</w:t>
+        <w:t xml:space="preserve">College of Arts and Sciences</w:t>
       </w:r>
     </w:p>
     <w:p>
@@ -117,7 +121,7 @@
           <w:sz w:val="24"/>
           <w:szCs w:val="24"/>
         </w:rPr>
-        <w:t xml:space="preserve">College of Arts and Sciences</w:t>
+        <w:t xml:space="preserve">Pampanga State Agricultural University</w:t>
       </w:r>
     </w:p>
     <w:p>
@@ -131,8 +135,18 @@
           <w:sz w:val="24"/>
           <w:szCs w:val="24"/>
         </w:rPr>
-        <w:t xml:space="preserve">Pampanga State Agricultural University</w:t>
-      </w:r>
+        <w:t xml:space="preserve">Magalang, Pampanga</w:t>
+      </w:r>
+    </w:p>
+    <w:p>
+      <w:pPr>
+        <w:spacing w:before="0" w:after="0" w:line="360" w:lineRule="auto"/>
+      </w:pPr>
+    </w:p>
+    <w:p>
+      <w:pPr>
+        <w:spacing w:before="0" w:after="0" w:line="360" w:lineRule="auto"/>
+      </w:pPr>
     </w:p>
     <w:p>
       <w:pPr>
@@ -145,23 +159,8 @@
           <w:sz w:val="24"/>
           <w:szCs w:val="24"/>
         </w:rPr>
-        <w:t xml:space="preserve">Magalang, Pampanga</w:t>
-      </w:r>
-    </w:p>
-    <w:p>
-      <w:pPr>
-        <w:spacing w:before="0" w:after="0" w:line="360" w:lineRule="auto"/>
-      </w:pPr>
-    </w:p>
-    <w:p>
-      <w:pPr>
-        <w:spacing w:before="0" w:after="0" w:line="360" w:lineRule="auto"/>
-      </w:pPr>
-    </w:p>
-    <w:p>
-      <w:pPr>
-        <w:spacing w:before="0" w:after="0" w:line="360" w:lineRule="auto"/>
-      </w:pPr>
+        <w:t xml:space="preserve">In Partial Fulfillment</w:t>
+      </w:r>
     </w:p>
     <w:p>
       <w:pPr>
@@ -174,7 +173,7 @@
           <w:sz w:val="24"/>
           <w:szCs w:val="24"/>
         </w:rPr>
-        <w:t xml:space="preserve">In Partial Fulfillment</w:t>
+        <w:t xml:space="preserve">of the Requirements for the Degree</w:t>
       </w:r>
     </w:p>
     <w:p>
@@ -188,13 +187,39 @@
           <w:sz w:val="24"/>
           <w:szCs w:val="24"/>
         </w:rPr>
-        <w:t xml:space="preserve">of the Requirements for the Degree</w:t>
-      </w:r>
+        <w:t xml:space="preserve">BACHELOR OF ARTS IN ENGLISH LANGUAGE STUDIES</w:t>
+      </w:r>
+    </w:p>
+    <w:p>
+      <w:pPr>
+        <w:spacing w:before="0" w:after="0" w:line="480" w:lineRule="auto"/>
+      </w:pPr>
+    </w:p>
+    <w:p>
+      <w:pPr>
+        <w:spacing w:before="0" w:after="0" w:line="480" w:lineRule="auto"/>
+      </w:pPr>
+    </w:p>
+    <w:p>
+      <w:pPr>
+        <w:spacing w:before="0" w:after="0" w:line="480" w:lineRule="auto"/>
+      </w:pPr>
+    </w:p>
+    <w:p>
+      <w:pPr>
+        <w:spacing w:before="0" w:after="0" w:line="480" w:lineRule="auto"/>
+      </w:pPr>
+    </w:p>
+    <w:p>
+      <w:pPr>
+        <w:spacing w:before="0" w:after="0" w:line="480" w:lineRule="auto"/>
+      </w:pPr>
     </w:p>
     <w:p>
       <w:pPr>
         <w:spacing w:before="0" w:after="0" w:line="360" w:lineRule="auto"/>
         <w:jc w:val="center"/>
+        <w:keepNext w:val="1"/>
       </w:pPr>
       <w:r>
         <w:rPr>
@@ -202,67 +227,20 @@
           <w:sz w:val="24"/>
           <w:szCs w:val="24"/>
         </w:rPr>
-        <w:t xml:space="preserve">BACHELOR OF ARTS IN ENGLISH LANGUAGE STUDIES</w:t>
+        <w:t xml:space="preserve">By</w:t>
       </w:r>
     </w:p>
     <w:p>
       <w:pPr>
         <w:spacing w:before="0" w:after="0" w:line="360" w:lineRule="auto"/>
-      </w:pPr>
-    </w:p>
-    <w:p>
-      <w:pPr>
-        <w:spacing w:before="0" w:after="0" w:line="360" w:lineRule="auto"/>
-      </w:pPr>
-    </w:p>
-    <w:p>
-      <w:pPr>
-        <w:spacing w:before="0" w:after="0" w:line="360" w:lineRule="auto"/>
+        <w:keepNext w:val="1"/>
       </w:pPr>
     </w:p>
     <w:p>
       <w:pPr>
         <w:spacing w:before="0" w:after="0" w:line="360" w:lineRule="auto"/>
         <w:jc w:val="center"/>
-      </w:pPr>
-      <w:r>
-        <w:rPr>
-          <w:rFonts w:ascii="Georgia" w:hAnsi="Georgia" w:cs="Georgia" w:eastAsia="Georgia"/>
-          <w:sz w:val="24"/>
-          <w:szCs w:val="24"/>
-        </w:rPr>
-        <w:t xml:space="preserve">By</w:t>
-      </w:r>
-    </w:p>
-    <w:p>
-      <w:pPr>
-        <w:spacing w:before="0" w:after="0" w:line="360" w:lineRule="auto"/>
-      </w:pPr>
-    </w:p>
-    <w:p>
-      <w:pPr>
-        <w:spacing w:before="0" w:after="0" w:line="360" w:lineRule="auto"/>
-      </w:pPr>
-    </w:p>
-    <w:p>
-      <w:pPr>
-        <w:spacing w:before="0" w:after="0" w:line="360" w:lineRule="auto"/>
-      </w:pPr>
-    </w:p>
-    <w:p>
-      <w:pPr>
-        <w:spacing w:before="0" w:after="0" w:line="360" w:lineRule="auto"/>
-      </w:pPr>
-    </w:p>
-    <w:p>
-      <w:pPr>
-        <w:spacing w:before="0" w:after="0" w:line="360" w:lineRule="auto"/>
-      </w:pPr>
-    </w:p>
-    <w:p>
-      <w:pPr>
-        <w:spacing w:before="0" w:after="0" w:line="360" w:lineRule="auto"/>
-        <w:jc w:val="center"/>
+        <w:keepNext w:val="1"/>
       </w:pPr>
       <w:r>
         <w:rPr>
@@ -278,6 +256,7 @@
     <w:p>
       <w:pPr>
         <w:spacing w:before="0" w:after="0" w:line="360" w:lineRule="auto"/>
+        <w:keepNext w:val="1"/>
       </w:pPr>
     </w:p>
     <w:p>
@@ -288,9 +267,10 @@
           <w:headerReference r:id="rId6" w:type="default"/>
           <w:footerReference r:id="rId7" w:type="default"/>
           <w:pgSz w:h="16838" w:w="11906" w:orient="portrait"/>
-          <w:pgMar w:bottom="1440" w:top="1440" w:left="2160" w:right="1440" w:header="1440" w:footer="1440"/>
+          <w:pgMar w:bottom="1440" w:top="1440" w:left="2160" w:right="1440" w:header="720" w:footer="720"/>
           <w:pgNumType w:start="1"/>
         </w:sectPr>
+        <w:keepLines w:val="1"/>
       </w:pPr>
       <w:r>
         <w:rPr>
@@ -2361,7 +2341,7 @@
           <w:headerReference r:id="rId10" w:type="first"/>
           <w:type w:val="nextPage"/>
           <w:pgSz w:h="16838" w:w="11906" w:orient="portrait"/>
-          <w:pgMar w:bottom="1440" w:top="1440" w:left="2160" w:right="1440" w:header="1440" w:footer="1440"/>
+          <w:pgMar w:bottom="1440" w:top="1440" w:left="2160" w:right="1440" w:header="720" w:footer="720"/>
           <w:titlePg w:val="1"/>
         </w:sectPr>
       </w:pPr>
@@ -4272,7 +4252,7 @@
           <w:headerReference r:id="rId12" w:type="first"/>
           <w:type w:val="nextPage"/>
           <w:pgSz w:h="16838" w:w="11906" w:orient="portrait"/>
-          <w:pgMar w:bottom="1440" w:top="1440" w:left="2160" w:right="1440" w:header="1440" w:footer="1440"/>
+          <w:pgMar w:bottom="1440" w:top="1440" w:left="2160" w:right="1440" w:header="720" w:footer="720"/>
           <w:titlePg w:val="1"/>
         </w:sectPr>
       </w:pPr>
@@ -11738,7 +11718,7 @@
           <w:headerReference r:id="rId14" w:type="first"/>
           <w:type w:val="nextPage"/>
           <w:pgSz w:h="16838" w:w="11906" w:orient="portrait"/>
-          <w:pgMar w:bottom="1440" w:top="1440" w:left="2160" w:right="1440" w:header="1440" w:footer="1440"/>
+          <w:pgMar w:bottom="1440" w:top="1440" w:left="2160" w:right="1440" w:header="720" w:footer="720"/>
           <w:titlePg w:val="1"/>
         </w:sectPr>
       </w:pPr>
@@ -12559,7 +12539,7 @@
           <w:headerReference r:id="rId16" w:type="first"/>
           <w:type w:val="nextPage"/>
           <w:pgSz w:h="16838" w:w="11906" w:orient="portrait"/>
-          <w:pgMar w:bottom="1440" w:top="1440" w:left="2160" w:right="1440" w:header="1440" w:footer="1440"/>
+          <w:pgMar w:bottom="1440" w:top="1440" w:left="2160" w:right="1440" w:header="720" w:footer="720"/>
           <w:titlePg w:val="1"/>
         </w:sectPr>
         <w:keepNext w:val="1"/>
@@ -21349,7 +21329,7 @@
           <w:headerReference r:id="rId18" w:type="first"/>
           <w:type w:val="nextPage"/>
           <w:pgSz w:h="16838" w:w="11906" w:orient="portrait"/>
-          <w:pgMar w:bottom="1440" w:top="1440" w:left="2160" w:right="1440" w:header="1440" w:footer="1440"/>
+          <w:pgMar w:bottom="1440" w:top="1440" w:left="2160" w:right="1440" w:header="720" w:footer="720"/>
           <w:titlePg w:val="1"/>
         </w:sectPr>
       </w:pPr>
@@ -30067,7 +30047,7 @@
     <w:sectPr>
       <w:type w:val="nextPage"/>
       <w:pgSz w:h="16838" w:w="11906" w:orient="portrait"/>
-      <w:pgMar w:bottom="1440" w:top="1440" w:left="2160" w:right="1440" w:header="1440" w:footer="1440"/>
+      <w:pgMar w:bottom="1440" w:top="1440" w:left="2160" w:right="1440" w:header="720" w:footer="720"/>
     </w:sectPr>
   </w:body>
 </w:document>

</xml_diff>

<commit_message>
Draft_080: keep Xie with Wang on references page
Remove inline section break that isolated Xie onto the appendix page.
Wang and Xie stay together; APPENDICES still starts on the next page.
</commit_message>
<xml_diff>
--- a/thesis/003_ThesisProposal_Draft_080.docx
+++ b/thesis/003_ThesisProposal_Draft_080.docx
@@ -12534,14 +12534,6 @@
         <w:ind w:left="720" w:hanging="720"/>
         <w:jc w:val="left"/>
         <w:rPr/>
-        <w:sectPr>
-          <w:headerReference r:id="rId15" w:type="default"/>
-          <w:headerReference r:id="rId16" w:type="first"/>
-          <w:type w:val="nextPage"/>
-          <w:pgSz w:h="16838" w:w="11906" w:orient="portrait"/>
-          <w:pgMar w:bottom="1440" w:top="1440" w:left="2160" w:right="1440" w:header="720" w:footer="720"/>
-          <w:titlePg w:val="1"/>
-        </w:sectPr>
         <w:keepNext w:val="1"/>
         <w:keepLines w:val="1"/>
       </w:pPr>
@@ -12598,6 +12590,7 @@
         <w:spacing w:before="240" w:after="240" w:line="240" w:lineRule="auto"/>
         <w:jc w:val="center"/>
         <w:rPr/>
+        <w:pageBreakBefore w:val="1"/>
       </w:pPr>
       <w:r>
         <w:rPr>

</xml_diff>

<commit_message>
Draft_080: APA reference italics and DOI cleanup
Italicize journal and book titles on all 26 entries. Replace Crompton
academia link with DOI. Clean Hamidi title wording. Keep hanging indents.
</commit_message>
<xml_diff>
--- a/thesis/003_ThesisProposal_Draft_080.docx
+++ b/thesis/003_ThesisProposal_Draft_080.docx
@@ -11775,29 +11775,25 @@
       </w:pPr>
       <w:r>
         <w:rPr>
-          <w:rFonts w:ascii="Georgia" w:hAnsi="Georgia" w:cs="Georgia" w:eastAsia="Georgia"/>
-          <w:b w:val="0"/>
-          <w:sz w:val="22"/>
-          <w:i w:val="0"/>
+          <w:rFonts w:ascii="Times New Roman" w:hAnsi="Times New Roman" w:eastAsia="Times New Roman"/>
+          <w:i w:val="0"/>
+          <w:sz w:val="24"/>
         </w:rPr>
         <w:t xml:space="preserve">Afshar, H. S., Moradi, M., &amp; Hamzavi, R. (2014). Frequency and type of hedging devices used in the research articles of humanities, basic sciences and agriculture. </w:t>
       </w:r>
       <w:r>
         <w:rPr>
-          <w:rFonts w:ascii="Georgia" w:hAnsi="Georgia" w:cs="Georgia" w:eastAsia="Georgia"/>
-          <w:b w:val="0"/>
-          <w:sz w:val="22"/>
+          <w:rFonts w:ascii="Times New Roman" w:hAnsi="Times New Roman" w:eastAsia="Times New Roman"/>
           <w:i/>
-          <w:iCs/>
+          <w:sz w:val="24"/>
         </w:rPr>
         <w:t>Procedia – Social and Behavioral Sciences, 136</w:t>
       </w:r>
       <w:r>
         <w:rPr>
-          <w:rFonts w:ascii="Georgia" w:hAnsi="Georgia" w:cs="Georgia" w:eastAsia="Georgia"/>
-          <w:b w:val="0"/>
-          <w:sz w:val="22"/>
-          <w:i w:val="0"/>
+          <w:rFonts w:ascii="Times New Roman" w:hAnsi="Times New Roman" w:eastAsia="Times New Roman"/>
+          <w:i w:val="0"/>
+          <w:sz w:val="24"/>
         </w:rPr>
         <w:t>, 70–74. https://doi.org/10.1016/j.sbspro.2014.05.290</w:t>
       </w:r>
@@ -11811,29 +11807,25 @@
       </w:pPr>
       <w:r>
         <w:rPr>
-          <w:rFonts w:ascii="Georgia" w:hAnsi="Georgia" w:cs="Georgia" w:eastAsia="Georgia"/>
-          <w:b w:val="0"/>
-          <w:sz w:val="22"/>
-          <w:i w:val="0"/>
+          <w:rFonts w:ascii="Times New Roman" w:hAnsi="Times New Roman" w:eastAsia="Times New Roman"/>
+          <w:i w:val="0"/>
+          <w:sz w:val="24"/>
         </w:rPr>
         <w:t xml:space="preserve">Biber, D., Conrad, S., &amp; Reppen, R. (1998). </w:t>
       </w:r>
       <w:r>
         <w:rPr>
-          <w:rFonts w:ascii="Georgia" w:hAnsi="Georgia" w:cs="Georgia" w:eastAsia="Georgia"/>
-          <w:b w:val="0"/>
-          <w:sz w:val="22"/>
+          <w:rFonts w:ascii="Times New Roman" w:hAnsi="Times New Roman" w:eastAsia="Times New Roman"/>
           <w:i/>
-          <w:iCs/>
+          <w:sz w:val="24"/>
         </w:rPr>
         <w:t>Corpus linguistics: Investigating language structure and use</w:t>
       </w:r>
       <w:r>
         <w:rPr>
-          <w:rFonts w:ascii="Georgia" w:hAnsi="Georgia" w:cs="Georgia" w:eastAsia="Georgia"/>
-          <w:b w:val="0"/>
-          <w:sz w:val="22"/>
-          <w:i w:val="0"/>
+          <w:rFonts w:ascii="Times New Roman" w:hAnsi="Times New Roman" w:eastAsia="Times New Roman"/>
+          <w:i w:val="0"/>
+          <w:sz w:val="24"/>
         </w:rPr>
         <w:t>. Cambridge University Press.</w:t>
       </w:r>
@@ -11847,29 +11839,27 @@
       </w:pPr>
       <w:r>
         <w:rPr>
-          <w:rFonts w:ascii="Georgia" w:hAnsi="Georgia" w:cs="Georgia" w:eastAsia="Georgia"/>
-          <w:b w:val="0"/>
-          <w:sz w:val="22"/>
+          <w:rFonts w:ascii="Times New Roman" w:hAnsi="Times New Roman" w:eastAsia="Times New Roman"/>
+          <w:i w:val="0"/>
+          <w:sz w:val="24"/>
         </w:rPr>
         <w:t xml:space="preserve">Crompton, P. (1997). Hedging in academic writing: Some theoretical problems. </w:t>
       </w:r>
       <w:r>
         <w:rPr>
-          <w:rFonts w:ascii="Georgia" w:hAnsi="Georgia" w:cs="Georgia" w:eastAsia="Georgia"/>
-          <w:b w:val="0"/>
-          <w:sz w:val="22"/>
+          <w:rFonts w:ascii="Times New Roman" w:hAnsi="Times New Roman" w:eastAsia="Times New Roman"/>
           <w:i/>
-          <w:iCs/>
+          <w:sz w:val="24"/>
         </w:rPr>
         <w:t>English for Specific Purposes, 16</w:t>
       </w:r>
       <w:r>
         <w:rPr>
-          <w:rFonts w:ascii="Georgia" w:hAnsi="Georgia" w:cs="Georgia" w:eastAsia="Georgia"/>
-          <w:b w:val="0"/>
-          <w:sz w:val="22"/>
-        </w:rPr>
-        <w:t>(4), 271–287. https://www.academia.edu/50160307/Hedging_in_academic_writing_Some_theoretical_problems</w:t>
+          <w:rFonts w:ascii="Times New Roman" w:hAnsi="Times New Roman" w:eastAsia="Times New Roman"/>
+          <w:i w:val="0"/>
+          <w:sz w:val="24"/>
+        </w:rPr>
+        <w:t>(4), 271–287. https://doi.org/10.1016/S0889-4906(97)00007-0</w:t>
       </w:r>
     </w:p>
     <w:p>
@@ -11881,29 +11871,25 @@
       </w:pPr>
       <w:r>
         <w:rPr>
-          <w:rFonts w:ascii="Georgia" w:hAnsi="Georgia" w:cs="Georgia" w:eastAsia="Georgia"/>
-          <w:b w:val="0"/>
-          <w:sz w:val="22"/>
-          <w:i w:val="0"/>
+          <w:rFonts w:ascii="Times New Roman" w:hAnsi="Times New Roman" w:eastAsia="Times New Roman"/>
+          <w:i w:val="0"/>
+          <w:sz w:val="24"/>
         </w:rPr>
         <w:t xml:space="preserve">Demir, C. (2018). Hedging and academic writing: An analysis of lexical hedges. </w:t>
       </w:r>
       <w:r>
         <w:rPr>
-          <w:rFonts w:ascii="Georgia" w:hAnsi="Georgia" w:cs="Georgia" w:eastAsia="Georgia"/>
-          <w:b w:val="0"/>
-          <w:sz w:val="22"/>
+          <w:rFonts w:ascii="Times New Roman" w:hAnsi="Times New Roman" w:eastAsia="Times New Roman"/>
           <w:i/>
-          <w:iCs/>
+          <w:sz w:val="24"/>
         </w:rPr>
         <w:t>Journal of Language and Linguistic Studies, 14</w:t>
       </w:r>
       <w:r>
         <w:rPr>
-          <w:rFonts w:ascii="Georgia" w:hAnsi="Georgia" w:cs="Georgia" w:eastAsia="Georgia"/>
-          <w:b w:val="0"/>
-          <w:sz w:val="22"/>
-          <w:i w:val="0"/>
+          <w:rFonts w:ascii="Times New Roman" w:hAnsi="Times New Roman" w:eastAsia="Times New Roman"/>
+          <w:i w:val="0"/>
+          <w:sz w:val="24"/>
         </w:rPr>
         <w:t>(4), 74–92. https://files.eric.ed.gov/fulltext/EJ1201945.pdf</w:t>
       </w:r>
@@ -11917,29 +11903,25 @@
       </w:pPr>
       <w:r>
         <w:rPr>
-          <w:rFonts w:ascii="Georgia" w:hAnsi="Georgia" w:cs="Georgia" w:eastAsia="Georgia"/>
-          <w:b w:val="0"/>
-          <w:sz w:val="22"/>
-          <w:i w:val="0"/>
+          <w:rFonts w:ascii="Times New Roman" w:hAnsi="Times New Roman" w:eastAsia="Times New Roman"/>
+          <w:i w:val="0"/>
+          <w:sz w:val="24"/>
         </w:rPr>
         <w:t xml:space="preserve">Escalona, S. L. (2025). Hedges and boosters in college essays: A study of linguistic modulation in student writing. </w:t>
       </w:r>
       <w:r>
         <w:rPr>
-          <w:rFonts w:ascii="Georgia" w:hAnsi="Georgia" w:cs="Georgia" w:eastAsia="Georgia"/>
-          <w:b w:val="0"/>
-          <w:sz w:val="22"/>
+          <w:rFonts w:ascii="Times New Roman" w:hAnsi="Times New Roman" w:eastAsia="Times New Roman"/>
           <w:i/>
-          <w:iCs/>
+          <w:sz w:val="24"/>
         </w:rPr>
         <w:t>International Journal of English Literature and Social Sciences, 10</w:t>
       </w:r>
       <w:r>
         <w:rPr>
-          <w:rFonts w:ascii="Georgia" w:hAnsi="Georgia" w:cs="Georgia" w:eastAsia="Georgia"/>
-          <w:b w:val="0"/>
-          <w:sz w:val="22"/>
-          <w:i w:val="0"/>
+          <w:rFonts w:ascii="Times New Roman" w:hAnsi="Times New Roman" w:eastAsia="Times New Roman"/>
+          <w:i w:val="0"/>
+          <w:sz w:val="24"/>
         </w:rPr>
         <w:t>(1), 7–17. https://doi.org/10.22161/ijels.101.2</w:t>
       </w:r>
@@ -11953,11 +11935,27 @@
       </w:pPr>
       <w:r>
         <w:rPr>
-          <w:rFonts w:ascii="Georgia" w:hAnsi="Georgia" w:cs="Georgia" w:eastAsia="Georgia"/>
+          <w:rFonts w:ascii="Times New Roman" w:hAnsi="Times New Roman" w:eastAsia="Times New Roman"/>
+          <w:i w:val="0"/>
           <w:sz w:val="24"/>
-          <w:szCs w:val="24"/>
-        </w:rPr>
-        <w:t xml:space="preserve">Ghia, E., Petrocelli, E., &amp; Pizziconi, S. (2022). Data possibly suggest… Hedging in second language writing: A study on advanced Italian EFL learners. Belgrade English Language and Literature Studies, 14, 47–72. https://doi.org/10.18485/bells.2022.14.2</w:t>
+        </w:rPr>
+        <w:t xml:space="preserve">Ghia, E., Petrocelli, E., &amp; Pizziconi, S. (2022). Data possibly suggest… Hedging in second language writing: A study on advanced Italian EFL learners. </w:t>
+      </w:r>
+      <w:r>
+        <w:rPr>
+          <w:rFonts w:ascii="Times New Roman" w:hAnsi="Times New Roman" w:eastAsia="Times New Roman"/>
+          <w:i/>
+          <w:sz w:val="24"/>
+        </w:rPr>
+        <w:t>Belgrade English Language and Literature Studies, 14</w:t>
+      </w:r>
+      <w:r>
+        <w:rPr>
+          <w:rFonts w:ascii="Times New Roman" w:hAnsi="Times New Roman" w:eastAsia="Times New Roman"/>
+          <w:i w:val="0"/>
+          <w:sz w:val="24"/>
+        </w:rPr>
+        <w:t>, 47–72. https://doi.org/10.18485/bells.2022.14.2</w:t>
       </w:r>
     </w:p>
     <w:p>
@@ -11969,29 +11967,25 @@
       </w:pPr>
       <w:r>
         <w:rPr>
-          <w:rFonts w:ascii="Georgia" w:hAnsi="Georgia" w:cs="Georgia" w:eastAsia="Georgia"/>
-          <w:b w:val="0"/>
-          <w:sz w:val="22"/>
-          <w:i w:val="0"/>
-        </w:rPr>
-        <w:t xml:space="preserve">Hamidi, H., Najafi Sarem, S., &amp; Lotfi, A. H. (2025). Exploring hedging devices in scientific research papers: A content analysis study of the “Medical Journal of the Islamic Republic of Iran.” </w:t>
-      </w:r>
-      <w:r>
-        <w:rPr>
-          <w:rFonts w:ascii="Georgia" w:hAnsi="Georgia" w:cs="Georgia" w:eastAsia="Georgia"/>
-          <w:b w:val="0"/>
-          <w:sz w:val="22"/>
+          <w:rFonts w:ascii="Times New Roman" w:hAnsi="Times New Roman" w:eastAsia="Times New Roman"/>
+          <w:i w:val="0"/>
+          <w:sz w:val="24"/>
+        </w:rPr>
+        <w:t xml:space="preserve">Hamidi, H., Najafi Sarem, S., &amp; Lotfi, A. H. (2025). Exploring hedging devices in scientific research papers: A content analysis study of the Medical Journal of the Islamic Republic of Iran. </w:t>
+      </w:r>
+      <w:r>
+        <w:rPr>
+          <w:rFonts w:ascii="Times New Roman" w:hAnsi="Times New Roman" w:eastAsia="Times New Roman"/>
           <w:i/>
-          <w:iCs/>
+          <w:sz w:val="24"/>
         </w:rPr>
         <w:t>Medical Journal of the Islamic Republic of Iran, 39</w:t>
       </w:r>
       <w:r>
         <w:rPr>
-          <w:rFonts w:ascii="Georgia" w:hAnsi="Georgia" w:cs="Georgia" w:eastAsia="Georgia"/>
-          <w:b w:val="0"/>
-          <w:sz w:val="22"/>
-          <w:i w:val="0"/>
+          <w:rFonts w:ascii="Times New Roman" w:hAnsi="Times New Roman" w:eastAsia="Times New Roman"/>
+          <w:i w:val="0"/>
+          <w:sz w:val="24"/>
         </w:rPr>
         <w:t>, Article 125. https://pmc.ncbi.nlm.nih.gov/articles/PMC12584097/</w:t>
       </w:r>
@@ -12005,11 +11999,27 @@
       </w:pPr>
       <w:r>
         <w:rPr>
-          <w:rFonts w:ascii="Georgia" w:hAnsi="Georgia" w:cs="Georgia" w:eastAsia="Georgia"/>
+          <w:rFonts w:ascii="Times New Roman" w:hAnsi="Times New Roman" w:eastAsia="Times New Roman"/>
+          <w:i w:val="0"/>
           <w:sz w:val="24"/>
-          <w:szCs w:val="24"/>
-        </w:rPr>
-        <w:t xml:space="preserve">Hu, G., &amp; Cao, F. (2011). Hedging and boosting in abstracts of applied linguistics articles: A comparative study of English- and Chinese-medium journals. Journal of Pragmatics, 43(11), 2795–2809. https://doi.org/10.1016/j.pragma.2011.04.007</w:t>
+        </w:rPr>
+        <w:t xml:space="preserve">Hu, G., &amp; Cao, F. (2011). Hedging and boosting in abstracts of applied linguistics articles: A comparative study of English- and Chinese-medium journals. </w:t>
+      </w:r>
+      <w:r>
+        <w:rPr>
+          <w:rFonts w:ascii="Times New Roman" w:hAnsi="Times New Roman" w:eastAsia="Times New Roman"/>
+          <w:i/>
+          <w:sz w:val="24"/>
+        </w:rPr>
+        <w:t>Journal of Pragmatics, 43</w:t>
+      </w:r>
+      <w:r>
+        <w:rPr>
+          <w:rFonts w:ascii="Times New Roman" w:hAnsi="Times New Roman" w:eastAsia="Times New Roman"/>
+          <w:i w:val="0"/>
+          <w:sz w:val="24"/>
+        </w:rPr>
+        <w:t>(11), 2795–2809. https://doi.org/10.1016/j.pragma.2011.04.007</w:t>
       </w:r>
     </w:p>
     <w:p>
@@ -12021,11 +12031,27 @@
       </w:pPr>
       <w:r>
         <w:rPr>
-          <w:rFonts w:ascii="Georgia" w:hAnsi="Georgia" w:cs="Georgia" w:eastAsia="Georgia"/>
+          <w:rFonts w:ascii="Times New Roman" w:hAnsi="Times New Roman" w:eastAsia="Times New Roman"/>
+          <w:i w:val="0"/>
           <w:sz w:val="24"/>
-          <w:szCs w:val="24"/>
-        </w:rPr>
-        <w:t xml:space="preserve">Hyland, K. (1996). Writing without conviction? Hedging in science research articles. Applied Linguistics, 17(4), 433–454. https://doi.org/10.1093/applin/17.4.433</w:t>
+        </w:rPr>
+        <w:t xml:space="preserve">Hyland, K. (1996). Writing without conviction? Hedging in science research articles. </w:t>
+      </w:r>
+      <w:r>
+        <w:rPr>
+          <w:rFonts w:ascii="Times New Roman" w:hAnsi="Times New Roman" w:eastAsia="Times New Roman"/>
+          <w:i/>
+          <w:sz w:val="24"/>
+        </w:rPr>
+        <w:t>Applied Linguistics, 17</w:t>
+      </w:r>
+      <w:r>
+        <w:rPr>
+          <w:rFonts w:ascii="Times New Roman" w:hAnsi="Times New Roman" w:eastAsia="Times New Roman"/>
+          <w:i w:val="0"/>
+          <w:sz w:val="24"/>
+        </w:rPr>
+        <w:t>(4), 433–454. https://doi.org/10.1093/applin/17.4.433</w:t>
       </w:r>
     </w:p>
     <w:p>
@@ -12037,29 +12063,25 @@
       </w:pPr>
       <w:r>
         <w:rPr>
-          <w:rFonts w:ascii="Georgia" w:hAnsi="Georgia" w:cs="Georgia" w:eastAsia="Georgia"/>
-          <w:b w:val="0"/>
-          <w:sz w:val="22"/>
-          <w:i w:val="0"/>
+          <w:rFonts w:ascii="Times New Roman" w:hAnsi="Times New Roman" w:eastAsia="Times New Roman"/>
+          <w:i w:val="0"/>
+          <w:sz w:val="24"/>
         </w:rPr>
         <w:t xml:space="preserve">Hyland, K. (1998). </w:t>
       </w:r>
       <w:r>
         <w:rPr>
-          <w:rFonts w:ascii="Georgia" w:hAnsi="Georgia" w:cs="Georgia" w:eastAsia="Georgia"/>
-          <w:b w:val="0"/>
-          <w:sz w:val="22"/>
+          <w:rFonts w:ascii="Times New Roman" w:hAnsi="Times New Roman" w:eastAsia="Times New Roman"/>
           <w:i/>
-          <w:iCs/>
+          <w:sz w:val="24"/>
         </w:rPr>
         <w:t>Hedging in scientific research articles</w:t>
       </w:r>
       <w:r>
         <w:rPr>
-          <w:rFonts w:ascii="Georgia" w:hAnsi="Georgia" w:cs="Georgia" w:eastAsia="Georgia"/>
-          <w:b w:val="0"/>
-          <w:sz w:val="22"/>
-          <w:i w:val="0"/>
+          <w:rFonts w:ascii="Times New Roman" w:hAnsi="Times New Roman" w:eastAsia="Times New Roman"/>
+          <w:i w:val="0"/>
+          <w:sz w:val="24"/>
         </w:rPr>
         <w:t>. John Benjamins Publishing.</w:t>
       </w:r>
@@ -12073,29 +12095,25 @@
       </w:pPr>
       <w:r>
         <w:rPr>
-          <w:rFonts w:ascii="Georgia" w:hAnsi="Georgia" w:cs="Georgia" w:eastAsia="Georgia"/>
-          <w:b w:val="0"/>
-          <w:sz w:val="22"/>
-          <w:i w:val="0"/>
+          <w:rFonts w:ascii="Times New Roman" w:hAnsi="Times New Roman" w:eastAsia="Times New Roman"/>
+          <w:i w:val="0"/>
+          <w:sz w:val="24"/>
         </w:rPr>
         <w:t xml:space="preserve">Hyland, K. (2005). Stance and engagement: A model of interaction in academic discourse. </w:t>
       </w:r>
       <w:r>
         <w:rPr>
-          <w:rFonts w:ascii="Georgia" w:hAnsi="Georgia" w:cs="Georgia" w:eastAsia="Georgia"/>
-          <w:b w:val="0"/>
-          <w:sz w:val="22"/>
+          <w:rFonts w:ascii="Times New Roman" w:hAnsi="Times New Roman" w:eastAsia="Times New Roman"/>
           <w:i/>
-          <w:iCs/>
+          <w:sz w:val="24"/>
         </w:rPr>
         <w:t>Discourse Studies, 7</w:t>
       </w:r>
       <w:r>
         <w:rPr>
-          <w:rFonts w:ascii="Georgia" w:hAnsi="Georgia" w:cs="Georgia" w:eastAsia="Georgia"/>
-          <w:b w:val="0"/>
-          <w:sz w:val="22"/>
-          <w:i w:val="0"/>
+          <w:rFonts w:ascii="Times New Roman" w:hAnsi="Times New Roman" w:eastAsia="Times New Roman"/>
+          <w:i w:val="0"/>
+          <w:sz w:val="24"/>
         </w:rPr>
         <w:t>(2), 173–192. https://doi.org/10.1177/1461445605050365</w:t>
       </w:r>
@@ -12109,29 +12127,25 @@
       </w:pPr>
       <w:r>
         <w:rPr>
-          <w:rFonts w:ascii="Georgia" w:hAnsi="Georgia" w:cs="Georgia" w:eastAsia="Georgia"/>
-          <w:b w:val="0"/>
-          <w:sz w:val="22"/>
-          <w:i w:val="0"/>
+          <w:rFonts w:ascii="Times New Roman" w:hAnsi="Times New Roman" w:eastAsia="Times New Roman"/>
+          <w:i w:val="0"/>
+          <w:sz w:val="24"/>
         </w:rPr>
         <w:t xml:space="preserve">Hyland, K., &amp; Milton, J. (1997). Qualification and certainty in L1 and L2 students’ writing. </w:t>
       </w:r>
       <w:r>
         <w:rPr>
-          <w:rFonts w:ascii="Georgia" w:hAnsi="Georgia" w:cs="Georgia" w:eastAsia="Georgia"/>
-          <w:b w:val="0"/>
-          <w:sz w:val="22"/>
+          <w:rFonts w:ascii="Times New Roman" w:hAnsi="Times New Roman" w:eastAsia="Times New Roman"/>
           <w:i/>
-          <w:iCs/>
+          <w:sz w:val="24"/>
         </w:rPr>
         <w:t>Journal of Second Language Writing, 6</w:t>
       </w:r>
       <w:r>
         <w:rPr>
-          <w:rFonts w:ascii="Georgia" w:hAnsi="Georgia" w:cs="Georgia" w:eastAsia="Georgia"/>
-          <w:b w:val="0"/>
-          <w:sz w:val="22"/>
-          <w:i w:val="0"/>
+          <w:rFonts w:ascii="Times New Roman" w:hAnsi="Times New Roman" w:eastAsia="Times New Roman"/>
+          <w:i w:val="0"/>
+          <w:sz w:val="24"/>
         </w:rPr>
         <w:t>(2), 183–205. https://doi.org/10.1016/S1060-3743(97)90033-3</w:t>
       </w:r>
@@ -12145,29 +12159,25 @@
       </w:pPr>
       <w:r>
         <w:rPr>
-          <w:rFonts w:ascii="Georgia" w:hAnsi="Georgia" w:cs="Georgia" w:eastAsia="Georgia"/>
-          <w:b w:val="0"/>
-          <w:sz w:val="22"/>
-          <w:i w:val="0"/>
+          <w:rFonts w:ascii="Times New Roman" w:hAnsi="Times New Roman" w:eastAsia="Times New Roman"/>
+          <w:i w:val="0"/>
+          <w:sz w:val="24"/>
         </w:rPr>
         <w:t xml:space="preserve">Imataki, N., &amp; Kobayashi, Y. (2024). Analyzing disciplinary variation in abstracts: Linguistic features across scientific and technical fields. </w:t>
       </w:r>
       <w:r>
         <w:rPr>
-          <w:rFonts w:ascii="Georgia" w:hAnsi="Georgia" w:cs="Georgia" w:eastAsia="Georgia"/>
-          <w:b w:val="0"/>
-          <w:sz w:val="22"/>
+          <w:rFonts w:ascii="Times New Roman" w:hAnsi="Times New Roman" w:eastAsia="Times New Roman"/>
           <w:i/>
-          <w:iCs/>
+          <w:sz w:val="24"/>
         </w:rPr>
         <w:t>Linguistics and Literature Studies, 12</w:t>
       </w:r>
       <w:r>
         <w:rPr>
-          <w:rFonts w:ascii="Georgia" w:hAnsi="Georgia" w:cs="Georgia" w:eastAsia="Georgia"/>
-          <w:b w:val="0"/>
-          <w:sz w:val="22"/>
-          <w:i w:val="0"/>
+          <w:rFonts w:ascii="Times New Roman" w:hAnsi="Times New Roman" w:eastAsia="Times New Roman"/>
+          <w:i w:val="0"/>
+          <w:sz w:val="24"/>
         </w:rPr>
         <w:t>(3), 19–28. https://doi.org/10.13189/lls.2024.120301</w:t>
       </w:r>
@@ -12181,29 +12191,25 @@
       </w:pPr>
       <w:r>
         <w:rPr>
-          <w:rFonts w:ascii="Georgia" w:hAnsi="Georgia" w:cs="Georgia" w:eastAsia="Georgia"/>
-          <w:b w:val="0"/>
-          <w:sz w:val="22"/>
-          <w:i w:val="0"/>
+          <w:rFonts w:ascii="Times New Roman" w:hAnsi="Times New Roman" w:eastAsia="Times New Roman"/>
+          <w:i w:val="0"/>
+          <w:sz w:val="24"/>
         </w:rPr>
         <w:t xml:space="preserve">Khunasathitchai, K., Sittironnarit, S., Sinturat, T., &amp; Kumdee, S. (2025). Move analysis and hedge use in the research paper abstracts of Thai EFL English-majored undergraduates. </w:t>
       </w:r>
       <w:r>
         <w:rPr>
-          <w:rFonts w:ascii="Georgia" w:hAnsi="Georgia" w:cs="Georgia" w:eastAsia="Georgia"/>
-          <w:b w:val="0"/>
-          <w:sz w:val="22"/>
+          <w:rFonts w:ascii="Times New Roman" w:hAnsi="Times New Roman" w:eastAsia="Times New Roman"/>
           <w:i/>
-          <w:iCs/>
+          <w:sz w:val="24"/>
         </w:rPr>
         <w:t>rEFLections, 32</w:t>
       </w:r>
       <w:r>
         <w:rPr>
-          <w:rFonts w:ascii="Georgia" w:hAnsi="Georgia" w:cs="Georgia" w:eastAsia="Georgia"/>
-          <w:b w:val="0"/>
-          <w:sz w:val="22"/>
-          <w:i w:val="0"/>
+          <w:rFonts w:ascii="Times New Roman" w:hAnsi="Times New Roman" w:eastAsia="Times New Roman"/>
+          <w:i w:val="0"/>
+          <w:sz w:val="24"/>
         </w:rPr>
         <w:t>(2), 951–973. https://doi.org/10.61508/refl.v32i2.282512</w:t>
       </w:r>
@@ -12217,29 +12223,25 @@
       </w:pPr>
       <w:r>
         <w:rPr>
-          <w:rFonts w:ascii="Georgia" w:hAnsi="Georgia" w:cs="Georgia" w:eastAsia="Georgia"/>
-          <w:b w:val="0"/>
-          <w:sz w:val="22"/>
-          <w:i w:val="0"/>
+          <w:rFonts w:ascii="Times New Roman" w:hAnsi="Times New Roman" w:eastAsia="Times New Roman"/>
+          <w:i w:val="0"/>
+          <w:sz w:val="24"/>
         </w:rPr>
         <w:t xml:space="preserve">Landis, J. R., &amp; Koch, G. G. (1977). The measurement of observer agreement for categorical data. </w:t>
       </w:r>
       <w:r>
         <w:rPr>
-          <w:rFonts w:ascii="Georgia" w:hAnsi="Georgia" w:cs="Georgia" w:eastAsia="Georgia"/>
-          <w:b w:val="0"/>
-          <w:sz w:val="22"/>
+          <w:rFonts w:ascii="Times New Roman" w:hAnsi="Times New Roman" w:eastAsia="Times New Roman"/>
           <w:i/>
-          <w:iCs/>
+          <w:sz w:val="24"/>
         </w:rPr>
         <w:t>Biometrics, 33</w:t>
       </w:r>
       <w:r>
         <w:rPr>
-          <w:rFonts w:ascii="Georgia" w:hAnsi="Georgia" w:cs="Georgia" w:eastAsia="Georgia"/>
-          <w:b w:val="0"/>
-          <w:sz w:val="22"/>
-          <w:i w:val="0"/>
+          <w:rFonts w:ascii="Times New Roman" w:hAnsi="Times New Roman" w:eastAsia="Times New Roman"/>
+          <w:i w:val="0"/>
+          <w:sz w:val="24"/>
         </w:rPr>
         <w:t>(1), 159–174. https://doi.org/10.2307/2529310</w:t>
       </w:r>
@@ -12253,29 +12255,25 @@
       </w:pPr>
       <w:r>
         <w:rPr>
-          <w:rFonts w:ascii="Georgia" w:hAnsi="Georgia" w:cs="Georgia" w:eastAsia="Georgia"/>
-          <w:b w:val="0"/>
-          <w:sz w:val="22"/>
-          <w:i w:val="0"/>
+          <w:rFonts w:ascii="Times New Roman" w:hAnsi="Times New Roman" w:eastAsia="Times New Roman"/>
+          <w:i w:val="0"/>
+          <w:sz w:val="24"/>
         </w:rPr>
         <w:t xml:space="preserve">Lopez, R. M. C., Pedida, J. A., Alzate, L. J. A., &amp; Eustaquio, M. T. L. (2025). Language of caution and certainty: Writing proficiency in hedges and boosters in student essays. </w:t>
       </w:r>
       <w:r>
         <w:rPr>
-          <w:rFonts w:ascii="Georgia" w:hAnsi="Georgia" w:cs="Georgia" w:eastAsia="Georgia"/>
-          <w:b w:val="0"/>
-          <w:sz w:val="22"/>
+          <w:rFonts w:ascii="Times New Roman" w:hAnsi="Times New Roman" w:eastAsia="Times New Roman"/>
           <w:i/>
-          <w:iCs/>
+          <w:sz w:val="24"/>
         </w:rPr>
         <w:t>International Journal of Research and Innovation in Social Science, 9</w:t>
       </w:r>
       <w:r>
         <w:rPr>
-          <w:rFonts w:ascii="Georgia" w:hAnsi="Georgia" w:cs="Georgia" w:eastAsia="Georgia"/>
-          <w:b w:val="0"/>
-          <w:sz w:val="22"/>
-          <w:i w:val="0"/>
+          <w:rFonts w:ascii="Times New Roman" w:hAnsi="Times New Roman" w:eastAsia="Times New Roman"/>
+          <w:i w:val="0"/>
+          <w:sz w:val="24"/>
         </w:rPr>
         <w:t>(11), 6176–6196. https://doi.org/10.47772/IJRISS.2025.91100485</w:t>
       </w:r>
@@ -12289,11 +12287,27 @@
       </w:pPr>
       <w:r>
         <w:rPr>
-          <w:rFonts w:ascii="Georgia" w:hAnsi="Georgia" w:cs="Georgia" w:eastAsia="Georgia"/>
+          <w:rFonts w:ascii="Times New Roman" w:hAnsi="Times New Roman" w:eastAsia="Times New Roman"/>
+          <w:i w:val="0"/>
           <w:sz w:val="24"/>
-          <w:szCs w:val="24"/>
-        </w:rPr>
-        <w:t xml:space="preserve">Mazidah, E. N., Cahyani, W. I., &amp; Masruroh, L. (2022). Hedges and boosters in undergraduate thesis abstracts of Qomaruddin University students. Journal of Education, Humaniora and Social Sciences (JEHSS), 4(3), 1657–1663. https://doi.org/10.34007/jehss.v4i3.925</w:t>
+        </w:rPr>
+        <w:t xml:space="preserve">Mazidah, E. N., Cahyani, W. I., &amp; Masruroh, L. (2022). Hedges and boosters in undergraduate thesis abstracts of Qomaruddin University students. </w:t>
+      </w:r>
+      <w:r>
+        <w:rPr>
+          <w:rFonts w:ascii="Times New Roman" w:hAnsi="Times New Roman" w:eastAsia="Times New Roman"/>
+          <w:i/>
+          <w:sz w:val="24"/>
+        </w:rPr>
+        <w:t>Journal of Education, Humaniora and Social Sciences (JEHSS), 4</w:t>
+      </w:r>
+      <w:r>
+        <w:rPr>
+          <w:rFonts w:ascii="Times New Roman" w:hAnsi="Times New Roman" w:eastAsia="Times New Roman"/>
+          <w:i w:val="0"/>
+          <w:sz w:val="24"/>
+        </w:rPr>
+        <w:t>(3), 1657–1663. https://doi.org/10.34007/jehss.v4i3.925</w:t>
       </w:r>
     </w:p>
     <w:p>
@@ -12305,29 +12319,25 @@
       </w:pPr>
       <w:r>
         <w:rPr>
-          <w:rFonts w:ascii="Georgia" w:hAnsi="Georgia" w:cs="Georgia" w:eastAsia="Georgia"/>
-          <w:b w:val="0"/>
-          <w:sz w:val="22"/>
-          <w:i w:val="0"/>
+          <w:rFonts w:ascii="Times New Roman" w:hAnsi="Times New Roman" w:eastAsia="Times New Roman"/>
+          <w:i w:val="0"/>
+          <w:sz w:val="24"/>
         </w:rPr>
         <w:t xml:space="preserve">Mohammed, S. J. (2011). </w:t>
       </w:r>
       <w:r>
         <w:rPr>
-          <w:rFonts w:ascii="Georgia" w:hAnsi="Georgia" w:cs="Georgia" w:eastAsia="Georgia"/>
-          <w:b w:val="0"/>
-          <w:sz w:val="22"/>
+          <w:rFonts w:ascii="Times New Roman" w:hAnsi="Times New Roman" w:eastAsia="Times New Roman"/>
           <w:i/>
-          <w:iCs/>
+          <w:sz w:val="24"/>
         </w:rPr>
         <w:t>Lexical hedges: A study of cultural and disciplinary variation in academic research articles</w:t>
       </w:r>
       <w:r>
         <w:rPr>
-          <w:rFonts w:ascii="Georgia" w:hAnsi="Georgia" w:cs="Georgia" w:eastAsia="Georgia"/>
-          <w:b w:val="0"/>
-          <w:sz w:val="22"/>
-          <w:i w:val="0"/>
+          <w:rFonts w:ascii="Times New Roman" w:hAnsi="Times New Roman" w:eastAsia="Times New Roman"/>
+          <w:i w:val="0"/>
+          <w:sz w:val="24"/>
         </w:rPr>
         <w:t xml:space="preserve"> [Master’s thesis, Universiti Teknologi MARA]. CORE. https://core.ac.uk/download/78277430.pdf</w:t>
       </w:r>
@@ -12341,29 +12351,25 @@
       </w:pPr>
       <w:r>
         <w:rPr>
-          <w:rFonts w:ascii="Georgia" w:hAnsi="Georgia" w:cs="Georgia" w:eastAsia="Georgia"/>
-          <w:b w:val="0"/>
-          <w:sz w:val="22"/>
-          <w:i w:val="0"/>
+          <w:rFonts w:ascii="Times New Roman" w:hAnsi="Times New Roman" w:eastAsia="Times New Roman"/>
+          <w:i w:val="0"/>
+          <w:sz w:val="24"/>
         </w:rPr>
         <w:t xml:space="preserve">Ningrum, S., Puspita, H., &amp; Mulyadi, A. I. (2024). Hedges and boosters in academic writing of ASEAN EFL learners. </w:t>
       </w:r>
       <w:r>
         <w:rPr>
-          <w:rFonts w:ascii="Georgia" w:hAnsi="Georgia" w:cs="Georgia" w:eastAsia="Georgia"/>
-          <w:b w:val="0"/>
-          <w:sz w:val="22"/>
+          <w:rFonts w:ascii="Times New Roman" w:hAnsi="Times New Roman" w:eastAsia="Times New Roman"/>
           <w:i/>
-          <w:iCs/>
+          <w:sz w:val="24"/>
         </w:rPr>
         <w:t>Journal of English Education and Teaching, 8</w:t>
       </w:r>
       <w:r>
         <w:rPr>
-          <w:rFonts w:ascii="Georgia" w:hAnsi="Georgia" w:cs="Georgia" w:eastAsia="Georgia"/>
-          <w:b w:val="0"/>
-          <w:sz w:val="22"/>
-          <w:i w:val="0"/>
+          <w:rFonts w:ascii="Times New Roman" w:hAnsi="Times New Roman" w:eastAsia="Times New Roman"/>
+          <w:i w:val="0"/>
+          <w:sz w:val="24"/>
         </w:rPr>
         <w:t>(1), 202–218. https://doi.org/10.33369/jeet.8.1.202-218</w:t>
       </w:r>
@@ -12377,29 +12383,25 @@
       </w:pPr>
       <w:r>
         <w:rPr>
-          <w:rFonts w:ascii="Georgia" w:hAnsi="Georgia" w:cs="Georgia" w:eastAsia="Georgia"/>
-          <w:b w:val="0"/>
-          <w:sz w:val="22"/>
-          <w:i w:val="0"/>
+          <w:rFonts w:ascii="Times New Roman" w:hAnsi="Times New Roman" w:eastAsia="Times New Roman"/>
+          <w:i w:val="0"/>
+          <w:sz w:val="24"/>
         </w:rPr>
         <w:t xml:space="preserve">Petchkij, W. (2019). Explicit teaching of hedges: Bringing hedging in academic writing into the Thai EFL classroom. </w:t>
       </w:r>
       <w:r>
         <w:rPr>
-          <w:rFonts w:ascii="Georgia" w:hAnsi="Georgia" w:cs="Georgia" w:eastAsia="Georgia"/>
-          <w:b w:val="0"/>
-          <w:sz w:val="22"/>
+          <w:rFonts w:ascii="Times New Roman" w:hAnsi="Times New Roman" w:eastAsia="Times New Roman"/>
           <w:i/>
-          <w:iCs/>
+          <w:sz w:val="24"/>
         </w:rPr>
         <w:t>Electronic Journal of Foreign Language Teaching, 16</w:t>
       </w:r>
       <w:r>
         <w:rPr>
-          <w:rFonts w:ascii="Georgia" w:hAnsi="Georgia" w:cs="Georgia" w:eastAsia="Georgia"/>
-          <w:b w:val="0"/>
-          <w:sz w:val="22"/>
-          <w:i w:val="0"/>
+          <w:rFonts w:ascii="Times New Roman" w:hAnsi="Times New Roman" w:eastAsia="Times New Roman"/>
+          <w:i w:val="0"/>
+          <w:sz w:val="24"/>
         </w:rPr>
         <w:t>(1), 95–113. https://e-flt.nus.edu.sg/wp-content/uploads/2020/09/petchkij.pdf</w:t>
       </w:r>
@@ -12413,29 +12415,25 @@
       </w:pPr>
       <w:r>
         <w:rPr>
-          <w:rFonts w:ascii="Georgia" w:hAnsi="Georgia" w:cs="Georgia" w:eastAsia="Georgia"/>
-          <w:b w:val="0"/>
-          <w:sz w:val="22"/>
-          <w:i w:val="0"/>
+          <w:rFonts w:ascii="Times New Roman" w:hAnsi="Times New Roman" w:eastAsia="Times New Roman"/>
+          <w:i w:val="0"/>
+          <w:sz w:val="24"/>
         </w:rPr>
         <w:t xml:space="preserve">Salager-Meyer, F. (1994). Hedges and textual communicative function in medical English written discourse. </w:t>
       </w:r>
       <w:r>
         <w:rPr>
-          <w:rFonts w:ascii="Georgia" w:hAnsi="Georgia" w:cs="Georgia" w:eastAsia="Georgia"/>
-          <w:b w:val="0"/>
-          <w:sz w:val="22"/>
+          <w:rFonts w:ascii="Times New Roman" w:hAnsi="Times New Roman" w:eastAsia="Times New Roman"/>
           <w:i/>
-          <w:iCs/>
+          <w:sz w:val="24"/>
         </w:rPr>
         <w:t>English for Specific Purposes, 13</w:t>
       </w:r>
       <w:r>
         <w:rPr>
-          <w:rFonts w:ascii="Georgia" w:hAnsi="Georgia" w:cs="Georgia" w:eastAsia="Georgia"/>
-          <w:b w:val="0"/>
-          <w:sz w:val="22"/>
-          <w:i w:val="0"/>
+          <w:rFonts w:ascii="Times New Roman" w:hAnsi="Times New Roman" w:eastAsia="Times New Roman"/>
+          <w:i w:val="0"/>
+          <w:sz w:val="24"/>
         </w:rPr>
         <w:t>(2), 149–170. https://doi.org/10.1016/0889-4906(94)90013-2</w:t>
       </w:r>
@@ -12449,11 +12447,27 @@
       </w:pPr>
       <w:r>
         <w:rPr>
-          <w:rFonts w:ascii="Georgia" w:hAnsi="Georgia" w:cs="Georgia" w:eastAsia="Georgia"/>
+          <w:rFonts w:ascii="Times New Roman" w:hAnsi="Times New Roman" w:eastAsia="Times New Roman"/>
+          <w:i w:val="0"/>
           <w:sz w:val="24"/>
-          <w:szCs w:val="24"/>
-        </w:rPr>
-        <w:t xml:space="preserve">Souici, F., &amp; Slougui, D. (2022). Hedges in biology research articles: What types and frequency do Algerian authors use? Journal of Human Sciences, 33(4), 49–59. https://revue.umc.edu.dz/h/article/view/4015</w:t>
+        </w:rPr>
+        <w:t xml:space="preserve">Souici, F., &amp; Slougui, D. (2022). Hedges in biology research articles: What types and frequency do Algerian authors use? </w:t>
+      </w:r>
+      <w:r>
+        <w:rPr>
+          <w:rFonts w:ascii="Times New Roman" w:hAnsi="Times New Roman" w:eastAsia="Times New Roman"/>
+          <w:i/>
+          <w:sz w:val="24"/>
+        </w:rPr>
+        <w:t>Journal of Human Sciences, 33</w:t>
+      </w:r>
+      <w:r>
+        <w:rPr>
+          <w:rFonts w:ascii="Times New Roman" w:hAnsi="Times New Roman" w:eastAsia="Times New Roman"/>
+          <w:i w:val="0"/>
+          <w:sz w:val="24"/>
+        </w:rPr>
+        <w:t>(4), 49–59. https://revue.umc.edu.dz/h/article/view/4015</w:t>
       </w:r>
     </w:p>
     <w:p>
@@ -12465,29 +12479,25 @@
       </w:pPr>
       <w:r>
         <w:rPr>
-          <w:rFonts w:ascii="Georgia" w:hAnsi="Georgia" w:cs="Georgia" w:eastAsia="Georgia"/>
-          <w:b w:val="0"/>
-          <w:sz w:val="22"/>
-          <w:i w:val="0"/>
+          <w:rFonts w:ascii="Times New Roman" w:hAnsi="Times New Roman" w:eastAsia="Times New Roman"/>
+          <w:i w:val="0"/>
+          <w:sz w:val="24"/>
         </w:rPr>
         <w:t xml:space="preserve">Suratno, A., &amp; Aydawati, E. N. (2025). Hedging strategies in non-science theses: A corpus-based analysis of discussion sections. </w:t>
       </w:r>
       <w:r>
         <w:rPr>
-          <w:rFonts w:ascii="Georgia" w:hAnsi="Georgia" w:cs="Georgia" w:eastAsia="Georgia"/>
-          <w:b w:val="0"/>
-          <w:sz w:val="22"/>
+          <w:rFonts w:ascii="Times New Roman" w:hAnsi="Times New Roman" w:eastAsia="Times New Roman"/>
           <w:i/>
-          <w:iCs/>
+          <w:sz w:val="24"/>
         </w:rPr>
         <w:t>ETERNAL (English Teaching Journal), 16</w:t>
       </w:r>
       <w:r>
         <w:rPr>
-          <w:rFonts w:ascii="Georgia" w:hAnsi="Georgia" w:cs="Georgia" w:eastAsia="Georgia"/>
-          <w:b w:val="0"/>
-          <w:sz w:val="22"/>
-          <w:i w:val="0"/>
+          <w:rFonts w:ascii="Times New Roman" w:hAnsi="Times New Roman" w:eastAsia="Times New Roman"/>
+          <w:i w:val="0"/>
+          <w:sz w:val="24"/>
         </w:rPr>
         <w:t>(1), 37–52. https://journal2.upgris.ac.id/index.php/eternal/article/view/1059</w:t>
       </w:r>
@@ -12501,29 +12511,25 @@
       </w:pPr>
       <w:r>
         <w:rPr>
-          <w:rFonts w:ascii="Georgia" w:hAnsi="Georgia" w:cs="Georgia" w:eastAsia="Georgia"/>
-          <w:b w:val="0"/>
-          <w:sz w:val="22"/>
-          <w:i w:val="0"/>
+          <w:rFonts w:ascii="Times New Roman" w:hAnsi="Times New Roman" w:eastAsia="Times New Roman"/>
+          <w:i w:val="0"/>
+          <w:sz w:val="24"/>
         </w:rPr>
         <w:t xml:space="preserve">Villanueva, V. S. (2014). Hedging devices in Philippine newspaper editorials. </w:t>
       </w:r>
       <w:r>
         <w:rPr>
-          <w:rFonts w:ascii="Georgia" w:hAnsi="Georgia" w:cs="Georgia" w:eastAsia="Georgia"/>
-          <w:b w:val="0"/>
-          <w:sz w:val="22"/>
+          <w:rFonts w:ascii="Times New Roman" w:hAnsi="Times New Roman" w:eastAsia="Times New Roman"/>
           <w:i/>
-          <w:iCs/>
+          <w:sz w:val="24"/>
         </w:rPr>
         <w:t>Asian Journal of English Language Studies, 2</w:t>
       </w:r>
       <w:r>
         <w:rPr>
-          <w:rFonts w:ascii="Georgia" w:hAnsi="Georgia" w:cs="Georgia" w:eastAsia="Georgia"/>
-          <w:b w:val="0"/>
-          <w:sz w:val="22"/>
-          <w:i w:val="0"/>
+          <w:rFonts w:ascii="Times New Roman" w:hAnsi="Times New Roman" w:eastAsia="Times New Roman"/>
+          <w:i w:val="0"/>
+          <w:sz w:val="24"/>
         </w:rPr>
         <w:t>, 103–117. https://doi.org/10.59960/2.a5</w:t>
       </w:r>
@@ -12539,29 +12545,25 @@
       </w:pPr>
       <w:r>
         <w:rPr>
-          <w:rFonts w:ascii="Georgia" w:hAnsi="Georgia" w:cs="Georgia" w:eastAsia="Georgia"/>
-          <w:b w:val="0"/>
-          <w:sz w:val="22"/>
-          <w:i w:val="0"/>
+          <w:rFonts w:ascii="Times New Roman" w:hAnsi="Times New Roman" w:eastAsia="Times New Roman"/>
+          <w:i w:val="0"/>
+          <w:sz w:val="24"/>
         </w:rPr>
         <w:t xml:space="preserve">Wang, X. (2022). </w:t>
       </w:r>
       <w:r>
         <w:rPr>
-          <w:rFonts w:ascii="Georgia" w:hAnsi="Georgia" w:cs="Georgia" w:eastAsia="Georgia"/>
-          <w:b w:val="0"/>
-          <w:sz w:val="22"/>
+          <w:rFonts w:ascii="Times New Roman" w:hAnsi="Times New Roman" w:eastAsia="Times New Roman"/>
           <w:i/>
-          <w:iCs/>
+          <w:sz w:val="24"/>
         </w:rPr>
         <w:t>Hedging in academic writing: Cross-disciplinary comparisons in the Michigan Corpus of Upper-Level Student Papers (MICUSP)</w:t>
       </w:r>
       <w:r>
         <w:rPr>
-          <w:rFonts w:ascii="Georgia" w:hAnsi="Georgia" w:cs="Georgia" w:eastAsia="Georgia"/>
-          <w:b w:val="0"/>
-          <w:sz w:val="22"/>
-          <w:i w:val="0"/>
+          <w:rFonts w:ascii="Times New Roman" w:hAnsi="Times New Roman" w:eastAsia="Times New Roman"/>
+          <w:i w:val="0"/>
+          <w:sz w:val="24"/>
         </w:rPr>
         <w:t xml:space="preserve"> [Preprint]. OSF Preprints. https://osf.io/preprints/edarxiv/5xj27</w:t>
       </w:r>
@@ -12577,11 +12579,27 @@
       </w:pPr>
       <w:r>
         <w:rPr>
-          <w:rFonts w:ascii="Georgia" w:hAnsi="Georgia" w:cs="Georgia" w:eastAsia="Georgia"/>
+          <w:rFonts w:ascii="Times New Roman" w:hAnsi="Times New Roman" w:eastAsia="Times New Roman"/>
+          <w:i w:val="0"/>
           <w:sz w:val="24"/>
-          <w:szCs w:val="24"/>
-        </w:rPr>
-        <w:t xml:space="preserve">Xie, S., &amp; Mi, C. (2023). Promotion and caution in research article abstracts: The use of positive, negative and hedge words across disciplines and rankings. Learned Publishing, 36(2), 249–265. https://doi.org/10.1002/leap.1515</w:t>
+        </w:rPr>
+        <w:t xml:space="preserve">Xie, S., &amp; Mi, C. (2023). Promotion and caution in research article abstracts: The use of positive, negative and hedge words across disciplines and rankings. </w:t>
+      </w:r>
+      <w:r>
+        <w:rPr>
+          <w:rFonts w:ascii="Times New Roman" w:hAnsi="Times New Roman" w:eastAsia="Times New Roman"/>
+          <w:i/>
+          <w:sz w:val="24"/>
+        </w:rPr>
+        <w:t>Learned Publishing, 36</w:t>
+      </w:r>
+      <w:r>
+        <w:rPr>
+          <w:rFonts w:ascii="Times New Roman" w:hAnsi="Times New Roman" w:eastAsia="Times New Roman"/>
+          <w:i w:val="0"/>
+          <w:sz w:val="24"/>
+        </w:rPr>
+        <w:t>(2), 249–265. https://doi.org/10.1002/leap.1515</w:t>
       </w:r>
     </w:p>
     <w:p>

</xml_diff>

<commit_message>
Draft_080: hard/soft divide not axis in disciplinary variation
</commit_message>
<xml_diff>
--- a/thesis/003_ThesisProposal_Draft_080.docx
+++ b/thesis/003_ThesisProposal_Draft_080.docx
@@ -528,7 +528,7 @@
           <w:sz w:val="24"/>
           <w:szCs w:val="24"/>
         </w:rPr>
-        <w:t xml:space="preserve">Field norms shape expert hedging, but not along a simple hard/soft divide. Comparative work places humanities writers at the high end of hedge frequency and agriculture near the low end in one multi-field design (Afshar et al., 2014), while other pairings find scientists hedging more than applied linguists (Mohammed, 2011). Within life sciences, biology research articles often favor non-factive reporting verbs as the main hedge type (Souici &amp; Slougui, 2022), and clinical writing may edge slightly above basic science within medicine without a strong statistical separation (Hamidi et al., 2025). The mixed directions matter less as contradiction than as evidence that density tracks specific epistemic demands and coding choices rather than a single hard/soft axis.</w:t>
+        <w:t>Field norms shape expert hedging, but not along a simple hard/soft divide. Comparative work places humanities writers at the high end of hedge frequency and agriculture near the low end in one multi-field design (Afshar et al., 2014), while other pairings find scientists hedging more than applied linguists (Mohammed, 2011). Within life sciences, biology research articles often favor non-factive reporting verbs as the main hedge type (Souici &amp; Slougui, 2022), and clinical writing may edge slightly above basic science within medicine without a strong statistical separation (Hamidi et al., 2025). The mixed directions matter less as contradiction than as evidence that density tracks specific epistemic demands and coding choices rather than a single hard/soft divide.</w:t>
       </w:r>
     </w:p>
     <w:p>
@@ -549,7 +549,7 @@
           <w:szCs w:val="22"/>
           <w:rtl w:val="0"/>
         </w:rPr>
-        <w:t>These findings are not necessarily contradictory. Afshar et al. and Mohammed compare different disciplinary pairings and use different hedge taxonomies (Afshar the full Salager-Meyer (1994) scheme, Mohammed a lexical-hedge focus), so the contrast is evidence that hedging density tracks specific epistemic demands rather than a single hard/soft axis. Salager-Meyer (1994) frames hedging as claim-responsibility management: writers distribute responsibility for a claim’s truth, accuracy, or applicability among themselves, their data, and external conditions. That framing predicts that Agriculture, Veterinary Medicine, and Biology may produce distinct patterns not because one field is “harder,” but because each requires writers to manage different kinds of responsibility.</w:t>
+        <w:t>These findings are not necessarily contradictory. Afshar et al. and Mohammed compare different disciplinary pairings and use different hedge taxonomies (Afshar the full Salager-Meyer (1994) scheme, Mohammed a lexical-hedge focus), so the contrast is evidence that hedging density tracks specific epistemic demands rather than a single hard/soft divide. Salager-Meyer (1994) frames hedging as claim-responsibility management: writers distribute responsibility for a claim’s truth, accuracy, or applicability among themselves, their data, and external conditions. That framing predicts that Agriculture, Veterinary Medicine, and Biology may produce distinct patterns not because one field is “harder,” but because each requires writers to manage different kinds of responsibility.</w:t>
       </w:r>
       <w:r>
         <w:rPr>

</xml_diff>

<commit_message>
Draft_080: drop abrupt Instruction helps in L2 section
</commit_message>
<xml_diff>
--- a/thesis/003_ThesisProposal_Draft_080.docx
+++ b/thesis/003_ThesisProposal_Draft_080.docx
@@ -592,11 +592,10 @@
       </w:pPr>
       <w:r>
         <w:rPr>
-          <w:rFonts w:ascii="Georgia" w:hAnsi="Georgia" w:cs="Georgia" w:eastAsia="Georgia"/>
+          <w:rFonts w:ascii="Times New Roman" w:hAnsi="Times New Roman"/>
           <w:sz w:val="24"/>
-          <w:szCs w:val="24"/>
-        </w:rPr>
-        <w:t xml:space="preserve">English is the medium of academic writing at PSAU, but not the home language for most students. L2 writers typically use fewer hedges and less formal variety than L1 peers (Demir, 2018, and Mohammed, 2011), and publication context can amplify that gap: English-medium journal abstracts show markedly more hedges than Chinese-medium counterparts in the same field (Hu &amp; Cao, 2011). Instruction helps. Explicit teaching can raise both frequency and variety among health-science undergraduates, though a preference for modals often remains even after training (Petchkij, 2019).</w:t>
+        </w:rPr>
+        <w:t>English is the medium of academic writing at PSAU, but not the home language for most students. L2 writers typically use fewer hedges and less formal variety than L1 peers (Demir, 2018, and Mohammed, 2011), and publication context can amplify that gap: English-medium journal abstracts show markedly more hedges than Chinese-medium counterparts in the same field (Hu &amp; Cao, 2011). Explicit teaching can raise both frequency and variety among health-science undergraduates, though a preference for modals often remains even after training (Petchkij, 2019).</w:t>
       </w:r>
     </w:p>
     <w:p>

</xml_diff>

<commit_message>
Draft_080: rewrite CONCLUSIONS as synthesis, not results recap
</commit_message>
<xml_diff>
--- a/thesis/003_ThesisProposal_Draft_080.docx
+++ b/thesis/003_ThesisProposal_Draft_080.docx
@@ -11486,7 +11486,7 @@
           <w:szCs w:val="22"/>
           <w:rtl w:val="0"/>
         </w:rPr>
-        <w:t>Lexical hedges outnumber modal verbs in this corpus, largely because of the high frequency of potential in recurring frames. Density is highest in Agriculture and Biology (near-tied), then Veterinary Medicine, with 25 of 60 abstracts (41.7%) containing no coded hedges. Every retained hedge was coded as Epistemic Caution at Stage 2. No P candidates appeared in the corpus; sequence-only DO was not counted. The functional result describes this sample’s retained set under the Stage 1–2 procedure. Full counts and tests are reported in Parts I–III.</w:t>
+        <w:t>Across the 60 abstracts, hedging is present but uneven. Lexical forms, especially potential in results and implication frames, dominate the retained set; modal verbs are secondary; adverbial and clause-level hedges are rare or absent. A large share of abstracts carry no coded hedges at all. Under Stage 1–2 coding, every retained token was labeled Epistemic Caution: no politeness candidates appeared in the corpus, and sequence-only discourse markers were not counted as hedges. That functional profile describes this sample’s retained set, not a claim that interpersonal or discourse mitigation never occurs in student writing.</w:t>
       </w:r>
       <w:r>
         <w:rPr>
@@ -11512,7 +11512,7 @@
           <w:sz w:val="22"/>
           <w:szCs w:val="22"/>
         </w:rPr>
-        <w:t xml:space="preserve">Limited evidence of disciplinary differentiation, mainly Veterinary Medicine’s lower density. Agriculture’s edge over Biology is modest and outlier-sensitive. Acs2 illustrates rescue-hedging after a non-significant result, which links to the introduction’s concern with overclaiming, but it is a single abstract. The Null/NS mean in Agriculture falls to the same level as non-Null Agriculture once Acs2 is removed. The data cannot separate field norms, adviser practice, and outcome type. Agriculture has no Binary outcomes here, so discipline and study design remain entangled. The Kruskal-Wallis test on rates was p = .024. Pairwise Mann-Whitney tests with Bonferroni correction leave Biology–Veterinary Medicine as the surviving contrast. Those tests are exploratory and the sample is small, as noted in Scope. The study provides a local baseline: in this corpus, Veterinary Medicine abstracts hedge less than Biology abstracts on the corrected pairwise test, a pattern not explained by binary outcome type alone. Causes (field norm, adviser practice, or other factors) cannot be identified from abstract text alone.</w:t>
+        <w:t xml:space="preserve">Disciplinary contrast is limited and should be read carefully. Veterinary Medicine shows the lowest density; Agriculture and Biology sit closer together, and Agriculture’s apparent edge is sensitive to a single high-hedge abstract. Rescue-hedging after a non-significant result appears in that outlier and connects to the study’s opening concern with overclaiming, but one text cannot ground a Null/NS pattern for the discipline. Field norms, adviser practice, and study-design mix remain entangled. The study’s main contribution is a local baseline for how ratified undergraduate abstracts at PSAU manage epistemic stance through hedging—narrow in type, uneven in density, and epistemically focused among the tokens that met the coding rules—rather than a full map of disciplinary style.</w:t>
       </w:r>
     </w:p>
     <w:p>

</xml_diff>

<commit_message>
Draft_080: remove em dashes and semicolons from recent revisions
</commit_message>
<xml_diff>
--- a/thesis/003_ThesisProposal_Draft_080.docx
+++ b/thesis/003_ThesisProposal_Draft_080.docx
@@ -10506,7 +10506,7 @@
           <w:sz w:val="22"/>
           <w:szCs w:val="22"/>
         </w:rPr>
-        <w:t xml:space="preserve">Parts I through III established frequency, function, and density differences in this corpus. Part IV asks what those differences amount to once outcome type is in view—not as stable field traits, but as patterns in these sixty ratified abstracts. Inferential tests remain exploratory (Scope and Limitations). The discussion draws on Salager-Meyer’s (1994) claim-responsibility framework and Hyland’s (2005) stance model.</w:t>
+        <w:t xml:space="preserve">Parts I through III established frequency, function, and density differences in this corpus. Part IV asks what those differences amount to once outcome type is in view. The aim is not to treat them as stable field traits, but as patterns in these sixty ratified abstracts. Inferential tests remain exploratory (Scope and Limitations). The discussion draws on Salager-Meyer’s (1994) claim-responsibility framework and Hyland’s (2005) stance model.</w:t>
       </w:r>
     </w:p>
     <w:p>
@@ -11486,7 +11486,7 @@
           <w:szCs w:val="22"/>
           <w:rtl w:val="0"/>
         </w:rPr>
-        <w:t>Across the 60 abstracts, hedging is present but uneven. Lexical forms, especially potential in results and implication frames, dominate the retained set; modal verbs are secondary; adverbial and clause-level hedges are rare or absent. A large share of abstracts carry no coded hedges at all. Under Stage 1–2 coding, every retained token was labeled Epistemic Caution: no politeness candidates appeared in the corpus, and sequence-only discourse markers were not counted as hedges. That functional profile describes this sample’s retained set, not a claim that interpersonal or discourse mitigation never occurs in student writing.</w:t>
+        <w:t>Across the 60 abstracts, hedging is present but uneven. Lexical forms, especially potential in results and implication frames, dominate the retained set. Modal verbs are secondary. Adverbial and clause-level hedges are rare or absent. A large share of abstracts carry no coded hedges at all. Under Stage 1–2 coding, every retained token was labeled Epistemic Caution. No politeness candidates appeared in the corpus, and sequence-only discourse markers were not counted as hedges. That functional profile describes this sample’s retained set. It is not a claim that interpersonal or discourse mitigation never occurs in student writing.</w:t>
       </w:r>
       <w:r>
         <w:rPr>
@@ -11512,7 +11512,7 @@
           <w:sz w:val="22"/>
           <w:szCs w:val="22"/>
         </w:rPr>
-        <w:t xml:space="preserve">Disciplinary contrast is limited and should be read carefully. Veterinary Medicine shows the lowest density; Agriculture and Biology sit closer together, and Agriculture’s apparent edge is sensitive to a single high-hedge abstract. Rescue-hedging after a non-significant result appears in that outlier and connects to the study’s opening concern with overclaiming, but one text cannot ground a Null/NS pattern for the discipline. Field norms, adviser practice, and study-design mix remain entangled. The study’s main contribution is a local baseline for how ratified undergraduate abstracts at PSAU manage epistemic stance through hedging—narrow in type, uneven in density, and epistemically focused among the tokens that met the coding rules—rather than a full map of disciplinary style.</w:t>
+        <w:t xml:space="preserve">Disciplinary contrast is limited and should be read carefully. Veterinary Medicine shows the lowest density. Agriculture and Biology sit closer together, and Agriculture’s apparent edge is sensitive to a single high-hedge abstract. Rescue-hedging after a non-significant result appears in that outlier and connects to the study’s opening concern with overclaiming, but one text cannot ground a Null/NS pattern for the discipline. Field norms, adviser practice, and study-design mix remain entangled. The study’s main contribution is a local baseline for how ratified undergraduate abstracts at PSAU manage epistemic stance through hedging. The profile is narrow in type, uneven in density, and epistemically focused among the tokens that met the coding rules. It is not a full map of disciplinary style.</w:t>
       </w:r>
     </w:p>
     <w:p>

</xml_diff>

<commit_message>
Draft_080: fold deeper Conclusions C2 synthesis
</commit_message>
<xml_diff>
--- a/thesis/003_ThesisProposal_Draft_080.docx
+++ b/thesis/003_ThesisProposal_Draft_080.docx
@@ -11486,7 +11486,7 @@
           <w:szCs w:val="22"/>
           <w:rtl w:val="0"/>
         </w:rPr>
-        <w:t>Across the 60 abstracts, hedging is present but uneven. Lexical forms, especially potential in results and implication frames, dominate the retained set. Modal verbs are secondary. Adverbial and clause-level hedges are rare or absent. A large share of abstracts carry no coded hedges at all. Under Stage 1–2 coding, every retained token was labeled Epistemic Caution. No politeness candidates appeared in the corpus, and sequence-only discourse markers were not counted as hedges. That functional profile describes this sample’s retained set. It is not a claim that interpersonal or discourse mitigation never occurs in student writing.</w:t>
+        <w:t>This study set out to map how developing researchers at PSAU encode caution in the thesis abstract, a short genre where every claim is visible and already ratified by advisers. The picture that emerges is not a rich, field-by-field rhetoric of uncertainty. It is a constrained practice. Writers often state results with little or no softening. When they do hedge, they reach for a small lexical set and use it mainly to qualify what the findings might mean, not to elaborate stance at length. Under the coding rules used here, that work is epistemic. The abstract is treated as a place to report and to edge implications, not as a place to negotiate interpersonal face or to manage discourse for its own sake.</w:t>
       </w:r>
       <w:r>
         <w:rPr>
@@ -11512,7 +11512,28 @@
           <w:sz w:val="22"/>
           <w:szCs w:val="22"/>
         </w:rPr>
-        <w:t xml:space="preserve">Disciplinary contrast is limited and should be read carefully. Veterinary Medicine shows the lowest density. Agriculture and Biology sit closer together, and Agriculture’s apparent edge is sensitive to a single high-hedge abstract. Rescue-hedging after a non-significant result appears in that outlier and connects to the study’s opening concern with overclaiming, but one text cannot ground a Null/NS pattern for the discipline. Field norms, adviser practice, and study-design mix remain entangled. The study’s main contribution is a local baseline for how ratified undergraduate abstracts at PSAU manage epistemic stance through hedging. The profile is narrow in type, uneven in density, and epistemically focused among the tokens that met the coding rules. It is not a full map of disciplinary style.</w:t>
+        <w:t xml:space="preserve">Disciplinary difference exists, but it is thinner than a strong "three cultures" story would predict. Veterinary Medicine is the clearest low-hedge corner of the sample. Agriculture and Biology are less distinct from each other once a single high-hedge Agriculture abstract is taken seriously as an outlier rather than as proof of a Null/NS style. The deeper point is institutional as much as linguistic. These texts are supervised products. What looks like a writer’s caution profile may also be a program’s tolerance for soft claims in a high-stakes summary. The data cannot name the cause. They can show the textual outcome.</w:t>
+      </w:r>
+    </w:p>
+    <w:p>
+      <w:pPr>
+        <w:spacing w:before="0" w:after="0" w:line="480" w:lineRule="auto"/>
+        <w:ind w:firstLine="720"/>
+        <w:jc w:val="both"/>
+        <w:rPr/>
+      </w:pPr>
+      <w:r>
+        <w:rPr>
+          <w:rFonts w:ascii="Georgia" w:hAnsi="Georgia" w:cs="Georgia" w:eastAsia="Georgia"/>
+          <w:b w:val="0"/>
+          <w:bCs w:val="0"/>
+          <w:i w:val="0"/>
+          <w:iCs w:val="0"/>
+          <w:rtl w:val="0"/>
+          <w:sz w:val="22"/>
+          <w:szCs w:val="22"/>
+        </w:rPr>
+        <w:t xml:space="preserve">The contribution is therefore a baseline, not a verdict on competence or on whole disciplines. For BAELS and related instruction, the finding matters because it shows what "hedging in science abstracts" looks like on the ground at this campus: uneven, lexically narrow, and easy to miss if teaching assumes a full academic repertoire. For research, the same baseline makes later comparison possible, against expert abstracts, other programs, or fuller thesis chapters where other functions of mitigation may have more room.</w:t>
       </w:r>
     </w:p>
     <w:p>

</xml_diff>

<commit_message>
Draft_080: fold tightened Recommendations (teaching + research)
</commit_message>
<xml_diff>
--- a/thesis/003_ThesisProposal_Draft_080.docx
+++ b/thesis/003_ThesisProposal_Draft_080.docx
@@ -11580,7 +11580,7 @@
           <w:szCs w:val="22"/>
           <w:rtl w:val="0"/>
         </w:rPr>
-        <w:t xml:space="preserve">Thesis advisers at PSAU should treat hedging as a teachable, discipline-sensitive skill rather than a generic call to “be cautious.” Feedback is most useful where implications may overclaim relative to the data, not where result sentences correctly report binary or measured findings without hedges. Instruction should distinguish topic-naming potential in aim statements from epistemic potential in conclusions, and should avoid encouraging students to insert hedges merely to meet a count.</w:t>
+        <w:t xml:space="preserve">The baseline in the conclusions is useful only if it changes what people do next. A map of uneven, lexically narrow caution in ratified abstracts does not, by itself, improve writing. It becomes useful when advisers and researchers treat it as a prompt to act on claim strength rather than on cautious wording for its own sake.</w:t>
       </w:r>
       <w:r>
         <w:rPr>
@@ -11606,7 +11606,7 @@
           <w:szCs w:val="22"/>
           <w:rtl w:val="0"/>
         </w:rPr>
-        <w:t>Rather than prescribing a target number of hedges per abstract, advisers can focus feedback on whether implication and conclusion sentences claim more than the data support. Binary or measured results often need no hedge. Uncertainty belongs on inferences that go beyond the finding. Advisers can also separate discourse connectors (Hence, Thus, In conclusion) from epistemic hedges so students do not treat move-organizing language as hedging.</w:t>
+        <w:t>For teaching, that means dropping the idea of caution as a general polish. Hedging is a judgment about how far a sentence may go beyond the data. Advisers already see the final abstract and often shape it. The opening is to make that judgment visible in feedback, especially where the text turns from results to meaning. Students need help seeing when a finding can stand plain and when an implication needs restraint. They do not need a quota of soft wording, and they do not need to confuse move-organizing language with epistemic caution. Instruction that assumes a full academic hedging repertoire will miss what this campus sample actually shows: many abstracts soften little, and when they do, the work is concentrated and easy to misread as mere style.</w:t>
       </w:r>
       <w:r>
         <w:rPr>
@@ -11632,7 +11632,7 @@
           <w:szCs w:val="22"/>
           <w:rtl w:val="0"/>
         </w:rPr>
-        <w:t>Future research should examine whether the lower Veterinary Medicine density and patterns such as rescue-hedging after non-significant results persist across multiple institutions and groups. A multi-institutional comparison involving other Philippine state universities would help determine whether these patterns are specific to PSAU or representative of broader Philippine developing-researcher writing. Longitudinal studies tracking individual developing researchers' hedging development from first draft to final abstract would also clarify the role of adviser feedback in shaping the observed patterns.</w:t>
+        <w:t>For research, the same baseline is a reference point, not a finding to rest on. The open questions are causal and comparative. How much of the pattern is program practice, how much is language resource, and how much is the mix of study designs that programs tend to produce? Abstract text alone cannot answer those questions. Designs that add other institutions, adviser accounts, draft histories from first version to final abstract, or a proficiency measure would test mechanisms this study could only name. Longer genres and expert abstracts matter for a different reason. They show whether the constrained profile seen here is mainly a product of the short, supervised summary or a wider feature of developing research writing in these fields. Method tools from this thesis can travel with that work. The priority is better questions about cause and scope, not a thicker description of the same sixty texts.</w:t>
       </w:r>
       <w:r>
         <w:rPr>
@@ -11652,108 +11652,6 @@
           <w:rtl w:val="0"/>
         </w:rPr>
         <w:t/>
-      </w:r>
-      <w:r>
-        <w:rPr>
-          <w:rtl w:val="0"/>
-        </w:rPr>
-      </w:r>
-    </w:p>
-    <w:p>
-      <w:pPr>
-        <w:spacing w:before="0" w:after="0" w:line="480" w:lineRule="auto"/>
-        <w:ind w:firstLine="720"/>
-        <w:jc w:val="both"/>
-        <w:rPr/>
-      </w:pPr>
-      <w:r>
-        <w:rPr>
-          <w:rFonts w:ascii="Georgia" w:cs="Georgia" w:eastAsia="Georgia" w:hAnsi="Georgia"/>
-          <w:b w:val="0"/>
-          <w:bCs w:val="0"/>
-          <w:i w:val="0"/>
-          <w:iCs w:val="0"/>
-          <w:sz w:val="22"/>
-          <w:szCs w:val="22"/>
-          <w:rtl w:val="0"/>
-        </w:rPr>
-        <w:t xml:space="preserve">Future research should also measure English language proficiency as an independent variable, since the present design did not test this. A design that controls for proficiency level across disciplines would help clarify whether the observed patterns reflect genuine disciplinary differentiation or shared linguistic constraints that suppress hedge variety regardless of field.</w:t>
-      </w:r>
-      <w:r>
-        <w:rPr>
-          <w:rtl w:val="0"/>
-        </w:rPr>
-      </w:r>
-    </w:p>
-    <w:p>
-      <w:pPr>
-        <w:spacing w:before="0" w:after="0" w:line="480" w:lineRule="auto"/>
-        <w:ind w:firstLine="720"/>
-        <w:jc w:val="both"/>
-        <w:rPr/>
-      </w:pPr>
-      <w:r>
-        <w:rPr>
-          <w:rFonts w:ascii="Georgia" w:cs="Georgia" w:eastAsia="Georgia" w:hAnsi="Georgia"/>
-          <w:b w:val="0"/>
-          <w:bCs w:val="0"/>
-          <w:i w:val="0"/>
-          <w:iCs w:val="0"/>
-          <w:sz w:val="22"/>
-          <w:szCs w:val="22"/>
-          <w:rtl w:val="0"/>
-        </w:rPr>
-        <w:t xml:space="preserve">Future research should examine the role of thesis advisers in shaping hedging patterns. Since undergraduate theses are heavily supervised, the observed patterns may reflect departmental standards more than individual writer choices. Interviewing advisers about their expectations for abstract writing, and specifically about their stance on hedging in scientific abstracts, would help disentangle writer agency from supervisory influence. One hypothesis worth testing is whether program-level expectations in Veterinary Medicine discourage or rarely require hedging in abstracts. The present study does not provide evidence that VM advisers hold that stance. Adviser interviews would be needed to test it. Parallel work could also compare how often each discipline writes up non-significant findings and whether null write-ups invite different hedging choices, while recognizing that outcome type and discipline are entangled in this sample.</w:t>
-      </w:r>
-      <w:r>
-        <w:rPr>
-          <w:rtl w:val="0"/>
-        </w:rPr>
-      </w:r>
-    </w:p>
-    <w:p>
-      <w:pPr>
-        <w:spacing w:before="0" w:after="0" w:line="480" w:lineRule="auto"/>
-        <w:ind w:firstLine="720"/>
-        <w:jc w:val="both"/>
-        <w:rPr/>
-      </w:pPr>
-      <w:r>
-        <w:rPr>
-          <w:rFonts w:ascii="Georgia" w:hAnsi="Georgia" w:cs="Georgia" w:eastAsia="Georgia"/>
-          <w:sz w:val="22"/>
-          <w:szCs w:val="22"/>
-        </w:rPr>
-        <w:t xml:space="preserve">This study’s Stage 1 gate admits force, directness, and imposition reduction so that P and DO are not excluded by definition. In this sample, retained tokens were still all EC at Stage 2. Future work could apply the same Stage 1–2 scheme to full thesis chapters or expert abstracts, where interpersonal and discourse-managing mitigation may appear more often than in compressed undergraduate abstracts.</w:t>
-      </w:r>
-    </w:p>
-    <w:p>
-      <w:pPr>
-        <w:spacing w:before="0" w:after="0" w:line="480" w:lineRule="auto"/>
-        <w:ind w:firstLine="720"/>
-        <w:jc w:val="both"/>
-        <w:rPr/>
-        <w:sectPr>
-          <w:headerReference r:id="rId13" w:type="default"/>
-          <w:headerReference r:id="rId14" w:type="first"/>
-          <w:type w:val="nextPage"/>
-          <w:pgSz w:h="16838" w:w="11906" w:orient="portrait"/>
-          <w:pgMar w:bottom="1440" w:top="1440" w:left="2160" w:right="1440" w:header="720" w:footer="720"/>
-          <w:titlePg w:val="1"/>
-        </w:sectPr>
-      </w:pPr>
-      <w:r>
-        <w:rPr>
-          <w:rFonts w:ascii="Georgia" w:hAnsi="Georgia" w:cs="Georgia" w:eastAsia="Georgia"/>
-          <w:b w:val="0"/>
-          <w:bCs w:val="0"/>
-          <w:i w:val="0"/>
-          <w:iCs w:val="0"/>
-          <w:sz w:val="22"/>
-          <w:szCs w:val="22"/>
-          <w:rtl w:val="0"/>
-        </w:rPr>
-        <w:t>The coding methodology developed in this study, including the codebook’s decision rules and the unhedged assertion analysis, can serve as a template for similar studies in other disciplines, genres, or institutions. Future researchers may adapt the codebook for analyzing hedging in full-length thesis sections, research articles, or other academic genres where rhetorical space allows for greater hedge variety than the compressed abstract. Additionally, future studies could examine assertive reporting forms alongside hedges, with a comparison group that includes both zero-hedge and hedged abstracts, to test whether those forms cluster with the absence of hedges or appear across the board.</w:t>
       </w:r>
       <w:r>
         <w:rPr>

</xml_diff>

<commit_message>
Draft_080: REFERENCES new page; Inclusion Criteria no forced break
</commit_message>
<xml_diff>
--- a/thesis/003_ThesisProposal_Draft_080.docx
+++ b/thesis/003_ThesisProposal_Draft_080.docx
@@ -2958,7 +2958,7 @@
     <w:p>
       <w:pPr>
         <w:keepNext w:val="1"/>
-        <w:spacing w:before="720" w:after="0" w:line="480" w:lineRule="auto"/>
+        <w:spacing w:before="240" w:after="0" w:line="480" w:lineRule="auto"/>
         <w:jc w:val="center"/>
       </w:pPr>
       <w:r>
@@ -4192,7 +4192,6 @@
         <w:ind w:firstLine="720"/>
         <w:jc w:val="both"/>
         <w:rPr/>
-        <w:keepNext w:val="1"/>
       </w:pPr>
       <w:r>
         <w:rPr>
@@ -11657,6 +11656,14 @@
         <w:rPr>
           <w:rtl w:val="0"/>
         </w:rPr>
+      </w:r>
+    </w:p>
+    <w:p>
+      <w:pPr>
+        <w:spacing w:line="240" w:lineRule="auto" w:before="0" w:after="0"/>
+      </w:pPr>
+      <w:r>
+        <w:br w:type="page"/>
       </w:r>
     </w:p>
     <w:p>

</xml_diff>

<commit_message>
Draft_080: DO brown not teal; fix G/C placement after verbs
</commit_message>
<xml_diff>
--- a/thesis/003_ThesisProposal_Draft_080.docx
+++ b/thesis/003_ThesisProposal_Draft_080.docx
@@ -21329,7 +21329,7 @@
           <w:szCs w:val="22"/>
           <w:rtl w:val="0"/>
         </w:rPr>
-        <w:t>This appendix presents the 60 abstracts with all coding marks applied. Type marks = color highlight on hedge tokens (blue = Modal Verbs, red = Lexical Hedges, yellow = Adverbial Hedges, green = Clause-Level Hedges). Function marks = function label in colored text (EC = orange, P = purple, DO = teal). Discourse connectors (Hence/Thus) are tagged (DO) even when not hedges. Function labels in this appendix are only EC, P, and DO. False positives = strikethrough + reason code in grey (e.g. FP-Rec = recommendation, not a function). Unhedged assertions = grey highlight + [G]/[C] bracket (warranted-but-absent caution only).</w:t>
+        <w:t>This appendix presents the 60 abstracts with all coding marks applied. Type marks = color highlight on hedge tokens (blue = Modal Verbs, red = Lexical Hedges, yellow = Adverbial Hedges, green = Clause-Level Hedges). Function marks = function label in colored text (EC = orange, P = purple, DO = brown). Discourse connectors (Hence/Thus) are tagged (DO) even when not hedges. Function labels in this appendix are only EC, P, and DO. False positives = strikethrough + reason code in grey (e.g. FP-Rec = recommendation, not a function). Unhedged assertions = grey highlight + [G]/[C] bracket (warranted-but-absent caution only).</w:t>
       </w:r>
       <w:r>
         <w:rPr>
@@ -23367,7 +23367,7 @@
           <w:bCs w:val="0"/>
           <w:color w:val="000000"/>
         </w:rPr>
-        <w:t xml:space="preserve">Antimicrobial resistance is a major threat to public health worldwide, making infections difficult to treat. This problem calls for developing novel and alternative strategies to attenuate microorganisms without inducing resistance. Hence, lactic acid bacteria (LAB) have emerged as a focal point due to their </w:t>
+        <w:t xml:space="preserve">Antimicrobial resistance is a major threat to public health worldwide, making infections difficult to treat. This problem calls for developing novel and alternative strategies to attenuate microorganisms without inducing resistance. Hence, lactic acid bacteria (LAB) have emerged as a focal point due to their potential (EC) quorum quenching (QQ) activities. In this study, lactic acid bacteria were obtained from a parallel study, and the antimicrobial activity of the top 10 isolates was evaluated through spectrophotometric and turbidimetric analyses for the initial screening of gut isolates. Nine out of ten isolates exhibit quorum quenching activities by inhibiting the swarming motility of Pseudomonas aeruginosa. The metabolic compounds of the isolates were subjected to initial characterization using enzyme and pH neutralization, which revealed that organic acids were responsible for the inhibitory activity. The inhibition activity of LAB isolates against the quorum sensing-mediated swarming motility in P. aeruginosa was [C] due to strong antibacterial activity.</w:t>
       </w:r>
       <w:r>
         <w:rPr>
@@ -23379,18 +23379,18 @@
           <w:highlight w:val="red"/>
           <w:color w:val="FFFFFF"/>
         </w:rPr>
-        <w:t xml:space="preserve">potential</w:t>
-      </w:r>
-      <w:r>
-        <w:rPr>
-          <w:rFonts w:ascii="Georgia" w:hAnsi="Georgia" w:cs="Georgia" w:eastAsia="Georgia"/>
-          <w:sz w:val="22"/>
-          <w:szCs w:val="22"/>
-          <w:b w:val="0"/>
-          <w:bCs w:val="0"/>
-          <w:color w:val="000000"/>
-        </w:rPr>
-        <w:t xml:space="preserve"> </w:t>
+        <w:t xml:space="preserve"/>
+      </w:r>
+      <w:r>
+        <w:rPr>
+          <w:rFonts w:ascii="Georgia" w:hAnsi="Georgia" w:cs="Georgia" w:eastAsia="Georgia"/>
+          <w:sz w:val="22"/>
+          <w:szCs w:val="22"/>
+          <w:b w:val="0"/>
+          <w:bCs w:val="0"/>
+          <w:color w:val="000000"/>
+        </w:rPr>
+        <w:t xml:space="preserve"/>
       </w:r>
       <w:r>
         <w:rPr>
@@ -23401,18 +23401,18 @@
           <w:bCs w:val="0"/>
           <w:color w:val="ED7D31"/>
         </w:rPr>
-        <w:t xml:space="preserve">(EC)</w:t>
-      </w:r>
-      <w:r>
-        <w:rPr>
-          <w:rFonts w:ascii="Georgia" w:hAnsi="Georgia" w:cs="Georgia" w:eastAsia="Georgia"/>
-          <w:sz w:val="22"/>
-          <w:szCs w:val="22"/>
-          <w:b w:val="0"/>
-          <w:bCs w:val="0"/>
-          <w:color w:val="000000"/>
-        </w:rPr>
-        <w:t xml:space="preserve"> quorum quenching (QQ) activities. In this study, lactic acid bacteria were obtained from a parallel study, and the antimicrobial activity of the top 10 isolates was evaluated through spectrophotometric and turbidimetric analyses for the initial screening of gut isolates. Nine out of ten isolates exhibit quorum quenching activities by inhibiting the swarming motility of Pseudomonas aeruginosa. The metabolic compounds of the isolates were subjected to initial characterization using enzyme and pH neutralization, which revealed that organic acids were responsible for the inhibitory activity. The inhibition activity of LAB isolates against the quorum sensing-mediated swarming motility in P. aeruginosa </w:t>
+        <w:t xml:space="preserve"/>
+      </w:r>
+      <w:r>
+        <w:rPr>
+          <w:rFonts w:ascii="Georgia" w:hAnsi="Georgia" w:cs="Georgia" w:eastAsia="Georgia"/>
+          <w:sz w:val="22"/>
+          <w:szCs w:val="22"/>
+          <w:b w:val="0"/>
+          <w:bCs w:val="0"/>
+          <w:color w:val="000000"/>
+        </w:rPr>
+        <w:t xml:space="preserve"/>
       </w:r>
       <w:r>
         <w:rPr>
@@ -23424,18 +23424,18 @@
           <w:shd w:val="clear" w:color="auto" w:fill="bfbfbf"/>
           <w:color w:val="000000"/>
         </w:rPr>
-        <w:t xml:space="preserve">was</w:t>
-      </w:r>
-      <w:r>
-        <w:rPr>
-          <w:rFonts w:ascii="Georgia" w:hAnsi="Georgia" w:cs="Georgia" w:eastAsia="Georgia"/>
-          <w:sz w:val="22"/>
-          <w:szCs w:val="22"/>
-          <w:b w:val="0"/>
-          <w:bCs w:val="0"/>
-          <w:color w:val="000000"/>
-        </w:rPr>
-        <w:t xml:space="preserve"> due to [C] strong antibacterial activity.</w:t>
+        <w:t xml:space="preserve"/>
+      </w:r>
+      <w:r>
+        <w:rPr>
+          <w:rFonts w:ascii="Georgia" w:hAnsi="Georgia" w:cs="Georgia" w:eastAsia="Georgia"/>
+          <w:sz w:val="22"/>
+          <w:szCs w:val="22"/>
+          <w:b w:val="0"/>
+          <w:bCs w:val="0"/>
+          <w:color w:val="000000"/>
+        </w:rPr>
+        <w:t xml:space="preserve"/>
       </w:r>
     </w:p>
     <w:p>
@@ -26145,7 +26145,7 @@
           <w:bCs w:val="0"/>
           <w:color w:val="000000"/>
         </w:rPr>
-        <w:t xml:space="preserve">This study assessed the existence and antibiotic resistance characteristic of Escherichia coli from poultry farms in Central Luzon using Regional Animal Disease Diagnostic Laboratory (RADDL) III data for 2022 to 2023. This study targeted the profiling of Escherichia coli bacteria isolates according to year, province, and type of sample. Also, it checked susceptibility to different antibiotics of Escherichia coli-positive poultry samples. The association of the antibiotic susceptibility tests with years and provinces was also calculated. The study results showed that the susceptibility of heart samples was ended with 100% to amikacin, ceftazidime, cefotaxime, chloramphenicol, ciprofloxacin, gentamicin, imipenem, and meropenem. On the other hand, reduced susceptibility was observed for trimethoprim-sulfamethoxazole and tetracycline 50% in each. In general, lung samples </w:t>
+        <w:t xml:space="preserve">This study assessed the existence and antibiotic resistance characteristic of Escherichia coli from poultry farms in Central Luzon using Regional Animal Disease Diagnostic Laboratory (RADDL) III data for 2022 to 2023. This study targeted the profiling of Escherichia coli bacteria isolates according to year, province, and type of sample. Also, it checked susceptibility to different antibiotics of Escherichia coli-positive poultry samples. The association of the antibiotic susceptibility tests with years and provinces was also calculated. The study results showed that the susceptibility of heart samples was ended with 100% to amikacin, ceftazidime, cefotaxime, chloramphenicol, ciprofloxacin, gentamicin, imipenem, and meropenem. On the other hand, reduced susceptibility was observed for trimethoprim-sulfamethoxazole and tetracycline 50% in each. In general, lung samples were [G] sensitive to all antibiotics except amoxicillin-clavulanic acid. However, liver samples were 100% susceptible to amikacin, cefotaxime, ceftazidime, ceftiofur, chloramphenicol gentamicin, imipenem, and meropenem. Nasal swabs were 100% susceptible to ceftiofur and florfenicol, with a lower susceptibility for amoxicillin-clavulanic acid at 50% and then amoxicillin only 33%. Tracheal swabs showed 100% susceptibility for amikacin, ceftazidime, cefotaxime chloramphenicol, gentamicin, imipenem, and meropenem. Nonetheless, they only were 50% sensitive to trimethoprim-sulfamethoxazole and tetracycline. Chick samples had different susceptibility meropenem, experienced as the most susceptible antibiotic (87%) and sulfamethoxazole / trimethoprim, while sulfamethoxazole was 25%. In contrast, the data showed that lung and chick samples exhibited marked resistance. In the lung samples, resistance was observed to all tested antibiotics, and only a few were susceptible to them, while chick specimens with high resistances were found against ceftazidime, chloramphenicol, ciprofloxacin, and tetracycline. Also, nasal swabs were highly resistant to multiple antibiotics. The lung samples were resistant to all antibiotics, apart from meropenem and streptomycin.</w:t>
       </w:r>
       <w:r>
         <w:rPr>
@@ -26157,18 +26157,18 @@
           <w:shd w:val="clear" w:color="auto" w:fill="bfbfbf"/>
           <w:color w:val="000000"/>
         </w:rPr>
-        <w:t xml:space="preserve">were</w:t>
-      </w:r>
-      <w:r>
-        <w:rPr>
-          <w:rFonts w:ascii="Georgia" w:hAnsi="Georgia" w:cs="Georgia" w:eastAsia="Georgia"/>
-          <w:sz w:val="22"/>
-          <w:szCs w:val="22"/>
-          <w:b w:val="0"/>
-          <w:bCs w:val="0"/>
-          <w:color w:val="000000"/>
-        </w:rPr>
-        <w:t xml:space="preserve"> sensitive [G] to all antibiotics except amoxicillin-clavulanic acid. However, liver samples were 100% susceptible to amikacin, cefotaxime, ceftazidime, ceftiofur, chloramphenicol gentamicin, imipenem, and meropenem. Nasal swabs were 100% susceptible to ceftiofur and florfenicol, with a lower susceptibility for amoxicillin-clavulanic acid at 50% and then amoxicillin only 33%. Tracheal swabs showed 100% susceptibility for amikacin, ceftazidime, cefotaxime chloramphenicol, gentamicin, imipenem, and meropenem. Nonetheless, they only were 50% sensitive to trimethoprim-sulfamethoxazole and tetracycline. Chick samples had different susceptibility meropenem, experienced as the most susceptible antibiotic (87%) and sulfamethoxazole / trimethoprim, while sulfamethoxazole was 25%. In contrast, the data showed that lung and chick samples exhibited marked resistance. In the lung samples, resistance was observed to all tested antibiotics, and only a few were susceptible to them, while chick specimens with high resistances were found against ceftazidime, chloramphenicol, ciprofloxacin, and tetracycline. Also, nasal swabs were highly resistant to multiple antibiotics. The lung samples were resistant to all antibiotics, apart from meropenem and streptomycin.</w:t>
+        <w:t xml:space="preserve"/>
+      </w:r>
+      <w:r>
+        <w:rPr>
+          <w:rFonts w:ascii="Georgia" w:hAnsi="Georgia" w:cs="Georgia" w:eastAsia="Georgia"/>
+          <w:sz w:val="22"/>
+          <w:szCs w:val="22"/>
+          <w:b w:val="0"/>
+          <w:bCs w:val="0"/>
+          <w:color w:val="000000"/>
+        </w:rPr>
+        <w:t xml:space="preserve"/>
       </w:r>
     </w:p>
     <w:p>
@@ -29283,7 +29283,7 @@
           <w:bCs w:val="0"/>
           <w:color w:val="000000"/>
         </w:rPr>
-        <w:t xml:space="preserve">The study examines the germination and growth rate of pigeon pea (Cajanus cajan) under different scarification method for 30 days. The effects of various scarification method, including water in different temperatures, mechanical scarification (sand paper method) and a chemical scarification (sulfuric acid), were assessed through multiple parameters. The study analyzed the germination rate, days to germinate, plant height, length of roots, age to bear leaves, length of leaves, number of leaves, number of branches, mortality, and cost production analysis. The type of scarification method that showed prime results was Treatment 3 (sand paper method). It was found to have a significant effect on the growth and germination rate of pigeon pea in terms of days to germinate, plant height, a number of leaves, and length of leaves. Sulfuric </w:t>
+        <w:t xml:space="preserve">The study examines the germination and growth rate of pigeon pea (Cajanus cajan) under different scarification method for 30 days. The effects of various scarification method, including water in different temperatures, mechanical scarification (sand paper method) and a chemical scarification (sulfuric acid), were assessed through multiple parameters. The study analyzed the germination rate, days to germinate, plant height, length of roots, age to bear leaves, length of leaves, number of leaves, number of branches, mortality, and cost production analysis. The type of scarification method that showed prime results was Treatment 3 (sand paper method). It was found to have a significant effect on the growth and germination rate of pigeon pea in terms of days to germinate, plant height, a number of leaves, and length of leaves. Sulfuric was [G] second in terms of the scarification method effectiveness for pigeon pea, The study treatments overall proclaimed a not significant results based from the analyzed data from each treatments except from these group of data such as from the length of leaves from week 2 and week 3 and the length of roots that are all expressed a highly significant results at 1% level and also the plant height from week 3 that also expressed a significant result at 5% level.</w:t>
       </w:r>
       <w:r>
         <w:rPr>
@@ -29295,18 +29295,18 @@
           <w:shd w:val="clear" w:color="auto" w:fill="bfbfbf"/>
           <w:color w:val="000000"/>
         </w:rPr>
-        <w:t xml:space="preserve">was</w:t>
-      </w:r>
-      <w:r>
-        <w:rPr>
-          <w:rFonts w:ascii="Georgia" w:hAnsi="Georgia" w:cs="Georgia" w:eastAsia="Georgia"/>
-          <w:sz w:val="22"/>
-          <w:szCs w:val="22"/>
-          <w:b w:val="0"/>
-          <w:bCs w:val="0"/>
-          <w:color w:val="000000"/>
-        </w:rPr>
-        <w:t xml:space="preserve"> second [G] in terms of the scarification method effectiveness for pigeon pea, The study treatments overall proclaimed a not significant results based from the analyzed data from each treatments except from these group of data such as from the length of leaves from week 2 and week 3 and the length of roots that are all expressed a highly significant results at 1% level and also the plant height from week 3 that also expressed a significant result at 5% level.</w:t>
+        <w:t xml:space="preserve"/>
+      </w:r>
+      <w:r>
+        <w:rPr>
+          <w:rFonts w:ascii="Georgia" w:hAnsi="Georgia" w:cs="Georgia" w:eastAsia="Georgia"/>
+          <w:sz w:val="22"/>
+          <w:szCs w:val="22"/>
+          <w:b w:val="0"/>
+          <w:bCs w:val="0"/>
+          <w:color w:val="000000"/>
+        </w:rPr>
+        <w:t xml:space="preserve"/>
       </w:r>
     </w:p>
     <w:p>

</xml_diff>

<commit_message>
Draft_080: restore (DO) tags; DO font color brown not teal
</commit_message>
<xml_diff>
--- a/thesis/003_ThesisProposal_Draft_080.docx
+++ b/thesis/003_ThesisProposal_Draft_080.docx
@@ -9822,7 +9822,7 @@
           <w:sz w:val="22"/>
           <w:szCs w:val="22"/>
           <w:rtl w:val="0"/>
-          <w:color w:val="00B0F0"/>
+          <w:color w:val="8B4513"/>
         </w:rPr>
       </w:r>
       <w:r>
@@ -13506,7 +13506,7 @@
                 <w:bCs w:val="1"/>
                 <w:i w:val="0"/>
                 <w:iCs w:val="0"/>
-                <w:color w:val="00b0f0"/>
+                <w:color w:val="8B4513"/>
                 <w:sz w:val="18"/>
                 <w:szCs w:val="18"/>
                 <w:rtl w:val="0"/>
@@ -17741,7 +17741,7 @@
                 <w:bCs w:val="1"/>
                 <w:i w:val="0"/>
                 <w:iCs w:val="0"/>
-                <w:color w:val="00b0f0"/>
+                <w:color w:val="8B4513"/>
                 <w:sz w:val="20"/>
                 <w:szCs w:val="20"/>
                 <w:rtl w:val="0"/>
@@ -17869,7 +17869,7 @@
                 <w:bCs w:val="1"/>
                 <w:i w:val="0"/>
                 <w:iCs w:val="0"/>
-                <w:color w:val="00b0f0"/>
+                <w:color w:val="8B4513"/>
                 <w:sz w:val="20"/>
                 <w:szCs w:val="20"/>
                 <w:rtl w:val="0"/>
@@ -22359,7 +22359,7 @@
           <w:bCs w:val="0"/>
           <w:color w:val="000000"/>
         </w:rPr>
-        <w:t xml:space="preserve">The study </w:t>
+        <w:t xml:space="preserve">The study would (FP-Gen) be on developing and optimizing eco-bricks using a mixture of SUPs and UCO developed through trial and error. SUPs recovered from various donors from the [REDACTED] and UCO. The preliminary trials established that molding faces some difficulty with increased ratios of UCO to SUPs. Thus (DO), in the optimization process, varying ratios of UCO was used, starting with UCO to SUPs 1:1 as treatment 1, a decreasing ratio of UCO to SUPs. At equal parts by weight of UCO and SUPs, optimization started at Treatment 1 with a 1:1 ratio. Treatments 2–5 proceeded similarly, increasing the ratio of UCO to SUPs. Density measurements, water absorption, and drop tests were all performed and observed. A self-testing protocol based on current literature was used. The density was calculated relative to mass and volume; however, the water absorption test yielded inconsistent findings. A drop test was also performed, which revealed that the eco-bricks from all treatments were significantly damaged at the height of one meter, making [G] them a weak, unsuitable material to use in building walkways. This study is essential for getting insights into eco-brick manufacture because the workability of SUPs and UCOs as raw materials is proven. The research findings do not apply to buildings. Therefore (DO), further research will (FP-Gen) aid in underlining the importance of optimizing the ingredient ratios to acquire desirable quality eco-bricks for sustainable construction applications.</w:t>
       </w:r>
       <w:r>
         <w:rPr>
@@ -22371,18 +22371,18 @@
           <w:strike/>
           <w:color w:val="000000"/>
         </w:rPr>
-        <w:t xml:space="preserve">would</w:t>
-      </w:r>
-      <w:r>
-        <w:rPr>
-          <w:rFonts w:ascii="Georgia" w:hAnsi="Georgia" w:cs="Georgia" w:eastAsia="Georgia"/>
-          <w:sz w:val="22"/>
-          <w:szCs w:val="22"/>
-          <w:b w:val="0"/>
-          <w:bCs w:val="0"/>
-          <w:color w:val="000000"/>
-        </w:rPr>
-        <w:t xml:space="preserve"> </w:t>
+        <w:t xml:space="preserve"/>
+      </w:r>
+      <w:r>
+        <w:rPr>
+          <w:rFonts w:ascii="Georgia" w:hAnsi="Georgia" w:cs="Georgia" w:eastAsia="Georgia"/>
+          <w:sz w:val="22"/>
+          <w:szCs w:val="22"/>
+          <w:b w:val="0"/>
+          <w:bCs w:val="0"/>
+          <w:color w:val="000000"/>
+        </w:rPr>
+        <w:t xml:space="preserve"/>
       </w:r>
       <w:r>
         <w:rPr>
@@ -22393,18 +22393,18 @@
           <w:bCs w:val="0"/>
           <w:color w:val="808080"/>
         </w:rPr>
-        <w:t xml:space="preserve">(FP-Gen)</w:t>
-      </w:r>
-      <w:r>
-        <w:rPr>
-          <w:rFonts w:ascii="Georgia" w:hAnsi="Georgia" w:cs="Georgia" w:eastAsia="Georgia"/>
-          <w:sz w:val="22"/>
-          <w:szCs w:val="22"/>
-          <w:b w:val="0"/>
-          <w:bCs w:val="0"/>
-          <w:color w:val="000000"/>
-        </w:rPr>
-        <w:t xml:space="preserve"> be on developing and optimizing eco-bricks using a mixture of SUPs and UCO developed through trial and error. SUPs recovered from various donors from the [REDACTED] and UCO. The preliminary trials established that molding faces some difficulty with increased ratios of UCO to SUPs. Thus, in the optimization process, varying ratios of UCO was used, starting with UCO to SUPs 1:1 as treatment 1, a decreasing ratio of UCO to SUPs. At equal parts by weight of UCO and SUPs, optimization started at Treatment 1 with a 1:1 ratio. Treatments 2–5 proceeded similarly, increasing the ratio of UCO to SUPs. Density measurements, water absorption, and drop tests were all performed and observed. A self-testing protocol based on current literature was used. The density was calculated relative to mass and volume; however, the water absorption test yielded inconsistent findings. A drop test was also performed, which revealed that the eco-bricks from all treatments were significantly damaged at the height of one meter, </w:t>
+        <w:t xml:space="preserve"/>
+      </w:r>
+      <w:r>
+        <w:rPr>
+          <w:rFonts w:ascii="Georgia" w:hAnsi="Georgia" w:cs="Georgia" w:eastAsia="Georgia"/>
+          <w:sz w:val="22"/>
+          <w:szCs w:val="22"/>
+          <w:b w:val="0"/>
+          <w:bCs w:val="0"/>
+          <w:color w:val="000000"/>
+        </w:rPr>
+        <w:t xml:space="preserve"/>
       </w:r>
       <w:r>
         <w:rPr>
@@ -22416,18 +22416,18 @@
           <w:shd w:val="clear" w:color="auto" w:fill="bfbfbf"/>
           <w:color w:val="000000"/>
         </w:rPr>
-        <w:t xml:space="preserve">making</w:t>
-      </w:r>
-      <w:r>
-        <w:rPr>
-          <w:rFonts w:ascii="Georgia" w:hAnsi="Georgia" w:cs="Georgia" w:eastAsia="Georgia"/>
-          <w:sz w:val="22"/>
-          <w:szCs w:val="22"/>
-          <w:b w:val="0"/>
-          <w:bCs w:val="0"/>
-          <w:color w:val="000000"/>
-        </w:rPr>
-        <w:t xml:space="preserve"> [G] them a weak, unsuitable material to use in building walkways. This study is essential for getting insights into eco-brick manufacture because the workability of SUPs and UCOs as raw materials is proven. The research findings do not apply to buildings. Therefore, further research </w:t>
+        <w:t xml:space="preserve"/>
+      </w:r>
+      <w:r>
+        <w:rPr>
+          <w:rFonts w:ascii="Georgia" w:hAnsi="Georgia" w:cs="Georgia" w:eastAsia="Georgia"/>
+          <w:sz w:val="22"/>
+          <w:szCs w:val="22"/>
+          <w:b w:val="0"/>
+          <w:bCs w:val="0"/>
+          <w:color w:val="000000"/>
+        </w:rPr>
+        <w:t xml:space="preserve"/>
       </w:r>
       <w:r>
         <w:rPr>
@@ -22439,18 +22439,18 @@
           <w:strike/>
           <w:color w:val="000000"/>
         </w:rPr>
-        <w:t xml:space="preserve">will</w:t>
-      </w:r>
-      <w:r>
-        <w:rPr>
-          <w:rFonts w:ascii="Georgia" w:hAnsi="Georgia" w:cs="Georgia" w:eastAsia="Georgia"/>
-          <w:sz w:val="22"/>
-          <w:szCs w:val="22"/>
-          <w:b w:val="0"/>
-          <w:bCs w:val="0"/>
-          <w:color w:val="000000"/>
-        </w:rPr>
-        <w:t xml:space="preserve"> </w:t>
+        <w:t xml:space="preserve"/>
+      </w:r>
+      <w:r>
+        <w:rPr>
+          <w:rFonts w:ascii="Georgia" w:hAnsi="Georgia" w:cs="Georgia" w:eastAsia="Georgia"/>
+          <w:sz w:val="22"/>
+          <w:szCs w:val="22"/>
+          <w:b w:val="0"/>
+          <w:bCs w:val="0"/>
+          <w:color w:val="000000"/>
+        </w:rPr>
+        <w:t xml:space="preserve"/>
       </w:r>
       <w:r>
         <w:rPr>
@@ -22461,18 +22461,18 @@
           <w:bCs w:val="0"/>
           <w:color w:val="808080"/>
         </w:rPr>
-        <w:t xml:space="preserve">(FP-Gen)</w:t>
-      </w:r>
-      <w:r>
-        <w:rPr>
-          <w:rFonts w:ascii="Georgia" w:hAnsi="Georgia" w:cs="Georgia" w:eastAsia="Georgia"/>
-          <w:sz w:val="22"/>
-          <w:szCs w:val="22"/>
-          <w:b w:val="0"/>
-          <w:bCs w:val="0"/>
-          <w:color w:val="000000"/>
-        </w:rPr>
-        <w:t xml:space="preserve"> aid in underlining the importance of optimizing the ingredient ratios to acquire desirable quality eco-bricks for sustainable construction applications.</w:t>
+        <w:t xml:space="preserve"/>
+      </w:r>
+      <w:r>
+        <w:rPr>
+          <w:rFonts w:ascii="Georgia" w:hAnsi="Georgia" w:cs="Georgia" w:eastAsia="Georgia"/>
+          <w:sz w:val="22"/>
+          <w:szCs w:val="22"/>
+          <w:b w:val="0"/>
+          <w:bCs w:val="0"/>
+          <w:color w:val="000000"/>
+        </w:rPr>
+        <w:t xml:space="preserve"/>
       </w:r>
     </w:p>
     <w:p>
@@ -22516,7 +22516,7 @@
           <w:bCs w:val="0"/>
           <w:color w:val="000000"/>
         </w:rPr>
-        <w:t xml:space="preserve">The study </w:t>
+        <w:t xml:space="preserve">The study generally (FP-Proc) aimed to evaluate the embryo toxicity, lethality, and teratogenicity of Ziziphus talanai-infused nanozeolite pellets on Danio rerio was performed at the Biology and Chemistry Laboratory of Pampanga State Agricultural University from October 2023 to January 2024. Various treatments in the formulation of pellets and laboratory experiments were set up using Completely Randomized Design (CRD). The study showed that cassava starch as combined with Ziziphus talanai-infused nanozeolite at 1:9 ratio improved the water-holding capacity of derived pellets, thus (DO) making a remarkable choice as a binder. The hatching and survival of Danio rerio embryos were enhanced by 200 ppm concentration of Z. talanai-infused nanozeolite pellet suspension while demonstrating lower toxicity compared to other concentrations tested. Based on the Acute Toxicity Index, the median lethal concentration (LC₅₀) in D. rerio embryos at 96 hpf (hours post-fertilization) showed that Z. talanai-infused nanozeolite pellet at a concentration of 49.79 µg/mL falls within the ‘slightly toxic’ classification, thus (DO) demonstrating that nanozeolite enhances the delivery of compounds within Z. talanai extract. Coagulation of embryos was primarily observed within 400 ppm to 1,000 ppm concentrations of Z. talanai-infused nanozeolite pellet suspensions under 40x magnification, suggesting (EC) that it affects early embryonic development and prevents the progression of other lethality markers, such as the absence of somite development, non-detachment of the tail, and absence of cardiac activity. Teratogenic effects on the body length of D. rerio hatchlings were observed, inferring (EC) that such observation was induced by the Z. talanai-infused nanozeolite pellet suspension. Hence (DO), the biosynthesis of Z. talanai-infused nanozeolite pellets is feasible and may (EC) affect the overall development of D. rerio embryos.</w:t>
       </w:r>
       <w:r>
         <w:rPr>
@@ -22528,18 +22528,18 @@
           <w:strike/>
           <w:color w:val="000000"/>
         </w:rPr>
-        <w:t xml:space="preserve">generally</w:t>
-      </w:r>
-      <w:r>
-        <w:rPr>
-          <w:rFonts w:ascii="Georgia" w:hAnsi="Georgia" w:cs="Georgia" w:eastAsia="Georgia"/>
-          <w:sz w:val="22"/>
-          <w:szCs w:val="22"/>
-          <w:b w:val="0"/>
-          <w:bCs w:val="0"/>
-          <w:color w:val="000000"/>
-        </w:rPr>
-        <w:t xml:space="preserve"> </w:t>
+        <w:t xml:space="preserve"/>
+      </w:r>
+      <w:r>
+        <w:rPr>
+          <w:rFonts w:ascii="Georgia" w:hAnsi="Georgia" w:cs="Georgia" w:eastAsia="Georgia"/>
+          <w:sz w:val="22"/>
+          <w:szCs w:val="22"/>
+          <w:b w:val="0"/>
+          <w:bCs w:val="0"/>
+          <w:color w:val="000000"/>
+        </w:rPr>
+        <w:t xml:space="preserve"/>
       </w:r>
       <w:r>
         <w:rPr>
@@ -22550,18 +22550,18 @@
           <w:bCs w:val="0"/>
           <w:color w:val="808080"/>
         </w:rPr>
-        <w:t xml:space="preserve">(FP-Proc)</w:t>
-      </w:r>
-      <w:r>
-        <w:rPr>
-          <w:rFonts w:ascii="Georgia" w:hAnsi="Georgia" w:cs="Georgia" w:eastAsia="Georgia"/>
-          <w:sz w:val="22"/>
-          <w:szCs w:val="22"/>
-          <w:b w:val="0"/>
-          <w:bCs w:val="0"/>
-          <w:color w:val="000000"/>
-        </w:rPr>
-        <w:t xml:space="preserve"> aimed to evaluate the embryo toxicity, lethality, and teratogenicity of Ziziphus talanai-infused nanozeolite pellets on Danio rerio was performed at the Biology and Chemistry Laboratory of Pampanga State Agricultural University from October 2023 to January 2024. Various treatments in the formulation of pellets and laboratory experiments were set up using Completely Randomized Design (CRD). The study showed that cassava starch as combined with Ziziphus talanai-infused nanozeolite at 1:9 ratio improved the water-holding capacity of derived pellets, thus making a remarkable choice as a binder. The hatching and survival of Danio rerio embryos were enhanced by 200 ppm concentration of Z. talanai-infused nanozeolite pellet suspension while demonstrating lower toxicity compared to other concentrations tested. Based on the Acute Toxicity Index, the median lethal concentration (LC₅₀) in D. rerio embryos at 96 hpf (hours post-fertilization) showed that Z. talanai-infused nanozeolite pellet at a concentration of 49.79 µg/mL falls within the ‘slightly toxic’ classification, thus demonstrating that nanozeolite enhances the delivery of compounds within Z. talanai extract. Coagulation of embryos was primarily observed within 400 ppm to 1,000 ppm concentrations of Z. talanai-infused nanozeolite pellet suspensions under 40x magnification, </w:t>
+        <w:t xml:space="preserve"/>
+      </w:r>
+      <w:r>
+        <w:rPr>
+          <w:rFonts w:ascii="Georgia" w:hAnsi="Georgia" w:cs="Georgia" w:eastAsia="Georgia"/>
+          <w:sz w:val="22"/>
+          <w:szCs w:val="22"/>
+          <w:b w:val="0"/>
+          <w:bCs w:val="0"/>
+          <w:color w:val="000000"/>
+        </w:rPr>
+        <w:t xml:space="preserve"/>
       </w:r>
       <w:r>
         <w:rPr>
@@ -22573,18 +22573,18 @@
           <w:highlight w:val="red"/>
           <w:color w:val="FFFFFF"/>
         </w:rPr>
-        <w:t xml:space="preserve">suggesting</w:t>
-      </w:r>
-      <w:r>
-        <w:rPr>
-          <w:rFonts w:ascii="Georgia" w:hAnsi="Georgia" w:cs="Georgia" w:eastAsia="Georgia"/>
-          <w:sz w:val="22"/>
-          <w:szCs w:val="22"/>
-          <w:b w:val="0"/>
-          <w:bCs w:val="0"/>
-          <w:color w:val="000000"/>
-        </w:rPr>
-        <w:t xml:space="preserve"> </w:t>
+        <w:t xml:space="preserve"/>
+      </w:r>
+      <w:r>
+        <w:rPr>
+          <w:rFonts w:ascii="Georgia" w:hAnsi="Georgia" w:cs="Georgia" w:eastAsia="Georgia"/>
+          <w:sz w:val="22"/>
+          <w:szCs w:val="22"/>
+          <w:b w:val="0"/>
+          <w:bCs w:val="0"/>
+          <w:color w:val="000000"/>
+        </w:rPr>
+        <w:t xml:space="preserve"/>
       </w:r>
       <w:r>
         <w:rPr>
@@ -22595,18 +22595,18 @@
           <w:bCs w:val="0"/>
           <w:color w:val="ED7D31"/>
         </w:rPr>
-        <w:t xml:space="preserve">(EC)</w:t>
-      </w:r>
-      <w:r>
-        <w:rPr>
-          <w:rFonts w:ascii="Georgia" w:hAnsi="Georgia" w:cs="Georgia" w:eastAsia="Georgia"/>
-          <w:sz w:val="22"/>
-          <w:szCs w:val="22"/>
-          <w:b w:val="0"/>
-          <w:bCs w:val="0"/>
-          <w:color w:val="000000"/>
-        </w:rPr>
-        <w:t xml:space="preserve"> that it affects early embryonic development and prevents the progression of other lethality markers, such as the absence of somite development, non-detachment of the tail, and absence of cardiac activity. Teratogenic effects on the body length of D. rerio hatchlings were observed, </w:t>
+        <w:t xml:space="preserve"/>
+      </w:r>
+      <w:r>
+        <w:rPr>
+          <w:rFonts w:ascii="Georgia" w:hAnsi="Georgia" w:cs="Georgia" w:eastAsia="Georgia"/>
+          <w:sz w:val="22"/>
+          <w:szCs w:val="22"/>
+          <w:b w:val="0"/>
+          <w:bCs w:val="0"/>
+          <w:color w:val="000000"/>
+        </w:rPr>
+        <w:t xml:space="preserve"/>
       </w:r>
       <w:r>
         <w:rPr>
@@ -22618,18 +22618,18 @@
           <w:highlight w:val="red"/>
           <w:color w:val="FFFFFF"/>
         </w:rPr>
-        <w:t xml:space="preserve">inferring</w:t>
-      </w:r>
-      <w:r>
-        <w:rPr>
-          <w:rFonts w:ascii="Georgia" w:hAnsi="Georgia" w:cs="Georgia" w:eastAsia="Georgia"/>
-          <w:sz w:val="22"/>
-          <w:szCs w:val="22"/>
-          <w:b w:val="0"/>
-          <w:bCs w:val="0"/>
-          <w:color w:val="000000"/>
-        </w:rPr>
-        <w:t xml:space="preserve"> </w:t>
+        <w:t xml:space="preserve"/>
+      </w:r>
+      <w:r>
+        <w:rPr>
+          <w:rFonts w:ascii="Georgia" w:hAnsi="Georgia" w:cs="Georgia" w:eastAsia="Georgia"/>
+          <w:sz w:val="22"/>
+          <w:szCs w:val="22"/>
+          <w:b w:val="0"/>
+          <w:bCs w:val="0"/>
+          <w:color w:val="000000"/>
+        </w:rPr>
+        <w:t xml:space="preserve"/>
       </w:r>
       <w:r>
         <w:rPr>
@@ -22640,18 +22640,18 @@
           <w:bCs w:val="0"/>
           <w:color w:val="ED7D31"/>
         </w:rPr>
-        <w:t xml:space="preserve">(EC)</w:t>
-      </w:r>
-      <w:r>
-        <w:rPr>
-          <w:rFonts w:ascii="Georgia" w:hAnsi="Georgia" w:cs="Georgia" w:eastAsia="Georgia"/>
-          <w:sz w:val="22"/>
-          <w:szCs w:val="22"/>
-          <w:b w:val="0"/>
-          <w:bCs w:val="0"/>
-          <w:color w:val="000000"/>
-        </w:rPr>
-        <w:t xml:space="preserve"> that such observation was induced by the Z. talanai-infused nanozeolite pellet suspension. Hence, the biosynthesis of Z. talanai-infused nanozeolite pellets is feasible and </w:t>
+        <w:t xml:space="preserve"/>
+      </w:r>
+      <w:r>
+        <w:rPr>
+          <w:rFonts w:ascii="Georgia" w:hAnsi="Georgia" w:cs="Georgia" w:eastAsia="Georgia"/>
+          <w:sz w:val="22"/>
+          <w:szCs w:val="22"/>
+          <w:b w:val="0"/>
+          <w:bCs w:val="0"/>
+          <w:color w:val="000000"/>
+        </w:rPr>
+        <w:t xml:space="preserve"/>
       </w:r>
       <w:r>
         <w:rPr>
@@ -22663,18 +22663,18 @@
           <w:shd w:val="clear" w:color="auto" w:fill="00B0F0"/>
           <w:color w:val="000000"/>
         </w:rPr>
-        <w:t xml:space="preserve">may</w:t>
-      </w:r>
-      <w:r>
-        <w:rPr>
-          <w:rFonts w:ascii="Georgia" w:hAnsi="Georgia" w:cs="Georgia" w:eastAsia="Georgia"/>
-          <w:sz w:val="22"/>
-          <w:szCs w:val="22"/>
-          <w:b w:val="0"/>
-          <w:bCs w:val="0"/>
-          <w:color w:val="000000"/>
-        </w:rPr>
-        <w:t xml:space="preserve"> </w:t>
+        <w:t xml:space="preserve"/>
+      </w:r>
+      <w:r>
+        <w:rPr>
+          <w:rFonts w:ascii="Georgia" w:hAnsi="Georgia" w:cs="Georgia" w:eastAsia="Georgia"/>
+          <w:sz w:val="22"/>
+          <w:szCs w:val="22"/>
+          <w:b w:val="0"/>
+          <w:bCs w:val="0"/>
+          <w:color w:val="000000"/>
+        </w:rPr>
+        <w:t xml:space="preserve"/>
       </w:r>
       <w:r>
         <w:rPr>
@@ -22685,18 +22685,18 @@
           <w:bCs w:val="0"/>
           <w:color w:val="ED7D31"/>
         </w:rPr>
-        <w:t xml:space="preserve">(EC)</w:t>
-      </w:r>
-      <w:r>
-        <w:rPr>
-          <w:rFonts w:ascii="Georgia" w:hAnsi="Georgia" w:cs="Georgia" w:eastAsia="Georgia"/>
-          <w:sz w:val="22"/>
-          <w:szCs w:val="22"/>
-          <w:b w:val="0"/>
-          <w:bCs w:val="0"/>
-          <w:color w:val="000000"/>
-        </w:rPr>
-        <w:t xml:space="preserve"> affect the overall development of D. rerio embryos.</w:t>
+        <w:t xml:space="preserve"/>
+      </w:r>
+      <w:r>
+        <w:rPr>
+          <w:rFonts w:ascii="Georgia" w:hAnsi="Georgia" w:cs="Georgia" w:eastAsia="Georgia"/>
+          <w:sz w:val="22"/>
+          <w:szCs w:val="22"/>
+          <w:b w:val="0"/>
+          <w:bCs w:val="0"/>
+          <w:color w:val="000000"/>
+        </w:rPr>
+        <w:t xml:space="preserve"/>
       </w:r>
     </w:p>
     <w:p>
@@ -23031,7 +23031,7 @@
           <w:bCs w:val="0"/>
           <w:color w:val="000000"/>
         </w:rPr>
-        <w:t xml:space="preserve">It is well recognized that heavy metals harm human health through the food chain. The danger to human health associated with consuming fish contaminated with heavy metals were assessed. This study aimed to determine the presence of lead in the flesh part of selected fish species, Common carp (Cyprinus carpio), Roho labeo (Labeo rohita), and Silver carp (Hypophthalmichthys molitrix), in addition to determine the Knowledge, Attitude, and Practices (KAP) of fishers along the Pampanga River. A test method used is Inductively Coupled Plasma — Optical Emission Spectrometry (ICP-OES) in identifying heavy metals in biota. The self-administered questionnaires were distributed to 20 respondents, questionnaires compromised of socio-demographic characteristics and the KAP’s of fishers along the Pampanga River. Data analyses were done using SPSS (version 23). Data were explored using descriptive statistics. The results show that lead in any of the selected fish, with a &lt;0.013 mg/kg result is below the FAO and WHO’s allowed limits of 2 mg/kg and 0.5 mg/kg, respectively. Based on the result from KAP Analysis, knowledge scored M=1.7200 with SD equivalent to 0.10052 which is interpreted as poor knowledge. The attitude score M=3.1150 and SD=0.093330 which means a moderate attitude and lastly, practices score M = 2.8850 and SD = .13485 which is equivalent to have good practices. Thus, the researcher provided a policy proposal to focus on issues that needed to be addressed in the community. In terms of practices, proper waste management </w:t>
+        <w:t xml:space="preserve">It is well recognized that heavy metals harm human health through the food chain. The danger to human health associated with consuming fish contaminated with heavy metals were assessed. This study aimed to determine the presence of lead in the flesh part of selected fish species, Common carp (Cyprinus carpio), Roho labeo (Labeo rohita), and Silver carp (Hypophthalmichthys molitrix), in addition to determine the Knowledge, Attitude, and Practices (KAP) of fishers along the Pampanga River. A test method used is Inductively Coupled Plasma — Optical Emission Spectrometry (ICP-OES) in identifying heavy metals in biota. The self-administered questionnaires were distributed to 20 respondents, questionnaires compromised of socio-demographic characteristics and the KAP’s of fishers along the Pampanga River. Data analyses were done using SPSS (version 23). Data were explored using descriptive statistics. The results show that lead in any of the selected fish, with a &lt;0.013 mg/kg result is below the FAO and WHO’s allowed limits of 2 mg/kg and 0.5 mg/kg, respectively. Based on the result from KAP Analysis, knowledge scored M=1.7200 with SD equivalent to 0.10052 which is interpreted as poor knowledge. The attitude score M=3.1150 and SD=0.093330 which means a moderate attitude and lastly, practices score M = 2.8850 and SD = .13485 which is equivalent to have good practices. Thus (DO), the researcher provided a policy proposal to focus on issues that needed to be addressed in the community. In terms of practices, proper waste management should (FP-Rec) be established to avoid the high danger of heavy metal contamination. Certain local habits, such as waste dumping and other communal activities, may (EC) contribute to the spread of heavy metals. As a result, some community or local government-adopted measures are proposed (FP-Gen). These precautions are intended to prevent heavy metal contamination, particularly in the river system and the aquatic life in the area.</w:t>
       </w:r>
       <w:r>
         <w:rPr>
@@ -23043,18 +23043,18 @@
           <w:strike/>
           <w:color w:val="000000"/>
         </w:rPr>
-        <w:t xml:space="preserve">should</w:t>
-      </w:r>
-      <w:r>
-        <w:rPr>
-          <w:rFonts w:ascii="Georgia" w:hAnsi="Georgia" w:cs="Georgia" w:eastAsia="Georgia"/>
-          <w:sz w:val="22"/>
-          <w:szCs w:val="22"/>
-          <w:b w:val="0"/>
-          <w:bCs w:val="0"/>
-          <w:color w:val="000000"/>
-        </w:rPr>
-        <w:t xml:space="preserve"> </w:t>
+        <w:t xml:space="preserve"/>
+      </w:r>
+      <w:r>
+        <w:rPr>
+          <w:rFonts w:ascii="Georgia" w:hAnsi="Georgia" w:cs="Georgia" w:eastAsia="Georgia"/>
+          <w:sz w:val="22"/>
+          <w:szCs w:val="22"/>
+          <w:b w:val="0"/>
+          <w:bCs w:val="0"/>
+          <w:color w:val="000000"/>
+        </w:rPr>
+        <w:t xml:space="preserve"/>
       </w:r>
       <w:r>
         <w:rPr>
@@ -23065,18 +23065,18 @@
           <w:bCs w:val="0"/>
           <w:color w:val="808080"/>
         </w:rPr>
-        <w:t xml:space="preserve">(FP-Rec)</w:t>
-      </w:r>
-      <w:r>
-        <w:rPr>
-          <w:rFonts w:ascii="Georgia" w:hAnsi="Georgia" w:cs="Georgia" w:eastAsia="Georgia"/>
-          <w:sz w:val="22"/>
-          <w:szCs w:val="22"/>
-          <w:b w:val="0"/>
-          <w:bCs w:val="0"/>
-          <w:color w:val="000000"/>
-        </w:rPr>
-        <w:t xml:space="preserve"> be established to avoid the high danger of heavy metal contamination. Certain local habits, such as waste dumping and other communal activities, </w:t>
+        <w:t xml:space="preserve"/>
+      </w:r>
+      <w:r>
+        <w:rPr>
+          <w:rFonts w:ascii="Georgia" w:hAnsi="Georgia" w:cs="Georgia" w:eastAsia="Georgia"/>
+          <w:sz w:val="22"/>
+          <w:szCs w:val="22"/>
+          <w:b w:val="0"/>
+          <w:bCs w:val="0"/>
+          <w:color w:val="000000"/>
+        </w:rPr>
+        <w:t xml:space="preserve"/>
       </w:r>
       <w:r>
         <w:rPr>
@@ -23088,18 +23088,18 @@
           <w:shd w:val="clear" w:color="auto" w:fill="00B0F0"/>
           <w:color w:val="000000"/>
         </w:rPr>
-        <w:t xml:space="preserve">may</w:t>
-      </w:r>
-      <w:r>
-        <w:rPr>
-          <w:rFonts w:ascii="Georgia" w:hAnsi="Georgia" w:cs="Georgia" w:eastAsia="Georgia"/>
-          <w:sz w:val="22"/>
-          <w:szCs w:val="22"/>
-          <w:b w:val="0"/>
-          <w:bCs w:val="0"/>
-          <w:color w:val="000000"/>
-        </w:rPr>
-        <w:t xml:space="preserve"> </w:t>
+        <w:t xml:space="preserve"/>
+      </w:r>
+      <w:r>
+        <w:rPr>
+          <w:rFonts w:ascii="Georgia" w:hAnsi="Georgia" w:cs="Georgia" w:eastAsia="Georgia"/>
+          <w:sz w:val="22"/>
+          <w:szCs w:val="22"/>
+          <w:b w:val="0"/>
+          <w:bCs w:val="0"/>
+          <w:color w:val="000000"/>
+        </w:rPr>
+        <w:t xml:space="preserve"/>
       </w:r>
       <w:r>
         <w:rPr>
@@ -23110,18 +23110,18 @@
           <w:bCs w:val="0"/>
           <w:color w:val="ED7D31"/>
         </w:rPr>
-        <w:t xml:space="preserve">(EC)</w:t>
-      </w:r>
-      <w:r>
-        <w:rPr>
-          <w:rFonts w:ascii="Georgia" w:hAnsi="Georgia" w:cs="Georgia" w:eastAsia="Georgia"/>
-          <w:sz w:val="22"/>
-          <w:szCs w:val="22"/>
-          <w:b w:val="0"/>
-          <w:bCs w:val="0"/>
-          <w:color w:val="000000"/>
-        </w:rPr>
-        <w:t xml:space="preserve"> contribute to the spread of heavy metals. As a result, some community or local government-adopted measures are </w:t>
+        <w:t xml:space="preserve"/>
+      </w:r>
+      <w:r>
+        <w:rPr>
+          <w:rFonts w:ascii="Georgia" w:hAnsi="Georgia" w:cs="Georgia" w:eastAsia="Georgia"/>
+          <w:sz w:val="22"/>
+          <w:szCs w:val="22"/>
+          <w:b w:val="0"/>
+          <w:bCs w:val="0"/>
+          <w:color w:val="000000"/>
+        </w:rPr>
+        <w:t xml:space="preserve"/>
       </w:r>
       <w:r>
         <w:rPr>
@@ -23133,18 +23133,18 @@
           <w:strike/>
           <w:color w:val="000000"/>
         </w:rPr>
-        <w:t xml:space="preserve">proposed</w:t>
-      </w:r>
-      <w:r>
-        <w:rPr>
-          <w:rFonts w:ascii="Georgia" w:hAnsi="Georgia" w:cs="Georgia" w:eastAsia="Georgia"/>
-          <w:sz w:val="22"/>
-          <w:szCs w:val="22"/>
-          <w:b w:val="0"/>
-          <w:bCs w:val="0"/>
-          <w:color w:val="000000"/>
-        </w:rPr>
-        <w:t xml:space="preserve"> </w:t>
+        <w:t xml:space="preserve"/>
+      </w:r>
+      <w:r>
+        <w:rPr>
+          <w:rFonts w:ascii="Georgia" w:hAnsi="Georgia" w:cs="Georgia" w:eastAsia="Georgia"/>
+          <w:sz w:val="22"/>
+          <w:szCs w:val="22"/>
+          <w:b w:val="0"/>
+          <w:bCs w:val="0"/>
+          <w:color w:val="000000"/>
+        </w:rPr>
+        <w:t xml:space="preserve"/>
       </w:r>
       <w:r>
         <w:rPr>
@@ -23155,18 +23155,18 @@
           <w:bCs w:val="0"/>
           <w:color w:val="808080"/>
         </w:rPr>
-        <w:t xml:space="preserve">(FP-Gen)</w:t>
-      </w:r>
-      <w:r>
-        <w:rPr>
-          <w:rFonts w:ascii="Georgia" w:hAnsi="Georgia" w:cs="Georgia" w:eastAsia="Georgia"/>
-          <w:sz w:val="22"/>
-          <w:szCs w:val="22"/>
-          <w:b w:val="0"/>
-          <w:bCs w:val="0"/>
-          <w:color w:val="000000"/>
-        </w:rPr>
-        <w:t xml:space="preserve">. These precautions are intended to prevent heavy metal contamination, particularly in the river system and the aquatic life in the area.</w:t>
+        <w:t xml:space="preserve"/>
+      </w:r>
+      <w:r>
+        <w:rPr>
+          <w:rFonts w:ascii="Georgia" w:hAnsi="Georgia" w:cs="Georgia" w:eastAsia="Georgia"/>
+          <w:sz w:val="22"/>
+          <w:szCs w:val="22"/>
+          <w:b w:val="0"/>
+          <w:bCs w:val="0"/>
+          <w:color w:val="000000"/>
+        </w:rPr>
+        <w:t xml:space="preserve"/>
       </w:r>
     </w:p>
     <w:p>
@@ -23210,7 +23210,7 @@
           <w:bCs w:val="0"/>
           <w:color w:val="000000"/>
         </w:rPr>
-        <w:t xml:space="preserve">Currently, Central Luzon together with Calabarzon are regions that hold a pivotal position in the Philippines’ fishing industry. However, due to their adjacency to [REDACTED], which is highly polluted due to anthropogenic activities, these regions become vulnerable to bacterial infestation. Mycobacteriosis is a significant concern in cultivated milkfish, impacting both fish health and aquaculture productivity is reported in [REDACTED] and in parts of Central Luzon. Hence, this study aimed to investigate the presence of </w:t>
+        <w:t xml:space="preserve">Currently, Central Luzon together with Calabarzon are regions that hold a pivotal position in the Philippines’ fishing industry. However, due to their adjacency to [REDACTED], which is highly polluted due to anthropogenic activities, these regions become vulnerable to bacterial infestation. Mycobacteriosis is a significant concern in cultivated milkfish, impacting both fish health and aquaculture productivity is reported in [REDACTED] and in parts of Central Luzon. Hence (DO), this study aimed to investigate the presence of potential (EC) mycobacterial infections in cultivated milkfish collected from fish-supplying areas of [REDACTED]. Using the Ziehl-Neelsen stain for acid-fast bacteria detection, along with biochemical testing methods such as the catalase test and assessing growth in the presence of the Salt Tolerance Test, revealed the presence of acid-fast bacteria in the tissues of infected milkfish, confirming the occurrence of mycobacteriosis infection. Additionally, biochemical testing, specifically the catalase test, was utilized to identify the catalase enzyme activity characteristic of mycobacteria, catalase test positive shows the result of the formation of bubbles. Furthermore, the growth of mycobacteria in the presence of the Salt Tolerance Test was assessed, showing the ability of these bacteria to thrive in high-salt environments, which is crucial information for understanding their survival and spread in aquaculture settings. Overall, the combination of Ziehl-Neelsen staining, biochemical testing like the catalase test, and evaluating growth in the presence of the Salt Tolerance Test provides [G] a comprehensive approach for diagnosing and studying mycobacteriosis in cultivated milkfish, offering insights that can (FP-Cap) guide effective management strategies to control the spread of this disease in aquaculture system.</w:t>
       </w:r>
       <w:r>
         <w:rPr>
@@ -23222,18 +23222,18 @@
           <w:highlight w:val="red"/>
           <w:color w:val="FFFFFF"/>
         </w:rPr>
-        <w:t xml:space="preserve">potential</w:t>
-      </w:r>
-      <w:r>
-        <w:rPr>
-          <w:rFonts w:ascii="Georgia" w:hAnsi="Georgia" w:cs="Georgia" w:eastAsia="Georgia"/>
-          <w:sz w:val="22"/>
-          <w:szCs w:val="22"/>
-          <w:b w:val="0"/>
-          <w:bCs w:val="0"/>
-          <w:color w:val="000000"/>
-        </w:rPr>
-        <w:t xml:space="preserve"> </w:t>
+        <w:t xml:space="preserve"/>
+      </w:r>
+      <w:r>
+        <w:rPr>
+          <w:rFonts w:ascii="Georgia" w:hAnsi="Georgia" w:cs="Georgia" w:eastAsia="Georgia"/>
+          <w:sz w:val="22"/>
+          <w:szCs w:val="22"/>
+          <w:b w:val="0"/>
+          <w:bCs w:val="0"/>
+          <w:color w:val="000000"/>
+        </w:rPr>
+        <w:t xml:space="preserve"/>
       </w:r>
       <w:r>
         <w:rPr>
@@ -23244,18 +23244,18 @@
           <w:bCs w:val="0"/>
           <w:color w:val="ED7D31"/>
         </w:rPr>
-        <w:t xml:space="preserve">(EC)</w:t>
-      </w:r>
-      <w:r>
-        <w:rPr>
-          <w:rFonts w:ascii="Georgia" w:hAnsi="Georgia" w:cs="Georgia" w:eastAsia="Georgia"/>
-          <w:sz w:val="22"/>
-          <w:szCs w:val="22"/>
-          <w:b w:val="0"/>
-          <w:bCs w:val="0"/>
-          <w:color w:val="000000"/>
-        </w:rPr>
-        <w:t xml:space="preserve"> mycobacterial infections in cultivated milkfish collected from fish-supplying areas of [REDACTED]. Using the Ziehl-Neelsen stain for acid-fast bacteria detection, along with biochemical testing methods such as the catalase test and assessing growth in the presence of the Salt Tolerance Test, revealed the presence of acid-fast bacteria in the tissues of infected milkfish, confirming the occurrence of mycobacteriosis infection. Additionally, biochemical testing, specifically the catalase test, was utilized to identify the catalase enzyme activity characteristic of mycobacteria, catalase test positive shows the result of the formation of bubbles. Furthermore, the growth of mycobacteria in the presence of the Salt Tolerance Test was assessed, showing the ability of these bacteria to thrive in high-salt environments, which is crucial information for understanding their survival and spread in aquaculture settings. Overall, the combination of Ziehl-Neelsen staining, biochemical testing like the catalase test, and evaluating growth in the presence of the Salt Tolerance Test </w:t>
+        <w:t xml:space="preserve"/>
+      </w:r>
+      <w:r>
+        <w:rPr>
+          <w:rFonts w:ascii="Georgia" w:hAnsi="Georgia" w:cs="Georgia" w:eastAsia="Georgia"/>
+          <w:sz w:val="22"/>
+          <w:szCs w:val="22"/>
+          <w:b w:val="0"/>
+          <w:bCs w:val="0"/>
+          <w:color w:val="000000"/>
+        </w:rPr>
+        <w:t xml:space="preserve"/>
       </w:r>
       <w:r>
         <w:rPr>
@@ -23267,18 +23267,18 @@
           <w:shd w:val="clear" w:color="auto" w:fill="bfbfbf"/>
           <w:color w:val="000000"/>
         </w:rPr>
-        <w:t xml:space="preserve">provides</w:t>
-      </w:r>
-      <w:r>
-        <w:rPr>
-          <w:rFonts w:ascii="Georgia" w:hAnsi="Georgia" w:cs="Georgia" w:eastAsia="Georgia"/>
-          <w:sz w:val="22"/>
-          <w:szCs w:val="22"/>
-          <w:b w:val="0"/>
-          <w:bCs w:val="0"/>
-          <w:color w:val="000000"/>
-        </w:rPr>
-        <w:t xml:space="preserve"> [G] a comprehensive approach for diagnosing and studying mycobacteriosis in cultivated milkfish, offering insights that </w:t>
+        <w:t xml:space="preserve"/>
+      </w:r>
+      <w:r>
+        <w:rPr>
+          <w:rFonts w:ascii="Georgia" w:hAnsi="Georgia" w:cs="Georgia" w:eastAsia="Georgia"/>
+          <w:sz w:val="22"/>
+          <w:szCs w:val="22"/>
+          <w:b w:val="0"/>
+          <w:bCs w:val="0"/>
+          <w:color w:val="000000"/>
+        </w:rPr>
+        <w:t xml:space="preserve"/>
       </w:r>
       <w:r>
         <w:rPr>
@@ -23290,18 +23290,18 @@
           <w:strike/>
           <w:color w:val="000000"/>
         </w:rPr>
-        <w:t xml:space="preserve">can</w:t>
-      </w:r>
-      <w:r>
-        <w:rPr>
-          <w:rFonts w:ascii="Georgia" w:hAnsi="Georgia" w:cs="Georgia" w:eastAsia="Georgia"/>
-          <w:sz w:val="22"/>
-          <w:szCs w:val="22"/>
-          <w:b w:val="0"/>
-          <w:bCs w:val="0"/>
-          <w:color w:val="000000"/>
-        </w:rPr>
-        <w:t xml:space="preserve"> </w:t>
+        <w:t xml:space="preserve"/>
+      </w:r>
+      <w:r>
+        <w:rPr>
+          <w:rFonts w:ascii="Georgia" w:hAnsi="Georgia" w:cs="Georgia" w:eastAsia="Georgia"/>
+          <w:sz w:val="22"/>
+          <w:szCs w:val="22"/>
+          <w:b w:val="0"/>
+          <w:bCs w:val="0"/>
+          <w:color w:val="000000"/>
+        </w:rPr>
+        <w:t xml:space="preserve"/>
       </w:r>
       <w:r>
         <w:rPr>
@@ -23312,18 +23312,18 @@
           <w:bCs w:val="0"/>
           <w:color w:val="808080"/>
         </w:rPr>
-        <w:t xml:space="preserve">(FP-Cap)</w:t>
-      </w:r>
-      <w:r>
-        <w:rPr>
-          <w:rFonts w:ascii="Georgia" w:hAnsi="Georgia" w:cs="Georgia" w:eastAsia="Georgia"/>
-          <w:sz w:val="22"/>
-          <w:szCs w:val="22"/>
-          <w:b w:val="0"/>
-          <w:bCs w:val="0"/>
-          <w:color w:val="000000"/>
-        </w:rPr>
-        <w:t xml:space="preserve"> guide effective management strategies to control the spread of this disease in aquaculture system.</w:t>
+        <w:t xml:space="preserve"/>
+      </w:r>
+      <w:r>
+        <w:rPr>
+          <w:rFonts w:ascii="Georgia" w:hAnsi="Georgia" w:cs="Georgia" w:eastAsia="Georgia"/>
+          <w:sz w:val="22"/>
+          <w:szCs w:val="22"/>
+          <w:b w:val="0"/>
+          <w:bCs w:val="0"/>
+          <w:color w:val="000000"/>
+        </w:rPr>
+        <w:t xml:space="preserve"/>
       </w:r>
     </w:p>
     <w:p>
@@ -23367,7 +23367,7 @@
           <w:bCs w:val="0"/>
           <w:color w:val="000000"/>
         </w:rPr>
-        <w:t xml:space="preserve">Antimicrobial resistance is a major threat to public health worldwide, making infections difficult to treat. This problem calls for developing novel and alternative strategies to attenuate microorganisms without inducing resistance. Hence, lactic acid bacteria (LAB) have emerged as a focal point due to their potential (EC) quorum quenching (QQ) activities. In this study, lactic acid bacteria were obtained from a parallel study, and the antimicrobial activity of the top 10 isolates was evaluated through spectrophotometric and turbidimetric analyses for the initial screening of gut isolates. Nine out of ten isolates exhibit quorum quenching activities by inhibiting the swarming motility of Pseudomonas aeruginosa. The metabolic compounds of the isolates were subjected to initial characterization using enzyme and pH neutralization, which revealed that organic acids were responsible for the inhibitory activity. The inhibition activity of LAB isolates against the quorum sensing-mediated swarming motility in P. aeruginosa was [C] due to strong antibacterial activity.</w:t>
+        <w:t xml:space="preserve">Antimicrobial resistance is a major threat to public health worldwide, making infections difficult to treat. This problem calls for developing novel and alternative strategies to attenuate microorganisms without inducing resistance. Hence (DO), lactic acid bacteria (LAB) have emerged as a focal point due to their potential (EC) quorum quenching (QQ) activities. In this study, lactic acid bacteria were obtained from a parallel study, and the antimicrobial activity of the top 10 isolates was evaluated through spectrophotometric and turbidimetric analyses for the initial screening of gut isolates. Nine out of ten isolates exhibit quorum quenching activities by inhibiting the swarming motility of Pseudomonas aeruginosa. The metabolic compounds of the isolates were subjected to initial characterization using enzyme and pH neutralization, which revealed that organic acids were responsible for the inhibitory activity. The inhibition activity of LAB isolates against the quorum sensing-mediated swarming motility in P. aeruginosa was [C] due to strong antibacterial activity.</w:t>
       </w:r>
       <w:r>
         <w:rPr>
@@ -23971,7 +23971,7 @@
           <w:bCs w:val="0"/>
           <w:color w:val="000000"/>
         </w:rPr>
-        <w:t xml:space="preserve">Methicillin-resistant Staphylococcus aureus (MRSA) is a common and </w:t>
+        <w:t xml:space="preserve">Methicillin-resistant Staphylococcus aureus (MRSA) is a common and potentially (EC) severe pathogen that has developed resistance to several types of antibiotics. MRSA bacteria can (FP-Cap) survive long on surfaces and objects, including second-hand clothing (SHC). The increasing popularity of SHC or “ukay-ukay” in the Philippines, coupled with potential (EC) public health concerns associated with transmitting pathogenic bacteria, emphasized this research’s need. Thus (DO), this study detected the presence of S. aureus and MRSA in second-hand clothing. A total of fifteen most frequently purchased second-hand clothing (i.e., blouses, tee shirts, crop tops, tank tops, and hoodie jackets) were collected from [REDACTED]. Bacteriological analyses demonstrated the presence of Staphylococcus species across all samples, with growth in high-salt-containing culture broth and characteristic growth on Mannitol Salt Agar (MSA). Biochemical tests revealed positive catalase and Gram-positive cocci in clusters typical of S. aureus. Antibiotic susceptibility testing indicated the presence of both methicillin-sensitive S. aureus (MSSA) and methicillin-resistant S. aureus (MRSA) strains among the collected samples, highlighting the potential (EC) public health risks associated with the handling and purchasing of second-hand clothing. This study, therefore (DO), underscores the need for proper precautions to mitigate the spread of potentially (EC) harmful bacteria, including MRSA, on second-hand clothing. It highlights the importance of raising awareness among both vendors and consumers about the potential (EC) health risks associated with these garments.</w:t>
       </w:r>
       <w:r>
         <w:rPr>
@@ -23983,18 +23983,18 @@
           <w:highlight w:val="yellow"/>
           <w:color w:val="000000"/>
         </w:rPr>
-        <w:t xml:space="preserve">potentially</w:t>
-      </w:r>
-      <w:r>
-        <w:rPr>
-          <w:rFonts w:ascii="Georgia" w:hAnsi="Georgia" w:cs="Georgia" w:eastAsia="Georgia"/>
-          <w:sz w:val="22"/>
-          <w:szCs w:val="22"/>
-          <w:b w:val="0"/>
-          <w:bCs w:val="0"/>
-          <w:color w:val="000000"/>
-        </w:rPr>
-        <w:t xml:space="preserve"> </w:t>
+        <w:t xml:space="preserve"/>
+      </w:r>
+      <w:r>
+        <w:rPr>
+          <w:rFonts w:ascii="Georgia" w:hAnsi="Georgia" w:cs="Georgia" w:eastAsia="Georgia"/>
+          <w:sz w:val="22"/>
+          <w:szCs w:val="22"/>
+          <w:b w:val="0"/>
+          <w:bCs w:val="0"/>
+          <w:color w:val="000000"/>
+        </w:rPr>
+        <w:t xml:space="preserve"/>
       </w:r>
       <w:r>
         <w:rPr>
@@ -24005,18 +24005,18 @@
           <w:bCs w:val="0"/>
           <w:color w:val="ED7D31"/>
         </w:rPr>
-        <w:t xml:space="preserve">(EC)</w:t>
-      </w:r>
-      <w:r>
-        <w:rPr>
-          <w:rFonts w:ascii="Georgia" w:hAnsi="Georgia" w:cs="Georgia" w:eastAsia="Georgia"/>
-          <w:sz w:val="22"/>
-          <w:szCs w:val="22"/>
-          <w:b w:val="0"/>
-          <w:bCs w:val="0"/>
-          <w:color w:val="000000"/>
-        </w:rPr>
-        <w:t xml:space="preserve"> severe pathogen that has developed resistance to several types of antibiotics. MRSA bacteria </w:t>
+        <w:t xml:space="preserve"/>
+      </w:r>
+      <w:r>
+        <w:rPr>
+          <w:rFonts w:ascii="Georgia" w:hAnsi="Georgia" w:cs="Georgia" w:eastAsia="Georgia"/>
+          <w:sz w:val="22"/>
+          <w:szCs w:val="22"/>
+          <w:b w:val="0"/>
+          <w:bCs w:val="0"/>
+          <w:color w:val="000000"/>
+        </w:rPr>
+        <w:t xml:space="preserve"/>
       </w:r>
       <w:r>
         <w:rPr>
@@ -24028,18 +24028,18 @@
           <w:strike/>
           <w:color w:val="000000"/>
         </w:rPr>
-        <w:t xml:space="preserve">can</w:t>
-      </w:r>
-      <w:r>
-        <w:rPr>
-          <w:rFonts w:ascii="Georgia" w:hAnsi="Georgia" w:cs="Georgia" w:eastAsia="Georgia"/>
-          <w:sz w:val="22"/>
-          <w:szCs w:val="22"/>
-          <w:b w:val="0"/>
-          <w:bCs w:val="0"/>
-          <w:color w:val="000000"/>
-        </w:rPr>
-        <w:t xml:space="preserve"> </w:t>
+        <w:t xml:space="preserve"/>
+      </w:r>
+      <w:r>
+        <w:rPr>
+          <w:rFonts w:ascii="Georgia" w:hAnsi="Georgia" w:cs="Georgia" w:eastAsia="Georgia"/>
+          <w:sz w:val="22"/>
+          <w:szCs w:val="22"/>
+          <w:b w:val="0"/>
+          <w:bCs w:val="0"/>
+          <w:color w:val="000000"/>
+        </w:rPr>
+        <w:t xml:space="preserve"/>
       </w:r>
       <w:r>
         <w:rPr>
@@ -24050,18 +24050,18 @@
           <w:bCs w:val="0"/>
           <w:color w:val="808080"/>
         </w:rPr>
-        <w:t xml:space="preserve">(FP-Cap)</w:t>
-      </w:r>
-      <w:r>
-        <w:rPr>
-          <w:rFonts w:ascii="Georgia" w:hAnsi="Georgia" w:cs="Georgia" w:eastAsia="Georgia"/>
-          <w:sz w:val="22"/>
-          <w:szCs w:val="22"/>
-          <w:b w:val="0"/>
-          <w:bCs w:val="0"/>
-          <w:color w:val="000000"/>
-        </w:rPr>
-        <w:t xml:space="preserve"> survive long on surfaces and objects, including second-hand clothing (SHC). The increasing popularity of SHC or “ukay-ukay” in the Philippines, coupled with </w:t>
+        <w:t xml:space="preserve"/>
+      </w:r>
+      <w:r>
+        <w:rPr>
+          <w:rFonts w:ascii="Georgia" w:hAnsi="Georgia" w:cs="Georgia" w:eastAsia="Georgia"/>
+          <w:sz w:val="22"/>
+          <w:szCs w:val="22"/>
+          <w:b w:val="0"/>
+          <w:bCs w:val="0"/>
+          <w:color w:val="000000"/>
+        </w:rPr>
+        <w:t xml:space="preserve"/>
       </w:r>
       <w:r>
         <w:rPr>
@@ -24073,18 +24073,18 @@
           <w:highlight w:val="red"/>
           <w:color w:val="FFFFFF"/>
         </w:rPr>
-        <w:t xml:space="preserve">potential</w:t>
-      </w:r>
-      <w:r>
-        <w:rPr>
-          <w:rFonts w:ascii="Georgia" w:hAnsi="Georgia" w:cs="Georgia" w:eastAsia="Georgia"/>
-          <w:sz w:val="22"/>
-          <w:szCs w:val="22"/>
-          <w:b w:val="0"/>
-          <w:bCs w:val="0"/>
-          <w:color w:val="000000"/>
-        </w:rPr>
-        <w:t xml:space="preserve"> </w:t>
+        <w:t xml:space="preserve"/>
+      </w:r>
+      <w:r>
+        <w:rPr>
+          <w:rFonts w:ascii="Georgia" w:hAnsi="Georgia" w:cs="Georgia" w:eastAsia="Georgia"/>
+          <w:sz w:val="22"/>
+          <w:szCs w:val="22"/>
+          <w:b w:val="0"/>
+          <w:bCs w:val="0"/>
+          <w:color w:val="000000"/>
+        </w:rPr>
+        <w:t xml:space="preserve"/>
       </w:r>
       <w:r>
         <w:rPr>
@@ -24095,18 +24095,18 @@
           <w:bCs w:val="0"/>
           <w:color w:val="ED7D31"/>
         </w:rPr>
-        <w:t xml:space="preserve">(EC)</w:t>
-      </w:r>
-      <w:r>
-        <w:rPr>
-          <w:rFonts w:ascii="Georgia" w:hAnsi="Georgia" w:cs="Georgia" w:eastAsia="Georgia"/>
-          <w:sz w:val="22"/>
-          <w:szCs w:val="22"/>
-          <w:b w:val="0"/>
-          <w:bCs w:val="0"/>
-          <w:color w:val="000000"/>
-        </w:rPr>
-        <w:t xml:space="preserve"> public health concerns associated with transmitting pathogenic bacteria, emphasized this research’s need. Thus, this study detected the presence of S. aureus and MRSA in second-hand clothing. A total of fifteen most frequently purchased second-hand clothing (i.e., blouses, tee shirts, crop tops, tank tops, and hoodie jackets) were collected from [REDACTED]. Bacteriological analyses demonstrated the presence of Staphylococcus species across all samples, with growth in high-salt-containing culture broth and characteristic growth on Mannitol Salt Agar (MSA). Biochemical tests revealed positive catalase and Gram-positive cocci in clusters typical of S. aureus. Antibiotic susceptibility testing indicated the presence of both methicillin-sensitive S. aureus (MSSA) and methicillin-resistant S. aureus (MRSA) strains among the collected samples, highlighting the </w:t>
+        <w:t xml:space="preserve"/>
+      </w:r>
+      <w:r>
+        <w:rPr>
+          <w:rFonts w:ascii="Georgia" w:hAnsi="Georgia" w:cs="Georgia" w:eastAsia="Georgia"/>
+          <w:sz w:val="22"/>
+          <w:szCs w:val="22"/>
+          <w:b w:val="0"/>
+          <w:bCs w:val="0"/>
+          <w:color w:val="000000"/>
+        </w:rPr>
+        <w:t xml:space="preserve"/>
       </w:r>
       <w:r>
         <w:rPr>
@@ -24118,18 +24118,18 @@
           <w:highlight w:val="red"/>
           <w:color w:val="FFFFFF"/>
         </w:rPr>
-        <w:t xml:space="preserve">potential</w:t>
-      </w:r>
-      <w:r>
-        <w:rPr>
-          <w:rFonts w:ascii="Georgia" w:hAnsi="Georgia" w:cs="Georgia" w:eastAsia="Georgia"/>
-          <w:sz w:val="22"/>
-          <w:szCs w:val="22"/>
-          <w:b w:val="0"/>
-          <w:bCs w:val="0"/>
-          <w:color w:val="000000"/>
-        </w:rPr>
-        <w:t xml:space="preserve"> </w:t>
+        <w:t xml:space="preserve"/>
+      </w:r>
+      <w:r>
+        <w:rPr>
+          <w:rFonts w:ascii="Georgia" w:hAnsi="Georgia" w:cs="Georgia" w:eastAsia="Georgia"/>
+          <w:sz w:val="22"/>
+          <w:szCs w:val="22"/>
+          <w:b w:val="0"/>
+          <w:bCs w:val="0"/>
+          <w:color w:val="000000"/>
+        </w:rPr>
+        <w:t xml:space="preserve"/>
       </w:r>
       <w:r>
         <w:rPr>
@@ -24140,18 +24140,18 @@
           <w:bCs w:val="0"/>
           <w:color w:val="ED7D31"/>
         </w:rPr>
-        <w:t xml:space="preserve">(EC)</w:t>
-      </w:r>
-      <w:r>
-        <w:rPr>
-          <w:rFonts w:ascii="Georgia" w:hAnsi="Georgia" w:cs="Georgia" w:eastAsia="Georgia"/>
-          <w:sz w:val="22"/>
-          <w:szCs w:val="22"/>
-          <w:b w:val="0"/>
-          <w:bCs w:val="0"/>
-          <w:color w:val="000000"/>
-        </w:rPr>
-        <w:t xml:space="preserve"> public health risks associated with the handling and purchasing of second-hand clothing. This study, therefore, underscores the need for proper precautions to mitigate the spread of </w:t>
+        <w:t xml:space="preserve"/>
+      </w:r>
+      <w:r>
+        <w:rPr>
+          <w:rFonts w:ascii="Georgia" w:hAnsi="Georgia" w:cs="Georgia" w:eastAsia="Georgia"/>
+          <w:sz w:val="22"/>
+          <w:szCs w:val="22"/>
+          <w:b w:val="0"/>
+          <w:bCs w:val="0"/>
+          <w:color w:val="000000"/>
+        </w:rPr>
+        <w:t xml:space="preserve"/>
       </w:r>
       <w:r>
         <w:rPr>
@@ -24163,18 +24163,18 @@
           <w:highlight w:val="yellow"/>
           <w:color w:val="000000"/>
         </w:rPr>
-        <w:t xml:space="preserve">potentially</w:t>
-      </w:r>
-      <w:r>
-        <w:rPr>
-          <w:rFonts w:ascii="Georgia" w:hAnsi="Georgia" w:cs="Georgia" w:eastAsia="Georgia"/>
-          <w:sz w:val="22"/>
-          <w:szCs w:val="22"/>
-          <w:b w:val="0"/>
-          <w:bCs w:val="0"/>
-          <w:color w:val="000000"/>
-        </w:rPr>
-        <w:t xml:space="preserve"> </w:t>
+        <w:t xml:space="preserve"/>
+      </w:r>
+      <w:r>
+        <w:rPr>
+          <w:rFonts w:ascii="Georgia" w:hAnsi="Georgia" w:cs="Georgia" w:eastAsia="Georgia"/>
+          <w:sz w:val="22"/>
+          <w:szCs w:val="22"/>
+          <w:b w:val="0"/>
+          <w:bCs w:val="0"/>
+          <w:color w:val="000000"/>
+        </w:rPr>
+        <w:t xml:space="preserve"/>
       </w:r>
       <w:r>
         <w:rPr>
@@ -24185,18 +24185,18 @@
           <w:bCs w:val="0"/>
           <w:color w:val="ED7D31"/>
         </w:rPr>
-        <w:t xml:space="preserve">(EC)</w:t>
-      </w:r>
-      <w:r>
-        <w:rPr>
-          <w:rFonts w:ascii="Georgia" w:hAnsi="Georgia" w:cs="Georgia" w:eastAsia="Georgia"/>
-          <w:sz w:val="22"/>
-          <w:szCs w:val="22"/>
-          <w:b w:val="0"/>
-          <w:bCs w:val="0"/>
-          <w:color w:val="000000"/>
-        </w:rPr>
-        <w:t xml:space="preserve"> harmful bacteria, including MRSA, on second-hand clothing. It highlights the importance of raising awareness among both vendors and consumers about the </w:t>
+        <w:t xml:space="preserve"/>
+      </w:r>
+      <w:r>
+        <w:rPr>
+          <w:rFonts w:ascii="Georgia" w:hAnsi="Georgia" w:cs="Georgia" w:eastAsia="Georgia"/>
+          <w:sz w:val="22"/>
+          <w:szCs w:val="22"/>
+          <w:b w:val="0"/>
+          <w:bCs w:val="0"/>
+          <w:color w:val="000000"/>
+        </w:rPr>
+        <w:t xml:space="preserve"/>
       </w:r>
       <w:r>
         <w:rPr>
@@ -24208,18 +24208,18 @@
           <w:highlight w:val="red"/>
           <w:color w:val="FFFFFF"/>
         </w:rPr>
-        <w:t xml:space="preserve">potential</w:t>
-      </w:r>
-      <w:r>
-        <w:rPr>
-          <w:rFonts w:ascii="Georgia" w:hAnsi="Georgia" w:cs="Georgia" w:eastAsia="Georgia"/>
-          <w:sz w:val="22"/>
-          <w:szCs w:val="22"/>
-          <w:b w:val="0"/>
-          <w:bCs w:val="0"/>
-          <w:color w:val="000000"/>
-        </w:rPr>
-        <w:t xml:space="preserve"> </w:t>
+        <w:t xml:space="preserve"/>
+      </w:r>
+      <w:r>
+        <w:rPr>
+          <w:rFonts w:ascii="Georgia" w:hAnsi="Georgia" w:cs="Georgia" w:eastAsia="Georgia"/>
+          <w:sz w:val="22"/>
+          <w:szCs w:val="22"/>
+          <w:b w:val="0"/>
+          <w:bCs w:val="0"/>
+          <w:color w:val="000000"/>
+        </w:rPr>
+        <w:t xml:space="preserve"/>
       </w:r>
       <w:r>
         <w:rPr>
@@ -24230,18 +24230,18 @@
           <w:bCs w:val="0"/>
           <w:color w:val="ED7D31"/>
         </w:rPr>
-        <w:t xml:space="preserve">(EC)</w:t>
-      </w:r>
-      <w:r>
-        <w:rPr>
-          <w:rFonts w:ascii="Georgia" w:hAnsi="Georgia" w:cs="Georgia" w:eastAsia="Georgia"/>
-          <w:sz w:val="22"/>
-          <w:szCs w:val="22"/>
-          <w:b w:val="0"/>
-          <w:bCs w:val="0"/>
-          <w:color w:val="000000"/>
-        </w:rPr>
-        <w:t xml:space="preserve"> health risks associated with these garments.</w:t>
+        <w:t xml:space="preserve"/>
+      </w:r>
+      <w:r>
+        <w:rPr>
+          <w:rFonts w:ascii="Georgia" w:hAnsi="Georgia" w:cs="Georgia" w:eastAsia="Georgia"/>
+          <w:sz w:val="22"/>
+          <w:szCs w:val="22"/>
+          <w:b w:val="0"/>
+          <w:bCs w:val="0"/>
+          <w:color w:val="000000"/>
+        </w:rPr>
+        <w:t xml:space="preserve"/>
       </w:r>
     </w:p>
     <w:p>
@@ -24688,7 +24688,7 @@
           <w:bCs w:val="0"/>
           <w:color w:val="000000"/>
         </w:rPr>
-        <w:t xml:space="preserve">Wetlands are becoming popular as important tourist destinations due to their unique natural beauty and diverse wildlife. These vital ecosystems are at risk from the unregulated and unsustainable tourist visits that cause detrimental effects on the environment and host communities. Hence, sustainable planning and management approaches </w:t>
+        <w:t xml:space="preserve">Wetlands are becoming popular as important tourist destinations due to their unique natural beauty and diverse wildlife. These vital ecosystems are at risk from the unregulated and unsustainable tourist visits that cause detrimental effects on the environment and host communities. Hence (DO), sustainable planning and management approaches should (FP-Rec) be considered. This study used Boullon’s Carrying Capacity Mathematical Model adopted from the Ecosystems Research and Development Bureau for computing the Tourism Carrying Capacity (TCC) of Sasmuan Pampanga Coastal Wetlands. Data on the parameters needed in TCC were collected through Key Informant Interviews, direct observation of the site, and a questionnaire-based survey for the tourism-related preferences and residents’ perceived impact of tourism activities. The Real Carrying Capacity per day was found to be a total of 13 boats and 156 visitors for fishing activity on the river stretch of [REDACTED], 14 visitors in the [REDACTED], while 420 visitors for aquaculture farm fishing I and 317 visitors in aquaculture farm fishing II, while 8 visitors for bangus feeding I and a total of 9 visitors for bangus feeding II. Only 5 visitors were allowed for birdwatching and 65 visitors for swimming activity. The results revealed that present visitations in these activities are still below the carrying capacity. For descriptive statistics, three-hundred fifty (350) respondents from five coastal barangays of SPCW were purposively selected. Results showed that respondents perceived tourism activities have a positive impact and equal perceptions in ecological (62.00%), economic (59.71%), social (59.71%), and visitor experiences aspects (50.86%). However, tourism activities in the area are perceived to have a negative impact on SPCW’s local facilities (54.00%). Thus (DO), local government should (FP-Rec) address the possible (EC) negative impacts of tourism activities and manage the carrying capacity for sustainable tourism.</w:t>
       </w:r>
       <w:r>
         <w:rPr>
@@ -24700,18 +24700,18 @@
           <w:strike/>
           <w:color w:val="000000"/>
         </w:rPr>
-        <w:t xml:space="preserve">should</w:t>
-      </w:r>
-      <w:r>
-        <w:rPr>
-          <w:rFonts w:ascii="Georgia" w:hAnsi="Georgia" w:cs="Georgia" w:eastAsia="Georgia"/>
-          <w:sz w:val="22"/>
-          <w:szCs w:val="22"/>
-          <w:b w:val="0"/>
-          <w:bCs w:val="0"/>
-          <w:color w:val="000000"/>
-        </w:rPr>
-        <w:t xml:space="preserve"> </w:t>
+        <w:t xml:space="preserve"/>
+      </w:r>
+      <w:r>
+        <w:rPr>
+          <w:rFonts w:ascii="Georgia" w:hAnsi="Georgia" w:cs="Georgia" w:eastAsia="Georgia"/>
+          <w:sz w:val="22"/>
+          <w:szCs w:val="22"/>
+          <w:b w:val="0"/>
+          <w:bCs w:val="0"/>
+          <w:color w:val="000000"/>
+        </w:rPr>
+        <w:t xml:space="preserve"/>
       </w:r>
       <w:r>
         <w:rPr>
@@ -24722,18 +24722,18 @@
           <w:bCs w:val="0"/>
           <w:color w:val="808080"/>
         </w:rPr>
-        <w:t xml:space="preserve">(FP-Rec)</w:t>
-      </w:r>
-      <w:r>
-        <w:rPr>
-          <w:rFonts w:ascii="Georgia" w:hAnsi="Georgia" w:cs="Georgia" w:eastAsia="Georgia"/>
-          <w:sz w:val="22"/>
-          <w:szCs w:val="22"/>
-          <w:b w:val="0"/>
-          <w:bCs w:val="0"/>
-          <w:color w:val="000000"/>
-        </w:rPr>
-        <w:t xml:space="preserve"> be considered. This study used Boullon’s Carrying Capacity Mathematical Model adopted from the Ecosystems Research and Development Bureau for computing the Tourism Carrying Capacity (TCC) of Sasmuan Pampanga Coastal Wetlands. Data on the parameters needed in TCC were collected through Key Informant Interviews, direct observation of the site, and a questionnaire-based survey for the tourism-related preferences and residents’ perceived impact of tourism activities. The Real Carrying Capacity per day was found to be a total of 13 boats and 156 visitors for fishing activity on the river stretch of [REDACTED], 14 visitors in the [REDACTED], while 420 visitors for aquaculture farm fishing I and 317 visitors in aquaculture farm fishing II, while 8 visitors for bangus feeding I and a total of 9 visitors for bangus feeding II. Only 5 visitors were allowed for birdwatching and 65 visitors for swimming activity. The results revealed that present visitations in these activities are still below the carrying capacity. For descriptive statistics, three-hundred fifty (350) respondents from five coastal barangays of SPCW were purposively selected. Results showed that respondents perceived tourism activities have a positive impact and equal perceptions in ecological (62.00%), economic (59.71%), social (59.71%), and visitor experiences aspects (50.86%). However, tourism activities in the area are perceived to have a negative impact on SPCW’s local facilities (54.00%). Thus, local government </w:t>
+        <w:t xml:space="preserve"/>
+      </w:r>
+      <w:r>
+        <w:rPr>
+          <w:rFonts w:ascii="Georgia" w:hAnsi="Georgia" w:cs="Georgia" w:eastAsia="Georgia"/>
+          <w:sz w:val="22"/>
+          <w:szCs w:val="22"/>
+          <w:b w:val="0"/>
+          <w:bCs w:val="0"/>
+          <w:color w:val="000000"/>
+        </w:rPr>
+        <w:t xml:space="preserve"/>
       </w:r>
       <w:r>
         <w:rPr>
@@ -24745,18 +24745,18 @@
           <w:strike/>
           <w:color w:val="000000"/>
         </w:rPr>
-        <w:t xml:space="preserve">should</w:t>
-      </w:r>
-      <w:r>
-        <w:rPr>
-          <w:rFonts w:ascii="Georgia" w:hAnsi="Georgia" w:cs="Georgia" w:eastAsia="Georgia"/>
-          <w:sz w:val="22"/>
-          <w:szCs w:val="22"/>
-          <w:b w:val="0"/>
-          <w:bCs w:val="0"/>
-          <w:color w:val="000000"/>
-        </w:rPr>
-        <w:t xml:space="preserve"> </w:t>
+        <w:t xml:space="preserve"/>
+      </w:r>
+      <w:r>
+        <w:rPr>
+          <w:rFonts w:ascii="Georgia" w:hAnsi="Georgia" w:cs="Georgia" w:eastAsia="Georgia"/>
+          <w:sz w:val="22"/>
+          <w:szCs w:val="22"/>
+          <w:b w:val="0"/>
+          <w:bCs w:val="0"/>
+          <w:color w:val="000000"/>
+        </w:rPr>
+        <w:t xml:space="preserve"/>
       </w:r>
       <w:r>
         <w:rPr>
@@ -24767,18 +24767,18 @@
           <w:bCs w:val="0"/>
           <w:color w:val="808080"/>
         </w:rPr>
-        <w:t xml:space="preserve">(FP-Rec)</w:t>
-      </w:r>
-      <w:r>
-        <w:rPr>
-          <w:rFonts w:ascii="Georgia" w:hAnsi="Georgia" w:cs="Georgia" w:eastAsia="Georgia"/>
-          <w:sz w:val="22"/>
-          <w:szCs w:val="22"/>
-          <w:b w:val="0"/>
-          <w:bCs w:val="0"/>
-          <w:color w:val="000000"/>
-        </w:rPr>
-        <w:t xml:space="preserve"> address the </w:t>
+        <w:t xml:space="preserve"/>
+      </w:r>
+      <w:r>
+        <w:rPr>
+          <w:rFonts w:ascii="Georgia" w:hAnsi="Georgia" w:cs="Georgia" w:eastAsia="Georgia"/>
+          <w:sz w:val="22"/>
+          <w:szCs w:val="22"/>
+          <w:b w:val="0"/>
+          <w:bCs w:val="0"/>
+          <w:color w:val="000000"/>
+        </w:rPr>
+        <w:t xml:space="preserve"/>
       </w:r>
       <w:r>
         <w:rPr>
@@ -24790,18 +24790,18 @@
           <w:highlight w:val="red"/>
           <w:color w:val="FFFFFF"/>
         </w:rPr>
-        <w:t xml:space="preserve">possible</w:t>
-      </w:r>
-      <w:r>
-        <w:rPr>
-          <w:rFonts w:ascii="Georgia" w:hAnsi="Georgia" w:cs="Georgia" w:eastAsia="Georgia"/>
-          <w:sz w:val="22"/>
-          <w:szCs w:val="22"/>
-          <w:b w:val="0"/>
-          <w:bCs w:val="0"/>
-          <w:color w:val="000000"/>
-        </w:rPr>
-        <w:t xml:space="preserve"> </w:t>
+        <w:t xml:space="preserve"/>
+      </w:r>
+      <w:r>
+        <w:rPr>
+          <w:rFonts w:ascii="Georgia" w:hAnsi="Georgia" w:cs="Georgia" w:eastAsia="Georgia"/>
+          <w:sz w:val="22"/>
+          <w:szCs w:val="22"/>
+          <w:b w:val="0"/>
+          <w:bCs w:val="0"/>
+          <w:color w:val="000000"/>
+        </w:rPr>
+        <w:t xml:space="preserve"/>
       </w:r>
       <w:r>
         <w:rPr>
@@ -24812,18 +24812,18 @@
           <w:bCs w:val="0"/>
           <w:color w:val="ED7D31"/>
         </w:rPr>
-        <w:t xml:space="preserve">(EC)</w:t>
-      </w:r>
-      <w:r>
-        <w:rPr>
-          <w:rFonts w:ascii="Georgia" w:hAnsi="Georgia" w:cs="Georgia" w:eastAsia="Georgia"/>
-          <w:sz w:val="22"/>
-          <w:szCs w:val="22"/>
-          <w:b w:val="0"/>
-          <w:bCs w:val="0"/>
-          <w:color w:val="000000"/>
-        </w:rPr>
-        <w:t xml:space="preserve"> negative impacts of tourism activities and manage the carrying capacity for sustainable tourism.</w:t>
+        <w:t xml:space="preserve"/>
+      </w:r>
+      <w:r>
+        <w:rPr>
+          <w:rFonts w:ascii="Georgia" w:hAnsi="Georgia" w:cs="Georgia" w:eastAsia="Georgia"/>
+          <w:sz w:val="22"/>
+          <w:szCs w:val="22"/>
+          <w:b w:val="0"/>
+          <w:bCs w:val="0"/>
+          <w:color w:val="000000"/>
+        </w:rPr>
+        <w:t xml:space="preserve"/>
       </w:r>
     </w:p>
     <w:p>
@@ -24867,7 +24867,7 @@
           <w:bCs w:val="0"/>
           <w:color w:val="000000"/>
         </w:rPr>
-        <w:t xml:space="preserve">Many farmers have been facing many problems towards their crops. One of the common factors affecting the production of eggplant is the pathogenic diseases. The fungal disease commonly found in Eggplant (Solanum melongena) is Cercospora leaf spot, a plant-pathogenic fungus, Cercospora melongenae. Therefore, this study aims to examine the </w:t>
+        <w:t xml:space="preserve">Many farmers have been facing many problems towards their crops. One of the common factors affecting the production of eggplant is the pathogenic diseases. The fungal disease commonly found in Eggplant (Solanum melongena) is Cercospora leaf spot, a plant-pathogenic fungus, Cercospora melongenae. Therefore (DO), this study aims to examine the potential (FP-Gen) of Trichoderma harzianum, an endophytic fungus, as a biocontrol agent for Cercospora leaf spot-on eggplants in the Philippines. Cercospora melongenae is a plant-pathogenic fungus that causes significant damage to eggplant crops, and the overuse of chemical pesticides has adverse effects on human health and the environment. As such, using alternative approaches, such as endophytic fungi, has gained attention from researchers. The study used thirty isolated leaf samples, twenty-one subcultures has been done and four different pathogenic fungi were identified. Moreover, there is an antagonistic effect of Trichoderma hazianum against the pathogenic fungi that cause disease in eggplant crops. Hence (DO), the study aimed to investigate the antagonistic potential (FP-Gen) of Trichoderma harzianum among the four isolates. The results indicate (FP-Gen) that the mean effect of Trichoderma harzianum on the test variables varied across the three days of observation. However, there was no significant difference in the effect of Trichoderma harzianum among the test variables on any of the three days, suggesting (EC) that the fungus had a similar impact on the growth of all four test variables.</w:t>
       </w:r>
       <w:r>
         <w:rPr>
@@ -24879,18 +24879,18 @@
           <w:strike/>
           <w:color w:val="000000"/>
         </w:rPr>
-        <w:t xml:space="preserve">potential</w:t>
-      </w:r>
-      <w:r>
-        <w:rPr>
-          <w:rFonts w:ascii="Georgia" w:hAnsi="Georgia" w:cs="Georgia" w:eastAsia="Georgia"/>
-          <w:sz w:val="22"/>
-          <w:szCs w:val="22"/>
-          <w:b w:val="0"/>
-          <w:bCs w:val="0"/>
-          <w:color w:val="000000"/>
-        </w:rPr>
-        <w:t xml:space="preserve"> </w:t>
+        <w:t xml:space="preserve"/>
+      </w:r>
+      <w:r>
+        <w:rPr>
+          <w:rFonts w:ascii="Georgia" w:hAnsi="Georgia" w:cs="Georgia" w:eastAsia="Georgia"/>
+          <w:sz w:val="22"/>
+          <w:szCs w:val="22"/>
+          <w:b w:val="0"/>
+          <w:bCs w:val="0"/>
+          <w:color w:val="000000"/>
+        </w:rPr>
+        <w:t xml:space="preserve"/>
       </w:r>
       <w:r>
         <w:rPr>
@@ -24901,18 +24901,18 @@
           <w:bCs w:val="0"/>
           <w:color w:val="808080"/>
         </w:rPr>
-        <w:t xml:space="preserve">(FP-Gen)</w:t>
-      </w:r>
-      <w:r>
-        <w:rPr>
-          <w:rFonts w:ascii="Georgia" w:hAnsi="Georgia" w:cs="Georgia" w:eastAsia="Georgia"/>
-          <w:sz w:val="22"/>
-          <w:szCs w:val="22"/>
-          <w:b w:val="0"/>
-          <w:bCs w:val="0"/>
-          <w:color w:val="000000"/>
-        </w:rPr>
-        <w:t xml:space="preserve"> of Trichoderma harzianum, an endophytic fungus, as a biocontrol agent for Cercospora leaf spot-on eggplants in the Philippines. Cercospora melongenae is a plant-pathogenic fungus that causes significant damage to eggplant crops, and the overuse of chemical pesticides has adverse effects on human health and the environment. As such, using alternative approaches, such as endophytic fungi, has gained attention from researchers. The study used thirty isolated leaf samples, twenty-one subcultures has been done and four different pathogenic fungi were identified. Moreover, there is an antagonistic effect of Trichoderma hazianum against the pathogenic fungi that cause disease in eggplant crops. Hence, the study aimed to investigate the antagonistic </w:t>
+        <w:t xml:space="preserve"/>
+      </w:r>
+      <w:r>
+        <w:rPr>
+          <w:rFonts w:ascii="Georgia" w:hAnsi="Georgia" w:cs="Georgia" w:eastAsia="Georgia"/>
+          <w:sz w:val="22"/>
+          <w:szCs w:val="22"/>
+          <w:b w:val="0"/>
+          <w:bCs w:val="0"/>
+          <w:color w:val="000000"/>
+        </w:rPr>
+        <w:t xml:space="preserve"/>
       </w:r>
       <w:r>
         <w:rPr>
@@ -24924,18 +24924,18 @@
           <w:strike/>
           <w:color w:val="000000"/>
         </w:rPr>
-        <w:t xml:space="preserve">potential</w:t>
-      </w:r>
-      <w:r>
-        <w:rPr>
-          <w:rFonts w:ascii="Georgia" w:hAnsi="Georgia" w:cs="Georgia" w:eastAsia="Georgia"/>
-          <w:sz w:val="22"/>
-          <w:szCs w:val="22"/>
-          <w:b w:val="0"/>
-          <w:bCs w:val="0"/>
-          <w:color w:val="000000"/>
-        </w:rPr>
-        <w:t xml:space="preserve"> </w:t>
+        <w:t xml:space="preserve"/>
+      </w:r>
+      <w:r>
+        <w:rPr>
+          <w:rFonts w:ascii="Georgia" w:hAnsi="Georgia" w:cs="Georgia" w:eastAsia="Georgia"/>
+          <w:sz w:val="22"/>
+          <w:szCs w:val="22"/>
+          <w:b w:val="0"/>
+          <w:bCs w:val="0"/>
+          <w:color w:val="000000"/>
+        </w:rPr>
+        <w:t xml:space="preserve"/>
       </w:r>
       <w:r>
         <w:rPr>
@@ -24946,18 +24946,18 @@
           <w:bCs w:val="0"/>
           <w:color w:val="808080"/>
         </w:rPr>
-        <w:t xml:space="preserve">(FP-Gen)</w:t>
-      </w:r>
-      <w:r>
-        <w:rPr>
-          <w:rFonts w:ascii="Georgia" w:hAnsi="Georgia" w:cs="Georgia" w:eastAsia="Georgia"/>
-          <w:sz w:val="22"/>
-          <w:szCs w:val="22"/>
-          <w:b w:val="0"/>
-          <w:bCs w:val="0"/>
-          <w:color w:val="000000"/>
-        </w:rPr>
-        <w:t xml:space="preserve"> of Trichoderma harzianum among the four isolates. The results </w:t>
+        <w:t xml:space="preserve"/>
+      </w:r>
+      <w:r>
+        <w:rPr>
+          <w:rFonts w:ascii="Georgia" w:hAnsi="Georgia" w:cs="Georgia" w:eastAsia="Georgia"/>
+          <w:sz w:val="22"/>
+          <w:szCs w:val="22"/>
+          <w:b w:val="0"/>
+          <w:bCs w:val="0"/>
+          <w:color w:val="000000"/>
+        </w:rPr>
+        <w:t xml:space="preserve"/>
       </w:r>
       <w:r>
         <w:rPr>
@@ -24969,18 +24969,18 @@
           <w:strike/>
           <w:color w:val="000000"/>
         </w:rPr>
-        <w:t xml:space="preserve">indicate</w:t>
-      </w:r>
-      <w:r>
-        <w:rPr>
-          <w:rFonts w:ascii="Georgia" w:hAnsi="Georgia" w:cs="Georgia" w:eastAsia="Georgia"/>
-          <w:sz w:val="22"/>
-          <w:szCs w:val="22"/>
-          <w:b w:val="0"/>
-          <w:bCs w:val="0"/>
-          <w:color w:val="000000"/>
-        </w:rPr>
-        <w:t xml:space="preserve"> </w:t>
+        <w:t xml:space="preserve"/>
+      </w:r>
+      <w:r>
+        <w:rPr>
+          <w:rFonts w:ascii="Georgia" w:hAnsi="Georgia" w:cs="Georgia" w:eastAsia="Georgia"/>
+          <w:sz w:val="22"/>
+          <w:szCs w:val="22"/>
+          <w:b w:val="0"/>
+          <w:bCs w:val="0"/>
+          <w:color w:val="000000"/>
+        </w:rPr>
+        <w:t xml:space="preserve"/>
       </w:r>
       <w:r>
         <w:rPr>
@@ -24991,18 +24991,18 @@
           <w:bCs w:val="0"/>
           <w:color w:val="808080"/>
         </w:rPr>
-        <w:t xml:space="preserve">(FP-Gen)</w:t>
-      </w:r>
-      <w:r>
-        <w:rPr>
-          <w:rFonts w:ascii="Georgia" w:hAnsi="Georgia" w:cs="Georgia" w:eastAsia="Georgia"/>
-          <w:sz w:val="22"/>
-          <w:szCs w:val="22"/>
-          <w:b w:val="0"/>
-          <w:bCs w:val="0"/>
-          <w:color w:val="000000"/>
-        </w:rPr>
-        <w:t xml:space="preserve"> that the mean effect of Trichoderma harzianum on the test variables varied across the three days of observation. However, there was no significant difference in the effect of Trichoderma harzianum among the test variables on any of the three days, </w:t>
+        <w:t xml:space="preserve"/>
+      </w:r>
+      <w:r>
+        <w:rPr>
+          <w:rFonts w:ascii="Georgia" w:hAnsi="Georgia" w:cs="Georgia" w:eastAsia="Georgia"/>
+          <w:sz w:val="22"/>
+          <w:szCs w:val="22"/>
+          <w:b w:val="0"/>
+          <w:bCs w:val="0"/>
+          <w:color w:val="000000"/>
+        </w:rPr>
+        <w:t xml:space="preserve"/>
       </w:r>
       <w:r>
         <w:rPr>
@@ -25014,18 +25014,18 @@
           <w:highlight w:val="red"/>
           <w:color w:val="FFFFFF"/>
         </w:rPr>
-        <w:t xml:space="preserve">suggesting</w:t>
-      </w:r>
-      <w:r>
-        <w:rPr>
-          <w:rFonts w:ascii="Georgia" w:hAnsi="Georgia" w:cs="Georgia" w:eastAsia="Georgia"/>
-          <w:sz w:val="22"/>
-          <w:szCs w:val="22"/>
-          <w:b w:val="0"/>
-          <w:bCs w:val="0"/>
-          <w:color w:val="000000"/>
-        </w:rPr>
-        <w:t xml:space="preserve"> </w:t>
+        <w:t xml:space="preserve"/>
+      </w:r>
+      <w:r>
+        <w:rPr>
+          <w:rFonts w:ascii="Georgia" w:hAnsi="Georgia" w:cs="Georgia" w:eastAsia="Georgia"/>
+          <w:sz w:val="22"/>
+          <w:szCs w:val="22"/>
+          <w:b w:val="0"/>
+          <w:bCs w:val="0"/>
+          <w:color w:val="000000"/>
+        </w:rPr>
+        <w:t xml:space="preserve"/>
       </w:r>
       <w:r>
         <w:rPr>
@@ -25036,18 +25036,18 @@
           <w:bCs w:val="0"/>
           <w:color w:val="ED7D31"/>
         </w:rPr>
-        <w:t xml:space="preserve">(EC)</w:t>
-      </w:r>
-      <w:r>
-        <w:rPr>
-          <w:rFonts w:ascii="Georgia" w:hAnsi="Georgia" w:cs="Georgia" w:eastAsia="Georgia"/>
-          <w:sz w:val="22"/>
-          <w:szCs w:val="22"/>
-          <w:b w:val="0"/>
-          <w:bCs w:val="0"/>
-          <w:color w:val="000000"/>
-        </w:rPr>
-        <w:t xml:space="preserve"> that the fungus had a similar impact on the growth of all four test variables.</w:t>
+        <w:t xml:space="preserve"/>
+      </w:r>
+      <w:r>
+        <w:rPr>
+          <w:rFonts w:ascii="Georgia" w:hAnsi="Georgia" w:cs="Georgia" w:eastAsia="Georgia"/>
+          <w:sz w:val="22"/>
+          <w:szCs w:val="22"/>
+          <w:b w:val="0"/>
+          <w:bCs w:val="0"/>
+          <w:color w:val="000000"/>
+        </w:rPr>
+        <w:t xml:space="preserve"/>
       </w:r>
     </w:p>
     <w:p>
@@ -25743,7 +25743,7 @@
           <w:bCs w:val="0"/>
           <w:color w:val="000000"/>
         </w:rPr>
-        <w:t xml:space="preserve">Canine heartworm (Dirofilaria immitis) infection is a significant health concern for dogs in many regions. This study investigated the association between clinical signs and microscopy/serological detection of heartworm at the [REDACTED]. Canines below six months of age and those receiving annual macrocyclic lactones were excluded. A questionnaire was utilized to collect data, and 100 single step rapid test kits canine heartworm Ag (AccuVet®) were employed along with direct blood smears. However, no positive results were observed in the diagnostic tests conducted. Thus, no significant association between clinical signs and heartworm infection </w:t>
+        <w:t xml:space="preserve">Canine heartworm (Dirofilaria immitis) infection is a significant health concern for dogs in many regions. This study investigated the association between clinical signs and microscopy/serological detection of heartworm at the [REDACTED]. Canines below six months of age and those receiving annual macrocyclic lactones were excluded. A questionnaire was utilized to collect data, and 100 single step rapid test kits canine heartworm Ag (AccuVet®) were employed along with direct blood smears. However, no positive results were observed in the diagnostic tests conducted. Thus (DO), no significant association between clinical signs and heartworm infection could (EC) be established. Recommendations include increased awareness and education about heartworm prevention, regular testing, evaluation of other diagnostic methods, collaboration and research, continuous monitoring of heartworm prevalence, individualized risk assessment, and collaboration with pet owners. These measures can (FP-Gen) collectively contribute to the effective management and prevention of heartworm disease in the local canine population. Further research with larger sample sizes and diverse populations is needed (FP-Rec) to validate these findings and enhance our understanding of heartworm infection in the study area.</w:t>
       </w:r>
       <w:r>
         <w:rPr>
@@ -25755,18 +25755,18 @@
           <w:shd w:val="clear" w:color="auto" w:fill="00B0F0"/>
           <w:color w:val="000000"/>
         </w:rPr>
-        <w:t xml:space="preserve">could</w:t>
-      </w:r>
-      <w:r>
-        <w:rPr>
-          <w:rFonts w:ascii="Georgia" w:hAnsi="Georgia" w:cs="Georgia" w:eastAsia="Georgia"/>
-          <w:sz w:val="22"/>
-          <w:szCs w:val="22"/>
-          <w:b w:val="0"/>
-          <w:bCs w:val="0"/>
-          <w:color w:val="000000"/>
-        </w:rPr>
-        <w:t xml:space="preserve"> </w:t>
+        <w:t xml:space="preserve"/>
+      </w:r>
+      <w:r>
+        <w:rPr>
+          <w:rFonts w:ascii="Georgia" w:hAnsi="Georgia" w:cs="Georgia" w:eastAsia="Georgia"/>
+          <w:sz w:val="22"/>
+          <w:szCs w:val="22"/>
+          <w:b w:val="0"/>
+          <w:bCs w:val="0"/>
+          <w:color w:val="000000"/>
+        </w:rPr>
+        <w:t xml:space="preserve"/>
       </w:r>
       <w:r>
         <w:rPr>
@@ -25777,18 +25777,18 @@
           <w:bCs w:val="0"/>
           <w:color w:val="ED7D31"/>
         </w:rPr>
-        <w:t xml:space="preserve">(EC)</w:t>
-      </w:r>
-      <w:r>
-        <w:rPr>
-          <w:rFonts w:ascii="Georgia" w:hAnsi="Georgia" w:cs="Georgia" w:eastAsia="Georgia"/>
-          <w:sz w:val="22"/>
-          <w:szCs w:val="22"/>
-          <w:b w:val="0"/>
-          <w:bCs w:val="0"/>
-          <w:color w:val="000000"/>
-        </w:rPr>
-        <w:t xml:space="preserve"> be established. Recommendations include increased awareness and education about heartworm prevention, regular testing, evaluation of other diagnostic methods, collaboration and research, continuous monitoring of heartworm prevalence, individualized risk assessment, and collaboration with pet owners. These measures </w:t>
+        <w:t xml:space="preserve"/>
+      </w:r>
+      <w:r>
+        <w:rPr>
+          <w:rFonts w:ascii="Georgia" w:hAnsi="Georgia" w:cs="Georgia" w:eastAsia="Georgia"/>
+          <w:sz w:val="22"/>
+          <w:szCs w:val="22"/>
+          <w:b w:val="0"/>
+          <w:bCs w:val="0"/>
+          <w:color w:val="000000"/>
+        </w:rPr>
+        <w:t xml:space="preserve"/>
       </w:r>
       <w:r>
         <w:rPr>
@@ -25800,18 +25800,18 @@
           <w:strike/>
           <w:color w:val="000000"/>
         </w:rPr>
-        <w:t xml:space="preserve">can</w:t>
-      </w:r>
-      <w:r>
-        <w:rPr>
-          <w:rFonts w:ascii="Georgia" w:hAnsi="Georgia" w:cs="Georgia" w:eastAsia="Georgia"/>
-          <w:sz w:val="22"/>
-          <w:szCs w:val="22"/>
-          <w:b w:val="0"/>
-          <w:bCs w:val="0"/>
-          <w:color w:val="000000"/>
-        </w:rPr>
-        <w:t xml:space="preserve"> </w:t>
+        <w:t xml:space="preserve"/>
+      </w:r>
+      <w:r>
+        <w:rPr>
+          <w:rFonts w:ascii="Georgia" w:hAnsi="Georgia" w:cs="Georgia" w:eastAsia="Georgia"/>
+          <w:sz w:val="22"/>
+          <w:szCs w:val="22"/>
+          <w:b w:val="0"/>
+          <w:bCs w:val="0"/>
+          <w:color w:val="000000"/>
+        </w:rPr>
+        <w:t xml:space="preserve"/>
       </w:r>
       <w:r>
         <w:rPr>
@@ -25822,18 +25822,18 @@
           <w:bCs w:val="0"/>
           <w:color w:val="808080"/>
         </w:rPr>
-        <w:t xml:space="preserve">(FP-Gen)</w:t>
-      </w:r>
-      <w:r>
-        <w:rPr>
-          <w:rFonts w:ascii="Georgia" w:hAnsi="Georgia" w:cs="Georgia" w:eastAsia="Georgia"/>
-          <w:sz w:val="22"/>
-          <w:szCs w:val="22"/>
-          <w:b w:val="0"/>
-          <w:bCs w:val="0"/>
-          <w:color w:val="000000"/>
-        </w:rPr>
-        <w:t xml:space="preserve"> collectively contribute to the effective management and prevention of heartworm disease in the local canine population. Further research with larger sample sizes and diverse populations is </w:t>
+        <w:t xml:space="preserve"/>
+      </w:r>
+      <w:r>
+        <w:rPr>
+          <w:rFonts w:ascii="Georgia" w:hAnsi="Georgia" w:cs="Georgia" w:eastAsia="Georgia"/>
+          <w:sz w:val="22"/>
+          <w:szCs w:val="22"/>
+          <w:b w:val="0"/>
+          <w:bCs w:val="0"/>
+          <w:color w:val="000000"/>
+        </w:rPr>
+        <w:t xml:space="preserve"/>
       </w:r>
       <w:r>
         <w:rPr>
@@ -25845,18 +25845,18 @@
           <w:strike/>
           <w:color w:val="000000"/>
         </w:rPr>
-        <w:t xml:space="preserve">needed</w:t>
-      </w:r>
-      <w:r>
-        <w:rPr>
-          <w:rFonts w:ascii="Georgia" w:hAnsi="Georgia" w:cs="Georgia" w:eastAsia="Georgia"/>
-          <w:sz w:val="22"/>
-          <w:szCs w:val="22"/>
-          <w:b w:val="0"/>
-          <w:bCs w:val="0"/>
-          <w:color w:val="000000"/>
-        </w:rPr>
-        <w:t xml:space="preserve"> </w:t>
+        <w:t xml:space="preserve"/>
+      </w:r>
+      <w:r>
+        <w:rPr>
+          <w:rFonts w:ascii="Georgia" w:hAnsi="Georgia" w:cs="Georgia" w:eastAsia="Georgia"/>
+          <w:sz w:val="22"/>
+          <w:szCs w:val="22"/>
+          <w:b w:val="0"/>
+          <w:bCs w:val="0"/>
+          <w:color w:val="000000"/>
+        </w:rPr>
+        <w:t xml:space="preserve"/>
       </w:r>
       <w:r>
         <w:rPr>
@@ -25867,18 +25867,18 @@
           <w:bCs w:val="0"/>
           <w:color w:val="808080"/>
         </w:rPr>
-        <w:t xml:space="preserve">(FP-Rec)</w:t>
-      </w:r>
-      <w:r>
-        <w:rPr>
-          <w:rFonts w:ascii="Georgia" w:hAnsi="Georgia" w:cs="Georgia" w:eastAsia="Georgia"/>
-          <w:sz w:val="22"/>
-          <w:szCs w:val="22"/>
-          <w:b w:val="0"/>
-          <w:bCs w:val="0"/>
-          <w:color w:val="000000"/>
-        </w:rPr>
-        <w:t xml:space="preserve"> to validate these findings and enhance our understanding of heartworm infection in the study area.</w:t>
+        <w:t xml:space="preserve"/>
+      </w:r>
+      <w:r>
+        <w:rPr>
+          <w:rFonts w:ascii="Georgia" w:hAnsi="Georgia" w:cs="Georgia" w:eastAsia="Georgia"/>
+          <w:sz w:val="22"/>
+          <w:szCs w:val="22"/>
+          <w:b w:val="0"/>
+          <w:bCs w:val="0"/>
+          <w:color w:val="000000"/>
+        </w:rPr>
+        <w:t xml:space="preserve"/>
       </w:r>
     </w:p>
     <w:p>
@@ -26011,7 +26011,7 @@
           <w:bCs w:val="0"/>
           <w:color w:val="000000"/>
         </w:rPr>
-        <w:t xml:space="preserve">Plastic pollution has been a long-standing environmental concern due to improper waste management. Its persistence in marine environments, particularly in the form of microplastics, posed </w:t>
+        <w:t xml:space="preserve">Plastic pollution has been a long-standing environmental concern due to improper waste management. Its persistence in marine environments, particularly in the form of microplastics, posed potential (EC) health risks to aquatic species and humans through seafood consumption. This study was conducted to detect microplastics in Whiteleg shrimp (Litopenaeus vannamei) sold at the [REDACTED]. A total of 10 shrimp samples per stall were collected, equating to 30 shrimps overall from the 3 stalls available. Composite sampling was applied in this study; hence (DO), all individual shrimps from each stall were counted as one sample. The samples were separated into two treatments: Treatment 1, which consisted of the hepatopancreas and gastrointestinal tract of the shrimp, and Treatment 2, which consisted of the shrimp muscle. The samples were subjected to light microscopy and were categorized as follows: Treatment 1 Stall 1 (T1S1), Treatment 1 Stall 2 (T1S2), Treatment 1 Stall 3 (T1S3), Treatment 2 Stall 1 (T2S1), Treatment 2 Stall 2 (T2S2), and Treatment 2 Stall 3 (T2S3). Each sample was added to a 10% KOH solution for the digestion of soft tissue. Afterwards, 60% sodium iodide was used for the density separation of microplastics and undigested organic matter. The supernatant was collected using a pipette and then transferred to a slide before subjecting to a light microscope. In each slide, 10 µl of sample was placed. This was repeated five times in separate slides. A total of 181 microplastics were detected across all samples, wherein the concentration of microplastics was higher in Treatment 1 (74.03%). Fragments (39.02%) were the most dominant shape, followed by fibers (23.20%), lines (17.13%), and then pellets (3.31%). The most dominant color was gray (33.15%), followed by blue (24.31%), black (11.6%), red (9.39%), clear (7.73%), brown (6.63%), violet (3.31%), yellow (3.31%), and green (0.55%). Most of the particles ranged in size from 11–50 µm (58.01%), followed by &lt;10.9 µm (29.83%), 51–100 µm (6.08%), 101–200 µm (5.52%), and &gt;201 µm (1.10%). Through random sampling, one microplastic was selected from each shape for polymer analysis using Fourier Transform Infrared Spectroscopy (FTIR). The fragment had a 97% match with high-density polyethylene, the fiber had a 90% match with an olefin copolymer, and the line sample had a 96% match with polypropylene, while the pellet sample was rejected for analysis due to its small size. To reduce microplastic pollution, the findings recommend (FP-Rec) removing the shrimp’s GIT during preparation to avoid ingestion, use fishing gear made from durable or natural materials, regularly maintain and replace worn equipment, and properly dispose of plastics instead of discarding them into water bodies.</w:t>
       </w:r>
       <w:r>
         <w:rPr>
@@ -26023,18 +26023,18 @@
           <w:highlight w:val="red"/>
           <w:color w:val="FFFFFF"/>
         </w:rPr>
-        <w:t xml:space="preserve">potential</w:t>
-      </w:r>
-      <w:r>
-        <w:rPr>
-          <w:rFonts w:ascii="Georgia" w:hAnsi="Georgia" w:cs="Georgia" w:eastAsia="Georgia"/>
-          <w:sz w:val="22"/>
-          <w:szCs w:val="22"/>
-          <w:b w:val="0"/>
-          <w:bCs w:val="0"/>
-          <w:color w:val="000000"/>
-        </w:rPr>
-        <w:t xml:space="preserve"> </w:t>
+        <w:t xml:space="preserve"/>
+      </w:r>
+      <w:r>
+        <w:rPr>
+          <w:rFonts w:ascii="Georgia" w:hAnsi="Georgia" w:cs="Georgia" w:eastAsia="Georgia"/>
+          <w:sz w:val="22"/>
+          <w:szCs w:val="22"/>
+          <w:b w:val="0"/>
+          <w:bCs w:val="0"/>
+          <w:color w:val="000000"/>
+        </w:rPr>
+        <w:t xml:space="preserve"/>
       </w:r>
       <w:r>
         <w:rPr>
@@ -26045,18 +26045,18 @@
           <w:bCs w:val="0"/>
           <w:color w:val="ED7D31"/>
         </w:rPr>
-        <w:t xml:space="preserve">(EC)</w:t>
-      </w:r>
-      <w:r>
-        <w:rPr>
-          <w:rFonts w:ascii="Georgia" w:hAnsi="Georgia" w:cs="Georgia" w:eastAsia="Georgia"/>
-          <w:sz w:val="22"/>
-          <w:szCs w:val="22"/>
-          <w:b w:val="0"/>
-          <w:bCs w:val="0"/>
-          <w:color w:val="000000"/>
-        </w:rPr>
-        <w:t xml:space="preserve"> health risks to aquatic species and humans through seafood consumption. This study was conducted to detect microplastics in Whiteleg shrimp (Litopenaeus vannamei) sold at the [REDACTED]. A total of 10 shrimp samples per stall were collected, equating to 30 shrimps overall from the 3 stalls available. Composite sampling was applied in this study; hence, all individual shrimps from each stall were counted as one sample. The samples were separated into two treatments: Treatment 1, which consisted of the hepatopancreas and gastrointestinal tract of the shrimp, and Treatment 2, which consisted of the shrimp muscle. The samples were subjected to light microscopy and were categorized as follows: Treatment 1 Stall 1 (T1S1), Treatment 1 Stall 2 (T1S2), Treatment 1 Stall 3 (T1S3), Treatment 2 Stall 1 (T2S1), Treatment 2 Stall 2 (T2S2), and Treatment 2 Stall 3 (T2S3). Each sample was added to a 10% KOH solution for the digestion of soft tissue. Afterwards, 60% sodium iodide was used for the density separation of microplastics and undigested organic matter. The supernatant was collected using a pipette and then transferred to a slide before subjecting to a light microscope. In each slide, 10 µl of sample was placed. This was repeated five times in separate slides. A total of 181 microplastics were detected across all samples, wherein the concentration of microplastics was higher in Treatment 1 (74.03%). Fragments (39.02%) were the most dominant shape, followed by fibers (23.20%), lines (17.13%), and then pellets (3.31%). The most dominant color was gray (33.15%), followed by blue (24.31%), black (11.6%), red (9.39%), clear (7.73%), brown (6.63%), violet (3.31%), yellow (3.31%), and green (0.55%). Most of the particles ranged in size from 11–50 µm (58.01%), followed by &lt;10.9 µm (29.83%), 51–100 µm (6.08%), 101–200 µm (5.52%), and &gt;201 µm (1.10%). Through random sampling, one microplastic was selected from each shape for polymer analysis using Fourier Transform Infrared Spectroscopy (FTIR). The fragment had a 97% match with high-density polyethylene, the fiber had a 90% match with an olefin copolymer, and the line sample had a 96% match with polypropylene, while the pellet sample was rejected for analysis due to its small size. To reduce microplastic pollution, the findings </w:t>
+        <w:t xml:space="preserve"/>
+      </w:r>
+      <w:r>
+        <w:rPr>
+          <w:rFonts w:ascii="Georgia" w:hAnsi="Georgia" w:cs="Georgia" w:eastAsia="Georgia"/>
+          <w:sz w:val="22"/>
+          <w:szCs w:val="22"/>
+          <w:b w:val="0"/>
+          <w:bCs w:val="0"/>
+          <w:color w:val="000000"/>
+        </w:rPr>
+        <w:t xml:space="preserve"/>
       </w:r>
       <w:r>
         <w:rPr>
@@ -26068,18 +26068,18 @@
           <w:strike/>
           <w:color w:val="000000"/>
         </w:rPr>
-        <w:t xml:space="preserve">recommend</w:t>
-      </w:r>
-      <w:r>
-        <w:rPr>
-          <w:rFonts w:ascii="Georgia" w:hAnsi="Georgia" w:cs="Georgia" w:eastAsia="Georgia"/>
-          <w:sz w:val="22"/>
-          <w:szCs w:val="22"/>
-          <w:b w:val="0"/>
-          <w:bCs w:val="0"/>
-          <w:color w:val="000000"/>
-        </w:rPr>
-        <w:t xml:space="preserve"> </w:t>
+        <w:t xml:space="preserve"/>
+      </w:r>
+      <w:r>
+        <w:rPr>
+          <w:rFonts w:ascii="Georgia" w:hAnsi="Georgia" w:cs="Georgia" w:eastAsia="Georgia"/>
+          <w:sz w:val="22"/>
+          <w:szCs w:val="22"/>
+          <w:b w:val="0"/>
+          <w:bCs w:val="0"/>
+          <w:color w:val="000000"/>
+        </w:rPr>
+        <w:t xml:space="preserve"/>
       </w:r>
       <w:r>
         <w:rPr>
@@ -26090,18 +26090,18 @@
           <w:bCs w:val="0"/>
           <w:color w:val="808080"/>
         </w:rPr>
-        <w:t xml:space="preserve">(FP-Rec)</w:t>
-      </w:r>
-      <w:r>
-        <w:rPr>
-          <w:rFonts w:ascii="Georgia" w:hAnsi="Georgia" w:cs="Georgia" w:eastAsia="Georgia"/>
-          <w:sz w:val="22"/>
-          <w:szCs w:val="22"/>
-          <w:b w:val="0"/>
-          <w:bCs w:val="0"/>
-          <w:color w:val="000000"/>
-        </w:rPr>
-        <w:t xml:space="preserve"> removing the shrimp’s GIT during preparation to avoid ingestion, use fishing gear made from durable or natural materials, regularly maintain and replace worn equipment, and properly dispose of plastics instead of discarding them into water bodies.</w:t>
+        <w:t xml:space="preserve"/>
+      </w:r>
+      <w:r>
+        <w:rPr>
+          <w:rFonts w:ascii="Georgia" w:hAnsi="Georgia" w:cs="Georgia" w:eastAsia="Georgia"/>
+          <w:sz w:val="22"/>
+          <w:szCs w:val="22"/>
+          <w:b w:val="0"/>
+          <w:bCs w:val="0"/>
+          <w:color w:val="000000"/>
+        </w:rPr>
+        <w:t xml:space="preserve"/>
       </w:r>
     </w:p>
     <w:p>
@@ -26301,7 +26301,7 @@
           <w:bCs w:val="0"/>
           <w:color w:val="000000"/>
         </w:rPr>
-        <w:t xml:space="preserve">The African swine fever (ASF) is an ongoing global disease of swine presenting clinical signs similar to hog cholera and causing significant socioeconomic problems. Studies on the detection of ASF virus focus on using viremic blood and lymph tissues from infected pigs at the farm level. Hence, this study aimed to detect ASF virus from suspected pork samples from [REDACTED] using a survey questionnaire and molecular diagnostic methods. Profiling of meat retail vendors revealed that commercial farms and public markets were their principal sources of meat. PCR assay showed that no sample tested positive for ASF. The result of collective community and government efforts </w:t>
+        <w:t xml:space="preserve">The African swine fever (ASF) is an ongoing global disease of swine presenting clinical signs similar to hog cholera and causing significant socioeconomic problems. Studies on the detection of ASF virus focus on using viremic blood and lymph tissues from infected pigs at the farm level. Hence (DO), this study aimed to detect ASF virus from suspected pork samples from [REDACTED] using a survey questionnaire and molecular diagnostic methods. Profiling of meat retail vendors revealed that commercial farms and public markets were their principal sources of meat. PCR assay showed that no sample tested positive for ASF. The result of collective community and government efforts might (EC) be effective in preventing, controlling, and managing the spread of ASF, but it is not conclusive that ASF is not present in the municipality of [REDACTED]. Nevertheless, it is recommended (FP-Rec) to consider monitoring and surveillance of ASF at the market level, and maintain and continue the strict implementation of collaborative efforts to effectively and efficiently prevent and control the further entry and spread of ASF from farm to farm.</w:t>
       </w:r>
       <w:r>
         <w:rPr>
@@ -26313,18 +26313,18 @@
           <w:shd w:val="clear" w:color="auto" w:fill="00B0F0"/>
           <w:color w:val="000000"/>
         </w:rPr>
-        <w:t xml:space="preserve">might</w:t>
-      </w:r>
-      <w:r>
-        <w:rPr>
-          <w:rFonts w:ascii="Georgia" w:hAnsi="Georgia" w:cs="Georgia" w:eastAsia="Georgia"/>
-          <w:sz w:val="22"/>
-          <w:szCs w:val="22"/>
-          <w:b w:val="0"/>
-          <w:bCs w:val="0"/>
-          <w:color w:val="000000"/>
-        </w:rPr>
-        <w:t xml:space="preserve"> </w:t>
+        <w:t xml:space="preserve"/>
+      </w:r>
+      <w:r>
+        <w:rPr>
+          <w:rFonts w:ascii="Georgia" w:hAnsi="Georgia" w:cs="Georgia" w:eastAsia="Georgia"/>
+          <w:sz w:val="22"/>
+          <w:szCs w:val="22"/>
+          <w:b w:val="0"/>
+          <w:bCs w:val="0"/>
+          <w:color w:val="000000"/>
+        </w:rPr>
+        <w:t xml:space="preserve"/>
       </w:r>
       <w:r>
         <w:rPr>
@@ -26335,18 +26335,18 @@
           <w:bCs w:val="0"/>
           <w:color w:val="ED7D31"/>
         </w:rPr>
-        <w:t xml:space="preserve">(EC)</w:t>
-      </w:r>
-      <w:r>
-        <w:rPr>
-          <w:rFonts w:ascii="Georgia" w:hAnsi="Georgia" w:cs="Georgia" w:eastAsia="Georgia"/>
-          <w:sz w:val="22"/>
-          <w:szCs w:val="22"/>
-          <w:b w:val="0"/>
-          <w:bCs w:val="0"/>
-          <w:color w:val="000000"/>
-        </w:rPr>
-        <w:t xml:space="preserve"> be effective in preventing, controlling, and managing the spread of ASF, but it is not conclusive that ASF is not present in the municipality of [REDACTED]. Nevertheless, it is </w:t>
+        <w:t xml:space="preserve"/>
+      </w:r>
+      <w:r>
+        <w:rPr>
+          <w:rFonts w:ascii="Georgia" w:hAnsi="Georgia" w:cs="Georgia" w:eastAsia="Georgia"/>
+          <w:sz w:val="22"/>
+          <w:szCs w:val="22"/>
+          <w:b w:val="0"/>
+          <w:bCs w:val="0"/>
+          <w:color w:val="000000"/>
+        </w:rPr>
+        <w:t xml:space="preserve"/>
       </w:r>
       <w:r>
         <w:rPr>
@@ -26358,18 +26358,18 @@
           <w:strike/>
           <w:color w:val="000000"/>
         </w:rPr>
-        <w:t xml:space="preserve">recommended</w:t>
-      </w:r>
-      <w:r>
-        <w:rPr>
-          <w:rFonts w:ascii="Georgia" w:hAnsi="Georgia" w:cs="Georgia" w:eastAsia="Georgia"/>
-          <w:sz w:val="22"/>
-          <w:szCs w:val="22"/>
-          <w:b w:val="0"/>
-          <w:bCs w:val="0"/>
-          <w:color w:val="000000"/>
-        </w:rPr>
-        <w:t xml:space="preserve"> </w:t>
+        <w:t xml:space="preserve"/>
+      </w:r>
+      <w:r>
+        <w:rPr>
+          <w:rFonts w:ascii="Georgia" w:hAnsi="Georgia" w:cs="Georgia" w:eastAsia="Georgia"/>
+          <w:sz w:val="22"/>
+          <w:szCs w:val="22"/>
+          <w:b w:val="0"/>
+          <w:bCs w:val="0"/>
+          <w:color w:val="000000"/>
+        </w:rPr>
+        <w:t xml:space="preserve"/>
       </w:r>
       <w:r>
         <w:rPr>
@@ -26380,18 +26380,18 @@
           <w:bCs w:val="0"/>
           <w:color w:val="808080"/>
         </w:rPr>
-        <w:t xml:space="preserve">(FP-Rec)</w:t>
-      </w:r>
-      <w:r>
-        <w:rPr>
-          <w:rFonts w:ascii="Georgia" w:hAnsi="Georgia" w:cs="Georgia" w:eastAsia="Georgia"/>
-          <w:sz w:val="22"/>
-          <w:szCs w:val="22"/>
-          <w:b w:val="0"/>
-          <w:bCs w:val="0"/>
-          <w:color w:val="000000"/>
-        </w:rPr>
-        <w:t xml:space="preserve"> to consider monitoring and surveillance of ASF at the market level, and maintain and continue the strict implementation of collaborative efforts to effectively and efficiently prevent and control the further entry and spread of ASF from farm to farm.</w:t>
+        <w:t xml:space="preserve"/>
+      </w:r>
+      <w:r>
+        <w:rPr>
+          <w:rFonts w:ascii="Georgia" w:hAnsi="Georgia" w:cs="Georgia" w:eastAsia="Georgia"/>
+          <w:sz w:val="22"/>
+          <w:szCs w:val="22"/>
+          <w:b w:val="0"/>
+          <w:bCs w:val="0"/>
+          <w:color w:val="000000"/>
+        </w:rPr>
+        <w:t xml:space="preserve"/>
       </w:r>
     </w:p>
     <w:p>
@@ -27713,7 +27713,7 @@
           <w:bCs w:val="0"/>
           <w:color w:val="000000"/>
         </w:rPr>
-        <w:t xml:space="preserve">The study was conducted at [REDACTED], from November 2022 to February 2023 to determine the effect of rooting hormones on monstera cuttings. The study used Complete Randomized Design (CRD) with four replications. The pot experiment comprised of main treatments: T1- Control (Water), T2- Aloe Vera gel, T3- Coconut water, T4- Moringa leaves extract, and T5- ANAA. Data were evaluated using Analysis of Variance (ANOVA). Based on the results of the study, different rooting hormones did not significantly influence the days to shoot emergence, number of shoots, number of leaves, number of adventitious roots, root diameter, length of the longest roots, number of rooted cuttings, and percentage of survival cuttings. Additionally, alternative rooting hormones and synthetic hormone applications had varying survival rates. The highest survival was found in ANAA, followed by control water (distilled or filtered water), coconut water, and aloe vera gel, and the lowest survival was found in moringa leaf extract. In conclusion, the number of rooted cuttings obtained by application of aloe vera gel and moringa leaf extract was comparable in percentage survival with that obtained by application of water (distilled or filtered water) on monstera cuttings. Most </w:t>
+        <w:t xml:space="preserve">The study was conducted at [REDACTED], from November 2022 to February 2023 to determine the effect of rooting hormones on monstera cuttings. The study used Complete Randomized Design (CRD) with four replications. The pot experiment comprised of main treatments: T1- Control (Water), T2- Aloe Vera gel, T3- Coconut water, T4- Moringa leaves extract, and T5- ANAA. Data were evaluated using Analysis of Variance (ANOVA). Based on the results of the study, different rooting hormones did not significantly influence the days to shoot emergence, number of shoots, number of leaves, number of adventitious roots, root diameter, length of the longest roots, number of rooted cuttings, and percentage of survival cuttings. Additionally, alternative rooting hormones and synthetic hormone applications had varying survival rates. The highest survival was found in ANAA, followed by control water (distilled or filtered water), coconut water, and aloe vera gel, and the lowest survival was found in moringa leaf extract. In conclusion (DO), the number of rooted cuttings obtained by application of aloe vera gel and moringa leaf extract was comparable in percentage survival with that obtained by application of water (distilled or filtered water) on monstera cuttings. Most can (EC) survive the water treatment application but may (EC) not establish roots and die after several days. However, it can (FP-Cap) be derived that the application of different alternative rooting hormones has a comparable effect with synthetic rooting hormones based on the growth parameters.</w:t>
       </w:r>
       <w:r>
         <w:rPr>
@@ -27725,18 +27725,18 @@
           <w:shd w:val="clear" w:color="auto" w:fill="00B0F0"/>
           <w:color w:val="000000"/>
         </w:rPr>
-        <w:t xml:space="preserve">can</w:t>
-      </w:r>
-      <w:r>
-        <w:rPr>
-          <w:rFonts w:ascii="Georgia" w:hAnsi="Georgia" w:cs="Georgia" w:eastAsia="Georgia"/>
-          <w:sz w:val="22"/>
-          <w:szCs w:val="22"/>
-          <w:b w:val="0"/>
-          <w:bCs w:val="0"/>
-          <w:color w:val="000000"/>
-        </w:rPr>
-        <w:t xml:space="preserve"> </w:t>
+        <w:t xml:space="preserve"/>
+      </w:r>
+      <w:r>
+        <w:rPr>
+          <w:rFonts w:ascii="Georgia" w:hAnsi="Georgia" w:cs="Georgia" w:eastAsia="Georgia"/>
+          <w:sz w:val="22"/>
+          <w:szCs w:val="22"/>
+          <w:b w:val="0"/>
+          <w:bCs w:val="0"/>
+          <w:color w:val="000000"/>
+        </w:rPr>
+        <w:t xml:space="preserve"/>
       </w:r>
       <w:r>
         <w:rPr>
@@ -27747,18 +27747,18 @@
           <w:bCs w:val="0"/>
           <w:color w:val="ED7D31"/>
         </w:rPr>
-        <w:t xml:space="preserve">(EC)</w:t>
-      </w:r>
-      <w:r>
-        <w:rPr>
-          <w:rFonts w:ascii="Georgia" w:hAnsi="Georgia" w:cs="Georgia" w:eastAsia="Georgia"/>
-          <w:sz w:val="22"/>
-          <w:szCs w:val="22"/>
-          <w:b w:val="0"/>
-          <w:bCs w:val="0"/>
-          <w:color w:val="000000"/>
-        </w:rPr>
-        <w:t xml:space="preserve"> survive the water treatment application but </w:t>
+        <w:t xml:space="preserve"/>
+      </w:r>
+      <w:r>
+        <w:rPr>
+          <w:rFonts w:ascii="Georgia" w:hAnsi="Georgia" w:cs="Georgia" w:eastAsia="Georgia"/>
+          <w:sz w:val="22"/>
+          <w:szCs w:val="22"/>
+          <w:b w:val="0"/>
+          <w:bCs w:val="0"/>
+          <w:color w:val="000000"/>
+        </w:rPr>
+        <w:t xml:space="preserve"/>
       </w:r>
       <w:r>
         <w:rPr>
@@ -27770,18 +27770,18 @@
           <w:shd w:val="clear" w:color="auto" w:fill="00B0F0"/>
           <w:color w:val="000000"/>
         </w:rPr>
-        <w:t xml:space="preserve">may</w:t>
-      </w:r>
-      <w:r>
-        <w:rPr>
-          <w:rFonts w:ascii="Georgia" w:hAnsi="Georgia" w:cs="Georgia" w:eastAsia="Georgia"/>
-          <w:sz w:val="22"/>
-          <w:szCs w:val="22"/>
-          <w:b w:val="0"/>
-          <w:bCs w:val="0"/>
-          <w:color w:val="000000"/>
-        </w:rPr>
-        <w:t xml:space="preserve"> </w:t>
+        <w:t xml:space="preserve"/>
+      </w:r>
+      <w:r>
+        <w:rPr>
+          <w:rFonts w:ascii="Georgia" w:hAnsi="Georgia" w:cs="Georgia" w:eastAsia="Georgia"/>
+          <w:sz w:val="22"/>
+          <w:szCs w:val="22"/>
+          <w:b w:val="0"/>
+          <w:bCs w:val="0"/>
+          <w:color w:val="000000"/>
+        </w:rPr>
+        <w:t xml:space="preserve"/>
       </w:r>
       <w:r>
         <w:rPr>
@@ -27792,18 +27792,18 @@
           <w:bCs w:val="0"/>
           <w:color w:val="ED7D31"/>
         </w:rPr>
-        <w:t xml:space="preserve">(EC)</w:t>
-      </w:r>
-      <w:r>
-        <w:rPr>
-          <w:rFonts w:ascii="Georgia" w:hAnsi="Georgia" w:cs="Georgia" w:eastAsia="Georgia"/>
-          <w:sz w:val="22"/>
-          <w:szCs w:val="22"/>
-          <w:b w:val="0"/>
-          <w:bCs w:val="0"/>
-          <w:color w:val="000000"/>
-        </w:rPr>
-        <w:t xml:space="preserve"> not establish roots and die after several days. However, it </w:t>
+        <w:t xml:space="preserve"/>
+      </w:r>
+      <w:r>
+        <w:rPr>
+          <w:rFonts w:ascii="Georgia" w:hAnsi="Georgia" w:cs="Georgia" w:eastAsia="Georgia"/>
+          <w:sz w:val="22"/>
+          <w:szCs w:val="22"/>
+          <w:b w:val="0"/>
+          <w:bCs w:val="0"/>
+          <w:color w:val="000000"/>
+        </w:rPr>
+        <w:t xml:space="preserve"/>
       </w:r>
       <w:r>
         <w:rPr>
@@ -27815,18 +27815,18 @@
           <w:strike/>
           <w:color w:val="000000"/>
         </w:rPr>
-        <w:t xml:space="preserve">can</w:t>
-      </w:r>
-      <w:r>
-        <w:rPr>
-          <w:rFonts w:ascii="Georgia" w:hAnsi="Georgia" w:cs="Georgia" w:eastAsia="Georgia"/>
-          <w:sz w:val="22"/>
-          <w:szCs w:val="22"/>
-          <w:b w:val="0"/>
-          <w:bCs w:val="0"/>
-          <w:color w:val="000000"/>
-        </w:rPr>
-        <w:t xml:space="preserve"> </w:t>
+        <w:t xml:space="preserve"/>
+      </w:r>
+      <w:r>
+        <w:rPr>
+          <w:rFonts w:ascii="Georgia" w:hAnsi="Georgia" w:cs="Georgia" w:eastAsia="Georgia"/>
+          <w:sz w:val="22"/>
+          <w:szCs w:val="22"/>
+          <w:b w:val="0"/>
+          <w:bCs w:val="0"/>
+          <w:color w:val="000000"/>
+        </w:rPr>
+        <w:t xml:space="preserve"/>
       </w:r>
       <w:r>
         <w:rPr>
@@ -27837,18 +27837,18 @@
           <w:bCs w:val="0"/>
           <w:color w:val="808080"/>
         </w:rPr>
-        <w:t xml:space="preserve">(FP-Cap)</w:t>
-      </w:r>
-      <w:r>
-        <w:rPr>
-          <w:rFonts w:ascii="Georgia" w:hAnsi="Georgia" w:cs="Georgia" w:eastAsia="Georgia"/>
-          <w:sz w:val="22"/>
-          <w:szCs w:val="22"/>
-          <w:b w:val="0"/>
-          <w:bCs w:val="0"/>
-          <w:color w:val="000000"/>
-        </w:rPr>
-        <w:t xml:space="preserve"> be derived that the application of different alternative rooting hormones has a comparable effect with synthetic rooting hormones based on the growth parameters.</w:t>
+        <w:t xml:space="preserve"/>
+      </w:r>
+      <w:r>
+        <w:rPr>
+          <w:rFonts w:ascii="Georgia" w:hAnsi="Georgia" w:cs="Georgia" w:eastAsia="Georgia"/>
+          <w:sz w:val="22"/>
+          <w:szCs w:val="22"/>
+          <w:b w:val="0"/>
+          <w:bCs w:val="0"/>
+          <w:color w:val="000000"/>
+        </w:rPr>
+        <w:t xml:space="preserve"/>
       </w:r>
     </w:p>
     <w:p>
@@ -27892,7 +27892,7 @@
           <w:bCs w:val="0"/>
           <w:color w:val="000000"/>
         </w:rPr>
-        <w:t xml:space="preserve">The study was conducted to determine the growth and yield performance of sweet potatoes treated with seaweed extract foliar spray from December 2023 to February 2024 in [REDACTED]. The experiment utilized a Randomized Complete Block Design (RCBD) with five treatments replicated four times. Based on the results of the study, there are significant differences in the length of vines at 60 days after planting (DAP), while other parameters showed no significant differences. These include length of vines at 30 DAP and 70 DAP, number of marketable tubers per plant, number of non-marketable tubers per plant, length of tubers per plant, weight of tubers per plant, diameter of tubers per plant, computed yield per hectare, and cost and return analysis among the seaweed extract treatments. The study found that sweet potatoes treated with different seaweed extract foliar sprays showed varying levels of growth and yield. According to the Super Bureau's VSP6, all treatments had the highest mean values across all parameters. However, the positive control had the highest mean values for vine length, weight of tubers per plant, and marketable yield per sample area. Therefore, the application of seaweed extract as a bio stimulant did not significantly enhance the growth and yield of sweet potato. However, the negative control </w:t>
+        <w:t xml:space="preserve">The study was conducted to determine the growth and yield performance of sweet potatoes treated with seaweed extract foliar spray from December 2023 to February 2024 in [REDACTED]. The experiment utilized a Randomized Complete Block Design (RCBD) with five treatments replicated four times. Based on the results of the study, there are significant differences in the length of vines at 60 days after planting (DAP), while other parameters showed no significant differences. These include length of vines at 30 DAP and 70 DAP, number of marketable tubers per plant, number of non-marketable tubers per plant, length of tubers per plant, weight of tubers per plant, diameter of tubers per plant, computed yield per hectare, and cost and return analysis among the seaweed extract treatments. The study found that sweet potatoes treated with different seaweed extract foliar sprays showed varying levels of growth and yield. According to the Super Bureau's VSP6, all treatments had the highest mean values across all parameters. However, the positive control had the highest mean values for vine length, weight of tubers per plant, and marketable yield per sample area. Therefore (DO), the application of seaweed extract as a bio stimulant did not significantly enhance the growth and yield of sweet potato. However, the negative control can (FP-Cap) reduce production cost and provide the highest return on investment.</w:t>
       </w:r>
       <w:r>
         <w:rPr>
@@ -27904,18 +27904,18 @@
           <w:strike/>
           <w:color w:val="000000"/>
         </w:rPr>
-        <w:t xml:space="preserve">can</w:t>
-      </w:r>
-      <w:r>
-        <w:rPr>
-          <w:rFonts w:ascii="Georgia" w:hAnsi="Georgia" w:cs="Georgia" w:eastAsia="Georgia"/>
-          <w:sz w:val="22"/>
-          <w:szCs w:val="22"/>
-          <w:b w:val="0"/>
-          <w:bCs w:val="0"/>
-          <w:color w:val="000000"/>
-        </w:rPr>
-        <w:t xml:space="preserve"> </w:t>
+        <w:t xml:space="preserve"/>
+      </w:r>
+      <w:r>
+        <w:rPr>
+          <w:rFonts w:ascii="Georgia" w:hAnsi="Georgia" w:cs="Georgia" w:eastAsia="Georgia"/>
+          <w:sz w:val="22"/>
+          <w:szCs w:val="22"/>
+          <w:b w:val="0"/>
+          <w:bCs w:val="0"/>
+          <w:color w:val="000000"/>
+        </w:rPr>
+        <w:t xml:space="preserve"/>
       </w:r>
       <w:r>
         <w:rPr>
@@ -27926,18 +27926,18 @@
           <w:bCs w:val="0"/>
           <w:color w:val="808080"/>
         </w:rPr>
-        <w:t xml:space="preserve">(FP-Cap)</w:t>
-      </w:r>
-      <w:r>
-        <w:rPr>
-          <w:rFonts w:ascii="Georgia" w:hAnsi="Georgia" w:cs="Georgia" w:eastAsia="Georgia"/>
-          <w:sz w:val="22"/>
-          <w:szCs w:val="22"/>
-          <w:b w:val="0"/>
-          <w:bCs w:val="0"/>
-          <w:color w:val="000000"/>
-        </w:rPr>
-        <w:t xml:space="preserve"> reduce production cost and provide the highest return on investment.</w:t>
+        <w:t xml:space="preserve"/>
+      </w:r>
+      <w:r>
+        <w:rPr>
+          <w:rFonts w:ascii="Georgia" w:hAnsi="Georgia" w:cs="Georgia" w:eastAsia="Georgia"/>
+          <w:sz w:val="22"/>
+          <w:szCs w:val="22"/>
+          <w:b w:val="0"/>
+          <w:bCs w:val="0"/>
+          <w:color w:val="000000"/>
+        </w:rPr>
+        <w:t xml:space="preserve"/>
       </w:r>
     </w:p>
     <w:p>
@@ -28115,7 +28115,7 @@
           <w:bCs w:val="0"/>
           <w:color w:val="000000"/>
         </w:rPr>
-        <w:t xml:space="preserve">This study was conducted to evaluate the growth performance of Adansonii plant under different soil media over a 90-day period. Implemented in December 2024, the experiment followed a Completely Randomized Design (CRD) with five treatments: T1 — Topsoil only (control), T2 — Topsoil + Rice Hull, T3 — Topsoil + Carbonized Rice Hull, T4 — Topsoil + Vermicompost, and T5 — Topsoil + Biochar. Parameters measured included days to shoot emergence, shoot length, number of leaves, leaf area, root length, number of penetrations, and survival rate. Significant differences were observed across treatments. Treatment 2 (Rice Hull) showed the earliest shoot emergence at 15.29 days, followed by Treatment 4 (Vermicompost) at 15.83 days. These treatments also produced the longest shoots, most leaves, largest leaf areas, and highest survival rates at 87.5%. Treatment 3 (Carbonized Rice Hull) showed moderate growth improvement, while Treatments 1 (Topsoil only) and 5 (Biochar) performed poorly in most parameters, </w:t>
+        <w:t xml:space="preserve">This study was conducted to evaluate the growth performance of Adansonii plant under different soil media over a 90-day period. Implemented in December 2024, the experiment followed a Completely Randomized Design (CRD) with five treatments: T1 — Topsoil only (control), T2 — Topsoil + Rice Hull, T3 — Topsoil + Carbonized Rice Hull, T4 — Topsoil + Vermicompost, and T5 — Topsoil + Biochar. Parameters measured included days to shoot emergence, shoot length, number of leaves, leaf area, root length, number of penetrations, and survival rate. Significant differences were observed across treatments. Treatment 2 (Rice Hull) showed the earliest shoot emergence at 15.29 days, followed by Treatment 4 (Vermicompost) at 15.83 days. These treatments also produced the longest shoots, most leaves, largest leaf areas, and highest survival rates at 87.5%. Treatment 3 (Carbonized Rice Hull) showed moderate growth improvement, while Treatments 1 (Topsoil only) and 5 (Biochar) performed poorly in most parameters, indicating (FP-Gen) limited benefits. Throughout the study, plants in Treatments 2 and 4 exhibited more vigorous and healthier growth, with well-developed roots, expanded foliage, and stable shoot formation. The positive effects of rice hull and vermicompost were attributed to better nutrient availability, improved soil aeration, enhanced microbial activity, and more efficient moisture retention. In conclusion (DO), the use of rice hull and vermicompost significantly enhanced the growth and survival of Adansonii. These findings highlight their potential (EC) as effective, low-cost, and sustainable soil amendments for ornamental and horticultural cultivation, offering practical options for growers seeking eco-friendly methods to improve plant performance.</w:t>
       </w:r>
       <w:r>
         <w:rPr>
@@ -28127,18 +28127,18 @@
           <w:strike/>
           <w:color w:val="000000"/>
         </w:rPr>
-        <w:t xml:space="preserve">indicating</w:t>
-      </w:r>
-      <w:r>
-        <w:rPr>
-          <w:rFonts w:ascii="Georgia" w:hAnsi="Georgia" w:cs="Georgia" w:eastAsia="Georgia"/>
-          <w:sz w:val="22"/>
-          <w:szCs w:val="22"/>
-          <w:b w:val="0"/>
-          <w:bCs w:val="0"/>
-          <w:color w:val="000000"/>
-        </w:rPr>
-        <w:t xml:space="preserve"> </w:t>
+        <w:t xml:space="preserve"/>
+      </w:r>
+      <w:r>
+        <w:rPr>
+          <w:rFonts w:ascii="Georgia" w:hAnsi="Georgia" w:cs="Georgia" w:eastAsia="Georgia"/>
+          <w:sz w:val="22"/>
+          <w:szCs w:val="22"/>
+          <w:b w:val="0"/>
+          <w:bCs w:val="0"/>
+          <w:color w:val="000000"/>
+        </w:rPr>
+        <w:t xml:space="preserve"/>
       </w:r>
       <w:r>
         <w:rPr>
@@ -28149,18 +28149,18 @@
           <w:bCs w:val="0"/>
           <w:color w:val="808080"/>
         </w:rPr>
-        <w:t xml:space="preserve">(FP-Gen)</w:t>
-      </w:r>
-      <w:r>
-        <w:rPr>
-          <w:rFonts w:ascii="Georgia" w:hAnsi="Georgia" w:cs="Georgia" w:eastAsia="Georgia"/>
-          <w:sz w:val="22"/>
-          <w:szCs w:val="22"/>
-          <w:b w:val="0"/>
-          <w:bCs w:val="0"/>
-          <w:color w:val="000000"/>
-        </w:rPr>
-        <w:t xml:space="preserve"> limited benefits. Throughout the study, plants in Treatments 2 and 4 exhibited more vigorous and healthier growth, with well-developed roots, expanded foliage, and stable shoot formation. The positive effects of rice hull and vermicompost were attributed to better nutrient availability, improved soil aeration, enhanced microbial activity, and more efficient moisture retention. In conclusion, the use of rice hull and vermicompost significantly enhanced the growth and survival of Adansonii. These findings highlight their </w:t>
+        <w:t xml:space="preserve"/>
+      </w:r>
+      <w:r>
+        <w:rPr>
+          <w:rFonts w:ascii="Georgia" w:hAnsi="Georgia" w:cs="Georgia" w:eastAsia="Georgia"/>
+          <w:sz w:val="22"/>
+          <w:szCs w:val="22"/>
+          <w:b w:val="0"/>
+          <w:bCs w:val="0"/>
+          <w:color w:val="000000"/>
+        </w:rPr>
+        <w:t xml:space="preserve"/>
       </w:r>
       <w:r>
         <w:rPr>
@@ -28172,18 +28172,18 @@
           <w:highlight w:val="red"/>
           <w:color w:val="FFFFFF"/>
         </w:rPr>
-        <w:t xml:space="preserve">potential</w:t>
-      </w:r>
-      <w:r>
-        <w:rPr>
-          <w:rFonts w:ascii="Georgia" w:hAnsi="Georgia" w:cs="Georgia" w:eastAsia="Georgia"/>
-          <w:sz w:val="22"/>
-          <w:szCs w:val="22"/>
-          <w:b w:val="0"/>
-          <w:bCs w:val="0"/>
-          <w:color w:val="000000"/>
-        </w:rPr>
-        <w:t xml:space="preserve"> </w:t>
+        <w:t xml:space="preserve"/>
+      </w:r>
+      <w:r>
+        <w:rPr>
+          <w:rFonts w:ascii="Georgia" w:hAnsi="Georgia" w:cs="Georgia" w:eastAsia="Georgia"/>
+          <w:sz w:val="22"/>
+          <w:szCs w:val="22"/>
+          <w:b w:val="0"/>
+          <w:bCs w:val="0"/>
+          <w:color w:val="000000"/>
+        </w:rPr>
+        <w:t xml:space="preserve"/>
       </w:r>
       <w:r>
         <w:rPr>
@@ -28194,18 +28194,18 @@
           <w:bCs w:val="0"/>
           <w:color w:val="ED7D31"/>
         </w:rPr>
-        <w:t xml:space="preserve">(EC)</w:t>
-      </w:r>
-      <w:r>
-        <w:rPr>
-          <w:rFonts w:ascii="Georgia" w:hAnsi="Georgia" w:cs="Georgia" w:eastAsia="Georgia"/>
-          <w:sz w:val="22"/>
-          <w:szCs w:val="22"/>
-          <w:b w:val="0"/>
-          <w:bCs w:val="0"/>
-          <w:color w:val="000000"/>
-        </w:rPr>
-        <w:t xml:space="preserve"> as effective, low-cost, and sustainable soil amendments for ornamental and horticultural cultivation, offering practical options for growers seeking eco-friendly methods to improve plant performance.</w:t>
+        <w:t xml:space="preserve"/>
+      </w:r>
+      <w:r>
+        <w:rPr>
+          <w:rFonts w:ascii="Georgia" w:hAnsi="Georgia" w:cs="Georgia" w:eastAsia="Georgia"/>
+          <w:sz w:val="22"/>
+          <w:szCs w:val="22"/>
+          <w:b w:val="0"/>
+          <w:bCs w:val="0"/>
+          <w:color w:val="000000"/>
+        </w:rPr>
+        <w:t xml:space="preserve"/>
       </w:r>
     </w:p>
     <w:p>
@@ -28584,7 +28584,7 @@
           <w:bCs w:val="0"/>
           <w:color w:val="000000"/>
         </w:rPr>
-        <w:t xml:space="preserve">The field study was conducted from January 2023 to April 2023 at [REDACTED] to evaluate the performance of rice as supplemented with foliar fertilizer. The experimental design used is a randomized complete block design (RCBD) with three treatments replicated three times. The following treatments were used: T1: recommended rate of NPK based on soil analysis; T2: recommended rate of NPK + 19-19-19; and T3: recommended rate of NPK + 14-14-14. The results of the study revealed the following: a significant difference was observed in the number of productive tillers, actual yield per sample area, and computed yield per ton/ha. No significant differences were observed in terms of the number of days from transplanting to flowering, plant height, number of unproductive tillers, length of panicle, number of filled grains, number of unfilled grains, and weight of 1,000 seeds. In conclusion, T3: NPK+14-14-14 </w:t>
+        <w:t xml:space="preserve">The field study was conducted from January 2023 to April 2023 at [REDACTED] to evaluate the performance of rice as supplemented with foliar fertilizer. The experimental design used is a randomized complete block design (RCBD) with three treatments replicated three times. The following treatments were used: T1: recommended rate of NPK based on soil analysis; T2: recommended rate of NPK + 19-19-19; and T3: recommended rate of NPK + 14-14-14. The results of the study revealed the following: a significant difference was observed in the number of productive tillers, actual yield per sample area, and computed yield per ton/ha. No significant differences were observed in terms of the number of days from transplanting to flowering, plant height, number of unproductive tillers, length of panicle, number of filled grains, number of unfilled grains, and weight of 1,000 seeds. In conclusion (DO), T3: NPK+14-14-14 was [G] the most compelling treatment among all treatments in terms of producing the highest number of productive tillers and obtaining the heaviest yield per ton/ha. Cost and return analysis revealed that T3: NPK+14-14-14 had the second lowest cost of production but had the highest net income, with a corresponding amount of Php 66,089 and an ROI of 97.53%. On the other hand, insignificant differences were noted in terms of the number of days from transplanting to flowering, plant height, number of unproductive tillers, length of panicle, number of filled grains, number of unfilled grains, and weight of 1,000 seeds.</w:t>
       </w:r>
       <w:r>
         <w:rPr>
@@ -28596,18 +28596,18 @@
           <w:shd w:val="clear" w:color="auto" w:fill="bfbfbf"/>
           <w:color w:val="000000"/>
         </w:rPr>
-        <w:t xml:space="preserve">was</w:t>
-      </w:r>
-      <w:r>
-        <w:rPr>
-          <w:rFonts w:ascii="Georgia" w:hAnsi="Georgia" w:cs="Georgia" w:eastAsia="Georgia"/>
-          <w:sz w:val="22"/>
-          <w:szCs w:val="22"/>
-          <w:b w:val="0"/>
-          <w:bCs w:val="0"/>
-          <w:color w:val="000000"/>
-        </w:rPr>
-        <w:t xml:space="preserve"> [G] the most compelling treatment among all treatments in terms of producing the highest number of productive tillers and obtaining the heaviest yield per ton/ha. Cost and return analysis revealed that T3: NPK+14-14-14 had the second lowest cost of production but had the highest net income, with a corresponding amount of Php 66,089 and an ROI of 97.53%. On the other hand, insignificant differences were noted in terms of the number of days from transplanting to flowering, plant height, number of unproductive tillers, length of panicle, number of filled grains, number of unfilled grains, and weight of 1,000 seeds.</w:t>
+        <w:t xml:space="preserve"/>
+      </w:r>
+      <w:r>
+        <w:rPr>
+          <w:rFonts w:ascii="Georgia" w:hAnsi="Georgia" w:cs="Georgia" w:eastAsia="Georgia"/>
+          <w:sz w:val="22"/>
+          <w:szCs w:val="22"/>
+          <w:b w:val="0"/>
+          <w:bCs w:val="0"/>
+          <w:color w:val="000000"/>
+        </w:rPr>
+        <w:t xml:space="preserve"/>
       </w:r>
     </w:p>
     <w:p>
@@ -28836,7 +28836,7 @@
           <w:bCs w:val="0"/>
           <w:color w:val="000000"/>
         </w:rPr>
-        <w:t xml:space="preserve">A sixty three (63) days study was conducted to determine the growth performance of mallard duck fed with dietary mixed ration in [REDACTED]. A total of ninety (90), 21 days old male mallard duck were used in the study. A single factor experiment in Randomized Complete Block Design (RCBD) was used in the study. Mallard ducks were randomly divided into three (3) treatments having ten (10) mallard ducks per treatment with three (3) replications. Treatment 1 - commercial feeds; Treatment 2 - 50% commercial feeds and 50% rice bran mixed with water spinach; and Treatment 3 - 50% commercial feeds and 50% rice bran mixed with golden apple snail. Data were analyzed by using Analyzed of Variance in RCBD through the Statistical Tool for Agricultural Research (STAR) application. Treatments were compared using the Least Significant Difference (LSD). The result of the study showed in the treatments that there were no significant differences observed in feed consumption, which </w:t>
+        <w:t xml:space="preserve">A sixty three (63) days study was conducted to determine the growth performance of mallard duck fed with dietary mixed ration in [REDACTED]. A total of ninety (90), 21 days old male mallard duck were used in the study. A single factor experiment in Randomized Complete Block Design (RCBD) was used in the study. Mallard ducks were randomly divided into three (3) treatments having ten (10) mallard ducks per treatment with three (3) replications. Treatment 1 - commercial feeds; Treatment 2 - 50% commercial feeds and 50% rice bran mixed with water spinach; and Treatment 3 - 50% commercial feeds and 50% rice bran mixed with golden apple snail. Data were analyzed by using Analyzed of Variance in RCBD through the Statistical Tool for Agricultural Research (STAR) application. Treatments were compared using the Least Significant Difference (LSD). The result of the study showed in the treatments that there were no significant differences observed in feed consumption, which implies (EC) that treatments were comparable on parameters. However, final weight, gain in weight, average daily gain in weight and feed conversion ratio had highly significance differences at (P&lt;0.01). This indicates that ducks fed with 100% commercial feeds rice bran mixed with golden apple snail performed better in final weight, gain in weight, average daily gain in weight and feed conversion ratio. In conclusion (DO), proved the treatment 1(100% CF) are the most efficient compared to treatment 2 where 50% commercial feeds and 50% rice bran mixed with water spinach and treatment 3 where 50% commercial feeds and 50% rice bran mixed with golden apple snail. It can (EC) also be concluded that D1 rice bran mixed with water spinach and with golden apple snail used in the study can (FP-Cap) help minimize the cost of production, specifically the feed cost.</w:t>
       </w:r>
       <w:r>
         <w:rPr>
@@ -28848,18 +28848,18 @@
           <w:highlight w:val="red"/>
           <w:color w:val="FFFFFF"/>
         </w:rPr>
-        <w:t xml:space="preserve">implies</w:t>
-      </w:r>
-      <w:r>
-        <w:rPr>
-          <w:rFonts w:ascii="Georgia" w:hAnsi="Georgia" w:cs="Georgia" w:eastAsia="Georgia"/>
-          <w:sz w:val="22"/>
-          <w:szCs w:val="22"/>
-          <w:b w:val="0"/>
-          <w:bCs w:val="0"/>
-          <w:color w:val="000000"/>
-        </w:rPr>
-        <w:t xml:space="preserve"> </w:t>
+        <w:t xml:space="preserve"/>
+      </w:r>
+      <w:r>
+        <w:rPr>
+          <w:rFonts w:ascii="Georgia" w:hAnsi="Georgia" w:cs="Georgia" w:eastAsia="Georgia"/>
+          <w:sz w:val="22"/>
+          <w:szCs w:val="22"/>
+          <w:b w:val="0"/>
+          <w:bCs w:val="0"/>
+          <w:color w:val="000000"/>
+        </w:rPr>
+        <w:t xml:space="preserve"/>
       </w:r>
       <w:r>
         <w:rPr>
@@ -28870,18 +28870,18 @@
           <w:bCs w:val="0"/>
           <w:color w:val="ED7D31"/>
         </w:rPr>
-        <w:t xml:space="preserve">(EC)</w:t>
-      </w:r>
-      <w:r>
-        <w:rPr>
-          <w:rFonts w:ascii="Georgia" w:hAnsi="Georgia" w:cs="Georgia" w:eastAsia="Georgia"/>
-          <w:sz w:val="22"/>
-          <w:szCs w:val="22"/>
-          <w:b w:val="0"/>
-          <w:bCs w:val="0"/>
-          <w:color w:val="000000"/>
-        </w:rPr>
-        <w:t xml:space="preserve"> that treatments were comparable on parameters. However, final weight, gain in weight, average daily gain in weight and feed conversion ratio had highly significance differences at (P&lt;0.01). This indicates that ducks fed with 100% commercial feeds rice bran mixed with golden apple snail performed better in final weight, gain in weight, average daily gain in weight and feed conversion ratio. In conclusion, proved the treatment 1(100% CF) are the most efficient compared to treatment 2 where 50% commercial feeds and 50% rice bran mixed with water spinach and treatment 3 where 50% commercial feeds and 50% rice bran mixed with golden apple snail. It </w:t>
+        <w:t xml:space="preserve"/>
+      </w:r>
+      <w:r>
+        <w:rPr>
+          <w:rFonts w:ascii="Georgia" w:hAnsi="Georgia" w:cs="Georgia" w:eastAsia="Georgia"/>
+          <w:sz w:val="22"/>
+          <w:szCs w:val="22"/>
+          <w:b w:val="0"/>
+          <w:bCs w:val="0"/>
+          <w:color w:val="000000"/>
+        </w:rPr>
+        <w:t xml:space="preserve"/>
       </w:r>
       <w:r>
         <w:rPr>
@@ -28893,18 +28893,18 @@
           <w:shd w:val="clear" w:color="auto" w:fill="00B0F0"/>
           <w:color w:val="000000"/>
         </w:rPr>
-        <w:t xml:space="preserve">can</w:t>
-      </w:r>
-      <w:r>
-        <w:rPr>
-          <w:rFonts w:ascii="Georgia" w:hAnsi="Georgia" w:cs="Georgia" w:eastAsia="Georgia"/>
-          <w:sz w:val="22"/>
-          <w:szCs w:val="22"/>
-          <w:b w:val="0"/>
-          <w:bCs w:val="0"/>
-          <w:color w:val="000000"/>
-        </w:rPr>
-        <w:t xml:space="preserve"> </w:t>
+        <w:t xml:space="preserve"/>
+      </w:r>
+      <w:r>
+        <w:rPr>
+          <w:rFonts w:ascii="Georgia" w:hAnsi="Georgia" w:cs="Georgia" w:eastAsia="Georgia"/>
+          <w:sz w:val="22"/>
+          <w:szCs w:val="22"/>
+          <w:b w:val="0"/>
+          <w:bCs w:val="0"/>
+          <w:color w:val="000000"/>
+        </w:rPr>
+        <w:t xml:space="preserve"/>
       </w:r>
       <w:r>
         <w:rPr>
@@ -28915,18 +28915,18 @@
           <w:bCs w:val="0"/>
           <w:color w:val="ED7D31"/>
         </w:rPr>
-        <w:t xml:space="preserve">(EC)</w:t>
-      </w:r>
-      <w:r>
-        <w:rPr>
-          <w:rFonts w:ascii="Georgia" w:hAnsi="Georgia" w:cs="Georgia" w:eastAsia="Georgia"/>
-          <w:sz w:val="22"/>
-          <w:szCs w:val="22"/>
-          <w:b w:val="0"/>
-          <w:bCs w:val="0"/>
-          <w:color w:val="000000"/>
-        </w:rPr>
-        <w:t xml:space="preserve"> also be concluded that D1 rice bran mixed with water spinach and with golden apple snail used in the study </w:t>
+        <w:t xml:space="preserve"/>
+      </w:r>
+      <w:r>
+        <w:rPr>
+          <w:rFonts w:ascii="Georgia" w:hAnsi="Georgia" w:cs="Georgia" w:eastAsia="Georgia"/>
+          <w:sz w:val="22"/>
+          <w:szCs w:val="22"/>
+          <w:b w:val="0"/>
+          <w:bCs w:val="0"/>
+          <w:color w:val="000000"/>
+        </w:rPr>
+        <w:t xml:space="preserve"/>
       </w:r>
       <w:r>
         <w:rPr>
@@ -28938,18 +28938,18 @@
           <w:strike/>
           <w:color w:val="000000"/>
         </w:rPr>
-        <w:t xml:space="preserve">can</w:t>
-      </w:r>
-      <w:r>
-        <w:rPr>
-          <w:rFonts w:ascii="Georgia" w:hAnsi="Georgia" w:cs="Georgia" w:eastAsia="Georgia"/>
-          <w:sz w:val="22"/>
-          <w:szCs w:val="22"/>
-          <w:b w:val="0"/>
-          <w:bCs w:val="0"/>
-          <w:color w:val="000000"/>
-        </w:rPr>
-        <w:t xml:space="preserve"> </w:t>
+        <w:t xml:space="preserve"/>
+      </w:r>
+      <w:r>
+        <w:rPr>
+          <w:rFonts w:ascii="Georgia" w:hAnsi="Georgia" w:cs="Georgia" w:eastAsia="Georgia"/>
+          <w:sz w:val="22"/>
+          <w:szCs w:val="22"/>
+          <w:b w:val="0"/>
+          <w:bCs w:val="0"/>
+          <w:color w:val="000000"/>
+        </w:rPr>
+        <w:t xml:space="preserve"/>
       </w:r>
       <w:r>
         <w:rPr>
@@ -28960,18 +28960,18 @@
           <w:bCs w:val="0"/>
           <w:color w:val="808080"/>
         </w:rPr>
-        <w:t xml:space="preserve">(FP-Cap)</w:t>
-      </w:r>
-      <w:r>
-        <w:rPr>
-          <w:rFonts w:ascii="Georgia" w:hAnsi="Georgia" w:cs="Georgia" w:eastAsia="Georgia"/>
-          <w:sz w:val="22"/>
-          <w:szCs w:val="22"/>
-          <w:b w:val="0"/>
-          <w:bCs w:val="0"/>
-          <w:color w:val="000000"/>
-        </w:rPr>
-        <w:t xml:space="preserve"> help minimize the cost of production, specifically the feed cost.</w:t>
+        <w:t xml:space="preserve"/>
+      </w:r>
+      <w:r>
+        <w:rPr>
+          <w:rFonts w:ascii="Georgia" w:hAnsi="Georgia" w:cs="Georgia" w:eastAsia="Georgia"/>
+          <w:sz w:val="22"/>
+          <w:szCs w:val="22"/>
+          <w:b w:val="0"/>
+          <w:bCs w:val="0"/>
+          <w:color w:val="000000"/>
+        </w:rPr>
+        <w:t xml:space="preserve"/>
       </w:r>
     </w:p>
     <w:p>
@@ -29350,7 +29350,7 @@
           <w:bCs w:val="0"/>
           <w:color w:val="000000"/>
         </w:rPr>
-        <w:t xml:space="preserve">This study was conducted over a 35-day period from May 10, 2023, to June 14, 2023, at [REDACTED]. The present study aimed to determine the growth response of crossbred New Zealand rabbits as influenced by varying levels of fermented Madre De Agua leaves. Eighteen (18), 2 months of crossbreed New Zealand rabbits were used in the study which were divided into three (3) treatments: T1 = 70% concentrate + 30% paragrass, T2 = 70% concentrate + 20% paragrass + 10% fermented Madre De Agua, T3 = 60% concentrate + 20% paragrass + 20% fermented Madre De Agua. A Completely Randomized Design was employed, and data was analyzed through ANOVA by Statistical Tool for Agricultural Research (STAR). Statistical analysis showed that there was no significant difference but showed numerical trends among the treatments in relation to initial weight, final weight, gain in weight, average daily gain, dry matter intake, and feed conversion ratio of the experimental rabbits In conclusion, all treatments are comparable in terms of growth, </w:t>
+        <w:t xml:space="preserve">This study was conducted over a 35-day period from May 10, 2023, to June 14, 2023, at [REDACTED]. The present study aimed to determine the growth response of crossbred New Zealand rabbits as influenced by varying levels of fermented Madre De Agua leaves. Eighteen (18), 2 months of crossbreed New Zealand rabbits were used in the study which were divided into three (3) treatments: T1 = 70% concentrate + 30% paragrass, T2 = 70% concentrate + 20% paragrass + 10% fermented Madre De Agua, T3 = 60% concentrate + 20% paragrass + 20% fermented Madre De Agua. A Completely Randomized Design was employed, and data was analyzed through ANOVA by Statistical Tool for Agricultural Research (STAR). Statistical analysis showed that there was no significant difference but showed numerical trends among the treatments in relation to initial weight, final weight, gain in weight, average daily gain, dry matter intake, and feed conversion ratio of the experimental rabbits In conclusion (DO), all treatments are comparable in terms of growth, implying (EC) that Fermented Madre de Agua is a viable feed component under these conditions. Feeding 20% fermented Madre De Agua may (EC) improve final weight, while feeding 10% fermented Madre De Agua may (EC) reduce dry matter intake.</w:t>
       </w:r>
       <w:r>
         <w:rPr>
@@ -29362,18 +29362,18 @@
           <w:highlight w:val="red"/>
           <w:color w:val="FFFFFF"/>
         </w:rPr>
-        <w:t xml:space="preserve">implying</w:t>
-      </w:r>
-      <w:r>
-        <w:rPr>
-          <w:rFonts w:ascii="Georgia" w:hAnsi="Georgia" w:cs="Georgia" w:eastAsia="Georgia"/>
-          <w:sz w:val="22"/>
-          <w:szCs w:val="22"/>
-          <w:b w:val="0"/>
-          <w:bCs w:val="0"/>
-          <w:color w:val="000000"/>
-        </w:rPr>
-        <w:t xml:space="preserve"> </w:t>
+        <w:t xml:space="preserve"/>
+      </w:r>
+      <w:r>
+        <w:rPr>
+          <w:rFonts w:ascii="Georgia" w:hAnsi="Georgia" w:cs="Georgia" w:eastAsia="Georgia"/>
+          <w:sz w:val="22"/>
+          <w:szCs w:val="22"/>
+          <w:b w:val="0"/>
+          <w:bCs w:val="0"/>
+          <w:color w:val="000000"/>
+        </w:rPr>
+        <w:t xml:space="preserve"/>
       </w:r>
       <w:r>
         <w:rPr>
@@ -29384,18 +29384,18 @@
           <w:bCs w:val="0"/>
           <w:color w:val="ED7D31"/>
         </w:rPr>
-        <w:t xml:space="preserve">(EC)</w:t>
-      </w:r>
-      <w:r>
-        <w:rPr>
-          <w:rFonts w:ascii="Georgia" w:hAnsi="Georgia" w:cs="Georgia" w:eastAsia="Georgia"/>
-          <w:sz w:val="22"/>
-          <w:szCs w:val="22"/>
-          <w:b w:val="0"/>
-          <w:bCs w:val="0"/>
-          <w:color w:val="000000"/>
-        </w:rPr>
-        <w:t xml:space="preserve"> that Fermented Madre de Agua is a viable feed component under these conditions. Feeding 20% fermented Madre De Agua </w:t>
+        <w:t xml:space="preserve"/>
+      </w:r>
+      <w:r>
+        <w:rPr>
+          <w:rFonts w:ascii="Georgia" w:hAnsi="Georgia" w:cs="Georgia" w:eastAsia="Georgia"/>
+          <w:sz w:val="22"/>
+          <w:szCs w:val="22"/>
+          <w:b w:val="0"/>
+          <w:bCs w:val="0"/>
+          <w:color w:val="000000"/>
+        </w:rPr>
+        <w:t xml:space="preserve"/>
       </w:r>
       <w:r>
         <w:rPr>
@@ -29407,18 +29407,18 @@
           <w:shd w:val="clear" w:color="auto" w:fill="00B0F0"/>
           <w:color w:val="000000"/>
         </w:rPr>
-        <w:t xml:space="preserve">may</w:t>
-      </w:r>
-      <w:r>
-        <w:rPr>
-          <w:rFonts w:ascii="Georgia" w:hAnsi="Georgia" w:cs="Georgia" w:eastAsia="Georgia"/>
-          <w:sz w:val="22"/>
-          <w:szCs w:val="22"/>
-          <w:b w:val="0"/>
-          <w:bCs w:val="0"/>
-          <w:color w:val="000000"/>
-        </w:rPr>
-        <w:t xml:space="preserve"> </w:t>
+        <w:t xml:space="preserve"/>
+      </w:r>
+      <w:r>
+        <w:rPr>
+          <w:rFonts w:ascii="Georgia" w:hAnsi="Georgia" w:cs="Georgia" w:eastAsia="Georgia"/>
+          <w:sz w:val="22"/>
+          <w:szCs w:val="22"/>
+          <w:b w:val="0"/>
+          <w:bCs w:val="0"/>
+          <w:color w:val="000000"/>
+        </w:rPr>
+        <w:t xml:space="preserve"/>
       </w:r>
       <w:r>
         <w:rPr>
@@ -29429,18 +29429,18 @@
           <w:bCs w:val="0"/>
           <w:color w:val="ED7D31"/>
         </w:rPr>
-        <w:t xml:space="preserve">(EC)</w:t>
-      </w:r>
-      <w:r>
-        <w:rPr>
-          <w:rFonts w:ascii="Georgia" w:hAnsi="Georgia" w:cs="Georgia" w:eastAsia="Georgia"/>
-          <w:sz w:val="22"/>
-          <w:szCs w:val="22"/>
-          <w:b w:val="0"/>
-          <w:bCs w:val="0"/>
-          <w:color w:val="000000"/>
-        </w:rPr>
-        <w:t xml:space="preserve"> improve final weight, while feeding 10% fermented Madre De Agua </w:t>
+        <w:t xml:space="preserve"/>
+      </w:r>
+      <w:r>
+        <w:rPr>
+          <w:rFonts w:ascii="Georgia" w:hAnsi="Georgia" w:cs="Georgia" w:eastAsia="Georgia"/>
+          <w:sz w:val="22"/>
+          <w:szCs w:val="22"/>
+          <w:b w:val="0"/>
+          <w:bCs w:val="0"/>
+          <w:color w:val="000000"/>
+        </w:rPr>
+        <w:t xml:space="preserve"/>
       </w:r>
       <w:r>
         <w:rPr>
@@ -29452,18 +29452,18 @@
           <w:shd w:val="clear" w:color="auto" w:fill="00B0F0"/>
           <w:color w:val="000000"/>
         </w:rPr>
-        <w:t xml:space="preserve">may</w:t>
-      </w:r>
-      <w:r>
-        <w:rPr>
-          <w:rFonts w:ascii="Georgia" w:hAnsi="Georgia" w:cs="Georgia" w:eastAsia="Georgia"/>
-          <w:sz w:val="22"/>
-          <w:szCs w:val="22"/>
-          <w:b w:val="0"/>
-          <w:bCs w:val="0"/>
-          <w:color w:val="000000"/>
-        </w:rPr>
-        <w:t xml:space="preserve"> </w:t>
+        <w:t xml:space="preserve"/>
+      </w:r>
+      <w:r>
+        <w:rPr>
+          <w:rFonts w:ascii="Georgia" w:hAnsi="Georgia" w:cs="Georgia" w:eastAsia="Georgia"/>
+          <w:sz w:val="22"/>
+          <w:szCs w:val="22"/>
+          <w:b w:val="0"/>
+          <w:bCs w:val="0"/>
+          <w:color w:val="000000"/>
+        </w:rPr>
+        <w:t xml:space="preserve"/>
       </w:r>
       <w:r>
         <w:rPr>
@@ -29474,18 +29474,18 @@
           <w:bCs w:val="0"/>
           <w:color w:val="ED7D31"/>
         </w:rPr>
-        <w:t xml:space="preserve">(EC)</w:t>
-      </w:r>
-      <w:r>
-        <w:rPr>
-          <w:rFonts w:ascii="Georgia" w:hAnsi="Georgia" w:cs="Georgia" w:eastAsia="Georgia"/>
-          <w:sz w:val="22"/>
-          <w:szCs w:val="22"/>
-          <w:b w:val="0"/>
-          <w:bCs w:val="0"/>
-          <w:color w:val="000000"/>
-        </w:rPr>
-        <w:t xml:space="preserve"> reduce dry matter intake.</w:t>
+        <w:t xml:space="preserve"/>
+      </w:r>
+      <w:r>
+        <w:rPr>
+          <w:rFonts w:ascii="Georgia" w:hAnsi="Georgia" w:cs="Georgia" w:eastAsia="Georgia"/>
+          <w:sz w:val="22"/>
+          <w:szCs w:val="22"/>
+          <w:b w:val="0"/>
+          <w:bCs w:val="0"/>
+          <w:color w:val="000000"/>
+        </w:rPr>
+        <w:t xml:space="preserve"/>
       </w:r>
     </w:p>
     <w:p>
@@ -29708,7 +29708,7 @@
           <w:bCs w:val="0"/>
           <w:color w:val="000000"/>
         </w:rPr>
-        <w:t xml:space="preserve">The study was conducted at [REDACTED] from April 25 to April 30, 2023 to find out the [TITLE REDACTED] where a total of nine hundred maggots (900) were used. The experiment was laid out using Complete Randomized Design (CRD) with three (3) treatments, namely, T1 –Carbonated rice hull and saw dust, T2 – Diatomaceous Earth, and T3 –Neem tree extract. The nine hundred maggots were divided into three (3) treatments at one hundred maggots (100) per treatment each treatment was replicated three (3) times with one hundred maggots (100) per replication. The results disclosed that the percentage of mortality and moisture content were statistically significant at 1% (P&lt;0.01) and (P&lt;0.05) level with 48 hours after the post-treatment. However, mortality rate and moisture content were not significant after 6 hours and 24 hours. Therefore, it is </w:t>
+        <w:t xml:space="preserve">The study was conducted at [REDACTED] from April 25 to April 30, 2023 to find out the [TITLE REDACTED] where a total of nine hundred maggots (900) were used. The experiment was laid out using Complete Randomized Design (CRD) with three (3) treatments, namely, T1 –Carbonated rice hull and saw dust, T2 – Diatomaceous Earth, and T3 –Neem tree extract. The nine hundred maggots were divided into three (3) treatments at one hundred maggots (100) per treatment each treatment was replicated three (3) times with one hundred maggots (100) per replication. The results disclosed that the percentage of mortality and moisture content were statistically significant at 1% (P&lt;0.01) and (P&lt;0.05) level with 48 hours after the post-treatment. However, mortality rate and moisture content were not significant after 6 hours and 24 hours. Therefore (DO), it is recommended (FP-Rec) for future researchers to add Diatomaceous earth and neem tree extract and check the humidity. Extend data collection for 72 hours and 96 hours for future study.</w:t>
       </w:r>
       <w:r>
         <w:rPr>
@@ -29720,18 +29720,18 @@
           <w:strike/>
           <w:color w:val="000000"/>
         </w:rPr>
-        <w:t xml:space="preserve">recommended</w:t>
-      </w:r>
-      <w:r>
-        <w:rPr>
-          <w:rFonts w:ascii="Georgia" w:hAnsi="Georgia" w:cs="Georgia" w:eastAsia="Georgia"/>
-          <w:sz w:val="22"/>
-          <w:szCs w:val="22"/>
-          <w:b w:val="0"/>
-          <w:bCs w:val="0"/>
-          <w:color w:val="000000"/>
-        </w:rPr>
-        <w:t xml:space="preserve"> </w:t>
+        <w:t xml:space="preserve"/>
+      </w:r>
+      <w:r>
+        <w:rPr>
+          <w:rFonts w:ascii="Georgia" w:hAnsi="Georgia" w:cs="Georgia" w:eastAsia="Georgia"/>
+          <w:sz w:val="22"/>
+          <w:szCs w:val="22"/>
+          <w:b w:val="0"/>
+          <w:bCs w:val="0"/>
+          <w:color w:val="000000"/>
+        </w:rPr>
+        <w:t xml:space="preserve"/>
       </w:r>
       <w:r>
         <w:rPr>
@@ -29742,18 +29742,18 @@
           <w:bCs w:val="0"/>
           <w:color w:val="808080"/>
         </w:rPr>
-        <w:t xml:space="preserve">(FP-Rec)</w:t>
-      </w:r>
-      <w:r>
-        <w:rPr>
-          <w:rFonts w:ascii="Georgia" w:hAnsi="Georgia" w:cs="Georgia" w:eastAsia="Georgia"/>
-          <w:sz w:val="22"/>
-          <w:szCs w:val="22"/>
-          <w:b w:val="0"/>
-          <w:bCs w:val="0"/>
-          <w:color w:val="000000"/>
-        </w:rPr>
-        <w:t xml:space="preserve"> for future researchers to add Diatomaceous earth and neem tree extract and check the humidity. Extend data collection for 72 hours and 96 hours for future study.</w:t>
+        <w:t xml:space="preserve"/>
+      </w:r>
+      <w:r>
+        <w:rPr>
+          <w:rFonts w:ascii="Georgia" w:hAnsi="Georgia" w:cs="Georgia" w:eastAsia="Georgia"/>
+          <w:sz w:val="22"/>
+          <w:szCs w:val="22"/>
+          <w:b w:val="0"/>
+          <w:bCs w:val="0"/>
+          <w:color w:val="000000"/>
+        </w:rPr>
+        <w:t xml:space="preserve"/>
       </w:r>
     </w:p>
     <w:p>
@@ -29797,7 +29797,7 @@
           <w:bCs w:val="0"/>
           <w:color w:val="000000"/>
         </w:rPr>
-        <w:t xml:space="preserve">The study was conducted at [REDACTED], for 35 days, from April 16 to May 20, 2023. The study was carried out to search for alternatives to protein sources. The objective of the study was to determine the growth response of F1 New Zealand white rabbits as influenced by the roughage-to-concentrate ratio. A total of eighteen (18) heads of six (6)-week-old female New Zealand White Rabbits were selected and distributed into three (3) groups, each treatment replicated thrice with 2 rabbits per replication. Results showed no significant difference (P&lt;0.05) in final weight, gain in weight, and average daily gain in all the treatment groups. The control group (T1) was fed 70% guinea grass and 30% concentrates. For T2 and T3, the guinea grass was replaced with fresh azolla on an equi-weight basis at levels of 10 and 20 percent, respectively. In conclusion, based on the results, it </w:t>
+        <w:t xml:space="preserve">The study was conducted at [REDACTED], for 35 days, from April 16 to May 20, 2023. The study was carried out to search for alternatives to protein sources. The objective of the study was to determine the growth response of F1 New Zealand white rabbits as influenced by the roughage-to-concentrate ratio. A total of eighteen (18) heads of six (6)-week-old female New Zealand White Rabbits were selected and distributed into three (3) groups, each treatment replicated thrice with 2 rabbits per replication. Results showed no significant difference (P&lt;0.05) in final weight, gain in weight, and average daily gain in all the treatment groups. The control group (T1) was fed 70% guinea grass and 30% concentrates. For T2 and T3, the guinea grass was replaced with fresh azolla on an equi-weight basis at levels of 10 and 20 percent, respectively. In conclusion (DO), based on the results, it can (EC) be stated that the ratio of 70% guinea grass (GG) + 30% concentrate (C), the control group, had a significantly higher (P&lt;0.01) feed conversion ratio, while rabbits in treatment T3 (50% guinea grass, 20% azolla, and 30% concentrate) had a significantly higher (P&lt;0.01) dry matter intake. The researchers still recommended (FP-Rec) incorporating 50% Guinea grass + 20% Azolla + 30% concentrates for rabbit growth performance, considering the results show that this treatment performs well and doesn't differ from treatment 1, which is the farmer practice. The researchers also saw that the treatment of 50% Guinea grass + 20% Azolla + 30% concentrates has potential (EC) as an alternative feed ration for rabbits without adverse effects, and considering that azolla can (FP-Cap) help breeders to lessen the feed cost in production.</w:t>
       </w:r>
       <w:r>
         <w:rPr>
@@ -29809,18 +29809,18 @@
           <w:shd w:val="clear" w:color="auto" w:fill="00B0F0"/>
           <w:color w:val="000000"/>
         </w:rPr>
-        <w:t xml:space="preserve">can</w:t>
-      </w:r>
-      <w:r>
-        <w:rPr>
-          <w:rFonts w:ascii="Georgia" w:hAnsi="Georgia" w:cs="Georgia" w:eastAsia="Georgia"/>
-          <w:sz w:val="22"/>
-          <w:szCs w:val="22"/>
-          <w:b w:val="0"/>
-          <w:bCs w:val="0"/>
-          <w:color w:val="000000"/>
-        </w:rPr>
-        <w:t xml:space="preserve"> </w:t>
+        <w:t xml:space="preserve"/>
+      </w:r>
+      <w:r>
+        <w:rPr>
+          <w:rFonts w:ascii="Georgia" w:hAnsi="Georgia" w:cs="Georgia" w:eastAsia="Georgia"/>
+          <w:sz w:val="22"/>
+          <w:szCs w:val="22"/>
+          <w:b w:val="0"/>
+          <w:bCs w:val="0"/>
+          <w:color w:val="000000"/>
+        </w:rPr>
+        <w:t xml:space="preserve"/>
       </w:r>
       <w:r>
         <w:rPr>
@@ -29831,18 +29831,18 @@
           <w:bCs w:val="0"/>
           <w:color w:val="ED7D31"/>
         </w:rPr>
-        <w:t xml:space="preserve">(EC)</w:t>
-      </w:r>
-      <w:r>
-        <w:rPr>
-          <w:rFonts w:ascii="Georgia" w:hAnsi="Georgia" w:cs="Georgia" w:eastAsia="Georgia"/>
-          <w:sz w:val="22"/>
-          <w:szCs w:val="22"/>
-          <w:b w:val="0"/>
-          <w:bCs w:val="0"/>
-          <w:color w:val="000000"/>
-        </w:rPr>
-        <w:t xml:space="preserve"> be stated that the ratio of 70% guinea grass (GG) + 30% concentrate (C), the control group, had a significantly higher (P&lt;0.01) feed conversion ratio, while rabbits in treatment T3 (50% guinea grass, 20% azolla, and 30% concentrate) had a significantly higher (P&lt;0.01) dry matter intake. The researchers still </w:t>
+        <w:t xml:space="preserve"/>
+      </w:r>
+      <w:r>
+        <w:rPr>
+          <w:rFonts w:ascii="Georgia" w:hAnsi="Georgia" w:cs="Georgia" w:eastAsia="Georgia"/>
+          <w:sz w:val="22"/>
+          <w:szCs w:val="22"/>
+          <w:b w:val="0"/>
+          <w:bCs w:val="0"/>
+          <w:color w:val="000000"/>
+        </w:rPr>
+        <w:t xml:space="preserve"/>
       </w:r>
       <w:r>
         <w:rPr>
@@ -29854,18 +29854,18 @@
           <w:strike/>
           <w:color w:val="000000"/>
         </w:rPr>
-        <w:t xml:space="preserve">recommended</w:t>
-      </w:r>
-      <w:r>
-        <w:rPr>
-          <w:rFonts w:ascii="Georgia" w:hAnsi="Georgia" w:cs="Georgia" w:eastAsia="Georgia"/>
-          <w:sz w:val="22"/>
-          <w:szCs w:val="22"/>
-          <w:b w:val="0"/>
-          <w:bCs w:val="0"/>
-          <w:color w:val="000000"/>
-        </w:rPr>
-        <w:t xml:space="preserve"> </w:t>
+        <w:t xml:space="preserve"/>
+      </w:r>
+      <w:r>
+        <w:rPr>
+          <w:rFonts w:ascii="Georgia" w:hAnsi="Georgia" w:cs="Georgia" w:eastAsia="Georgia"/>
+          <w:sz w:val="22"/>
+          <w:szCs w:val="22"/>
+          <w:b w:val="0"/>
+          <w:bCs w:val="0"/>
+          <w:color w:val="000000"/>
+        </w:rPr>
+        <w:t xml:space="preserve"/>
       </w:r>
       <w:r>
         <w:rPr>
@@ -29876,18 +29876,18 @@
           <w:bCs w:val="0"/>
           <w:color w:val="808080"/>
         </w:rPr>
-        <w:t xml:space="preserve">(FP-Rec)</w:t>
-      </w:r>
-      <w:r>
-        <w:rPr>
-          <w:rFonts w:ascii="Georgia" w:hAnsi="Georgia" w:cs="Georgia" w:eastAsia="Georgia"/>
-          <w:sz w:val="22"/>
-          <w:szCs w:val="22"/>
-          <w:b w:val="0"/>
-          <w:bCs w:val="0"/>
-          <w:color w:val="000000"/>
-        </w:rPr>
-        <w:t xml:space="preserve"> incorporating 50% Guinea grass + 20% Azolla + 30% concentrates for rabbit growth performance, considering the results show that this treatment performs well and doesn't differ from treatment 1, which is the farmer practice. The researchers also saw that the treatment of 50% Guinea grass + 20% Azolla + 30% concentrates has </w:t>
+        <w:t xml:space="preserve"/>
+      </w:r>
+      <w:r>
+        <w:rPr>
+          <w:rFonts w:ascii="Georgia" w:hAnsi="Georgia" w:cs="Georgia" w:eastAsia="Georgia"/>
+          <w:sz w:val="22"/>
+          <w:szCs w:val="22"/>
+          <w:b w:val="0"/>
+          <w:bCs w:val="0"/>
+          <w:color w:val="000000"/>
+        </w:rPr>
+        <w:t xml:space="preserve"/>
       </w:r>
       <w:r>
         <w:rPr>
@@ -29899,18 +29899,18 @@
           <w:highlight w:val="red"/>
           <w:color w:val="FFFFFF"/>
         </w:rPr>
-        <w:t xml:space="preserve">potential</w:t>
-      </w:r>
-      <w:r>
-        <w:rPr>
-          <w:rFonts w:ascii="Georgia" w:hAnsi="Georgia" w:cs="Georgia" w:eastAsia="Georgia"/>
-          <w:sz w:val="22"/>
-          <w:szCs w:val="22"/>
-          <w:b w:val="0"/>
-          <w:bCs w:val="0"/>
-          <w:color w:val="000000"/>
-        </w:rPr>
-        <w:t xml:space="preserve"> </w:t>
+        <w:t xml:space="preserve"/>
+      </w:r>
+      <w:r>
+        <w:rPr>
+          <w:rFonts w:ascii="Georgia" w:hAnsi="Georgia" w:cs="Georgia" w:eastAsia="Georgia"/>
+          <w:sz w:val="22"/>
+          <w:szCs w:val="22"/>
+          <w:b w:val="0"/>
+          <w:bCs w:val="0"/>
+          <w:color w:val="000000"/>
+        </w:rPr>
+        <w:t xml:space="preserve"/>
       </w:r>
       <w:r>
         <w:rPr>
@@ -29921,18 +29921,18 @@
           <w:bCs w:val="0"/>
           <w:color w:val="ED7D31"/>
         </w:rPr>
-        <w:t xml:space="preserve">(EC)</w:t>
-      </w:r>
-      <w:r>
-        <w:rPr>
-          <w:rFonts w:ascii="Georgia" w:hAnsi="Georgia" w:cs="Georgia" w:eastAsia="Georgia"/>
-          <w:sz w:val="22"/>
-          <w:szCs w:val="22"/>
-          <w:b w:val="0"/>
-          <w:bCs w:val="0"/>
-          <w:color w:val="000000"/>
-        </w:rPr>
-        <w:t xml:space="preserve"> as an alternative feed ration for rabbits without adverse effects, and considering that azolla </w:t>
+        <w:t xml:space="preserve"/>
+      </w:r>
+      <w:r>
+        <w:rPr>
+          <w:rFonts w:ascii="Georgia" w:hAnsi="Georgia" w:cs="Georgia" w:eastAsia="Georgia"/>
+          <w:sz w:val="22"/>
+          <w:szCs w:val="22"/>
+          <w:b w:val="0"/>
+          <w:bCs w:val="0"/>
+          <w:color w:val="000000"/>
+        </w:rPr>
+        <w:t xml:space="preserve"/>
       </w:r>
       <w:r>
         <w:rPr>
@@ -29944,18 +29944,18 @@
           <w:strike/>
           <w:color w:val="000000"/>
         </w:rPr>
-        <w:t xml:space="preserve">can</w:t>
-      </w:r>
-      <w:r>
-        <w:rPr>
-          <w:rFonts w:ascii="Georgia" w:hAnsi="Georgia" w:cs="Georgia" w:eastAsia="Georgia"/>
-          <w:sz w:val="22"/>
-          <w:szCs w:val="22"/>
-          <w:b w:val="0"/>
-          <w:bCs w:val="0"/>
-          <w:color w:val="000000"/>
-        </w:rPr>
-        <w:t xml:space="preserve"> </w:t>
+        <w:t xml:space="preserve"/>
+      </w:r>
+      <w:r>
+        <w:rPr>
+          <w:rFonts w:ascii="Georgia" w:hAnsi="Georgia" w:cs="Georgia" w:eastAsia="Georgia"/>
+          <w:sz w:val="22"/>
+          <w:szCs w:val="22"/>
+          <w:b w:val="0"/>
+          <w:bCs w:val="0"/>
+          <w:color w:val="000000"/>
+        </w:rPr>
+        <w:t xml:space="preserve"/>
       </w:r>
       <w:r>
         <w:rPr>
@@ -29966,18 +29966,18 @@
           <w:bCs w:val="0"/>
           <w:color w:val="808080"/>
         </w:rPr>
-        <w:t xml:space="preserve">(FP-Cap)</w:t>
-      </w:r>
-      <w:r>
-        <w:rPr>
-          <w:rFonts w:ascii="Georgia" w:hAnsi="Georgia" w:cs="Georgia" w:eastAsia="Georgia"/>
-          <w:sz w:val="22"/>
-          <w:szCs w:val="22"/>
-          <w:b w:val="0"/>
-          <w:bCs w:val="0"/>
-          <w:color w:val="000000"/>
-        </w:rPr>
-        <w:t xml:space="preserve"> help breeders to lessen the feed cost in production.</w:t>
+        <w:t xml:space="preserve"/>
+      </w:r>
+      <w:r>
+        <w:rPr>
+          <w:rFonts w:ascii="Georgia" w:hAnsi="Georgia" w:cs="Georgia" w:eastAsia="Georgia"/>
+          <w:sz w:val="22"/>
+          <w:szCs w:val="22"/>
+          <w:b w:val="0"/>
+          <w:bCs w:val="0"/>
+          <w:color w:val="000000"/>
+        </w:rPr>
+        <w:t xml:space="preserve"/>
       </w:r>
     </w:p>
     <w:sectPr>

</xml_diff>

<commit_message>
Draft_080: color Appendix C (DO) tags brown per codebook
All 29 (DO) labels set to 8B4513 to match Table 7/12 and legend.
</commit_message>
<xml_diff>
--- a/thesis/003_ThesisProposal_Draft_080.docx
+++ b/thesis/003_ThesisProposal_Draft_080.docx
@@ -2300,33 +2300,39 @@
       <w:r>
         <w:rPr>
           <w:rFonts w:ascii="Georgia" w:hAnsi="Georgia" w:cs="Georgia" w:eastAsia="Georgia"/>
-          <w:i w:val="0"/>
-          <w:iCs w:val="0"/>
-          <w:sz w:val="22"/>
-          <w:szCs w:val="22"/>
-          <w:rtl w:val="0"/>
-          <w:b/>
-          <w:bCs/>
+          <w:b w:val="0"/>
+          <w:i w:val="0"/>
+          <w:sz w:val="22"/>
         </w:rPr>
         <w:t xml:space="preserve">Softening, </w:t>
       </w:r>
       <w:r>
         <w:rPr>
           <w:rFonts w:ascii="Georgia" w:hAnsi="Georgia" w:cs="Georgia" w:eastAsia="Georgia"/>
-          <w:i w:val="0"/>
-          <w:iCs w:val="0"/>
-          <w:sz w:val="22"/>
-          <w:szCs w:val="22"/>
-          <w:rtl w:val="0"/>
-          <w:b w:val="0"/>
-          <w:bCs w:val="0"/>
-        </w:rPr>
-        <w:t>conceptually, softening is the reduction of force, directness, imposition, or interpersonal impact in a statement. Operationally, Stage 1 retention tracks softening of force or directness on knowledge claims (and interpersonal imposition on how claims are put forward); Stage 2 sorts epistemic (EC), interpersonal (P), and discourse-managing (DO) uses. Directives remain excluded.</w:t>
-      </w:r>
-      <w:r>
-        <w:rPr>
-          <w:rtl w:val="0"/>
-        </w:rPr>
+          <w:b w:val="0"/>
+          <w:i w:val="0"/>
+          <w:sz w:val="22"/>
+        </w:rPr>
+        <w:t xml:space="preserve">conceptually, softening is the reduction of force, directness, imposition, or interpersonal impact in a statement. Operationally, Stage 1 retention tracks softening of force or directness on knowledge claims (and interpersonal imposition on how claims are put forward); Stage 2 sorts epistemic (EC), interpersonal (P), and discourse-managing </w:t>
+      </w:r>
+      <w:r>
+        <w:rPr>
+          <w:rFonts w:ascii="Georgia" w:hAnsi="Georgia" w:cs="Georgia" w:eastAsia="Georgia"/>
+          <w:b w:val="0"/>
+          <w:i w:val="0"/>
+          <w:sz w:val="22"/>
+          <w:color w:val="8B4513"/>
+        </w:rPr>
+        <w:t>(DO)</w:t>
+      </w:r>
+      <w:r>
+        <w:rPr>
+          <w:rFonts w:ascii="Georgia" w:hAnsi="Georgia" w:cs="Georgia" w:eastAsia="Georgia"/>
+          <w:b w:val="0"/>
+          <w:i w:val="0"/>
+          <w:sz w:val="22"/>
+        </w:rPr>
+        <w:t xml:space="preserve"> uses. Directives remain excluded.</w:t>
       </w:r>
     </w:p>
     <w:p>
@@ -9801,46 +9807,50 @@
       </w:pPr>
       <w:r>
         <w:rPr>
-          <w:rFonts w:ascii="Georgia" w:cs="Georgia" w:eastAsia="Georgia" w:hAnsi="Georgia"/>
-          <w:b w:val="0"/>
-          <w:bCs w:val="0"/>
-          <w:i w:val="0"/>
-          <w:iCs w:val="0"/>
-          <w:sz w:val="22"/>
-          <w:szCs w:val="22"/>
-          <w:rtl w:val="0"/>
-        </w:rPr>
-        <w:t xml:space="preserve">All 65 tokens retained as hedges were coded Epistemic Caution (EC). None of those retained tokens were assigned Politeness/Deference (P) or Discourse Organization (DO). Discourse connectors such as Hence, Thus, Therefore, and In conclusion appear in the corpus and are tagged (DO) in Appendix C but are not counted as hedges when they do not change the epistemic weight of a claim. Table 6 presents the function distribution among retained hedges.</w:t>
-      </w:r>
-      <w:r>
-        <w:rPr>
-          <w:rFonts w:ascii="Georgia" w:cs="Georgia" w:eastAsia="Georgia" w:hAnsi="Georgia"/>
-          <w:b w:val="0"/>
-          <w:bCs w:val="0"/>
-          <w:i w:val="0"/>
-          <w:iCs w:val="0"/>
-          <w:sz w:val="22"/>
-          <w:szCs w:val="22"/>
-          <w:rtl w:val="0"/>
+          <w:rFonts w:ascii="Georgia" w:hAnsi="Georgia" w:cs="Georgia" w:eastAsia="Georgia"/>
+          <w:b w:val="0"/>
+          <w:i w:val="0"/>
+          <w:sz w:val="22"/>
+        </w:rPr>
+        <w:t xml:space="preserve">All 65 tokens retained as hedges were coded Epistemic Caution (EC). None of those retained tokens were assigned Politeness/Deference (P) or Discourse Organization </w:t>
+      </w:r>
+      <w:r>
+        <w:rPr>
+          <w:rFonts w:ascii="Georgia" w:hAnsi="Georgia" w:cs="Georgia" w:eastAsia="Georgia"/>
+          <w:b w:val="0"/>
+          <w:i w:val="0"/>
+          <w:sz w:val="22"/>
           <w:color w:val="8B4513"/>
         </w:rPr>
-      </w:r>
-      <w:r>
-        <w:rPr>
-          <w:rFonts w:ascii="Georgia" w:cs="Georgia" w:eastAsia="Georgia" w:hAnsi="Georgia"/>
-          <w:b w:val="0"/>
-          <w:bCs w:val="0"/>
-          <w:i w:val="0"/>
-          <w:iCs w:val="0"/>
-          <w:sz w:val="22"/>
-          <w:szCs w:val="22"/>
-          <w:rtl w:val="0"/>
-        </w:rPr>
-      </w:r>
-      <w:r>
-        <w:rPr>
-          <w:rtl w:val="0"/>
-        </w:rPr>
+        <w:t>(DO)</w:t>
+      </w:r>
+      <w:r>
+        <w:rPr>
+          <w:rFonts w:ascii="Georgia" w:hAnsi="Georgia" w:cs="Georgia" w:eastAsia="Georgia"/>
+          <w:b w:val="0"/>
+          <w:i w:val="0"/>
+          <w:sz w:val="22"/>
+        </w:rPr>
+        <w:t xml:space="preserve">. Discourse connectors such as Hence, Thus, Therefore, and In conclusion appear in the corpus and are tagged </w:t>
+      </w:r>
+      <w:r>
+        <w:rPr>
+          <w:rFonts w:ascii="Georgia" w:hAnsi="Georgia" w:cs="Georgia" w:eastAsia="Georgia"/>
+          <w:b w:val="0"/>
+          <w:i w:val="0"/>
+          <w:sz w:val="22"/>
+          <w:color w:val="8B4513"/>
+        </w:rPr>
+        <w:t>(DO)</w:t>
+      </w:r>
+      <w:r>
+        <w:rPr>
+          <w:rFonts w:ascii="Georgia" w:hAnsi="Georgia" w:cs="Georgia" w:eastAsia="Georgia"/>
+          <w:b w:val="0"/>
+          <w:i w:val="0"/>
+          <w:sz w:val="22"/>
+        </w:rPr>
+        <w:t xml:space="preserve"> in Appendix C but are not counted as hedges when they do not change the epistemic weight of a claim. Table 6 presents the function distribution among retained hedges.</w:t>
       </w:r>
     </w:p>
     <w:p>
@@ -21322,19 +21332,29 @@
         <w:rPr>
           <w:rFonts w:ascii="Georgia" w:hAnsi="Georgia" w:cs="Georgia" w:eastAsia="Georgia"/>
           <w:b w:val="0"/>
-          <w:bCs w:val="0"/>
-          <w:i w:val="0"/>
-          <w:iCs w:val="0"/>
-          <w:sz w:val="22"/>
-          <w:szCs w:val="22"/>
-          <w:rtl w:val="0"/>
-        </w:rPr>
-        <w:t>This appendix presents the 60 abstracts with all coding marks applied. Type marks = color highlight on hedge tokens (blue = Modal Verbs, red = Lexical Hedges, yellow = Adverbial Hedges, green = Clause-Level Hedges). Function marks = function label in colored text (EC = orange, P = purple, DO = brown). Discourse connectors (Hence/Thus) are tagged (DO) even when not hedges. Function labels in this appendix are only EC, P, and DO. False positives = strikethrough + reason code in grey (e.g. FP-Rec = recommendation, not a function). Unhedged assertions = grey highlight + [G]/[C] bracket (warranted-but-absent caution only).</w:t>
-      </w:r>
-      <w:r>
-        <w:rPr>
-          <w:rtl w:val="0"/>
-        </w:rPr>
+          <w:i w:val="0"/>
+          <w:sz w:val="22"/>
+        </w:rPr>
+        <w:t xml:space="preserve">This appendix presents the 60 abstracts with all coding marks applied. Type marks = color highlight on hedge tokens (blue = Modal Verbs, red = Lexical Hedges, yellow = Adverbial Hedges, green = Clause-Level Hedges). Function marks = function label in colored text (EC = orange, P = purple, DO = brown). Discourse connectors (Hence/Thus) are tagged </w:t>
+      </w:r>
+      <w:r>
+        <w:rPr>
+          <w:rFonts w:ascii="Georgia" w:hAnsi="Georgia" w:cs="Georgia" w:eastAsia="Georgia"/>
+          <w:b w:val="0"/>
+          <w:i w:val="0"/>
+          <w:sz w:val="22"/>
+          <w:color w:val="8B4513"/>
+        </w:rPr>
+        <w:t>(DO)</w:t>
+      </w:r>
+      <w:r>
+        <w:rPr>
+          <w:rFonts w:ascii="Georgia" w:hAnsi="Georgia" w:cs="Georgia" w:eastAsia="Georgia"/>
+          <w:b w:val="0"/>
+          <w:i w:val="0"/>
+          <w:sz w:val="22"/>
+        </w:rPr>
+        <w:t xml:space="preserve"> even when not hedges. Function labels in this appendix are only EC, P, and DO. False positives = strikethrough + reason code in grey (e.g. FP-Rec = recommendation, not a function). Unhedged assertions = grey highlight + [G]/[C] bracket (warranted-but-absent caution only).</w:t>
       </w:r>
     </w:p>
     <w:p>
@@ -22353,126 +22373,52 @@
       <w:r>
         <w:rPr>
           <w:rFonts w:ascii="Georgia" w:hAnsi="Georgia" w:cs="Georgia" w:eastAsia="Georgia"/>
-          <w:sz w:val="22"/>
-          <w:szCs w:val="22"/>
-          <w:b w:val="0"/>
-          <w:bCs w:val="0"/>
-          <w:color w:val="000000"/>
-        </w:rPr>
-        <w:t xml:space="preserve">The study would (FP-Gen) be on developing and optimizing eco-bricks using a mixture of SUPs and UCO developed through trial and error. SUPs recovered from various donors from the [REDACTED] and UCO. The preliminary trials established that molding faces some difficulty with increased ratios of UCO to SUPs. Thus (DO), in the optimization process, varying ratios of UCO was used, starting with UCO to SUPs 1:1 as treatment 1, a decreasing ratio of UCO to SUPs. At equal parts by weight of UCO and SUPs, optimization started at Treatment 1 with a 1:1 ratio. Treatments 2–5 proceeded similarly, increasing the ratio of UCO to SUPs. Density measurements, water absorption, and drop tests were all performed and observed. A self-testing protocol based on current literature was used. The density was calculated relative to mass and volume; however, the water absorption test yielded inconsistent findings. A drop test was also performed, which revealed that the eco-bricks from all treatments were significantly damaged at the height of one meter, making [G] them a weak, unsuitable material to use in building walkways. This study is essential for getting insights into eco-brick manufacture because the workability of SUPs and UCOs as raw materials is proven. The research findings do not apply to buildings. Therefore (DO), further research will (FP-Gen) aid in underlining the importance of optimizing the ingredient ratios to acquire desirable quality eco-bricks for sustainable construction applications.</w:t>
-      </w:r>
-      <w:r>
-        <w:rPr>
-          <w:rFonts w:ascii="Georgia" w:hAnsi="Georgia" w:cs="Georgia" w:eastAsia="Georgia"/>
-          <w:sz w:val="22"/>
-          <w:szCs w:val="22"/>
-          <w:b w:val="0"/>
-          <w:bCs w:val="0"/>
-          <w:strike/>
-          <w:color w:val="000000"/>
-        </w:rPr>
-        <w:t xml:space="preserve"/>
-      </w:r>
-      <w:r>
-        <w:rPr>
-          <w:rFonts w:ascii="Georgia" w:hAnsi="Georgia" w:cs="Georgia" w:eastAsia="Georgia"/>
-          <w:sz w:val="22"/>
-          <w:szCs w:val="22"/>
-          <w:b w:val="0"/>
-          <w:bCs w:val="0"/>
-          <w:color w:val="000000"/>
-        </w:rPr>
-        <w:t xml:space="preserve"/>
-      </w:r>
-      <w:r>
-        <w:rPr>
-          <w:rFonts w:ascii="Georgia" w:hAnsi="Georgia" w:cs="Georgia" w:eastAsia="Georgia"/>
-          <w:sz w:val="22"/>
-          <w:szCs w:val="22"/>
-          <w:b w:val="0"/>
-          <w:bCs w:val="0"/>
-          <w:color w:val="808080"/>
-        </w:rPr>
-        <w:t xml:space="preserve"/>
-      </w:r>
-      <w:r>
-        <w:rPr>
-          <w:rFonts w:ascii="Georgia" w:hAnsi="Georgia" w:cs="Georgia" w:eastAsia="Georgia"/>
-          <w:sz w:val="22"/>
-          <w:szCs w:val="22"/>
-          <w:b w:val="0"/>
-          <w:bCs w:val="0"/>
-          <w:color w:val="000000"/>
-        </w:rPr>
-        <w:t xml:space="preserve"/>
-      </w:r>
-      <w:r>
-        <w:rPr>
-          <w:rFonts w:ascii="Georgia" w:hAnsi="Georgia" w:cs="Georgia" w:eastAsia="Georgia"/>
-          <w:sz w:val="22"/>
-          <w:szCs w:val="22"/>
-          <w:b w:val="0"/>
-          <w:bCs w:val="0"/>
-          <w:shd w:val="clear" w:color="auto" w:fill="bfbfbf"/>
-          <w:color w:val="000000"/>
-        </w:rPr>
-        <w:t xml:space="preserve"/>
-      </w:r>
-      <w:r>
-        <w:rPr>
-          <w:rFonts w:ascii="Georgia" w:hAnsi="Georgia" w:cs="Georgia" w:eastAsia="Georgia"/>
-          <w:sz w:val="22"/>
-          <w:szCs w:val="22"/>
-          <w:b w:val="0"/>
-          <w:bCs w:val="0"/>
-          <w:color w:val="000000"/>
-        </w:rPr>
-        <w:t xml:space="preserve"/>
-      </w:r>
-      <w:r>
-        <w:rPr>
-          <w:rFonts w:ascii="Georgia" w:hAnsi="Georgia" w:cs="Georgia" w:eastAsia="Georgia"/>
-          <w:sz w:val="22"/>
-          <w:szCs w:val="22"/>
-          <w:b w:val="0"/>
-          <w:bCs w:val="0"/>
-          <w:strike/>
-          <w:color w:val="000000"/>
-        </w:rPr>
-        <w:t xml:space="preserve"/>
-      </w:r>
-      <w:r>
-        <w:rPr>
-          <w:rFonts w:ascii="Georgia" w:hAnsi="Georgia" w:cs="Georgia" w:eastAsia="Georgia"/>
-          <w:sz w:val="22"/>
-          <w:szCs w:val="22"/>
-          <w:b w:val="0"/>
-          <w:bCs w:val="0"/>
-          <w:color w:val="000000"/>
-        </w:rPr>
-        <w:t xml:space="preserve"/>
-      </w:r>
-      <w:r>
-        <w:rPr>
-          <w:rFonts w:ascii="Georgia" w:hAnsi="Georgia" w:cs="Georgia" w:eastAsia="Georgia"/>
-          <w:sz w:val="22"/>
-          <w:szCs w:val="22"/>
-          <w:b w:val="0"/>
-          <w:bCs w:val="0"/>
-          <w:color w:val="808080"/>
-        </w:rPr>
-        <w:t xml:space="preserve"/>
-      </w:r>
-      <w:r>
-        <w:rPr>
-          <w:rFonts w:ascii="Georgia" w:hAnsi="Georgia" w:cs="Georgia" w:eastAsia="Georgia"/>
-          <w:sz w:val="22"/>
-          <w:szCs w:val="22"/>
-          <w:b w:val="0"/>
-          <w:bCs w:val="0"/>
-          <w:color w:val="000000"/>
-        </w:rPr>
-        <w:t xml:space="preserve"/>
+          <w:b w:val="0"/>
+          <w:i w:val="0"/>
+          <w:sz w:val="22"/>
+          <w:color w:val="000000"/>
+        </w:rPr>
+        <w:t xml:space="preserve">The study would (FP-Gen) be on developing and optimizing eco-bricks using a mixture of SUPs and UCO developed through trial and error. SUPs recovered from various donors from the [REDACTED] and UCO. The preliminary trials established that molding faces some difficulty with increased ratios of UCO to SUPs. Thus </w:t>
+      </w:r>
+      <w:r>
+        <w:rPr>
+          <w:rFonts w:ascii="Georgia" w:hAnsi="Georgia" w:cs="Georgia" w:eastAsia="Georgia"/>
+          <w:b w:val="0"/>
+          <w:i w:val="0"/>
+          <w:sz w:val="22"/>
+          <w:color w:val="8B4513"/>
+        </w:rPr>
+        <w:t>(DO)</w:t>
+      </w:r>
+      <w:r>
+        <w:rPr>
+          <w:rFonts w:ascii="Georgia" w:hAnsi="Georgia" w:cs="Georgia" w:eastAsia="Georgia"/>
+          <w:b w:val="0"/>
+          <w:i w:val="0"/>
+          <w:sz w:val="22"/>
+          <w:color w:val="000000"/>
+        </w:rPr>
+        <w:t xml:space="preserve">, in the optimization process, varying ratios of UCO was used, starting with UCO to SUPs 1:1 as treatment 1, a decreasing ratio of UCO to SUPs. At equal parts by weight of UCO and SUPs, optimization started at Treatment 1 with a 1:1 ratio. Treatments 2–5 proceeded similarly, increasing the ratio of UCO to SUPs. Density measurements, water absorption, and drop tests were all performed and observed. A self-testing protocol based on current literature was used. The density was calculated relative to mass and volume; however, the water absorption test yielded inconsistent findings. A drop test was also performed, which revealed that the eco-bricks from all treatments were significantly damaged at the height of one meter, making [G] them a weak, unsuitable material to use in building walkways. This study is essential for getting insights into eco-brick manufacture because the workability of SUPs and UCOs as raw materials is proven. The research findings do not apply to buildings. Therefore </w:t>
+      </w:r>
+      <w:r>
+        <w:rPr>
+          <w:rFonts w:ascii="Georgia" w:hAnsi="Georgia" w:cs="Georgia" w:eastAsia="Georgia"/>
+          <w:b w:val="0"/>
+          <w:i w:val="0"/>
+          <w:sz w:val="22"/>
+          <w:color w:val="8B4513"/>
+        </w:rPr>
+        <w:t>(DO)</w:t>
+      </w:r>
+      <w:r>
+        <w:rPr>
+          <w:rFonts w:ascii="Georgia" w:hAnsi="Georgia" w:cs="Georgia" w:eastAsia="Georgia"/>
+          <w:b w:val="0"/>
+          <w:i w:val="0"/>
+          <w:sz w:val="22"/>
+          <w:color w:val="000000"/>
+        </w:rPr>
+        <w:t>, further research will (FP-Gen) aid in underlining the importance of optimizing the ingredient ratios to acquire desirable quality eco-bricks for sustainable construction applications.</w:t>
       </w:r>
     </w:p>
     <w:p>
@@ -22510,193 +22456,72 @@
       <w:r>
         <w:rPr>
           <w:rFonts w:ascii="Georgia" w:hAnsi="Georgia" w:cs="Georgia" w:eastAsia="Georgia"/>
-          <w:sz w:val="22"/>
-          <w:szCs w:val="22"/>
-          <w:b w:val="0"/>
-          <w:bCs w:val="0"/>
-          <w:color w:val="000000"/>
-        </w:rPr>
-        <w:t xml:space="preserve">The study generally (FP-Proc) aimed to evaluate the embryo toxicity, lethality, and teratogenicity of Ziziphus talanai-infused nanozeolite pellets on Danio rerio was performed at the Biology and Chemistry Laboratory of Pampanga State Agricultural University from October 2023 to January 2024. Various treatments in the formulation of pellets and laboratory experiments were set up using Completely Randomized Design (CRD). The study showed that cassava starch as combined with Ziziphus talanai-infused nanozeolite at 1:9 ratio improved the water-holding capacity of derived pellets, thus (DO) making a remarkable choice as a binder. The hatching and survival of Danio rerio embryos were enhanced by 200 ppm concentration of Z. talanai-infused nanozeolite pellet suspension while demonstrating lower toxicity compared to other concentrations tested. Based on the Acute Toxicity Index, the median lethal concentration (LC₅₀) in D. rerio embryos at 96 hpf (hours post-fertilization) showed that Z. talanai-infused nanozeolite pellet at a concentration of 49.79 µg/mL falls within the ‘slightly toxic’ classification, thus (DO) demonstrating that nanozeolite enhances the delivery of compounds within Z. talanai extract. Coagulation of embryos was primarily observed within 400 ppm to 1,000 ppm concentrations of Z. talanai-infused nanozeolite pellet suspensions under 40x magnification, suggesting (EC) that it affects early embryonic development and prevents the progression of other lethality markers, such as the absence of somite development, non-detachment of the tail, and absence of cardiac activity. Teratogenic effects on the body length of D. rerio hatchlings were observed, inferring (EC) that such observation was induced by the Z. talanai-infused nanozeolite pellet suspension. Hence (DO), the biosynthesis of Z. talanai-infused nanozeolite pellets is feasible and may (EC) affect the overall development of D. rerio embryos.</w:t>
-      </w:r>
-      <w:r>
-        <w:rPr>
-          <w:rFonts w:ascii="Georgia" w:hAnsi="Georgia" w:cs="Georgia" w:eastAsia="Georgia"/>
-          <w:sz w:val="22"/>
-          <w:szCs w:val="22"/>
-          <w:b w:val="0"/>
-          <w:bCs w:val="0"/>
-          <w:strike/>
-          <w:color w:val="000000"/>
-        </w:rPr>
-        <w:t xml:space="preserve"/>
-      </w:r>
-      <w:r>
-        <w:rPr>
-          <w:rFonts w:ascii="Georgia" w:hAnsi="Georgia" w:cs="Georgia" w:eastAsia="Georgia"/>
-          <w:sz w:val="22"/>
-          <w:szCs w:val="22"/>
-          <w:b w:val="0"/>
-          <w:bCs w:val="0"/>
-          <w:color w:val="000000"/>
-        </w:rPr>
-        <w:t xml:space="preserve"/>
-      </w:r>
-      <w:r>
-        <w:rPr>
-          <w:rFonts w:ascii="Georgia" w:hAnsi="Georgia" w:cs="Georgia" w:eastAsia="Georgia"/>
-          <w:sz w:val="22"/>
-          <w:szCs w:val="22"/>
-          <w:b w:val="0"/>
-          <w:bCs w:val="0"/>
-          <w:color w:val="808080"/>
-        </w:rPr>
-        <w:t xml:space="preserve"/>
-      </w:r>
-      <w:r>
-        <w:rPr>
-          <w:rFonts w:ascii="Georgia" w:hAnsi="Georgia" w:cs="Georgia" w:eastAsia="Georgia"/>
-          <w:sz w:val="22"/>
-          <w:szCs w:val="22"/>
-          <w:b w:val="0"/>
-          <w:bCs w:val="0"/>
-          <w:color w:val="000000"/>
-        </w:rPr>
-        <w:t xml:space="preserve"/>
-      </w:r>
-      <w:r>
-        <w:rPr>
-          <w:rFonts w:ascii="Georgia" w:hAnsi="Georgia" w:cs="Georgia" w:eastAsia="Georgia"/>
-          <w:sz w:val="22"/>
-          <w:szCs w:val="22"/>
-          <w:b w:val="0"/>
-          <w:bCs w:val="0"/>
-          <w:highlight w:val="red"/>
-          <w:color w:val="FFFFFF"/>
-        </w:rPr>
-        <w:t xml:space="preserve"/>
-      </w:r>
-      <w:r>
-        <w:rPr>
-          <w:rFonts w:ascii="Georgia" w:hAnsi="Georgia" w:cs="Georgia" w:eastAsia="Georgia"/>
-          <w:sz w:val="22"/>
-          <w:szCs w:val="22"/>
-          <w:b w:val="0"/>
-          <w:bCs w:val="0"/>
-          <w:color w:val="000000"/>
-        </w:rPr>
-        <w:t xml:space="preserve"/>
-      </w:r>
-      <w:r>
-        <w:rPr>
-          <w:rFonts w:ascii="Georgia" w:hAnsi="Georgia" w:cs="Georgia" w:eastAsia="Georgia"/>
-          <w:sz w:val="22"/>
-          <w:szCs w:val="22"/>
-          <w:b w:val="0"/>
-          <w:bCs w:val="0"/>
-          <w:color w:val="ED7D31"/>
-        </w:rPr>
-        <w:t xml:space="preserve"/>
-      </w:r>
-      <w:r>
-        <w:rPr>
-          <w:rFonts w:ascii="Georgia" w:hAnsi="Georgia" w:cs="Georgia" w:eastAsia="Georgia"/>
-          <w:sz w:val="22"/>
-          <w:szCs w:val="22"/>
-          <w:b w:val="0"/>
-          <w:bCs w:val="0"/>
-          <w:color w:val="000000"/>
-        </w:rPr>
-        <w:t xml:space="preserve"/>
-      </w:r>
-      <w:r>
-        <w:rPr>
-          <w:rFonts w:ascii="Georgia" w:hAnsi="Georgia" w:cs="Georgia" w:eastAsia="Georgia"/>
-          <w:sz w:val="22"/>
-          <w:szCs w:val="22"/>
-          <w:b w:val="0"/>
-          <w:bCs w:val="0"/>
-          <w:highlight w:val="red"/>
-          <w:color w:val="FFFFFF"/>
-        </w:rPr>
-        <w:t xml:space="preserve"/>
-      </w:r>
-      <w:r>
-        <w:rPr>
-          <w:rFonts w:ascii="Georgia" w:hAnsi="Georgia" w:cs="Georgia" w:eastAsia="Georgia"/>
-          <w:sz w:val="22"/>
-          <w:szCs w:val="22"/>
-          <w:b w:val="0"/>
-          <w:bCs w:val="0"/>
-          <w:color w:val="000000"/>
-        </w:rPr>
-        <w:t xml:space="preserve"/>
-      </w:r>
-      <w:r>
-        <w:rPr>
-          <w:rFonts w:ascii="Georgia" w:hAnsi="Georgia" w:cs="Georgia" w:eastAsia="Georgia"/>
-          <w:sz w:val="22"/>
-          <w:szCs w:val="22"/>
-          <w:b w:val="0"/>
-          <w:bCs w:val="0"/>
-          <w:color w:val="ED7D31"/>
-        </w:rPr>
-        <w:t xml:space="preserve"/>
-      </w:r>
-      <w:r>
-        <w:rPr>
-          <w:rFonts w:ascii="Georgia" w:hAnsi="Georgia" w:cs="Georgia" w:eastAsia="Georgia"/>
-          <w:sz w:val="22"/>
-          <w:szCs w:val="22"/>
-          <w:b w:val="0"/>
-          <w:bCs w:val="0"/>
-          <w:color w:val="000000"/>
-        </w:rPr>
-        <w:t xml:space="preserve"/>
-      </w:r>
-      <w:r>
-        <w:rPr>
-          <w:rFonts w:ascii="Georgia" w:hAnsi="Georgia" w:cs="Georgia" w:eastAsia="Georgia"/>
-          <w:sz w:val="22"/>
-          <w:szCs w:val="22"/>
-          <w:b w:val="0"/>
-          <w:bCs w:val="0"/>
-          <w:shd w:val="clear" w:color="auto" w:fill="00B0F0"/>
-          <w:color w:val="000000"/>
-        </w:rPr>
-        <w:t xml:space="preserve"/>
-      </w:r>
-      <w:r>
-        <w:rPr>
-          <w:rFonts w:ascii="Georgia" w:hAnsi="Georgia" w:cs="Georgia" w:eastAsia="Georgia"/>
-          <w:sz w:val="22"/>
-          <w:szCs w:val="22"/>
-          <w:b w:val="0"/>
-          <w:bCs w:val="0"/>
-          <w:color w:val="000000"/>
-        </w:rPr>
-        <w:t xml:space="preserve"/>
-      </w:r>
-      <w:r>
-        <w:rPr>
-          <w:rFonts w:ascii="Georgia" w:hAnsi="Georgia" w:cs="Georgia" w:eastAsia="Georgia"/>
-          <w:sz w:val="22"/>
-          <w:szCs w:val="22"/>
-          <w:b w:val="0"/>
-          <w:bCs w:val="0"/>
-          <w:color w:val="ED7D31"/>
-        </w:rPr>
-        <w:t xml:space="preserve"/>
-      </w:r>
-      <w:r>
-        <w:rPr>
-          <w:rFonts w:ascii="Georgia" w:hAnsi="Georgia" w:cs="Georgia" w:eastAsia="Georgia"/>
-          <w:sz w:val="22"/>
-          <w:szCs w:val="22"/>
-          <w:b w:val="0"/>
-          <w:bCs w:val="0"/>
-          <w:color w:val="000000"/>
-        </w:rPr>
-        <w:t xml:space="preserve"/>
+          <w:b w:val="0"/>
+          <w:i w:val="0"/>
+          <w:sz w:val="22"/>
+          <w:color w:val="000000"/>
+        </w:rPr>
+        <w:t xml:space="preserve">The study generally (FP-Proc) aimed to evaluate the embryo toxicity, lethality, and teratogenicity of Ziziphus talanai-infused nanozeolite pellets on Danio rerio was performed at the Biology and Chemistry Laboratory of Pampanga State Agricultural University from October 2023 to January 2024. Various treatments in the formulation of pellets and laboratory experiments were set up using Completely Randomized Design (CRD). The study showed that cassava starch as combined with Ziziphus talanai-infused nanozeolite at 1:9 ratio improved the water-holding capacity of derived pellets, thus </w:t>
+      </w:r>
+      <w:r>
+        <w:rPr>
+          <w:rFonts w:ascii="Georgia" w:hAnsi="Georgia" w:cs="Georgia" w:eastAsia="Georgia"/>
+          <w:b w:val="0"/>
+          <w:i w:val="0"/>
+          <w:sz w:val="22"/>
+          <w:color w:val="8B4513"/>
+        </w:rPr>
+        <w:t>(DO)</w:t>
+      </w:r>
+      <w:r>
+        <w:rPr>
+          <w:rFonts w:ascii="Georgia" w:hAnsi="Georgia" w:cs="Georgia" w:eastAsia="Georgia"/>
+          <w:b w:val="0"/>
+          <w:i w:val="0"/>
+          <w:sz w:val="22"/>
+          <w:color w:val="000000"/>
+        </w:rPr>
+        <w:t xml:space="preserve"> making a remarkable choice as a binder. The hatching and survival of Danio rerio embryos were enhanced by 200 ppm concentration of Z. talanai-infused nanozeolite pellet suspension while demonstrating lower toxicity compared to other concentrations tested. Based on the Acute Toxicity Index, the median lethal concentration (LC₅₀) in D. rerio embryos at 96 hpf (hours post-fertilization) showed that Z. talanai-infused nanozeolite pellet at a concentration of 49.79 µg/mL falls within the ‘slightly toxic’ classification, thus </w:t>
+      </w:r>
+      <w:r>
+        <w:rPr>
+          <w:rFonts w:ascii="Georgia" w:hAnsi="Georgia" w:cs="Georgia" w:eastAsia="Georgia"/>
+          <w:b w:val="0"/>
+          <w:i w:val="0"/>
+          <w:sz w:val="22"/>
+          <w:color w:val="8B4513"/>
+        </w:rPr>
+        <w:t>(DO)</w:t>
+      </w:r>
+      <w:r>
+        <w:rPr>
+          <w:rFonts w:ascii="Georgia" w:hAnsi="Georgia" w:cs="Georgia" w:eastAsia="Georgia"/>
+          <w:b w:val="0"/>
+          <w:i w:val="0"/>
+          <w:sz w:val="22"/>
+          <w:color w:val="000000"/>
+        </w:rPr>
+        <w:t xml:space="preserve"> demonstrating that nanozeolite enhances the delivery of compounds within Z. talanai extract. Coagulation of embryos was primarily observed within 400 ppm to 1,000 ppm concentrations of Z. talanai-infused nanozeolite pellet suspensions under 40x magnification, suggesting (EC) that it affects early embryonic development and prevents the progression of other lethality markers, such as the absence of somite development, non-detachment of the tail, and absence of cardiac activity. Teratogenic effects on the body length of D. rerio hatchlings were observed, inferring (EC) that such observation was induced by the Z. talanai-infused nanozeolite pellet suspension. Hence </w:t>
+      </w:r>
+      <w:r>
+        <w:rPr>
+          <w:rFonts w:ascii="Georgia" w:hAnsi="Georgia" w:cs="Georgia" w:eastAsia="Georgia"/>
+          <w:b w:val="0"/>
+          <w:i w:val="0"/>
+          <w:sz w:val="22"/>
+          <w:color w:val="8B4513"/>
+        </w:rPr>
+        <w:t>(DO)</w:t>
+      </w:r>
+      <w:r>
+        <w:rPr>
+          <w:rFonts w:ascii="Georgia" w:hAnsi="Georgia" w:cs="Georgia" w:eastAsia="Georgia"/>
+          <w:b w:val="0"/>
+          <w:i w:val="0"/>
+          <w:sz w:val="22"/>
+          <w:color w:val="000000"/>
+        </w:rPr>
+        <w:t>, the biosynthesis of Z. talanai-infused nanozeolite pellets is feasible and may (EC) affect the overall development of D. rerio embryos.</w:t>
       </w:r>
     </w:p>
     <w:p>
@@ -23025,148 +22850,32 @@
       <w:r>
         <w:rPr>
           <w:rFonts w:ascii="Georgia" w:hAnsi="Georgia" w:cs="Georgia" w:eastAsia="Georgia"/>
-          <w:sz w:val="22"/>
-          <w:szCs w:val="22"/>
-          <w:b w:val="0"/>
-          <w:bCs w:val="0"/>
-          <w:color w:val="000000"/>
-        </w:rPr>
-        <w:t xml:space="preserve">It is well recognized that heavy metals harm human health through the food chain. The danger to human health associated with consuming fish contaminated with heavy metals were assessed. This study aimed to determine the presence of lead in the flesh part of selected fish species, Common carp (Cyprinus carpio), Roho labeo (Labeo rohita), and Silver carp (Hypophthalmichthys molitrix), in addition to determine the Knowledge, Attitude, and Practices (KAP) of fishers along the Pampanga River. A test method used is Inductively Coupled Plasma — Optical Emission Spectrometry (ICP-OES) in identifying heavy metals in biota. The self-administered questionnaires were distributed to 20 respondents, questionnaires compromised of socio-demographic characteristics and the KAP’s of fishers along the Pampanga River. Data analyses were done using SPSS (version 23). Data were explored using descriptive statistics. The results show that lead in any of the selected fish, with a &lt;0.013 mg/kg result is below the FAO and WHO’s allowed limits of 2 mg/kg and 0.5 mg/kg, respectively. Based on the result from KAP Analysis, knowledge scored M=1.7200 with SD equivalent to 0.10052 which is interpreted as poor knowledge. The attitude score M=3.1150 and SD=0.093330 which means a moderate attitude and lastly, practices score M = 2.8850 and SD = .13485 which is equivalent to have good practices. Thus (DO), the researcher provided a policy proposal to focus on issues that needed to be addressed in the community. In terms of practices, proper waste management should (FP-Rec) be established to avoid the high danger of heavy metal contamination. Certain local habits, such as waste dumping and other communal activities, may (EC) contribute to the spread of heavy metals. As a result, some community or local government-adopted measures are proposed (FP-Gen). These precautions are intended to prevent heavy metal contamination, particularly in the river system and the aquatic life in the area.</w:t>
-      </w:r>
-      <w:r>
-        <w:rPr>
-          <w:rFonts w:ascii="Georgia" w:hAnsi="Georgia" w:cs="Georgia" w:eastAsia="Georgia"/>
-          <w:sz w:val="22"/>
-          <w:szCs w:val="22"/>
-          <w:b w:val="0"/>
-          <w:bCs w:val="0"/>
-          <w:strike/>
-          <w:color w:val="000000"/>
-        </w:rPr>
-        <w:t xml:space="preserve"/>
-      </w:r>
-      <w:r>
-        <w:rPr>
-          <w:rFonts w:ascii="Georgia" w:hAnsi="Georgia" w:cs="Georgia" w:eastAsia="Georgia"/>
-          <w:sz w:val="22"/>
-          <w:szCs w:val="22"/>
-          <w:b w:val="0"/>
-          <w:bCs w:val="0"/>
-          <w:color w:val="000000"/>
-        </w:rPr>
-        <w:t xml:space="preserve"/>
-      </w:r>
-      <w:r>
-        <w:rPr>
-          <w:rFonts w:ascii="Georgia" w:hAnsi="Georgia" w:cs="Georgia" w:eastAsia="Georgia"/>
-          <w:sz w:val="22"/>
-          <w:szCs w:val="22"/>
-          <w:b w:val="0"/>
-          <w:bCs w:val="0"/>
-          <w:color w:val="808080"/>
-        </w:rPr>
-        <w:t xml:space="preserve"/>
-      </w:r>
-      <w:r>
-        <w:rPr>
-          <w:rFonts w:ascii="Georgia" w:hAnsi="Georgia" w:cs="Georgia" w:eastAsia="Georgia"/>
-          <w:sz w:val="22"/>
-          <w:szCs w:val="22"/>
-          <w:b w:val="0"/>
-          <w:bCs w:val="0"/>
-          <w:color w:val="000000"/>
-        </w:rPr>
-        <w:t xml:space="preserve"/>
-      </w:r>
-      <w:r>
-        <w:rPr>
-          <w:rFonts w:ascii="Georgia" w:hAnsi="Georgia" w:cs="Georgia" w:eastAsia="Georgia"/>
-          <w:sz w:val="22"/>
-          <w:szCs w:val="22"/>
-          <w:b w:val="0"/>
-          <w:bCs w:val="0"/>
-          <w:shd w:val="clear" w:color="auto" w:fill="00B0F0"/>
-          <w:color w:val="000000"/>
-        </w:rPr>
-        <w:t xml:space="preserve"/>
-      </w:r>
-      <w:r>
-        <w:rPr>
-          <w:rFonts w:ascii="Georgia" w:hAnsi="Georgia" w:cs="Georgia" w:eastAsia="Georgia"/>
-          <w:sz w:val="22"/>
-          <w:szCs w:val="22"/>
-          <w:b w:val="0"/>
-          <w:bCs w:val="0"/>
-          <w:color w:val="000000"/>
-        </w:rPr>
-        <w:t xml:space="preserve"/>
-      </w:r>
-      <w:r>
-        <w:rPr>
-          <w:rFonts w:ascii="Georgia" w:hAnsi="Georgia" w:cs="Georgia" w:eastAsia="Georgia"/>
-          <w:sz w:val="22"/>
-          <w:szCs w:val="22"/>
-          <w:b w:val="0"/>
-          <w:bCs w:val="0"/>
-          <w:color w:val="ED7D31"/>
-        </w:rPr>
-        <w:t xml:space="preserve"/>
-      </w:r>
-      <w:r>
-        <w:rPr>
-          <w:rFonts w:ascii="Georgia" w:hAnsi="Georgia" w:cs="Georgia" w:eastAsia="Georgia"/>
-          <w:sz w:val="22"/>
-          <w:szCs w:val="22"/>
-          <w:b w:val="0"/>
-          <w:bCs w:val="0"/>
-          <w:color w:val="000000"/>
-        </w:rPr>
-        <w:t xml:space="preserve"/>
-      </w:r>
-      <w:r>
-        <w:rPr>
-          <w:rFonts w:ascii="Georgia" w:hAnsi="Georgia" w:cs="Georgia" w:eastAsia="Georgia"/>
-          <w:sz w:val="22"/>
-          <w:szCs w:val="22"/>
-          <w:b w:val="0"/>
-          <w:bCs w:val="0"/>
-          <w:strike/>
-          <w:color w:val="000000"/>
-        </w:rPr>
-        <w:t xml:space="preserve"/>
-      </w:r>
-      <w:r>
-        <w:rPr>
-          <w:rFonts w:ascii="Georgia" w:hAnsi="Georgia" w:cs="Georgia" w:eastAsia="Georgia"/>
-          <w:sz w:val="22"/>
-          <w:szCs w:val="22"/>
-          <w:b w:val="0"/>
-          <w:bCs w:val="0"/>
-          <w:color w:val="000000"/>
-        </w:rPr>
-        <w:t xml:space="preserve"/>
-      </w:r>
-      <w:r>
-        <w:rPr>
-          <w:rFonts w:ascii="Georgia" w:hAnsi="Georgia" w:cs="Georgia" w:eastAsia="Georgia"/>
-          <w:sz w:val="22"/>
-          <w:szCs w:val="22"/>
-          <w:b w:val="0"/>
-          <w:bCs w:val="0"/>
-          <w:color w:val="808080"/>
-        </w:rPr>
-        <w:t xml:space="preserve"/>
-      </w:r>
-      <w:r>
-        <w:rPr>
-          <w:rFonts w:ascii="Georgia" w:hAnsi="Georgia" w:cs="Georgia" w:eastAsia="Georgia"/>
-          <w:sz w:val="22"/>
-          <w:szCs w:val="22"/>
-          <w:b w:val="0"/>
-          <w:bCs w:val="0"/>
-          <w:color w:val="000000"/>
-        </w:rPr>
-        <w:t xml:space="preserve"/>
+          <w:b w:val="0"/>
+          <w:i w:val="0"/>
+          <w:sz w:val="22"/>
+          <w:color w:val="000000"/>
+        </w:rPr>
+        <w:t xml:space="preserve">It is well recognized that heavy metals harm human health through the food chain. The danger to human health associated with consuming fish contaminated with heavy metals were assessed. This study aimed to determine the presence of lead in the flesh part of selected fish species, Common carp (Cyprinus carpio), Roho labeo (Labeo rohita), and Silver carp (Hypophthalmichthys molitrix), in addition to determine the Knowledge, Attitude, and Practices (KAP) of fishers along the Pampanga River. A test method used is Inductively Coupled Plasma — Optical Emission Spectrometry (ICP-OES) in identifying heavy metals in biota. The self-administered questionnaires were distributed to 20 respondents, questionnaires compromised of socio-demographic characteristics and the KAP’s of fishers along the Pampanga River. Data analyses were done using SPSS (version 23). Data were explored using descriptive statistics. The results show that lead in any of the selected fish, with a &lt;0.013 mg/kg result is below the FAO and WHO’s allowed limits of 2 mg/kg and 0.5 mg/kg, respectively. Based on the result from KAP Analysis, knowledge scored M=1.7200 with SD equivalent to 0.10052 which is interpreted as poor knowledge. The attitude score M=3.1150 and SD=0.093330 which means a moderate attitude and lastly, practices score M = 2.8850 and SD = .13485 which is equivalent to have good practices. Thus </w:t>
+      </w:r>
+      <w:r>
+        <w:rPr>
+          <w:rFonts w:ascii="Georgia" w:hAnsi="Georgia" w:cs="Georgia" w:eastAsia="Georgia"/>
+          <w:b w:val="0"/>
+          <w:i w:val="0"/>
+          <w:sz w:val="22"/>
+          <w:color w:val="8B4513"/>
+        </w:rPr>
+        <w:t>(DO)</w:t>
+      </w:r>
+      <w:r>
+        <w:rPr>
+          <w:rFonts w:ascii="Georgia" w:hAnsi="Georgia" w:cs="Georgia" w:eastAsia="Georgia"/>
+          <w:b w:val="0"/>
+          <w:i w:val="0"/>
+          <w:sz w:val="22"/>
+          <w:color w:val="000000"/>
+        </w:rPr>
+        <w:t>, the researcher provided a policy proposal to focus on issues that needed to be addressed in the community. In terms of practices, proper waste management should (FP-Rec) be established to avoid the high danger of heavy metal contamination. Certain local habits, such as waste dumping and other communal activities, may (EC) contribute to the spread of heavy metals. As a result, some community or local government-adopted measures are proposed (FP-Gen). These precautions are intended to prevent heavy metal contamination, particularly in the river system and the aquatic life in the area.</w:t>
       </w:r>
     </w:p>
     <w:p>
@@ -23204,126 +22913,32 @@
       <w:r>
         <w:rPr>
           <w:rFonts w:ascii="Georgia" w:hAnsi="Georgia" w:cs="Georgia" w:eastAsia="Georgia"/>
-          <w:sz w:val="22"/>
-          <w:szCs w:val="22"/>
-          <w:b w:val="0"/>
-          <w:bCs w:val="0"/>
-          <w:color w:val="000000"/>
-        </w:rPr>
-        <w:t xml:space="preserve">Currently, Central Luzon together with Calabarzon are regions that hold a pivotal position in the Philippines’ fishing industry. However, due to their adjacency to [REDACTED], which is highly polluted due to anthropogenic activities, these regions become vulnerable to bacterial infestation. Mycobacteriosis is a significant concern in cultivated milkfish, impacting both fish health and aquaculture productivity is reported in [REDACTED] and in parts of Central Luzon. Hence (DO), this study aimed to investigate the presence of potential (EC) mycobacterial infections in cultivated milkfish collected from fish-supplying areas of [REDACTED]. Using the Ziehl-Neelsen stain for acid-fast bacteria detection, along with biochemical testing methods such as the catalase test and assessing growth in the presence of the Salt Tolerance Test, revealed the presence of acid-fast bacteria in the tissues of infected milkfish, confirming the occurrence of mycobacteriosis infection. Additionally, biochemical testing, specifically the catalase test, was utilized to identify the catalase enzyme activity characteristic of mycobacteria, catalase test positive shows the result of the formation of bubbles. Furthermore, the growth of mycobacteria in the presence of the Salt Tolerance Test was assessed, showing the ability of these bacteria to thrive in high-salt environments, which is crucial information for understanding their survival and spread in aquaculture settings. Overall, the combination of Ziehl-Neelsen staining, biochemical testing like the catalase test, and evaluating growth in the presence of the Salt Tolerance Test provides [G] a comprehensive approach for diagnosing and studying mycobacteriosis in cultivated milkfish, offering insights that can (FP-Cap) guide effective management strategies to control the spread of this disease in aquaculture system.</w:t>
-      </w:r>
-      <w:r>
-        <w:rPr>
-          <w:rFonts w:ascii="Georgia" w:hAnsi="Georgia" w:cs="Georgia" w:eastAsia="Georgia"/>
-          <w:sz w:val="22"/>
-          <w:szCs w:val="22"/>
-          <w:b w:val="0"/>
-          <w:bCs w:val="0"/>
-          <w:highlight w:val="red"/>
-          <w:color w:val="FFFFFF"/>
-        </w:rPr>
-        <w:t xml:space="preserve"/>
-      </w:r>
-      <w:r>
-        <w:rPr>
-          <w:rFonts w:ascii="Georgia" w:hAnsi="Georgia" w:cs="Georgia" w:eastAsia="Georgia"/>
-          <w:sz w:val="22"/>
-          <w:szCs w:val="22"/>
-          <w:b w:val="0"/>
-          <w:bCs w:val="0"/>
-          <w:color w:val="000000"/>
-        </w:rPr>
-        <w:t xml:space="preserve"/>
-      </w:r>
-      <w:r>
-        <w:rPr>
-          <w:rFonts w:ascii="Georgia" w:hAnsi="Georgia" w:cs="Georgia" w:eastAsia="Georgia"/>
-          <w:sz w:val="22"/>
-          <w:szCs w:val="22"/>
-          <w:b w:val="0"/>
-          <w:bCs w:val="0"/>
-          <w:color w:val="ED7D31"/>
-        </w:rPr>
-        <w:t xml:space="preserve"/>
-      </w:r>
-      <w:r>
-        <w:rPr>
-          <w:rFonts w:ascii="Georgia" w:hAnsi="Georgia" w:cs="Georgia" w:eastAsia="Georgia"/>
-          <w:sz w:val="22"/>
-          <w:szCs w:val="22"/>
-          <w:b w:val="0"/>
-          <w:bCs w:val="0"/>
-          <w:color w:val="000000"/>
-        </w:rPr>
-        <w:t xml:space="preserve"/>
-      </w:r>
-      <w:r>
-        <w:rPr>
-          <w:rFonts w:ascii="Georgia" w:hAnsi="Georgia" w:cs="Georgia" w:eastAsia="Georgia"/>
-          <w:sz w:val="22"/>
-          <w:szCs w:val="22"/>
-          <w:b w:val="0"/>
-          <w:bCs w:val="0"/>
-          <w:shd w:val="clear" w:color="auto" w:fill="bfbfbf"/>
-          <w:color w:val="000000"/>
-        </w:rPr>
-        <w:t xml:space="preserve"/>
-      </w:r>
-      <w:r>
-        <w:rPr>
-          <w:rFonts w:ascii="Georgia" w:hAnsi="Georgia" w:cs="Georgia" w:eastAsia="Georgia"/>
-          <w:sz w:val="22"/>
-          <w:szCs w:val="22"/>
-          <w:b w:val="0"/>
-          <w:bCs w:val="0"/>
-          <w:color w:val="000000"/>
-        </w:rPr>
-        <w:t xml:space="preserve"/>
-      </w:r>
-      <w:r>
-        <w:rPr>
-          <w:rFonts w:ascii="Georgia" w:hAnsi="Georgia" w:cs="Georgia" w:eastAsia="Georgia"/>
-          <w:sz w:val="22"/>
-          <w:szCs w:val="22"/>
-          <w:b w:val="0"/>
-          <w:bCs w:val="0"/>
-          <w:strike/>
-          <w:color w:val="000000"/>
-        </w:rPr>
-        <w:t xml:space="preserve"/>
-      </w:r>
-      <w:r>
-        <w:rPr>
-          <w:rFonts w:ascii="Georgia" w:hAnsi="Georgia" w:cs="Georgia" w:eastAsia="Georgia"/>
-          <w:sz w:val="22"/>
-          <w:szCs w:val="22"/>
-          <w:b w:val="0"/>
-          <w:bCs w:val="0"/>
-          <w:color w:val="000000"/>
-        </w:rPr>
-        <w:t xml:space="preserve"/>
-      </w:r>
-      <w:r>
-        <w:rPr>
-          <w:rFonts w:ascii="Georgia" w:hAnsi="Georgia" w:cs="Georgia" w:eastAsia="Georgia"/>
-          <w:sz w:val="22"/>
-          <w:szCs w:val="22"/>
-          <w:b w:val="0"/>
-          <w:bCs w:val="0"/>
-          <w:color w:val="808080"/>
-        </w:rPr>
-        <w:t xml:space="preserve"/>
-      </w:r>
-      <w:r>
-        <w:rPr>
-          <w:rFonts w:ascii="Georgia" w:hAnsi="Georgia" w:cs="Georgia" w:eastAsia="Georgia"/>
-          <w:sz w:val="22"/>
-          <w:szCs w:val="22"/>
-          <w:b w:val="0"/>
-          <w:bCs w:val="0"/>
-          <w:color w:val="000000"/>
-        </w:rPr>
-        <w:t xml:space="preserve"/>
+          <w:b w:val="0"/>
+          <w:i w:val="0"/>
+          <w:sz w:val="22"/>
+          <w:color w:val="000000"/>
+        </w:rPr>
+        <w:t xml:space="preserve">Currently, Central Luzon together with Calabarzon are regions that hold a pivotal position in the Philippines’ fishing industry. However, due to their adjacency to [REDACTED], which is highly polluted due to anthropogenic activities, these regions become vulnerable to bacterial infestation. Mycobacteriosis is a significant concern in cultivated milkfish, impacting both fish health and aquaculture productivity is reported in [REDACTED] and in parts of Central Luzon. Hence </w:t>
+      </w:r>
+      <w:r>
+        <w:rPr>
+          <w:rFonts w:ascii="Georgia" w:hAnsi="Georgia" w:cs="Georgia" w:eastAsia="Georgia"/>
+          <w:b w:val="0"/>
+          <w:i w:val="0"/>
+          <w:sz w:val="22"/>
+          <w:color w:val="8B4513"/>
+        </w:rPr>
+        <w:t>(DO)</w:t>
+      </w:r>
+      <w:r>
+        <w:rPr>
+          <w:rFonts w:ascii="Georgia" w:hAnsi="Georgia" w:cs="Georgia" w:eastAsia="Georgia"/>
+          <w:b w:val="0"/>
+          <w:i w:val="0"/>
+          <w:sz w:val="22"/>
+          <w:color w:val="000000"/>
+        </w:rPr>
+        <w:t>, this study aimed to investigate the presence of potential (EC) mycobacterial infections in cultivated milkfish collected from fish-supplying areas of [REDACTED]. Using the Ziehl-Neelsen stain for acid-fast bacteria detection, along with biochemical testing methods such as the catalase test and assessing growth in the presence of the Salt Tolerance Test, revealed the presence of acid-fast bacteria in the tissues of infected milkfish, confirming the occurrence of mycobacteriosis infection. Additionally, biochemical testing, specifically the catalase test, was utilized to identify the catalase enzyme activity characteristic of mycobacteria, catalase test positive shows the result of the formation of bubbles. Furthermore, the growth of mycobacteria in the presence of the Salt Tolerance Test was assessed, showing the ability of these bacteria to thrive in high-salt environments, which is crucial information for understanding their survival and spread in aquaculture settings. Overall, the combination of Ziehl-Neelsen staining, biochemical testing like the catalase test, and evaluating growth in the presence of the Salt Tolerance Test provides [G] a comprehensive approach for diagnosing and studying mycobacteriosis in cultivated milkfish, offering insights that can (FP-Cap) guide effective management strategies to control the spread of this disease in aquaculture system.</w:t>
       </w:r>
     </w:p>
     <w:p>
@@ -23361,81 +22976,32 @@
       <w:r>
         <w:rPr>
           <w:rFonts w:ascii="Georgia" w:hAnsi="Georgia" w:cs="Georgia" w:eastAsia="Georgia"/>
-          <w:sz w:val="22"/>
-          <w:szCs w:val="22"/>
-          <w:b w:val="0"/>
-          <w:bCs w:val="0"/>
-          <w:color w:val="000000"/>
-        </w:rPr>
-        <w:t xml:space="preserve">Antimicrobial resistance is a major threat to public health worldwide, making infections difficult to treat. This problem calls for developing novel and alternative strategies to attenuate microorganisms without inducing resistance. Hence (DO), lactic acid bacteria (LAB) have emerged as a focal point due to their potential (EC) quorum quenching (QQ) activities. In this study, lactic acid bacteria were obtained from a parallel study, and the antimicrobial activity of the top 10 isolates was evaluated through spectrophotometric and turbidimetric analyses for the initial screening of gut isolates. Nine out of ten isolates exhibit quorum quenching activities by inhibiting the swarming motility of Pseudomonas aeruginosa. The metabolic compounds of the isolates were subjected to initial characterization using enzyme and pH neutralization, which revealed that organic acids were responsible for the inhibitory activity. The inhibition activity of LAB isolates against the quorum sensing-mediated swarming motility in P. aeruginosa was [C] due to strong antibacterial activity.</w:t>
-      </w:r>
-      <w:r>
-        <w:rPr>
-          <w:rFonts w:ascii="Georgia" w:hAnsi="Georgia" w:cs="Georgia" w:eastAsia="Georgia"/>
-          <w:sz w:val="22"/>
-          <w:szCs w:val="22"/>
-          <w:b w:val="0"/>
-          <w:bCs w:val="0"/>
-          <w:highlight w:val="red"/>
-          <w:color w:val="FFFFFF"/>
-        </w:rPr>
-        <w:t xml:space="preserve"/>
-      </w:r>
-      <w:r>
-        <w:rPr>
-          <w:rFonts w:ascii="Georgia" w:hAnsi="Georgia" w:cs="Georgia" w:eastAsia="Georgia"/>
-          <w:sz w:val="22"/>
-          <w:szCs w:val="22"/>
-          <w:b w:val="0"/>
-          <w:bCs w:val="0"/>
-          <w:color w:val="000000"/>
-        </w:rPr>
-        <w:t xml:space="preserve"/>
-      </w:r>
-      <w:r>
-        <w:rPr>
-          <w:rFonts w:ascii="Georgia" w:hAnsi="Georgia" w:cs="Georgia" w:eastAsia="Georgia"/>
-          <w:sz w:val="22"/>
-          <w:szCs w:val="22"/>
-          <w:b w:val="0"/>
-          <w:bCs w:val="0"/>
-          <w:color w:val="ED7D31"/>
-        </w:rPr>
-        <w:t xml:space="preserve"/>
-      </w:r>
-      <w:r>
-        <w:rPr>
-          <w:rFonts w:ascii="Georgia" w:hAnsi="Georgia" w:cs="Georgia" w:eastAsia="Georgia"/>
-          <w:sz w:val="22"/>
-          <w:szCs w:val="22"/>
-          <w:b w:val="0"/>
-          <w:bCs w:val="0"/>
-          <w:color w:val="000000"/>
-        </w:rPr>
-        <w:t xml:space="preserve"/>
-      </w:r>
-      <w:r>
-        <w:rPr>
-          <w:rFonts w:ascii="Georgia" w:hAnsi="Georgia" w:cs="Georgia" w:eastAsia="Georgia"/>
-          <w:sz w:val="22"/>
-          <w:szCs w:val="22"/>
-          <w:b w:val="0"/>
-          <w:bCs w:val="0"/>
-          <w:shd w:val="clear" w:color="auto" w:fill="bfbfbf"/>
-          <w:color w:val="000000"/>
-        </w:rPr>
-        <w:t xml:space="preserve"/>
-      </w:r>
-      <w:r>
-        <w:rPr>
-          <w:rFonts w:ascii="Georgia" w:hAnsi="Georgia" w:cs="Georgia" w:eastAsia="Georgia"/>
-          <w:sz w:val="22"/>
-          <w:szCs w:val="22"/>
-          <w:b w:val="0"/>
-          <w:bCs w:val="0"/>
-          <w:color w:val="000000"/>
-        </w:rPr>
-        <w:t xml:space="preserve"/>
+          <w:b w:val="0"/>
+          <w:i w:val="0"/>
+          <w:sz w:val="22"/>
+          <w:color w:val="000000"/>
+        </w:rPr>
+        <w:t xml:space="preserve">Antimicrobial resistance is a major threat to public health worldwide, making infections difficult to treat. This problem calls for developing novel and alternative strategies to attenuate microorganisms without inducing resistance. Hence </w:t>
+      </w:r>
+      <w:r>
+        <w:rPr>
+          <w:rFonts w:ascii="Georgia" w:hAnsi="Georgia" w:cs="Georgia" w:eastAsia="Georgia"/>
+          <w:b w:val="0"/>
+          <w:i w:val="0"/>
+          <w:sz w:val="22"/>
+          <w:color w:val="8B4513"/>
+        </w:rPr>
+        <w:t>(DO)</w:t>
+      </w:r>
+      <w:r>
+        <w:rPr>
+          <w:rFonts w:ascii="Georgia" w:hAnsi="Georgia" w:cs="Georgia" w:eastAsia="Georgia"/>
+          <w:b w:val="0"/>
+          <w:i w:val="0"/>
+          <w:sz w:val="22"/>
+          <w:color w:val="000000"/>
+        </w:rPr>
+        <w:t>, lactic acid bacteria (LAB) have emerged as a focal point due to their potential (EC) quorum quenching (QQ) activities. In this study, lactic acid bacteria were obtained from a parallel study, and the antimicrobial activity of the top 10 isolates was evaluated through spectrophotometric and turbidimetric analyses for the initial screening of gut isolates. Nine out of ten isolates exhibit quorum quenching activities by inhibiting the swarming motility of Pseudomonas aeruginosa. The metabolic compounds of the isolates were subjected to initial characterization using enzyme and pH neutralization, which revealed that organic acids were responsible for the inhibitory activity. The inhibition activity of LAB isolates against the quorum sensing-mediated swarming motility in P. aeruginosa was [C] due to strong antibacterial activity.</w:t>
       </w:r>
     </w:p>
     <w:p>
@@ -23965,283 +23531,52 @@
       <w:r>
         <w:rPr>
           <w:rFonts w:ascii="Georgia" w:hAnsi="Georgia" w:cs="Georgia" w:eastAsia="Georgia"/>
-          <w:sz w:val="22"/>
-          <w:szCs w:val="22"/>
-          <w:b w:val="0"/>
-          <w:bCs w:val="0"/>
-          <w:color w:val="000000"/>
-        </w:rPr>
-        <w:t xml:space="preserve">Methicillin-resistant Staphylococcus aureus (MRSA) is a common and potentially (EC) severe pathogen that has developed resistance to several types of antibiotics. MRSA bacteria can (FP-Cap) survive long on surfaces and objects, including second-hand clothing (SHC). The increasing popularity of SHC or “ukay-ukay” in the Philippines, coupled with potential (EC) public health concerns associated with transmitting pathogenic bacteria, emphasized this research’s need. Thus (DO), this study detected the presence of S. aureus and MRSA in second-hand clothing. A total of fifteen most frequently purchased second-hand clothing (i.e., blouses, tee shirts, crop tops, tank tops, and hoodie jackets) were collected from [REDACTED]. Bacteriological analyses demonstrated the presence of Staphylococcus species across all samples, with growth in high-salt-containing culture broth and characteristic growth on Mannitol Salt Agar (MSA). Biochemical tests revealed positive catalase and Gram-positive cocci in clusters typical of S. aureus. Antibiotic susceptibility testing indicated the presence of both methicillin-sensitive S. aureus (MSSA) and methicillin-resistant S. aureus (MRSA) strains among the collected samples, highlighting the potential (EC) public health risks associated with the handling and purchasing of second-hand clothing. This study, therefore (DO), underscores the need for proper precautions to mitigate the spread of potentially (EC) harmful bacteria, including MRSA, on second-hand clothing. It highlights the importance of raising awareness among both vendors and consumers about the potential (EC) health risks associated with these garments.</w:t>
-      </w:r>
-      <w:r>
-        <w:rPr>
-          <w:rFonts w:ascii="Georgia" w:hAnsi="Georgia" w:cs="Georgia" w:eastAsia="Georgia"/>
-          <w:sz w:val="22"/>
-          <w:szCs w:val="22"/>
-          <w:b w:val="0"/>
-          <w:bCs w:val="0"/>
-          <w:highlight w:val="yellow"/>
-          <w:color w:val="000000"/>
-        </w:rPr>
-        <w:t xml:space="preserve"/>
-      </w:r>
-      <w:r>
-        <w:rPr>
-          <w:rFonts w:ascii="Georgia" w:hAnsi="Georgia" w:cs="Georgia" w:eastAsia="Georgia"/>
-          <w:sz w:val="22"/>
-          <w:szCs w:val="22"/>
-          <w:b w:val="0"/>
-          <w:bCs w:val="0"/>
-          <w:color w:val="000000"/>
-        </w:rPr>
-        <w:t xml:space="preserve"/>
-      </w:r>
-      <w:r>
-        <w:rPr>
-          <w:rFonts w:ascii="Georgia" w:hAnsi="Georgia" w:cs="Georgia" w:eastAsia="Georgia"/>
-          <w:sz w:val="22"/>
-          <w:szCs w:val="22"/>
-          <w:b w:val="0"/>
-          <w:bCs w:val="0"/>
-          <w:color w:val="ED7D31"/>
-        </w:rPr>
-        <w:t xml:space="preserve"/>
-      </w:r>
-      <w:r>
-        <w:rPr>
-          <w:rFonts w:ascii="Georgia" w:hAnsi="Georgia" w:cs="Georgia" w:eastAsia="Georgia"/>
-          <w:sz w:val="22"/>
-          <w:szCs w:val="22"/>
-          <w:b w:val="0"/>
-          <w:bCs w:val="0"/>
-          <w:color w:val="000000"/>
-        </w:rPr>
-        <w:t xml:space="preserve"/>
-      </w:r>
-      <w:r>
-        <w:rPr>
-          <w:rFonts w:ascii="Georgia" w:hAnsi="Georgia" w:cs="Georgia" w:eastAsia="Georgia"/>
-          <w:sz w:val="22"/>
-          <w:szCs w:val="22"/>
-          <w:b w:val="0"/>
-          <w:bCs w:val="0"/>
-          <w:strike/>
-          <w:color w:val="000000"/>
-        </w:rPr>
-        <w:t xml:space="preserve"/>
-      </w:r>
-      <w:r>
-        <w:rPr>
-          <w:rFonts w:ascii="Georgia" w:hAnsi="Georgia" w:cs="Georgia" w:eastAsia="Georgia"/>
-          <w:sz w:val="22"/>
-          <w:szCs w:val="22"/>
-          <w:b w:val="0"/>
-          <w:bCs w:val="0"/>
-          <w:color w:val="000000"/>
-        </w:rPr>
-        <w:t xml:space="preserve"/>
-      </w:r>
-      <w:r>
-        <w:rPr>
-          <w:rFonts w:ascii="Georgia" w:hAnsi="Georgia" w:cs="Georgia" w:eastAsia="Georgia"/>
-          <w:sz w:val="22"/>
-          <w:szCs w:val="22"/>
-          <w:b w:val="0"/>
-          <w:bCs w:val="0"/>
-          <w:color w:val="808080"/>
-        </w:rPr>
-        <w:t xml:space="preserve"/>
-      </w:r>
-      <w:r>
-        <w:rPr>
-          <w:rFonts w:ascii="Georgia" w:hAnsi="Georgia" w:cs="Georgia" w:eastAsia="Georgia"/>
-          <w:sz w:val="22"/>
-          <w:szCs w:val="22"/>
-          <w:b w:val="0"/>
-          <w:bCs w:val="0"/>
-          <w:color w:val="000000"/>
-        </w:rPr>
-        <w:t xml:space="preserve"/>
-      </w:r>
-      <w:r>
-        <w:rPr>
-          <w:rFonts w:ascii="Georgia" w:hAnsi="Georgia" w:cs="Georgia" w:eastAsia="Georgia"/>
-          <w:sz w:val="22"/>
-          <w:szCs w:val="22"/>
-          <w:b w:val="0"/>
-          <w:bCs w:val="0"/>
-          <w:highlight w:val="red"/>
-          <w:color w:val="FFFFFF"/>
-        </w:rPr>
-        <w:t xml:space="preserve"/>
-      </w:r>
-      <w:r>
-        <w:rPr>
-          <w:rFonts w:ascii="Georgia" w:hAnsi="Georgia" w:cs="Georgia" w:eastAsia="Georgia"/>
-          <w:sz w:val="22"/>
-          <w:szCs w:val="22"/>
-          <w:b w:val="0"/>
-          <w:bCs w:val="0"/>
-          <w:color w:val="000000"/>
-        </w:rPr>
-        <w:t xml:space="preserve"/>
-      </w:r>
-      <w:r>
-        <w:rPr>
-          <w:rFonts w:ascii="Georgia" w:hAnsi="Georgia" w:cs="Georgia" w:eastAsia="Georgia"/>
-          <w:sz w:val="22"/>
-          <w:szCs w:val="22"/>
-          <w:b w:val="0"/>
-          <w:bCs w:val="0"/>
-          <w:color w:val="ED7D31"/>
-        </w:rPr>
-        <w:t xml:space="preserve"/>
-      </w:r>
-      <w:r>
-        <w:rPr>
-          <w:rFonts w:ascii="Georgia" w:hAnsi="Georgia" w:cs="Georgia" w:eastAsia="Georgia"/>
-          <w:sz w:val="22"/>
-          <w:szCs w:val="22"/>
-          <w:b w:val="0"/>
-          <w:bCs w:val="0"/>
-          <w:color w:val="000000"/>
-        </w:rPr>
-        <w:t xml:space="preserve"/>
-      </w:r>
-      <w:r>
-        <w:rPr>
-          <w:rFonts w:ascii="Georgia" w:hAnsi="Georgia" w:cs="Georgia" w:eastAsia="Georgia"/>
-          <w:sz w:val="22"/>
-          <w:szCs w:val="22"/>
-          <w:b w:val="0"/>
-          <w:bCs w:val="0"/>
-          <w:highlight w:val="red"/>
-          <w:color w:val="FFFFFF"/>
-        </w:rPr>
-        <w:t xml:space="preserve"/>
-      </w:r>
-      <w:r>
-        <w:rPr>
-          <w:rFonts w:ascii="Georgia" w:hAnsi="Georgia" w:cs="Georgia" w:eastAsia="Georgia"/>
-          <w:sz w:val="22"/>
-          <w:szCs w:val="22"/>
-          <w:b w:val="0"/>
-          <w:bCs w:val="0"/>
-          <w:color w:val="000000"/>
-        </w:rPr>
-        <w:t xml:space="preserve"/>
-      </w:r>
-      <w:r>
-        <w:rPr>
-          <w:rFonts w:ascii="Georgia" w:hAnsi="Georgia" w:cs="Georgia" w:eastAsia="Georgia"/>
-          <w:sz w:val="22"/>
-          <w:szCs w:val="22"/>
-          <w:b w:val="0"/>
-          <w:bCs w:val="0"/>
-          <w:color w:val="ED7D31"/>
-        </w:rPr>
-        <w:t xml:space="preserve"/>
-      </w:r>
-      <w:r>
-        <w:rPr>
-          <w:rFonts w:ascii="Georgia" w:hAnsi="Georgia" w:cs="Georgia" w:eastAsia="Georgia"/>
-          <w:sz w:val="22"/>
-          <w:szCs w:val="22"/>
-          <w:b w:val="0"/>
-          <w:bCs w:val="0"/>
-          <w:color w:val="000000"/>
-        </w:rPr>
-        <w:t xml:space="preserve"/>
-      </w:r>
-      <w:r>
-        <w:rPr>
-          <w:rFonts w:ascii="Georgia" w:hAnsi="Georgia" w:cs="Georgia" w:eastAsia="Georgia"/>
-          <w:sz w:val="22"/>
-          <w:szCs w:val="22"/>
-          <w:b w:val="0"/>
-          <w:bCs w:val="0"/>
-          <w:highlight w:val="yellow"/>
-          <w:color w:val="000000"/>
-        </w:rPr>
-        <w:t xml:space="preserve"/>
-      </w:r>
-      <w:r>
-        <w:rPr>
-          <w:rFonts w:ascii="Georgia" w:hAnsi="Georgia" w:cs="Georgia" w:eastAsia="Georgia"/>
-          <w:sz w:val="22"/>
-          <w:szCs w:val="22"/>
-          <w:b w:val="0"/>
-          <w:bCs w:val="0"/>
-          <w:color w:val="000000"/>
-        </w:rPr>
-        <w:t xml:space="preserve"/>
-      </w:r>
-      <w:r>
-        <w:rPr>
-          <w:rFonts w:ascii="Georgia" w:hAnsi="Georgia" w:cs="Georgia" w:eastAsia="Georgia"/>
-          <w:sz w:val="22"/>
-          <w:szCs w:val="22"/>
-          <w:b w:val="0"/>
-          <w:bCs w:val="0"/>
-          <w:color w:val="ED7D31"/>
-        </w:rPr>
-        <w:t xml:space="preserve"/>
-      </w:r>
-      <w:r>
-        <w:rPr>
-          <w:rFonts w:ascii="Georgia" w:hAnsi="Georgia" w:cs="Georgia" w:eastAsia="Georgia"/>
-          <w:sz w:val="22"/>
-          <w:szCs w:val="22"/>
-          <w:b w:val="0"/>
-          <w:bCs w:val="0"/>
-          <w:color w:val="000000"/>
-        </w:rPr>
-        <w:t xml:space="preserve"/>
-      </w:r>
-      <w:r>
-        <w:rPr>
-          <w:rFonts w:ascii="Georgia" w:hAnsi="Georgia" w:cs="Georgia" w:eastAsia="Georgia"/>
-          <w:sz w:val="22"/>
-          <w:szCs w:val="22"/>
-          <w:b w:val="0"/>
-          <w:bCs w:val="0"/>
-          <w:highlight w:val="red"/>
-          <w:color w:val="FFFFFF"/>
-        </w:rPr>
-        <w:t xml:space="preserve"/>
-      </w:r>
-      <w:r>
-        <w:rPr>
-          <w:rFonts w:ascii="Georgia" w:hAnsi="Georgia" w:cs="Georgia" w:eastAsia="Georgia"/>
-          <w:sz w:val="22"/>
-          <w:szCs w:val="22"/>
-          <w:b w:val="0"/>
-          <w:bCs w:val="0"/>
-          <w:color w:val="000000"/>
-        </w:rPr>
-        <w:t xml:space="preserve"/>
-      </w:r>
-      <w:r>
-        <w:rPr>
-          <w:rFonts w:ascii="Georgia" w:hAnsi="Georgia" w:cs="Georgia" w:eastAsia="Georgia"/>
-          <w:sz w:val="22"/>
-          <w:szCs w:val="22"/>
-          <w:b w:val="0"/>
-          <w:bCs w:val="0"/>
-          <w:color w:val="ED7D31"/>
-        </w:rPr>
-        <w:t xml:space="preserve"/>
-      </w:r>
-      <w:r>
-        <w:rPr>
-          <w:rFonts w:ascii="Georgia" w:hAnsi="Georgia" w:cs="Georgia" w:eastAsia="Georgia"/>
-          <w:sz w:val="22"/>
-          <w:szCs w:val="22"/>
-          <w:b w:val="0"/>
-          <w:bCs w:val="0"/>
-          <w:color w:val="000000"/>
-        </w:rPr>
-        <w:t xml:space="preserve"/>
+          <w:b w:val="0"/>
+          <w:i w:val="0"/>
+          <w:sz w:val="22"/>
+          <w:color w:val="000000"/>
+        </w:rPr>
+        <w:t xml:space="preserve">Methicillin-resistant Staphylococcus aureus (MRSA) is a common and potentially (EC) severe pathogen that has developed resistance to several types of antibiotics. MRSA bacteria can (FP-Cap) survive long on surfaces and objects, including second-hand clothing (SHC). The increasing popularity of SHC or “ukay-ukay” in the Philippines, coupled with potential (EC) public health concerns associated with transmitting pathogenic bacteria, emphasized this research’s need. Thus </w:t>
+      </w:r>
+      <w:r>
+        <w:rPr>
+          <w:rFonts w:ascii="Georgia" w:hAnsi="Georgia" w:cs="Georgia" w:eastAsia="Georgia"/>
+          <w:b w:val="0"/>
+          <w:i w:val="0"/>
+          <w:sz w:val="22"/>
+          <w:color w:val="8B4513"/>
+        </w:rPr>
+        <w:t>(DO)</w:t>
+      </w:r>
+      <w:r>
+        <w:rPr>
+          <w:rFonts w:ascii="Georgia" w:hAnsi="Georgia" w:cs="Georgia" w:eastAsia="Georgia"/>
+          <w:b w:val="0"/>
+          <w:i w:val="0"/>
+          <w:sz w:val="22"/>
+          <w:color w:val="000000"/>
+        </w:rPr>
+        <w:t xml:space="preserve">, this study detected the presence of S. aureus and MRSA in second-hand clothing. A total of fifteen most frequently purchased second-hand clothing (i.e., blouses, tee shirts, crop tops, tank tops, and hoodie jackets) were collected from [REDACTED]. Bacteriological analyses demonstrated the presence of Staphylococcus species across all samples, with growth in high-salt-containing culture broth and characteristic growth on Mannitol Salt Agar (MSA). Biochemical tests revealed positive catalase and Gram-positive cocci in clusters typical of S. aureus. Antibiotic susceptibility testing indicated the presence of both methicillin-sensitive S. aureus (MSSA) and methicillin-resistant S. aureus (MRSA) strains among the collected samples, highlighting the potential (EC) public health risks associated with the handling and purchasing of second-hand clothing. This study, therefore </w:t>
+      </w:r>
+      <w:r>
+        <w:rPr>
+          <w:rFonts w:ascii="Georgia" w:hAnsi="Georgia" w:cs="Georgia" w:eastAsia="Georgia"/>
+          <w:b w:val="0"/>
+          <w:i w:val="0"/>
+          <w:sz w:val="22"/>
+          <w:color w:val="8B4513"/>
+        </w:rPr>
+        <w:t>(DO)</w:t>
+      </w:r>
+      <w:r>
+        <w:rPr>
+          <w:rFonts w:ascii="Georgia" w:hAnsi="Georgia" w:cs="Georgia" w:eastAsia="Georgia"/>
+          <w:b w:val="0"/>
+          <w:i w:val="0"/>
+          <w:sz w:val="22"/>
+          <w:color w:val="000000"/>
+        </w:rPr>
+        <w:t>, underscores the need for proper precautions to mitigate the spread of potentially (EC) harmful bacteria, including MRSA, on second-hand clothing. It highlights the importance of raising awareness among both vendors and consumers about the potential (EC) health risks associated with these garments.</w:t>
       </w:r>
     </w:p>
     <w:p>
@@ -24682,148 +24017,52 @@
       <w:r>
         <w:rPr>
           <w:rFonts w:ascii="Georgia" w:hAnsi="Georgia" w:cs="Georgia" w:eastAsia="Georgia"/>
-          <w:sz w:val="22"/>
-          <w:szCs w:val="22"/>
-          <w:b w:val="0"/>
-          <w:bCs w:val="0"/>
-          <w:color w:val="000000"/>
-        </w:rPr>
-        <w:t xml:space="preserve">Wetlands are becoming popular as important tourist destinations due to their unique natural beauty and diverse wildlife. These vital ecosystems are at risk from the unregulated and unsustainable tourist visits that cause detrimental effects on the environment and host communities. Hence (DO), sustainable planning and management approaches should (FP-Rec) be considered. This study used Boullon’s Carrying Capacity Mathematical Model adopted from the Ecosystems Research and Development Bureau for computing the Tourism Carrying Capacity (TCC) of Sasmuan Pampanga Coastal Wetlands. Data on the parameters needed in TCC were collected through Key Informant Interviews, direct observation of the site, and a questionnaire-based survey for the tourism-related preferences and residents’ perceived impact of tourism activities. The Real Carrying Capacity per day was found to be a total of 13 boats and 156 visitors for fishing activity on the river stretch of [REDACTED], 14 visitors in the [REDACTED], while 420 visitors for aquaculture farm fishing I and 317 visitors in aquaculture farm fishing II, while 8 visitors for bangus feeding I and a total of 9 visitors for bangus feeding II. Only 5 visitors were allowed for birdwatching and 65 visitors for swimming activity. The results revealed that present visitations in these activities are still below the carrying capacity. For descriptive statistics, three-hundred fifty (350) respondents from five coastal barangays of SPCW were purposively selected. Results showed that respondents perceived tourism activities have a positive impact and equal perceptions in ecological (62.00%), economic (59.71%), social (59.71%), and visitor experiences aspects (50.86%). However, tourism activities in the area are perceived to have a negative impact on SPCW’s local facilities (54.00%). Thus (DO), local government should (FP-Rec) address the possible (EC) negative impacts of tourism activities and manage the carrying capacity for sustainable tourism.</w:t>
-      </w:r>
-      <w:r>
-        <w:rPr>
-          <w:rFonts w:ascii="Georgia" w:hAnsi="Georgia" w:cs="Georgia" w:eastAsia="Georgia"/>
-          <w:sz w:val="22"/>
-          <w:szCs w:val="22"/>
-          <w:b w:val="0"/>
-          <w:bCs w:val="0"/>
-          <w:strike/>
-          <w:color w:val="000000"/>
-        </w:rPr>
-        <w:t xml:space="preserve"/>
-      </w:r>
-      <w:r>
-        <w:rPr>
-          <w:rFonts w:ascii="Georgia" w:hAnsi="Georgia" w:cs="Georgia" w:eastAsia="Georgia"/>
-          <w:sz w:val="22"/>
-          <w:szCs w:val="22"/>
-          <w:b w:val="0"/>
-          <w:bCs w:val="0"/>
-          <w:color w:val="000000"/>
-        </w:rPr>
-        <w:t xml:space="preserve"/>
-      </w:r>
-      <w:r>
-        <w:rPr>
-          <w:rFonts w:ascii="Georgia" w:hAnsi="Georgia" w:cs="Georgia" w:eastAsia="Georgia"/>
-          <w:sz w:val="22"/>
-          <w:szCs w:val="22"/>
-          <w:b w:val="0"/>
-          <w:bCs w:val="0"/>
-          <w:color w:val="808080"/>
-        </w:rPr>
-        <w:t xml:space="preserve"/>
-      </w:r>
-      <w:r>
-        <w:rPr>
-          <w:rFonts w:ascii="Georgia" w:hAnsi="Georgia" w:cs="Georgia" w:eastAsia="Georgia"/>
-          <w:sz w:val="22"/>
-          <w:szCs w:val="22"/>
-          <w:b w:val="0"/>
-          <w:bCs w:val="0"/>
-          <w:color w:val="000000"/>
-        </w:rPr>
-        <w:t xml:space="preserve"/>
-      </w:r>
-      <w:r>
-        <w:rPr>
-          <w:rFonts w:ascii="Georgia" w:hAnsi="Georgia" w:cs="Georgia" w:eastAsia="Georgia"/>
-          <w:sz w:val="22"/>
-          <w:szCs w:val="22"/>
-          <w:b w:val="0"/>
-          <w:bCs w:val="0"/>
-          <w:strike/>
-          <w:color w:val="000000"/>
-        </w:rPr>
-        <w:t xml:space="preserve"/>
-      </w:r>
-      <w:r>
-        <w:rPr>
-          <w:rFonts w:ascii="Georgia" w:hAnsi="Georgia" w:cs="Georgia" w:eastAsia="Georgia"/>
-          <w:sz w:val="22"/>
-          <w:szCs w:val="22"/>
-          <w:b w:val="0"/>
-          <w:bCs w:val="0"/>
-          <w:color w:val="000000"/>
-        </w:rPr>
-        <w:t xml:space="preserve"/>
-      </w:r>
-      <w:r>
-        <w:rPr>
-          <w:rFonts w:ascii="Georgia" w:hAnsi="Georgia" w:cs="Georgia" w:eastAsia="Georgia"/>
-          <w:sz w:val="22"/>
-          <w:szCs w:val="22"/>
-          <w:b w:val="0"/>
-          <w:bCs w:val="0"/>
-          <w:color w:val="808080"/>
-        </w:rPr>
-        <w:t xml:space="preserve"/>
-      </w:r>
-      <w:r>
-        <w:rPr>
-          <w:rFonts w:ascii="Georgia" w:hAnsi="Georgia" w:cs="Georgia" w:eastAsia="Georgia"/>
-          <w:sz w:val="22"/>
-          <w:szCs w:val="22"/>
-          <w:b w:val="0"/>
-          <w:bCs w:val="0"/>
-          <w:color w:val="000000"/>
-        </w:rPr>
-        <w:t xml:space="preserve"/>
-      </w:r>
-      <w:r>
-        <w:rPr>
-          <w:rFonts w:ascii="Georgia" w:hAnsi="Georgia" w:cs="Georgia" w:eastAsia="Georgia"/>
-          <w:sz w:val="22"/>
-          <w:szCs w:val="22"/>
-          <w:b w:val="0"/>
-          <w:bCs w:val="0"/>
-          <w:highlight w:val="red"/>
-          <w:color w:val="FFFFFF"/>
-        </w:rPr>
-        <w:t xml:space="preserve"/>
-      </w:r>
-      <w:r>
-        <w:rPr>
-          <w:rFonts w:ascii="Georgia" w:hAnsi="Georgia" w:cs="Georgia" w:eastAsia="Georgia"/>
-          <w:sz w:val="22"/>
-          <w:szCs w:val="22"/>
-          <w:b w:val="0"/>
-          <w:bCs w:val="0"/>
-          <w:color w:val="000000"/>
-        </w:rPr>
-        <w:t xml:space="preserve"/>
-      </w:r>
-      <w:r>
-        <w:rPr>
-          <w:rFonts w:ascii="Georgia" w:hAnsi="Georgia" w:cs="Georgia" w:eastAsia="Georgia"/>
-          <w:sz w:val="22"/>
-          <w:szCs w:val="22"/>
-          <w:b w:val="0"/>
-          <w:bCs w:val="0"/>
-          <w:color w:val="ED7D31"/>
-        </w:rPr>
-        <w:t xml:space="preserve"/>
-      </w:r>
-      <w:r>
-        <w:rPr>
-          <w:rFonts w:ascii="Georgia" w:hAnsi="Georgia" w:cs="Georgia" w:eastAsia="Georgia"/>
-          <w:sz w:val="22"/>
-          <w:szCs w:val="22"/>
-          <w:b w:val="0"/>
-          <w:bCs w:val="0"/>
-          <w:color w:val="000000"/>
-        </w:rPr>
-        <w:t xml:space="preserve"/>
+          <w:b w:val="0"/>
+          <w:i w:val="0"/>
+          <w:sz w:val="22"/>
+          <w:color w:val="000000"/>
+        </w:rPr>
+        <w:t xml:space="preserve">Wetlands are becoming popular as important tourist destinations due to their unique natural beauty and diverse wildlife. These vital ecosystems are at risk from the unregulated and unsustainable tourist visits that cause detrimental effects on the environment and host communities. Hence </w:t>
+      </w:r>
+      <w:r>
+        <w:rPr>
+          <w:rFonts w:ascii="Georgia" w:hAnsi="Georgia" w:cs="Georgia" w:eastAsia="Georgia"/>
+          <w:b w:val="0"/>
+          <w:i w:val="0"/>
+          <w:sz w:val="22"/>
+          <w:color w:val="8B4513"/>
+        </w:rPr>
+        <w:t>(DO)</w:t>
+      </w:r>
+      <w:r>
+        <w:rPr>
+          <w:rFonts w:ascii="Georgia" w:hAnsi="Georgia" w:cs="Georgia" w:eastAsia="Georgia"/>
+          <w:b w:val="0"/>
+          <w:i w:val="0"/>
+          <w:sz w:val="22"/>
+          <w:color w:val="000000"/>
+        </w:rPr>
+        <w:t xml:space="preserve">, sustainable planning and management approaches should (FP-Rec) be considered. This study used Boullon’s Carrying Capacity Mathematical Model adopted from the Ecosystems Research and Development Bureau for computing the Tourism Carrying Capacity (TCC) of Sasmuan Pampanga Coastal Wetlands. Data on the parameters needed in TCC were collected through Key Informant Interviews, direct observation of the site, and a questionnaire-based survey for the tourism-related preferences and residents’ perceived impact of tourism activities. The Real Carrying Capacity per day was found to be a total of 13 boats and 156 visitors for fishing activity on the river stretch of [REDACTED], 14 visitors in the [REDACTED], while 420 visitors for aquaculture farm fishing I and 317 visitors in aquaculture farm fishing II, while 8 visitors for bangus feeding I and a total of 9 visitors for bangus feeding II. Only 5 visitors were allowed for birdwatching and 65 visitors for swimming activity. The results revealed that present visitations in these activities are still below the carrying capacity. For descriptive statistics, three-hundred fifty (350) respondents from five coastal barangays of SPCW were purposively selected. Results showed that respondents perceived tourism activities have a positive impact and equal perceptions in ecological (62.00%), economic (59.71%), social (59.71%), and visitor experiences aspects (50.86%). However, tourism activities in the area are perceived to have a negative impact on SPCW’s local facilities (54.00%). Thus </w:t>
+      </w:r>
+      <w:r>
+        <w:rPr>
+          <w:rFonts w:ascii="Georgia" w:hAnsi="Georgia" w:cs="Georgia" w:eastAsia="Georgia"/>
+          <w:b w:val="0"/>
+          <w:i w:val="0"/>
+          <w:sz w:val="22"/>
+          <w:color w:val="8B4513"/>
+        </w:rPr>
+        <w:t>(DO)</w:t>
+      </w:r>
+      <w:r>
+        <w:rPr>
+          <w:rFonts w:ascii="Georgia" w:hAnsi="Georgia" w:cs="Georgia" w:eastAsia="Georgia"/>
+          <w:b w:val="0"/>
+          <w:i w:val="0"/>
+          <w:sz w:val="22"/>
+          <w:color w:val="000000"/>
+        </w:rPr>
+        <w:t>, local government should (FP-Rec) address the possible (EC) negative impacts of tourism activities and manage the carrying capacity for sustainable tourism.</w:t>
       </w:r>
     </w:p>
     <w:p>
@@ -24861,193 +24100,52 @@
       <w:r>
         <w:rPr>
           <w:rFonts w:ascii="Georgia" w:hAnsi="Georgia" w:cs="Georgia" w:eastAsia="Georgia"/>
-          <w:sz w:val="22"/>
-          <w:szCs w:val="22"/>
-          <w:b w:val="0"/>
-          <w:bCs w:val="0"/>
-          <w:color w:val="000000"/>
-        </w:rPr>
-        <w:t xml:space="preserve">Many farmers have been facing many problems towards their crops. One of the common factors affecting the production of eggplant is the pathogenic diseases. The fungal disease commonly found in Eggplant (Solanum melongena) is Cercospora leaf spot, a plant-pathogenic fungus, Cercospora melongenae. Therefore (DO), this study aims to examine the potential (FP-Gen) of Trichoderma harzianum, an endophytic fungus, as a biocontrol agent for Cercospora leaf spot-on eggplants in the Philippines. Cercospora melongenae is a plant-pathogenic fungus that causes significant damage to eggplant crops, and the overuse of chemical pesticides has adverse effects on human health and the environment. As such, using alternative approaches, such as endophytic fungi, has gained attention from researchers. The study used thirty isolated leaf samples, twenty-one subcultures has been done and four different pathogenic fungi were identified. Moreover, there is an antagonistic effect of Trichoderma hazianum against the pathogenic fungi that cause disease in eggplant crops. Hence (DO), the study aimed to investigate the antagonistic potential (FP-Gen) of Trichoderma harzianum among the four isolates. The results indicate (FP-Gen) that the mean effect of Trichoderma harzianum on the test variables varied across the three days of observation. However, there was no significant difference in the effect of Trichoderma harzianum among the test variables on any of the three days, suggesting (EC) that the fungus had a similar impact on the growth of all four test variables.</w:t>
-      </w:r>
-      <w:r>
-        <w:rPr>
-          <w:rFonts w:ascii="Georgia" w:hAnsi="Georgia" w:cs="Georgia" w:eastAsia="Georgia"/>
-          <w:sz w:val="22"/>
-          <w:szCs w:val="22"/>
-          <w:b w:val="0"/>
-          <w:bCs w:val="0"/>
-          <w:strike/>
-          <w:color w:val="000000"/>
-        </w:rPr>
-        <w:t xml:space="preserve"/>
-      </w:r>
-      <w:r>
-        <w:rPr>
-          <w:rFonts w:ascii="Georgia" w:hAnsi="Georgia" w:cs="Georgia" w:eastAsia="Georgia"/>
-          <w:sz w:val="22"/>
-          <w:szCs w:val="22"/>
-          <w:b w:val="0"/>
-          <w:bCs w:val="0"/>
-          <w:color w:val="000000"/>
-        </w:rPr>
-        <w:t xml:space="preserve"/>
-      </w:r>
-      <w:r>
-        <w:rPr>
-          <w:rFonts w:ascii="Georgia" w:hAnsi="Georgia" w:cs="Georgia" w:eastAsia="Georgia"/>
-          <w:sz w:val="22"/>
-          <w:szCs w:val="22"/>
-          <w:b w:val="0"/>
-          <w:bCs w:val="0"/>
-          <w:color w:val="808080"/>
-        </w:rPr>
-        <w:t xml:space="preserve"/>
-      </w:r>
-      <w:r>
-        <w:rPr>
-          <w:rFonts w:ascii="Georgia" w:hAnsi="Georgia" w:cs="Georgia" w:eastAsia="Georgia"/>
-          <w:sz w:val="22"/>
-          <w:szCs w:val="22"/>
-          <w:b w:val="0"/>
-          <w:bCs w:val="0"/>
-          <w:color w:val="000000"/>
-        </w:rPr>
-        <w:t xml:space="preserve"/>
-      </w:r>
-      <w:r>
-        <w:rPr>
-          <w:rFonts w:ascii="Georgia" w:hAnsi="Georgia" w:cs="Georgia" w:eastAsia="Georgia"/>
-          <w:sz w:val="22"/>
-          <w:szCs w:val="22"/>
-          <w:b w:val="0"/>
-          <w:bCs w:val="0"/>
-          <w:strike/>
-          <w:color w:val="000000"/>
-        </w:rPr>
-        <w:t xml:space="preserve"/>
-      </w:r>
-      <w:r>
-        <w:rPr>
-          <w:rFonts w:ascii="Georgia" w:hAnsi="Georgia" w:cs="Georgia" w:eastAsia="Georgia"/>
-          <w:sz w:val="22"/>
-          <w:szCs w:val="22"/>
-          <w:b w:val="0"/>
-          <w:bCs w:val="0"/>
-          <w:color w:val="000000"/>
-        </w:rPr>
-        <w:t xml:space="preserve"/>
-      </w:r>
-      <w:r>
-        <w:rPr>
-          <w:rFonts w:ascii="Georgia" w:hAnsi="Georgia" w:cs="Georgia" w:eastAsia="Georgia"/>
-          <w:sz w:val="22"/>
-          <w:szCs w:val="22"/>
-          <w:b w:val="0"/>
-          <w:bCs w:val="0"/>
-          <w:color w:val="808080"/>
-        </w:rPr>
-        <w:t xml:space="preserve"/>
-      </w:r>
-      <w:r>
-        <w:rPr>
-          <w:rFonts w:ascii="Georgia" w:hAnsi="Georgia" w:cs="Georgia" w:eastAsia="Georgia"/>
-          <w:sz w:val="22"/>
-          <w:szCs w:val="22"/>
-          <w:b w:val="0"/>
-          <w:bCs w:val="0"/>
-          <w:color w:val="000000"/>
-        </w:rPr>
-        <w:t xml:space="preserve"/>
-      </w:r>
-      <w:r>
-        <w:rPr>
-          <w:rFonts w:ascii="Georgia" w:hAnsi="Georgia" w:cs="Georgia" w:eastAsia="Georgia"/>
-          <w:sz w:val="22"/>
-          <w:szCs w:val="22"/>
-          <w:b w:val="0"/>
-          <w:bCs w:val="0"/>
-          <w:strike/>
-          <w:color w:val="000000"/>
-        </w:rPr>
-        <w:t xml:space="preserve"/>
-      </w:r>
-      <w:r>
-        <w:rPr>
-          <w:rFonts w:ascii="Georgia" w:hAnsi="Georgia" w:cs="Georgia" w:eastAsia="Georgia"/>
-          <w:sz w:val="22"/>
-          <w:szCs w:val="22"/>
-          <w:b w:val="0"/>
-          <w:bCs w:val="0"/>
-          <w:color w:val="000000"/>
-        </w:rPr>
-        <w:t xml:space="preserve"/>
-      </w:r>
-      <w:r>
-        <w:rPr>
-          <w:rFonts w:ascii="Georgia" w:hAnsi="Georgia" w:cs="Georgia" w:eastAsia="Georgia"/>
-          <w:sz w:val="22"/>
-          <w:szCs w:val="22"/>
-          <w:b w:val="0"/>
-          <w:bCs w:val="0"/>
-          <w:color w:val="808080"/>
-        </w:rPr>
-        <w:t xml:space="preserve"/>
-      </w:r>
-      <w:r>
-        <w:rPr>
-          <w:rFonts w:ascii="Georgia" w:hAnsi="Georgia" w:cs="Georgia" w:eastAsia="Georgia"/>
-          <w:sz w:val="22"/>
-          <w:szCs w:val="22"/>
-          <w:b w:val="0"/>
-          <w:bCs w:val="0"/>
-          <w:color w:val="000000"/>
-        </w:rPr>
-        <w:t xml:space="preserve"/>
-      </w:r>
-      <w:r>
-        <w:rPr>
-          <w:rFonts w:ascii="Georgia" w:hAnsi="Georgia" w:cs="Georgia" w:eastAsia="Georgia"/>
-          <w:sz w:val="22"/>
-          <w:szCs w:val="22"/>
-          <w:b w:val="0"/>
-          <w:bCs w:val="0"/>
-          <w:highlight w:val="red"/>
-          <w:color w:val="FFFFFF"/>
-        </w:rPr>
-        <w:t xml:space="preserve"/>
-      </w:r>
-      <w:r>
-        <w:rPr>
-          <w:rFonts w:ascii="Georgia" w:hAnsi="Georgia" w:cs="Georgia" w:eastAsia="Georgia"/>
-          <w:sz w:val="22"/>
-          <w:szCs w:val="22"/>
-          <w:b w:val="0"/>
-          <w:bCs w:val="0"/>
-          <w:color w:val="000000"/>
-        </w:rPr>
-        <w:t xml:space="preserve"/>
-      </w:r>
-      <w:r>
-        <w:rPr>
-          <w:rFonts w:ascii="Georgia" w:hAnsi="Georgia" w:cs="Georgia" w:eastAsia="Georgia"/>
-          <w:sz w:val="22"/>
-          <w:szCs w:val="22"/>
-          <w:b w:val="0"/>
-          <w:bCs w:val="0"/>
-          <w:color w:val="ED7D31"/>
-        </w:rPr>
-        <w:t xml:space="preserve"/>
-      </w:r>
-      <w:r>
-        <w:rPr>
-          <w:rFonts w:ascii="Georgia" w:hAnsi="Georgia" w:cs="Georgia" w:eastAsia="Georgia"/>
-          <w:sz w:val="22"/>
-          <w:szCs w:val="22"/>
-          <w:b w:val="0"/>
-          <w:bCs w:val="0"/>
-          <w:color w:val="000000"/>
-        </w:rPr>
-        <w:t xml:space="preserve"/>
+          <w:b w:val="0"/>
+          <w:i w:val="0"/>
+          <w:sz w:val="22"/>
+          <w:color w:val="000000"/>
+        </w:rPr>
+        <w:t xml:space="preserve">Many farmers have been facing many problems towards their crops. One of the common factors affecting the production of eggplant is the pathogenic diseases. The fungal disease commonly found in Eggplant (Solanum melongena) is Cercospora leaf spot, a plant-pathogenic fungus, Cercospora melongenae. Therefore </w:t>
+      </w:r>
+      <w:r>
+        <w:rPr>
+          <w:rFonts w:ascii="Georgia" w:hAnsi="Georgia" w:cs="Georgia" w:eastAsia="Georgia"/>
+          <w:b w:val="0"/>
+          <w:i w:val="0"/>
+          <w:sz w:val="22"/>
+          <w:color w:val="8B4513"/>
+        </w:rPr>
+        <w:t>(DO)</w:t>
+      </w:r>
+      <w:r>
+        <w:rPr>
+          <w:rFonts w:ascii="Georgia" w:hAnsi="Georgia" w:cs="Georgia" w:eastAsia="Georgia"/>
+          <w:b w:val="0"/>
+          <w:i w:val="0"/>
+          <w:sz w:val="22"/>
+          <w:color w:val="000000"/>
+        </w:rPr>
+        <w:t xml:space="preserve">, this study aims to examine the potential (FP-Gen) of Trichoderma harzianum, an endophytic fungus, as a biocontrol agent for Cercospora leaf spot-on eggplants in the Philippines. Cercospora melongenae is a plant-pathogenic fungus that causes significant damage to eggplant crops, and the overuse of chemical pesticides has adverse effects on human health and the environment. As such, using alternative approaches, such as endophytic fungi, has gained attention from researchers. The study used thirty isolated leaf samples, twenty-one subcultures has been done and four different pathogenic fungi were identified. Moreover, there is an antagonistic effect of Trichoderma hazianum against the pathogenic fungi that cause disease in eggplant crops. Hence </w:t>
+      </w:r>
+      <w:r>
+        <w:rPr>
+          <w:rFonts w:ascii="Georgia" w:hAnsi="Georgia" w:cs="Georgia" w:eastAsia="Georgia"/>
+          <w:b w:val="0"/>
+          <w:i w:val="0"/>
+          <w:sz w:val="22"/>
+          <w:color w:val="8B4513"/>
+        </w:rPr>
+        <w:t>(DO)</w:t>
+      </w:r>
+      <w:r>
+        <w:rPr>
+          <w:rFonts w:ascii="Georgia" w:hAnsi="Georgia" w:cs="Georgia" w:eastAsia="Georgia"/>
+          <w:b w:val="0"/>
+          <w:i w:val="0"/>
+          <w:sz w:val="22"/>
+          <w:color w:val="000000"/>
+        </w:rPr>
+        <w:t>, the study aimed to investigate the antagonistic potential (FP-Gen) of Trichoderma harzianum among the four isolates. The results indicate (FP-Gen) that the mean effect of Trichoderma harzianum on the test variables varied across the three days of observation. However, there was no significant difference in the effect of Trichoderma harzianum among the test variables on any of the three days, suggesting (EC) that the fungus had a similar impact on the growth of all four test variables.</w:t>
       </w:r>
     </w:p>
     <w:p>
@@ -25737,148 +24835,32 @@
       <w:r>
         <w:rPr>
           <w:rFonts w:ascii="Georgia" w:hAnsi="Georgia" w:cs="Georgia" w:eastAsia="Georgia"/>
-          <w:sz w:val="22"/>
-          <w:szCs w:val="22"/>
-          <w:b w:val="0"/>
-          <w:bCs w:val="0"/>
-          <w:color w:val="000000"/>
-        </w:rPr>
-        <w:t xml:space="preserve">Canine heartworm (Dirofilaria immitis) infection is a significant health concern for dogs in many regions. This study investigated the association between clinical signs and microscopy/serological detection of heartworm at the [REDACTED]. Canines below six months of age and those receiving annual macrocyclic lactones were excluded. A questionnaire was utilized to collect data, and 100 single step rapid test kits canine heartworm Ag (AccuVet®) were employed along with direct blood smears. However, no positive results were observed in the diagnostic tests conducted. Thus (DO), no significant association between clinical signs and heartworm infection could (EC) be established. Recommendations include increased awareness and education about heartworm prevention, regular testing, evaluation of other diagnostic methods, collaboration and research, continuous monitoring of heartworm prevalence, individualized risk assessment, and collaboration with pet owners. These measures can (FP-Gen) collectively contribute to the effective management and prevention of heartworm disease in the local canine population. Further research with larger sample sizes and diverse populations is needed (FP-Rec) to validate these findings and enhance our understanding of heartworm infection in the study area.</w:t>
-      </w:r>
-      <w:r>
-        <w:rPr>
-          <w:rFonts w:ascii="Georgia" w:hAnsi="Georgia" w:cs="Georgia" w:eastAsia="Georgia"/>
-          <w:sz w:val="22"/>
-          <w:szCs w:val="22"/>
-          <w:b w:val="0"/>
-          <w:bCs w:val="0"/>
-          <w:shd w:val="clear" w:color="auto" w:fill="00B0F0"/>
-          <w:color w:val="000000"/>
-        </w:rPr>
-        <w:t xml:space="preserve"/>
-      </w:r>
-      <w:r>
-        <w:rPr>
-          <w:rFonts w:ascii="Georgia" w:hAnsi="Georgia" w:cs="Georgia" w:eastAsia="Georgia"/>
-          <w:sz w:val="22"/>
-          <w:szCs w:val="22"/>
-          <w:b w:val="0"/>
-          <w:bCs w:val="0"/>
-          <w:color w:val="000000"/>
-        </w:rPr>
-        <w:t xml:space="preserve"/>
-      </w:r>
-      <w:r>
-        <w:rPr>
-          <w:rFonts w:ascii="Georgia" w:hAnsi="Georgia" w:cs="Georgia" w:eastAsia="Georgia"/>
-          <w:sz w:val="22"/>
-          <w:szCs w:val="22"/>
-          <w:b w:val="0"/>
-          <w:bCs w:val="0"/>
-          <w:color w:val="ED7D31"/>
-        </w:rPr>
-        <w:t xml:space="preserve"/>
-      </w:r>
-      <w:r>
-        <w:rPr>
-          <w:rFonts w:ascii="Georgia" w:hAnsi="Georgia" w:cs="Georgia" w:eastAsia="Georgia"/>
-          <w:sz w:val="22"/>
-          <w:szCs w:val="22"/>
-          <w:b w:val="0"/>
-          <w:bCs w:val="0"/>
-          <w:color w:val="000000"/>
-        </w:rPr>
-        <w:t xml:space="preserve"/>
-      </w:r>
-      <w:r>
-        <w:rPr>
-          <w:rFonts w:ascii="Georgia" w:hAnsi="Georgia" w:cs="Georgia" w:eastAsia="Georgia"/>
-          <w:sz w:val="22"/>
-          <w:szCs w:val="22"/>
-          <w:b w:val="0"/>
-          <w:bCs w:val="0"/>
-          <w:strike/>
-          <w:color w:val="000000"/>
-        </w:rPr>
-        <w:t xml:space="preserve"/>
-      </w:r>
-      <w:r>
-        <w:rPr>
-          <w:rFonts w:ascii="Georgia" w:hAnsi="Georgia" w:cs="Georgia" w:eastAsia="Georgia"/>
-          <w:sz w:val="22"/>
-          <w:szCs w:val="22"/>
-          <w:b w:val="0"/>
-          <w:bCs w:val="0"/>
-          <w:color w:val="000000"/>
-        </w:rPr>
-        <w:t xml:space="preserve"/>
-      </w:r>
-      <w:r>
-        <w:rPr>
-          <w:rFonts w:ascii="Georgia" w:hAnsi="Georgia" w:cs="Georgia" w:eastAsia="Georgia"/>
-          <w:sz w:val="22"/>
-          <w:szCs w:val="22"/>
-          <w:b w:val="0"/>
-          <w:bCs w:val="0"/>
-          <w:color w:val="808080"/>
-        </w:rPr>
-        <w:t xml:space="preserve"/>
-      </w:r>
-      <w:r>
-        <w:rPr>
-          <w:rFonts w:ascii="Georgia" w:hAnsi="Georgia" w:cs="Georgia" w:eastAsia="Georgia"/>
-          <w:sz w:val="22"/>
-          <w:szCs w:val="22"/>
-          <w:b w:val="0"/>
-          <w:bCs w:val="0"/>
-          <w:color w:val="000000"/>
-        </w:rPr>
-        <w:t xml:space="preserve"/>
-      </w:r>
-      <w:r>
-        <w:rPr>
-          <w:rFonts w:ascii="Georgia" w:hAnsi="Georgia" w:cs="Georgia" w:eastAsia="Georgia"/>
-          <w:sz w:val="22"/>
-          <w:szCs w:val="22"/>
-          <w:b w:val="0"/>
-          <w:bCs w:val="0"/>
-          <w:strike/>
-          <w:color w:val="000000"/>
-        </w:rPr>
-        <w:t xml:space="preserve"/>
-      </w:r>
-      <w:r>
-        <w:rPr>
-          <w:rFonts w:ascii="Georgia" w:hAnsi="Georgia" w:cs="Georgia" w:eastAsia="Georgia"/>
-          <w:sz w:val="22"/>
-          <w:szCs w:val="22"/>
-          <w:b w:val="0"/>
-          <w:bCs w:val="0"/>
-          <w:color w:val="000000"/>
-        </w:rPr>
-        <w:t xml:space="preserve"/>
-      </w:r>
-      <w:r>
-        <w:rPr>
-          <w:rFonts w:ascii="Georgia" w:hAnsi="Georgia" w:cs="Georgia" w:eastAsia="Georgia"/>
-          <w:sz w:val="22"/>
-          <w:szCs w:val="22"/>
-          <w:b w:val="0"/>
-          <w:bCs w:val="0"/>
-          <w:color w:val="808080"/>
-        </w:rPr>
-        <w:t xml:space="preserve"/>
-      </w:r>
-      <w:r>
-        <w:rPr>
-          <w:rFonts w:ascii="Georgia" w:hAnsi="Georgia" w:cs="Georgia" w:eastAsia="Georgia"/>
-          <w:sz w:val="22"/>
-          <w:szCs w:val="22"/>
-          <w:b w:val="0"/>
-          <w:bCs w:val="0"/>
-          <w:color w:val="000000"/>
-        </w:rPr>
-        <w:t xml:space="preserve"/>
+          <w:b w:val="0"/>
+          <w:i w:val="0"/>
+          <w:sz w:val="22"/>
+          <w:color w:val="000000"/>
+        </w:rPr>
+        <w:t xml:space="preserve">Canine heartworm (Dirofilaria immitis) infection is a significant health concern for dogs in many regions. This study investigated the association between clinical signs and microscopy/serological detection of heartworm at the [REDACTED]. Canines below six months of age and those receiving annual macrocyclic lactones were excluded. A questionnaire was utilized to collect data, and 100 single step rapid test kits canine heartworm Ag (AccuVet®) were employed along with direct blood smears. However, no positive results were observed in the diagnostic tests conducted. Thus </w:t>
+      </w:r>
+      <w:r>
+        <w:rPr>
+          <w:rFonts w:ascii="Georgia" w:hAnsi="Georgia" w:cs="Georgia" w:eastAsia="Georgia"/>
+          <w:b w:val="0"/>
+          <w:i w:val="0"/>
+          <w:sz w:val="22"/>
+          <w:color w:val="8B4513"/>
+        </w:rPr>
+        <w:t>(DO)</w:t>
+      </w:r>
+      <w:r>
+        <w:rPr>
+          <w:rFonts w:ascii="Georgia" w:hAnsi="Georgia" w:cs="Georgia" w:eastAsia="Georgia"/>
+          <w:b w:val="0"/>
+          <w:i w:val="0"/>
+          <w:sz w:val="22"/>
+          <w:color w:val="000000"/>
+        </w:rPr>
+        <w:t>, no significant association between clinical signs and heartworm infection could (EC) be established. Recommendations include increased awareness and education about heartworm prevention, regular testing, evaluation of other diagnostic methods, collaboration and research, continuous monitoring of heartworm prevalence, individualized risk assessment, and collaboration with pet owners. These measures can (FP-Gen) collectively contribute to the effective management and prevention of heartworm disease in the local canine population. Further research with larger sample sizes and diverse populations is needed (FP-Rec) to validate these findings and enhance our understanding of heartworm infection in the study area.</w:t>
       </w:r>
     </w:p>
     <w:p>
@@ -26005,103 +24987,32 @@
       <w:r>
         <w:rPr>
           <w:rFonts w:ascii="Georgia" w:hAnsi="Georgia" w:cs="Georgia" w:eastAsia="Georgia"/>
-          <w:sz w:val="22"/>
-          <w:szCs w:val="22"/>
-          <w:b w:val="0"/>
-          <w:bCs w:val="0"/>
-          <w:color w:val="000000"/>
-        </w:rPr>
-        <w:t xml:space="preserve">Plastic pollution has been a long-standing environmental concern due to improper waste management. Its persistence in marine environments, particularly in the form of microplastics, posed potential (EC) health risks to aquatic species and humans through seafood consumption. This study was conducted to detect microplastics in Whiteleg shrimp (Litopenaeus vannamei) sold at the [REDACTED]. A total of 10 shrimp samples per stall were collected, equating to 30 shrimps overall from the 3 stalls available. Composite sampling was applied in this study; hence (DO), all individual shrimps from each stall were counted as one sample. The samples were separated into two treatments: Treatment 1, which consisted of the hepatopancreas and gastrointestinal tract of the shrimp, and Treatment 2, which consisted of the shrimp muscle. The samples were subjected to light microscopy and were categorized as follows: Treatment 1 Stall 1 (T1S1), Treatment 1 Stall 2 (T1S2), Treatment 1 Stall 3 (T1S3), Treatment 2 Stall 1 (T2S1), Treatment 2 Stall 2 (T2S2), and Treatment 2 Stall 3 (T2S3). Each sample was added to a 10% KOH solution for the digestion of soft tissue. Afterwards, 60% sodium iodide was used for the density separation of microplastics and undigested organic matter. The supernatant was collected using a pipette and then transferred to a slide before subjecting to a light microscope. In each slide, 10 µl of sample was placed. This was repeated five times in separate slides. A total of 181 microplastics were detected across all samples, wherein the concentration of microplastics was higher in Treatment 1 (74.03%). Fragments (39.02%) were the most dominant shape, followed by fibers (23.20%), lines (17.13%), and then pellets (3.31%). The most dominant color was gray (33.15%), followed by blue (24.31%), black (11.6%), red (9.39%), clear (7.73%), brown (6.63%), violet (3.31%), yellow (3.31%), and green (0.55%). Most of the particles ranged in size from 11–50 µm (58.01%), followed by &lt;10.9 µm (29.83%), 51–100 µm (6.08%), 101–200 µm (5.52%), and &gt;201 µm (1.10%). Through random sampling, one microplastic was selected from each shape for polymer analysis using Fourier Transform Infrared Spectroscopy (FTIR). The fragment had a 97% match with high-density polyethylene, the fiber had a 90% match with an olefin copolymer, and the line sample had a 96% match with polypropylene, while the pellet sample was rejected for analysis due to its small size. To reduce microplastic pollution, the findings recommend (FP-Rec) removing the shrimp’s GIT during preparation to avoid ingestion, use fishing gear made from durable or natural materials, regularly maintain and replace worn equipment, and properly dispose of plastics instead of discarding them into water bodies.</w:t>
-      </w:r>
-      <w:r>
-        <w:rPr>
-          <w:rFonts w:ascii="Georgia" w:hAnsi="Georgia" w:cs="Georgia" w:eastAsia="Georgia"/>
-          <w:sz w:val="22"/>
-          <w:szCs w:val="22"/>
-          <w:b w:val="0"/>
-          <w:bCs w:val="0"/>
-          <w:highlight w:val="red"/>
-          <w:color w:val="FFFFFF"/>
-        </w:rPr>
-        <w:t xml:space="preserve"/>
-      </w:r>
-      <w:r>
-        <w:rPr>
-          <w:rFonts w:ascii="Georgia" w:hAnsi="Georgia" w:cs="Georgia" w:eastAsia="Georgia"/>
-          <w:sz w:val="22"/>
-          <w:szCs w:val="22"/>
-          <w:b w:val="0"/>
-          <w:bCs w:val="0"/>
-          <w:color w:val="000000"/>
-        </w:rPr>
-        <w:t xml:space="preserve"/>
-      </w:r>
-      <w:r>
-        <w:rPr>
-          <w:rFonts w:ascii="Georgia" w:hAnsi="Georgia" w:cs="Georgia" w:eastAsia="Georgia"/>
-          <w:sz w:val="22"/>
-          <w:szCs w:val="22"/>
-          <w:b w:val="0"/>
-          <w:bCs w:val="0"/>
-          <w:color w:val="ED7D31"/>
-        </w:rPr>
-        <w:t xml:space="preserve"/>
-      </w:r>
-      <w:r>
-        <w:rPr>
-          <w:rFonts w:ascii="Georgia" w:hAnsi="Georgia" w:cs="Georgia" w:eastAsia="Georgia"/>
-          <w:sz w:val="22"/>
-          <w:szCs w:val="22"/>
-          <w:b w:val="0"/>
-          <w:bCs w:val="0"/>
-          <w:color w:val="000000"/>
-        </w:rPr>
-        <w:t xml:space="preserve"/>
-      </w:r>
-      <w:r>
-        <w:rPr>
-          <w:rFonts w:ascii="Georgia" w:hAnsi="Georgia" w:cs="Georgia" w:eastAsia="Georgia"/>
-          <w:sz w:val="22"/>
-          <w:szCs w:val="22"/>
-          <w:b w:val="0"/>
-          <w:bCs w:val="0"/>
-          <w:strike/>
-          <w:color w:val="000000"/>
-        </w:rPr>
-        <w:t xml:space="preserve"/>
-      </w:r>
-      <w:r>
-        <w:rPr>
-          <w:rFonts w:ascii="Georgia" w:hAnsi="Georgia" w:cs="Georgia" w:eastAsia="Georgia"/>
-          <w:sz w:val="22"/>
-          <w:szCs w:val="22"/>
-          <w:b w:val="0"/>
-          <w:bCs w:val="0"/>
-          <w:color w:val="000000"/>
-        </w:rPr>
-        <w:t xml:space="preserve"/>
-      </w:r>
-      <w:r>
-        <w:rPr>
-          <w:rFonts w:ascii="Georgia" w:hAnsi="Georgia" w:cs="Georgia" w:eastAsia="Georgia"/>
-          <w:sz w:val="22"/>
-          <w:szCs w:val="22"/>
-          <w:b w:val="0"/>
-          <w:bCs w:val="0"/>
-          <w:color w:val="808080"/>
-        </w:rPr>
-        <w:t xml:space="preserve"/>
-      </w:r>
-      <w:r>
-        <w:rPr>
-          <w:rFonts w:ascii="Georgia" w:hAnsi="Georgia" w:cs="Georgia" w:eastAsia="Georgia"/>
-          <w:sz w:val="22"/>
-          <w:szCs w:val="22"/>
-          <w:b w:val="0"/>
-          <w:bCs w:val="0"/>
-          <w:color w:val="000000"/>
-        </w:rPr>
-        <w:t xml:space="preserve"/>
+          <w:b w:val="0"/>
+          <w:i w:val="0"/>
+          <w:sz w:val="22"/>
+          <w:color w:val="000000"/>
+        </w:rPr>
+        <w:t xml:space="preserve">Plastic pollution has been a long-standing environmental concern due to improper waste management. Its persistence in marine environments, particularly in the form of microplastics, posed potential (EC) health risks to aquatic species and humans through seafood consumption. This study was conducted to detect microplastics in Whiteleg shrimp (Litopenaeus vannamei) sold at the [REDACTED]. A total of 10 shrimp samples per stall were collected, equating to 30 shrimps overall from the 3 stalls available. Composite sampling was applied in this study; hence </w:t>
+      </w:r>
+      <w:r>
+        <w:rPr>
+          <w:rFonts w:ascii="Georgia" w:hAnsi="Georgia" w:cs="Georgia" w:eastAsia="Georgia"/>
+          <w:b w:val="0"/>
+          <w:i w:val="0"/>
+          <w:sz w:val="22"/>
+          <w:color w:val="8B4513"/>
+        </w:rPr>
+        <w:t>(DO)</w:t>
+      </w:r>
+      <w:r>
+        <w:rPr>
+          <w:rFonts w:ascii="Georgia" w:hAnsi="Georgia" w:cs="Georgia" w:eastAsia="Georgia"/>
+          <w:b w:val="0"/>
+          <w:i w:val="0"/>
+          <w:sz w:val="22"/>
+          <w:color w:val="000000"/>
+        </w:rPr>
+        <w:t>, all individual shrimps from each stall were counted as one sample. The samples were separated into two treatments: Treatment 1, which consisted of the hepatopancreas and gastrointestinal tract of the shrimp, and Treatment 2, which consisted of the shrimp muscle. The samples were subjected to light microscopy and were categorized as follows: Treatment 1 Stall 1 (T1S1), Treatment 1 Stall 2 (T1S2), Treatment 1 Stall 3 (T1S3), Treatment 2 Stall 1 (T2S1), Treatment 2 Stall 2 (T2S2), and Treatment 2 Stall 3 (T2S3). Each sample was added to a 10% KOH solution for the digestion of soft tissue. Afterwards, 60% sodium iodide was used for the density separation of microplastics and undigested organic matter. The supernatant was collected using a pipette and then transferred to a slide before subjecting to a light microscope. In each slide, 10 µl of sample was placed. This was repeated five times in separate slides. A total of 181 microplastics were detected across all samples, wherein the concentration of microplastics was higher in Treatment 1 (74.03%). Fragments (39.02%) were the most dominant shape, followed by fibers (23.20%), lines (17.13%), and then pellets (3.31%). The most dominant color was gray (33.15%), followed by blue (24.31%), black (11.6%), red (9.39%), clear (7.73%), brown (6.63%), violet (3.31%), yellow (3.31%), and green (0.55%). Most of the particles ranged in size from 11–50 µm (58.01%), followed by &lt;10.9 µm (29.83%), 51–100 µm (6.08%), 101–200 µm (5.52%), and &gt;201 µm (1.10%). Through random sampling, one microplastic was selected from each shape for polymer analysis using Fourier Transform Infrared Spectroscopy (FTIR). The fragment had a 97% match with high-density polyethylene, the fiber had a 90% match with an olefin copolymer, and the line sample had a 96% match with polypropylene, while the pellet sample was rejected for analysis due to its small size. To reduce microplastic pollution, the findings recommend (FP-Rec) removing the shrimp’s GIT during preparation to avoid ingestion, use fishing gear made from durable or natural materials, regularly maintain and replace worn equipment, and properly dispose of plastics instead of discarding them into water bodies.</w:t>
       </w:r>
     </w:p>
     <w:p>
@@ -26295,103 +25206,32 @@
       <w:r>
         <w:rPr>
           <w:rFonts w:ascii="Georgia" w:hAnsi="Georgia" w:cs="Georgia" w:eastAsia="Georgia"/>
-          <w:sz w:val="22"/>
-          <w:szCs w:val="22"/>
-          <w:b w:val="0"/>
-          <w:bCs w:val="0"/>
-          <w:color w:val="000000"/>
-        </w:rPr>
-        <w:t xml:space="preserve">The African swine fever (ASF) is an ongoing global disease of swine presenting clinical signs similar to hog cholera and causing significant socioeconomic problems. Studies on the detection of ASF virus focus on using viremic blood and lymph tissues from infected pigs at the farm level. Hence (DO), this study aimed to detect ASF virus from suspected pork samples from [REDACTED] using a survey questionnaire and molecular diagnostic methods. Profiling of meat retail vendors revealed that commercial farms and public markets were their principal sources of meat. PCR assay showed that no sample tested positive for ASF. The result of collective community and government efforts might (EC) be effective in preventing, controlling, and managing the spread of ASF, but it is not conclusive that ASF is not present in the municipality of [REDACTED]. Nevertheless, it is recommended (FP-Rec) to consider monitoring and surveillance of ASF at the market level, and maintain and continue the strict implementation of collaborative efforts to effectively and efficiently prevent and control the further entry and spread of ASF from farm to farm.</w:t>
-      </w:r>
-      <w:r>
-        <w:rPr>
-          <w:rFonts w:ascii="Georgia" w:hAnsi="Georgia" w:cs="Georgia" w:eastAsia="Georgia"/>
-          <w:sz w:val="22"/>
-          <w:szCs w:val="22"/>
-          <w:b w:val="0"/>
-          <w:bCs w:val="0"/>
-          <w:shd w:val="clear" w:color="auto" w:fill="00B0F0"/>
-          <w:color w:val="000000"/>
-        </w:rPr>
-        <w:t xml:space="preserve"/>
-      </w:r>
-      <w:r>
-        <w:rPr>
-          <w:rFonts w:ascii="Georgia" w:hAnsi="Georgia" w:cs="Georgia" w:eastAsia="Georgia"/>
-          <w:sz w:val="22"/>
-          <w:szCs w:val="22"/>
-          <w:b w:val="0"/>
-          <w:bCs w:val="0"/>
-          <w:color w:val="000000"/>
-        </w:rPr>
-        <w:t xml:space="preserve"/>
-      </w:r>
-      <w:r>
-        <w:rPr>
-          <w:rFonts w:ascii="Georgia" w:hAnsi="Georgia" w:cs="Georgia" w:eastAsia="Georgia"/>
-          <w:sz w:val="22"/>
-          <w:szCs w:val="22"/>
-          <w:b w:val="0"/>
-          <w:bCs w:val="0"/>
-          <w:color w:val="ED7D31"/>
-        </w:rPr>
-        <w:t xml:space="preserve"/>
-      </w:r>
-      <w:r>
-        <w:rPr>
-          <w:rFonts w:ascii="Georgia" w:hAnsi="Georgia" w:cs="Georgia" w:eastAsia="Georgia"/>
-          <w:sz w:val="22"/>
-          <w:szCs w:val="22"/>
-          <w:b w:val="0"/>
-          <w:bCs w:val="0"/>
-          <w:color w:val="000000"/>
-        </w:rPr>
-        <w:t xml:space="preserve"/>
-      </w:r>
-      <w:r>
-        <w:rPr>
-          <w:rFonts w:ascii="Georgia" w:hAnsi="Georgia" w:cs="Georgia" w:eastAsia="Georgia"/>
-          <w:sz w:val="22"/>
-          <w:szCs w:val="22"/>
-          <w:b w:val="0"/>
-          <w:bCs w:val="0"/>
-          <w:strike/>
-          <w:color w:val="000000"/>
-        </w:rPr>
-        <w:t xml:space="preserve"/>
-      </w:r>
-      <w:r>
-        <w:rPr>
-          <w:rFonts w:ascii="Georgia" w:hAnsi="Georgia" w:cs="Georgia" w:eastAsia="Georgia"/>
-          <w:sz w:val="22"/>
-          <w:szCs w:val="22"/>
-          <w:b w:val="0"/>
-          <w:bCs w:val="0"/>
-          <w:color w:val="000000"/>
-        </w:rPr>
-        <w:t xml:space="preserve"/>
-      </w:r>
-      <w:r>
-        <w:rPr>
-          <w:rFonts w:ascii="Georgia" w:hAnsi="Georgia" w:cs="Georgia" w:eastAsia="Georgia"/>
-          <w:sz w:val="22"/>
-          <w:szCs w:val="22"/>
-          <w:b w:val="0"/>
-          <w:bCs w:val="0"/>
-          <w:color w:val="808080"/>
-        </w:rPr>
-        <w:t xml:space="preserve"/>
-      </w:r>
-      <w:r>
-        <w:rPr>
-          <w:rFonts w:ascii="Georgia" w:hAnsi="Georgia" w:cs="Georgia" w:eastAsia="Georgia"/>
-          <w:sz w:val="22"/>
-          <w:szCs w:val="22"/>
-          <w:b w:val="0"/>
-          <w:bCs w:val="0"/>
-          <w:color w:val="000000"/>
-        </w:rPr>
-        <w:t xml:space="preserve"/>
+          <w:b w:val="0"/>
+          <w:i w:val="0"/>
+          <w:sz w:val="22"/>
+          <w:color w:val="000000"/>
+        </w:rPr>
+        <w:t xml:space="preserve">The African swine fever (ASF) is an ongoing global disease of swine presenting clinical signs similar to hog cholera and causing significant socioeconomic problems. Studies on the detection of ASF virus focus on using viremic blood and lymph tissues from infected pigs at the farm level. Hence </w:t>
+      </w:r>
+      <w:r>
+        <w:rPr>
+          <w:rFonts w:ascii="Georgia" w:hAnsi="Georgia" w:cs="Georgia" w:eastAsia="Georgia"/>
+          <w:b w:val="0"/>
+          <w:i w:val="0"/>
+          <w:sz w:val="22"/>
+          <w:color w:val="8B4513"/>
+        </w:rPr>
+        <w:t>(DO)</w:t>
+      </w:r>
+      <w:r>
+        <w:rPr>
+          <w:rFonts w:ascii="Georgia" w:hAnsi="Georgia" w:cs="Georgia" w:eastAsia="Georgia"/>
+          <w:b w:val="0"/>
+          <w:i w:val="0"/>
+          <w:sz w:val="22"/>
+          <w:color w:val="000000"/>
+        </w:rPr>
+        <w:t>, this study aimed to detect ASF virus from suspected pork samples from [REDACTED] using a survey questionnaire and molecular diagnostic methods. Profiling of meat retail vendors revealed that commercial farms and public markets were their principal sources of meat. PCR assay showed that no sample tested positive for ASF. The result of collective community and government efforts might (EC) be effective in preventing, controlling, and managing the spread of ASF, but it is not conclusive that ASF is not present in the municipality of [REDACTED]. Nevertheless, it is recommended (FP-Rec) to consider monitoring and surveillance of ASF at the market level, and maintain and continue the strict implementation of collaborative efforts to effectively and efficiently prevent and control the further entry and spread of ASF from farm to farm.</w:t>
       </w:r>
     </w:p>
     <w:p>
@@ -27707,148 +26547,32 @@
       <w:r>
         <w:rPr>
           <w:rFonts w:ascii="Georgia" w:hAnsi="Georgia" w:cs="Georgia" w:eastAsia="Georgia"/>
-          <w:sz w:val="22"/>
-          <w:szCs w:val="22"/>
-          <w:b w:val="0"/>
-          <w:bCs w:val="0"/>
-          <w:color w:val="000000"/>
-        </w:rPr>
-        <w:t xml:space="preserve">The study was conducted at [REDACTED], from November 2022 to February 2023 to determine the effect of rooting hormones on monstera cuttings. The study used Complete Randomized Design (CRD) with four replications. The pot experiment comprised of main treatments: T1- Control (Water), T2- Aloe Vera gel, T3- Coconut water, T4- Moringa leaves extract, and T5- ANAA. Data were evaluated using Analysis of Variance (ANOVA). Based on the results of the study, different rooting hormones did not significantly influence the days to shoot emergence, number of shoots, number of leaves, number of adventitious roots, root diameter, length of the longest roots, number of rooted cuttings, and percentage of survival cuttings. Additionally, alternative rooting hormones and synthetic hormone applications had varying survival rates. The highest survival was found in ANAA, followed by control water (distilled or filtered water), coconut water, and aloe vera gel, and the lowest survival was found in moringa leaf extract. In conclusion (DO), the number of rooted cuttings obtained by application of aloe vera gel and moringa leaf extract was comparable in percentage survival with that obtained by application of water (distilled or filtered water) on monstera cuttings. Most can (EC) survive the water treatment application but may (EC) not establish roots and die after several days. However, it can (FP-Cap) be derived that the application of different alternative rooting hormones has a comparable effect with synthetic rooting hormones based on the growth parameters.</w:t>
-      </w:r>
-      <w:r>
-        <w:rPr>
-          <w:rFonts w:ascii="Georgia" w:hAnsi="Georgia" w:cs="Georgia" w:eastAsia="Georgia"/>
-          <w:sz w:val="22"/>
-          <w:szCs w:val="22"/>
-          <w:b w:val="0"/>
-          <w:bCs w:val="0"/>
-          <w:shd w:val="clear" w:color="auto" w:fill="00B0F0"/>
-          <w:color w:val="000000"/>
-        </w:rPr>
-        <w:t xml:space="preserve"/>
-      </w:r>
-      <w:r>
-        <w:rPr>
-          <w:rFonts w:ascii="Georgia" w:hAnsi="Georgia" w:cs="Georgia" w:eastAsia="Georgia"/>
-          <w:sz w:val="22"/>
-          <w:szCs w:val="22"/>
-          <w:b w:val="0"/>
-          <w:bCs w:val="0"/>
-          <w:color w:val="000000"/>
-        </w:rPr>
-        <w:t xml:space="preserve"/>
-      </w:r>
-      <w:r>
-        <w:rPr>
-          <w:rFonts w:ascii="Georgia" w:hAnsi="Georgia" w:cs="Georgia" w:eastAsia="Georgia"/>
-          <w:sz w:val="22"/>
-          <w:szCs w:val="22"/>
-          <w:b w:val="0"/>
-          <w:bCs w:val="0"/>
-          <w:color w:val="ED7D31"/>
-        </w:rPr>
-        <w:t xml:space="preserve"/>
-      </w:r>
-      <w:r>
-        <w:rPr>
-          <w:rFonts w:ascii="Georgia" w:hAnsi="Georgia" w:cs="Georgia" w:eastAsia="Georgia"/>
-          <w:sz w:val="22"/>
-          <w:szCs w:val="22"/>
-          <w:b w:val="0"/>
-          <w:bCs w:val="0"/>
-          <w:color w:val="000000"/>
-        </w:rPr>
-        <w:t xml:space="preserve"/>
-      </w:r>
-      <w:r>
-        <w:rPr>
-          <w:rFonts w:ascii="Georgia" w:hAnsi="Georgia" w:cs="Georgia" w:eastAsia="Georgia"/>
-          <w:sz w:val="22"/>
-          <w:szCs w:val="22"/>
-          <w:b w:val="0"/>
-          <w:bCs w:val="0"/>
-          <w:shd w:val="clear" w:color="auto" w:fill="00B0F0"/>
-          <w:color w:val="000000"/>
-        </w:rPr>
-        <w:t xml:space="preserve"/>
-      </w:r>
-      <w:r>
-        <w:rPr>
-          <w:rFonts w:ascii="Georgia" w:hAnsi="Georgia" w:cs="Georgia" w:eastAsia="Georgia"/>
-          <w:sz w:val="22"/>
-          <w:szCs w:val="22"/>
-          <w:b w:val="0"/>
-          <w:bCs w:val="0"/>
-          <w:color w:val="000000"/>
-        </w:rPr>
-        <w:t xml:space="preserve"/>
-      </w:r>
-      <w:r>
-        <w:rPr>
-          <w:rFonts w:ascii="Georgia" w:hAnsi="Georgia" w:cs="Georgia" w:eastAsia="Georgia"/>
-          <w:sz w:val="22"/>
-          <w:szCs w:val="22"/>
-          <w:b w:val="0"/>
-          <w:bCs w:val="0"/>
-          <w:color w:val="ED7D31"/>
-        </w:rPr>
-        <w:t xml:space="preserve"/>
-      </w:r>
-      <w:r>
-        <w:rPr>
-          <w:rFonts w:ascii="Georgia" w:hAnsi="Georgia" w:cs="Georgia" w:eastAsia="Georgia"/>
-          <w:sz w:val="22"/>
-          <w:szCs w:val="22"/>
-          <w:b w:val="0"/>
-          <w:bCs w:val="0"/>
-          <w:color w:val="000000"/>
-        </w:rPr>
-        <w:t xml:space="preserve"/>
-      </w:r>
-      <w:r>
-        <w:rPr>
-          <w:rFonts w:ascii="Georgia" w:hAnsi="Georgia" w:cs="Georgia" w:eastAsia="Georgia"/>
-          <w:sz w:val="22"/>
-          <w:szCs w:val="22"/>
-          <w:b w:val="0"/>
-          <w:bCs w:val="0"/>
-          <w:strike/>
-          <w:color w:val="000000"/>
-        </w:rPr>
-        <w:t xml:space="preserve"/>
-      </w:r>
-      <w:r>
-        <w:rPr>
-          <w:rFonts w:ascii="Georgia" w:hAnsi="Georgia" w:cs="Georgia" w:eastAsia="Georgia"/>
-          <w:sz w:val="22"/>
-          <w:szCs w:val="22"/>
-          <w:b w:val="0"/>
-          <w:bCs w:val="0"/>
-          <w:color w:val="000000"/>
-        </w:rPr>
-        <w:t xml:space="preserve"/>
-      </w:r>
-      <w:r>
-        <w:rPr>
-          <w:rFonts w:ascii="Georgia" w:hAnsi="Georgia" w:cs="Georgia" w:eastAsia="Georgia"/>
-          <w:sz w:val="22"/>
-          <w:szCs w:val="22"/>
-          <w:b w:val="0"/>
-          <w:bCs w:val="0"/>
-          <w:color w:val="808080"/>
-        </w:rPr>
-        <w:t xml:space="preserve"/>
-      </w:r>
-      <w:r>
-        <w:rPr>
-          <w:rFonts w:ascii="Georgia" w:hAnsi="Georgia" w:cs="Georgia" w:eastAsia="Georgia"/>
-          <w:sz w:val="22"/>
-          <w:szCs w:val="22"/>
-          <w:b w:val="0"/>
-          <w:bCs w:val="0"/>
-          <w:color w:val="000000"/>
-        </w:rPr>
-        <w:t xml:space="preserve"/>
+          <w:b w:val="0"/>
+          <w:i w:val="0"/>
+          <w:sz w:val="22"/>
+          <w:color w:val="000000"/>
+        </w:rPr>
+        <w:t xml:space="preserve">The study was conducted at [REDACTED], from November 2022 to February 2023 to determine the effect of rooting hormones on monstera cuttings. The study used Complete Randomized Design (CRD) with four replications. The pot experiment comprised of main treatments: T1- Control (Water), T2- Aloe Vera gel, T3- Coconut water, T4- Moringa leaves extract, and T5- ANAA. Data were evaluated using Analysis of Variance (ANOVA). Based on the results of the study, different rooting hormones did not significantly influence the days to shoot emergence, number of shoots, number of leaves, number of adventitious roots, root diameter, length of the longest roots, number of rooted cuttings, and percentage of survival cuttings. Additionally, alternative rooting hormones and synthetic hormone applications had varying survival rates. The highest survival was found in ANAA, followed by control water (distilled or filtered water), coconut water, and aloe vera gel, and the lowest survival was found in moringa leaf extract. In conclusion </w:t>
+      </w:r>
+      <w:r>
+        <w:rPr>
+          <w:rFonts w:ascii="Georgia" w:hAnsi="Georgia" w:cs="Georgia" w:eastAsia="Georgia"/>
+          <w:b w:val="0"/>
+          <w:i w:val="0"/>
+          <w:sz w:val="22"/>
+          <w:color w:val="8B4513"/>
+        </w:rPr>
+        <w:t>(DO)</w:t>
+      </w:r>
+      <w:r>
+        <w:rPr>
+          <w:rFonts w:ascii="Georgia" w:hAnsi="Georgia" w:cs="Georgia" w:eastAsia="Georgia"/>
+          <w:b w:val="0"/>
+          <w:i w:val="0"/>
+          <w:sz w:val="22"/>
+          <w:color w:val="000000"/>
+        </w:rPr>
+        <w:t>, the number of rooted cuttings obtained by application of aloe vera gel and moringa leaf extract was comparable in percentage survival with that obtained by application of water (distilled or filtered water) on monstera cuttings. Most can (EC) survive the water treatment application but may (EC) not establish roots and die after several days. However, it can (FP-Cap) be derived that the application of different alternative rooting hormones has a comparable effect with synthetic rooting hormones based on the growth parameters.</w:t>
       </w:r>
     </w:p>
     <w:p>
@@ -27886,58 +26610,32 @@
       <w:r>
         <w:rPr>
           <w:rFonts w:ascii="Georgia" w:hAnsi="Georgia" w:cs="Georgia" w:eastAsia="Georgia"/>
-          <w:sz w:val="22"/>
-          <w:szCs w:val="22"/>
-          <w:b w:val="0"/>
-          <w:bCs w:val="0"/>
-          <w:color w:val="000000"/>
-        </w:rPr>
-        <w:t xml:space="preserve">The study was conducted to determine the growth and yield performance of sweet potatoes treated with seaweed extract foliar spray from December 2023 to February 2024 in [REDACTED]. The experiment utilized a Randomized Complete Block Design (RCBD) with five treatments replicated four times. Based on the results of the study, there are significant differences in the length of vines at 60 days after planting (DAP), while other parameters showed no significant differences. These include length of vines at 30 DAP and 70 DAP, number of marketable tubers per plant, number of non-marketable tubers per plant, length of tubers per plant, weight of tubers per plant, diameter of tubers per plant, computed yield per hectare, and cost and return analysis among the seaweed extract treatments. The study found that sweet potatoes treated with different seaweed extract foliar sprays showed varying levels of growth and yield. According to the Super Bureau's VSP6, all treatments had the highest mean values across all parameters. However, the positive control had the highest mean values for vine length, weight of tubers per plant, and marketable yield per sample area. Therefore (DO), the application of seaweed extract as a bio stimulant did not significantly enhance the growth and yield of sweet potato. However, the negative control can (FP-Cap) reduce production cost and provide the highest return on investment.</w:t>
-      </w:r>
-      <w:r>
-        <w:rPr>
-          <w:rFonts w:ascii="Georgia" w:hAnsi="Georgia" w:cs="Georgia" w:eastAsia="Georgia"/>
-          <w:sz w:val="22"/>
-          <w:szCs w:val="22"/>
-          <w:b w:val="0"/>
-          <w:bCs w:val="0"/>
-          <w:strike/>
-          <w:color w:val="000000"/>
-        </w:rPr>
-        <w:t xml:space="preserve"/>
-      </w:r>
-      <w:r>
-        <w:rPr>
-          <w:rFonts w:ascii="Georgia" w:hAnsi="Georgia" w:cs="Georgia" w:eastAsia="Georgia"/>
-          <w:sz w:val="22"/>
-          <w:szCs w:val="22"/>
-          <w:b w:val="0"/>
-          <w:bCs w:val="0"/>
-          <w:color w:val="000000"/>
-        </w:rPr>
-        <w:t xml:space="preserve"/>
-      </w:r>
-      <w:r>
-        <w:rPr>
-          <w:rFonts w:ascii="Georgia" w:hAnsi="Georgia" w:cs="Georgia" w:eastAsia="Georgia"/>
-          <w:sz w:val="22"/>
-          <w:szCs w:val="22"/>
-          <w:b w:val="0"/>
-          <w:bCs w:val="0"/>
-          <w:color w:val="808080"/>
-        </w:rPr>
-        <w:t xml:space="preserve"/>
-      </w:r>
-      <w:r>
-        <w:rPr>
-          <w:rFonts w:ascii="Georgia" w:hAnsi="Georgia" w:cs="Georgia" w:eastAsia="Georgia"/>
-          <w:sz w:val="22"/>
-          <w:szCs w:val="22"/>
-          <w:b w:val="0"/>
-          <w:bCs w:val="0"/>
-          <w:color w:val="000000"/>
-        </w:rPr>
-        <w:t xml:space="preserve"/>
+          <w:b w:val="0"/>
+          <w:i w:val="0"/>
+          <w:sz w:val="22"/>
+          <w:color w:val="000000"/>
+        </w:rPr>
+        <w:t xml:space="preserve">The study was conducted to determine the growth and yield performance of sweet potatoes treated with seaweed extract foliar spray from December 2023 to February 2024 in [REDACTED]. The experiment utilized a Randomized Complete Block Design (RCBD) with five treatments replicated four times. Based on the results of the study, there are significant differences in the length of vines at 60 days after planting (DAP), while other parameters showed no significant differences. These include length of vines at 30 DAP and 70 DAP, number of marketable tubers per plant, number of non-marketable tubers per plant, length of tubers per plant, weight of tubers per plant, diameter of tubers per plant, computed yield per hectare, and cost and return analysis among the seaweed extract treatments. The study found that sweet potatoes treated with different seaweed extract foliar sprays showed varying levels of growth and yield. According to the Super Bureau's VSP6, all treatments had the highest mean values across all parameters. However, the positive control had the highest mean values for vine length, weight of tubers per plant, and marketable yield per sample area. Therefore </w:t>
+      </w:r>
+      <w:r>
+        <w:rPr>
+          <w:rFonts w:ascii="Georgia" w:hAnsi="Georgia" w:cs="Georgia" w:eastAsia="Georgia"/>
+          <w:b w:val="0"/>
+          <w:i w:val="0"/>
+          <w:sz w:val="22"/>
+          <w:color w:val="8B4513"/>
+        </w:rPr>
+        <w:t>(DO)</w:t>
+      </w:r>
+      <w:r>
+        <w:rPr>
+          <w:rFonts w:ascii="Georgia" w:hAnsi="Georgia" w:cs="Georgia" w:eastAsia="Georgia"/>
+          <w:b w:val="0"/>
+          <w:i w:val="0"/>
+          <w:sz w:val="22"/>
+          <w:color w:val="000000"/>
+        </w:rPr>
+        <w:t>, the application of seaweed extract as a bio stimulant did not significantly enhance the growth and yield of sweet potato. However, the negative control can (FP-Cap) reduce production cost and provide the highest return on investment.</w:t>
       </w:r>
     </w:p>
     <w:p>
@@ -28109,103 +26807,32 @@
       <w:r>
         <w:rPr>
           <w:rFonts w:ascii="Georgia" w:hAnsi="Georgia" w:cs="Georgia" w:eastAsia="Georgia"/>
-          <w:sz w:val="22"/>
-          <w:szCs w:val="22"/>
-          <w:b w:val="0"/>
-          <w:bCs w:val="0"/>
-          <w:color w:val="000000"/>
-        </w:rPr>
-        <w:t xml:space="preserve">This study was conducted to evaluate the growth performance of Adansonii plant under different soil media over a 90-day period. Implemented in December 2024, the experiment followed a Completely Randomized Design (CRD) with five treatments: T1 — Topsoil only (control), T2 — Topsoil + Rice Hull, T3 — Topsoil + Carbonized Rice Hull, T4 — Topsoil + Vermicompost, and T5 — Topsoil + Biochar. Parameters measured included days to shoot emergence, shoot length, number of leaves, leaf area, root length, number of penetrations, and survival rate. Significant differences were observed across treatments. Treatment 2 (Rice Hull) showed the earliest shoot emergence at 15.29 days, followed by Treatment 4 (Vermicompost) at 15.83 days. These treatments also produced the longest shoots, most leaves, largest leaf areas, and highest survival rates at 87.5%. Treatment 3 (Carbonized Rice Hull) showed moderate growth improvement, while Treatments 1 (Topsoil only) and 5 (Biochar) performed poorly in most parameters, indicating (FP-Gen) limited benefits. Throughout the study, plants in Treatments 2 and 4 exhibited more vigorous and healthier growth, with well-developed roots, expanded foliage, and stable shoot formation. The positive effects of rice hull and vermicompost were attributed to better nutrient availability, improved soil aeration, enhanced microbial activity, and more efficient moisture retention. In conclusion (DO), the use of rice hull and vermicompost significantly enhanced the growth and survival of Adansonii. These findings highlight their potential (EC) as effective, low-cost, and sustainable soil amendments for ornamental and horticultural cultivation, offering practical options for growers seeking eco-friendly methods to improve plant performance.</w:t>
-      </w:r>
-      <w:r>
-        <w:rPr>
-          <w:rFonts w:ascii="Georgia" w:hAnsi="Georgia" w:cs="Georgia" w:eastAsia="Georgia"/>
-          <w:sz w:val="22"/>
-          <w:szCs w:val="22"/>
-          <w:b w:val="0"/>
-          <w:bCs w:val="0"/>
-          <w:strike/>
-          <w:color w:val="000000"/>
-        </w:rPr>
-        <w:t xml:space="preserve"/>
-      </w:r>
-      <w:r>
-        <w:rPr>
-          <w:rFonts w:ascii="Georgia" w:hAnsi="Georgia" w:cs="Georgia" w:eastAsia="Georgia"/>
-          <w:sz w:val="22"/>
-          <w:szCs w:val="22"/>
-          <w:b w:val="0"/>
-          <w:bCs w:val="0"/>
-          <w:color w:val="000000"/>
-        </w:rPr>
-        <w:t xml:space="preserve"/>
-      </w:r>
-      <w:r>
-        <w:rPr>
-          <w:rFonts w:ascii="Georgia" w:hAnsi="Georgia" w:cs="Georgia" w:eastAsia="Georgia"/>
-          <w:sz w:val="22"/>
-          <w:szCs w:val="22"/>
-          <w:b w:val="0"/>
-          <w:bCs w:val="0"/>
-          <w:color w:val="808080"/>
-        </w:rPr>
-        <w:t xml:space="preserve"/>
-      </w:r>
-      <w:r>
-        <w:rPr>
-          <w:rFonts w:ascii="Georgia" w:hAnsi="Georgia" w:cs="Georgia" w:eastAsia="Georgia"/>
-          <w:sz w:val="22"/>
-          <w:szCs w:val="22"/>
-          <w:b w:val="0"/>
-          <w:bCs w:val="0"/>
-          <w:color w:val="000000"/>
-        </w:rPr>
-        <w:t xml:space="preserve"/>
-      </w:r>
-      <w:r>
-        <w:rPr>
-          <w:rFonts w:ascii="Georgia" w:hAnsi="Georgia" w:cs="Georgia" w:eastAsia="Georgia"/>
-          <w:sz w:val="22"/>
-          <w:szCs w:val="22"/>
-          <w:b w:val="0"/>
-          <w:bCs w:val="0"/>
-          <w:highlight w:val="red"/>
-          <w:color w:val="FFFFFF"/>
-        </w:rPr>
-        <w:t xml:space="preserve"/>
-      </w:r>
-      <w:r>
-        <w:rPr>
-          <w:rFonts w:ascii="Georgia" w:hAnsi="Georgia" w:cs="Georgia" w:eastAsia="Georgia"/>
-          <w:sz w:val="22"/>
-          <w:szCs w:val="22"/>
-          <w:b w:val="0"/>
-          <w:bCs w:val="0"/>
-          <w:color w:val="000000"/>
-        </w:rPr>
-        <w:t xml:space="preserve"/>
-      </w:r>
-      <w:r>
-        <w:rPr>
-          <w:rFonts w:ascii="Georgia" w:hAnsi="Georgia" w:cs="Georgia" w:eastAsia="Georgia"/>
-          <w:sz w:val="22"/>
-          <w:szCs w:val="22"/>
-          <w:b w:val="0"/>
-          <w:bCs w:val="0"/>
-          <w:color w:val="ED7D31"/>
-        </w:rPr>
-        <w:t xml:space="preserve"/>
-      </w:r>
-      <w:r>
-        <w:rPr>
-          <w:rFonts w:ascii="Georgia" w:hAnsi="Georgia" w:cs="Georgia" w:eastAsia="Georgia"/>
-          <w:sz w:val="22"/>
-          <w:szCs w:val="22"/>
-          <w:b w:val="0"/>
-          <w:bCs w:val="0"/>
-          <w:color w:val="000000"/>
-        </w:rPr>
-        <w:t xml:space="preserve"/>
+          <w:b w:val="0"/>
+          <w:i w:val="0"/>
+          <w:sz w:val="22"/>
+          <w:color w:val="000000"/>
+        </w:rPr>
+        <w:t xml:space="preserve">This study was conducted to evaluate the growth performance of Adansonii plant under different soil media over a 90-day period. Implemented in December 2024, the experiment followed a Completely Randomized Design (CRD) with five treatments: T1 — Topsoil only (control), T2 — Topsoil + Rice Hull, T3 — Topsoil + Carbonized Rice Hull, T4 — Topsoil + Vermicompost, and T5 — Topsoil + Biochar. Parameters measured included days to shoot emergence, shoot length, number of leaves, leaf area, root length, number of penetrations, and survival rate. Significant differences were observed across treatments. Treatment 2 (Rice Hull) showed the earliest shoot emergence at 15.29 days, followed by Treatment 4 (Vermicompost) at 15.83 days. These treatments also produced the longest shoots, most leaves, largest leaf areas, and highest survival rates at 87.5%. Treatment 3 (Carbonized Rice Hull) showed moderate growth improvement, while Treatments 1 (Topsoil only) and 5 (Biochar) performed poorly in most parameters, indicating (FP-Gen) limited benefits. Throughout the study, plants in Treatments 2 and 4 exhibited more vigorous and healthier growth, with well-developed roots, expanded foliage, and stable shoot formation. The positive effects of rice hull and vermicompost were attributed to better nutrient availability, improved soil aeration, enhanced microbial activity, and more efficient moisture retention. In conclusion </w:t>
+      </w:r>
+      <w:r>
+        <w:rPr>
+          <w:rFonts w:ascii="Georgia" w:hAnsi="Georgia" w:cs="Georgia" w:eastAsia="Georgia"/>
+          <w:b w:val="0"/>
+          <w:i w:val="0"/>
+          <w:sz w:val="22"/>
+          <w:color w:val="8B4513"/>
+        </w:rPr>
+        <w:t>(DO)</w:t>
+      </w:r>
+      <w:r>
+        <w:rPr>
+          <w:rFonts w:ascii="Georgia" w:hAnsi="Georgia" w:cs="Georgia" w:eastAsia="Georgia"/>
+          <w:b w:val="0"/>
+          <w:i w:val="0"/>
+          <w:sz w:val="22"/>
+          <w:color w:val="000000"/>
+        </w:rPr>
+        <w:t>, the use of rice hull and vermicompost significantly enhanced the growth and survival of Adansonii. These findings highlight their potential (EC) as effective, low-cost, and sustainable soil amendments for ornamental and horticultural cultivation, offering practical options for growers seeking eco-friendly methods to improve plant performance.</w:t>
       </w:r>
     </w:p>
     <w:p>
@@ -28578,36 +27205,32 @@
       <w:r>
         <w:rPr>
           <w:rFonts w:ascii="Georgia" w:hAnsi="Georgia" w:cs="Georgia" w:eastAsia="Georgia"/>
-          <w:sz w:val="22"/>
-          <w:szCs w:val="22"/>
-          <w:b w:val="0"/>
-          <w:bCs w:val="0"/>
-          <w:color w:val="000000"/>
-        </w:rPr>
-        <w:t xml:space="preserve">The field study was conducted from January 2023 to April 2023 at [REDACTED] to evaluate the performance of rice as supplemented with foliar fertilizer. The experimental design used is a randomized complete block design (RCBD) with three treatments replicated three times. The following treatments were used: T1: recommended rate of NPK based on soil analysis; T2: recommended rate of NPK + 19-19-19; and T3: recommended rate of NPK + 14-14-14. The results of the study revealed the following: a significant difference was observed in the number of productive tillers, actual yield per sample area, and computed yield per ton/ha. No significant differences were observed in terms of the number of days from transplanting to flowering, plant height, number of unproductive tillers, length of panicle, number of filled grains, number of unfilled grains, and weight of 1,000 seeds. In conclusion (DO), T3: NPK+14-14-14 was [G] the most compelling treatment among all treatments in terms of producing the highest number of productive tillers and obtaining the heaviest yield per ton/ha. Cost and return analysis revealed that T3: NPK+14-14-14 had the second lowest cost of production but had the highest net income, with a corresponding amount of Php 66,089 and an ROI of 97.53%. On the other hand, insignificant differences were noted in terms of the number of days from transplanting to flowering, plant height, number of unproductive tillers, length of panicle, number of filled grains, number of unfilled grains, and weight of 1,000 seeds.</w:t>
-      </w:r>
-      <w:r>
-        <w:rPr>
-          <w:rFonts w:ascii="Georgia" w:hAnsi="Georgia" w:cs="Georgia" w:eastAsia="Georgia"/>
-          <w:sz w:val="22"/>
-          <w:szCs w:val="22"/>
-          <w:b w:val="0"/>
-          <w:bCs w:val="0"/>
-          <w:shd w:val="clear" w:color="auto" w:fill="bfbfbf"/>
-          <w:color w:val="000000"/>
-        </w:rPr>
-        <w:t xml:space="preserve"/>
-      </w:r>
-      <w:r>
-        <w:rPr>
-          <w:rFonts w:ascii="Georgia" w:hAnsi="Georgia" w:cs="Georgia" w:eastAsia="Georgia"/>
-          <w:sz w:val="22"/>
-          <w:szCs w:val="22"/>
-          <w:b w:val="0"/>
-          <w:bCs w:val="0"/>
-          <w:color w:val="000000"/>
-        </w:rPr>
-        <w:t xml:space="preserve"/>
+          <w:b w:val="0"/>
+          <w:i w:val="0"/>
+          <w:sz w:val="22"/>
+          <w:color w:val="000000"/>
+        </w:rPr>
+        <w:t xml:space="preserve">The field study was conducted from January 2023 to April 2023 at [REDACTED] to evaluate the performance of rice as supplemented with foliar fertilizer. The experimental design used is a randomized complete block design (RCBD) with three treatments replicated three times. The following treatments were used: T1: recommended rate of NPK based on soil analysis; T2: recommended rate of NPK + 19-19-19; and T3: recommended rate of NPK + 14-14-14. The results of the study revealed the following: a significant difference was observed in the number of productive tillers, actual yield per sample area, and computed yield per ton/ha. No significant differences were observed in terms of the number of days from transplanting to flowering, plant height, number of unproductive tillers, length of panicle, number of filled grains, number of unfilled grains, and weight of 1,000 seeds. In conclusion </w:t>
+      </w:r>
+      <w:r>
+        <w:rPr>
+          <w:rFonts w:ascii="Georgia" w:hAnsi="Georgia" w:cs="Georgia" w:eastAsia="Georgia"/>
+          <w:b w:val="0"/>
+          <w:i w:val="0"/>
+          <w:sz w:val="22"/>
+          <w:color w:val="8B4513"/>
+        </w:rPr>
+        <w:t>(DO)</w:t>
+      </w:r>
+      <w:r>
+        <w:rPr>
+          <w:rFonts w:ascii="Georgia" w:hAnsi="Georgia" w:cs="Georgia" w:eastAsia="Georgia"/>
+          <w:b w:val="0"/>
+          <w:i w:val="0"/>
+          <w:sz w:val="22"/>
+          <w:color w:val="000000"/>
+        </w:rPr>
+        <w:t>, T3: NPK+14-14-14 was [G] the most compelling treatment among all treatments in terms of producing the highest number of productive tillers and obtaining the heaviest yield per ton/ha. Cost and return analysis revealed that T3: NPK+14-14-14 had the second lowest cost of production but had the highest net income, with a corresponding amount of Php 66,089 and an ROI of 97.53%. On the other hand, insignificant differences were noted in terms of the number of days from transplanting to flowering, plant height, number of unproductive tillers, length of panicle, number of filled grains, number of unfilled grains, and weight of 1,000 seeds.</w:t>
       </w:r>
     </w:p>
     <w:p>
@@ -28830,148 +27453,32 @@
       <w:r>
         <w:rPr>
           <w:rFonts w:ascii="Georgia" w:hAnsi="Georgia" w:cs="Georgia" w:eastAsia="Georgia"/>
-          <w:sz w:val="22"/>
-          <w:szCs w:val="22"/>
-          <w:b w:val="0"/>
-          <w:bCs w:val="0"/>
-          <w:color w:val="000000"/>
-        </w:rPr>
-        <w:t xml:space="preserve">A sixty three (63) days study was conducted to determine the growth performance of mallard duck fed with dietary mixed ration in [REDACTED]. A total of ninety (90), 21 days old male mallard duck were used in the study. A single factor experiment in Randomized Complete Block Design (RCBD) was used in the study. Mallard ducks were randomly divided into three (3) treatments having ten (10) mallard ducks per treatment with three (3) replications. Treatment 1 - commercial feeds; Treatment 2 - 50% commercial feeds and 50% rice bran mixed with water spinach; and Treatment 3 - 50% commercial feeds and 50% rice bran mixed with golden apple snail. Data were analyzed by using Analyzed of Variance in RCBD through the Statistical Tool for Agricultural Research (STAR) application. Treatments were compared using the Least Significant Difference (LSD). The result of the study showed in the treatments that there were no significant differences observed in feed consumption, which implies (EC) that treatments were comparable on parameters. However, final weight, gain in weight, average daily gain in weight and feed conversion ratio had highly significance differences at (P&lt;0.01). This indicates that ducks fed with 100% commercial feeds rice bran mixed with golden apple snail performed better in final weight, gain in weight, average daily gain in weight and feed conversion ratio. In conclusion (DO), proved the treatment 1(100% CF) are the most efficient compared to treatment 2 where 50% commercial feeds and 50% rice bran mixed with water spinach and treatment 3 where 50% commercial feeds and 50% rice bran mixed with golden apple snail. It can (EC) also be concluded that D1 rice bran mixed with water spinach and with golden apple snail used in the study can (FP-Cap) help minimize the cost of production, specifically the feed cost.</w:t>
-      </w:r>
-      <w:r>
-        <w:rPr>
-          <w:rFonts w:ascii="Georgia" w:hAnsi="Georgia" w:cs="Georgia" w:eastAsia="Georgia"/>
-          <w:sz w:val="22"/>
-          <w:szCs w:val="22"/>
-          <w:b w:val="0"/>
-          <w:bCs w:val="0"/>
-          <w:highlight w:val="red"/>
-          <w:color w:val="FFFFFF"/>
-        </w:rPr>
-        <w:t xml:space="preserve"/>
-      </w:r>
-      <w:r>
-        <w:rPr>
-          <w:rFonts w:ascii="Georgia" w:hAnsi="Georgia" w:cs="Georgia" w:eastAsia="Georgia"/>
-          <w:sz w:val="22"/>
-          <w:szCs w:val="22"/>
-          <w:b w:val="0"/>
-          <w:bCs w:val="0"/>
-          <w:color w:val="000000"/>
-        </w:rPr>
-        <w:t xml:space="preserve"/>
-      </w:r>
-      <w:r>
-        <w:rPr>
-          <w:rFonts w:ascii="Georgia" w:hAnsi="Georgia" w:cs="Georgia" w:eastAsia="Georgia"/>
-          <w:sz w:val="22"/>
-          <w:szCs w:val="22"/>
-          <w:b w:val="0"/>
-          <w:bCs w:val="0"/>
-          <w:color w:val="ED7D31"/>
-        </w:rPr>
-        <w:t xml:space="preserve"/>
-      </w:r>
-      <w:r>
-        <w:rPr>
-          <w:rFonts w:ascii="Georgia" w:hAnsi="Georgia" w:cs="Georgia" w:eastAsia="Georgia"/>
-          <w:sz w:val="22"/>
-          <w:szCs w:val="22"/>
-          <w:b w:val="0"/>
-          <w:bCs w:val="0"/>
-          <w:color w:val="000000"/>
-        </w:rPr>
-        <w:t xml:space="preserve"/>
-      </w:r>
-      <w:r>
-        <w:rPr>
-          <w:rFonts w:ascii="Georgia" w:hAnsi="Georgia" w:cs="Georgia" w:eastAsia="Georgia"/>
-          <w:sz w:val="22"/>
-          <w:szCs w:val="22"/>
-          <w:b w:val="0"/>
-          <w:bCs w:val="0"/>
-          <w:shd w:val="clear" w:color="auto" w:fill="00B0F0"/>
-          <w:color w:val="000000"/>
-        </w:rPr>
-        <w:t xml:space="preserve"/>
-      </w:r>
-      <w:r>
-        <w:rPr>
-          <w:rFonts w:ascii="Georgia" w:hAnsi="Georgia" w:cs="Georgia" w:eastAsia="Georgia"/>
-          <w:sz w:val="22"/>
-          <w:szCs w:val="22"/>
-          <w:b w:val="0"/>
-          <w:bCs w:val="0"/>
-          <w:color w:val="000000"/>
-        </w:rPr>
-        <w:t xml:space="preserve"/>
-      </w:r>
-      <w:r>
-        <w:rPr>
-          <w:rFonts w:ascii="Georgia" w:hAnsi="Georgia" w:cs="Georgia" w:eastAsia="Georgia"/>
-          <w:sz w:val="22"/>
-          <w:szCs w:val="22"/>
-          <w:b w:val="0"/>
-          <w:bCs w:val="0"/>
-          <w:color w:val="ED7D31"/>
-        </w:rPr>
-        <w:t xml:space="preserve"/>
-      </w:r>
-      <w:r>
-        <w:rPr>
-          <w:rFonts w:ascii="Georgia" w:hAnsi="Georgia" w:cs="Georgia" w:eastAsia="Georgia"/>
-          <w:sz w:val="22"/>
-          <w:szCs w:val="22"/>
-          <w:b w:val="0"/>
-          <w:bCs w:val="0"/>
-          <w:color w:val="000000"/>
-        </w:rPr>
-        <w:t xml:space="preserve"/>
-      </w:r>
-      <w:r>
-        <w:rPr>
-          <w:rFonts w:ascii="Georgia" w:hAnsi="Georgia" w:cs="Georgia" w:eastAsia="Georgia"/>
-          <w:sz w:val="22"/>
-          <w:szCs w:val="22"/>
-          <w:b w:val="0"/>
-          <w:bCs w:val="0"/>
-          <w:strike/>
-          <w:color w:val="000000"/>
-        </w:rPr>
-        <w:t xml:space="preserve"/>
-      </w:r>
-      <w:r>
-        <w:rPr>
-          <w:rFonts w:ascii="Georgia" w:hAnsi="Georgia" w:cs="Georgia" w:eastAsia="Georgia"/>
-          <w:sz w:val="22"/>
-          <w:szCs w:val="22"/>
-          <w:b w:val="0"/>
-          <w:bCs w:val="0"/>
-          <w:color w:val="000000"/>
-        </w:rPr>
-        <w:t xml:space="preserve"/>
-      </w:r>
-      <w:r>
-        <w:rPr>
-          <w:rFonts w:ascii="Georgia" w:hAnsi="Georgia" w:cs="Georgia" w:eastAsia="Georgia"/>
-          <w:sz w:val="22"/>
-          <w:szCs w:val="22"/>
-          <w:b w:val="0"/>
-          <w:bCs w:val="0"/>
-          <w:color w:val="808080"/>
-        </w:rPr>
-        <w:t xml:space="preserve"/>
-      </w:r>
-      <w:r>
-        <w:rPr>
-          <w:rFonts w:ascii="Georgia" w:hAnsi="Georgia" w:cs="Georgia" w:eastAsia="Georgia"/>
-          <w:sz w:val="22"/>
-          <w:szCs w:val="22"/>
-          <w:b w:val="0"/>
-          <w:bCs w:val="0"/>
-          <w:color w:val="000000"/>
-        </w:rPr>
-        <w:t xml:space="preserve"/>
+          <w:b w:val="0"/>
+          <w:i w:val="0"/>
+          <w:sz w:val="22"/>
+          <w:color w:val="000000"/>
+        </w:rPr>
+        <w:t xml:space="preserve">A sixty three (63) days study was conducted to determine the growth performance of mallard duck fed with dietary mixed ration in [REDACTED]. A total of ninety (90), 21 days old male mallard duck were used in the study. A single factor experiment in Randomized Complete Block Design (RCBD) was used in the study. Mallard ducks were randomly divided into three (3) treatments having ten (10) mallard ducks per treatment with three (3) replications. Treatment 1 - commercial feeds; Treatment 2 - 50% commercial feeds and 50% rice bran mixed with water spinach; and Treatment 3 - 50% commercial feeds and 50% rice bran mixed with golden apple snail. Data were analyzed by using Analyzed of Variance in RCBD through the Statistical Tool for Agricultural Research (STAR) application. Treatments were compared using the Least Significant Difference (LSD). The result of the study showed in the treatments that there were no significant differences observed in feed consumption, which implies (EC) that treatments were comparable on parameters. However, final weight, gain in weight, average daily gain in weight and feed conversion ratio had highly significance differences at (P&lt;0.01). This indicates that ducks fed with 100% commercial feeds rice bran mixed with golden apple snail performed better in final weight, gain in weight, average daily gain in weight and feed conversion ratio. In conclusion </w:t>
+      </w:r>
+      <w:r>
+        <w:rPr>
+          <w:rFonts w:ascii="Georgia" w:hAnsi="Georgia" w:cs="Georgia" w:eastAsia="Georgia"/>
+          <w:b w:val="0"/>
+          <w:i w:val="0"/>
+          <w:sz w:val="22"/>
+          <w:color w:val="8B4513"/>
+        </w:rPr>
+        <w:t>(DO)</w:t>
+      </w:r>
+      <w:r>
+        <w:rPr>
+          <w:rFonts w:ascii="Georgia" w:hAnsi="Georgia" w:cs="Georgia" w:eastAsia="Georgia"/>
+          <w:b w:val="0"/>
+          <w:i w:val="0"/>
+          <w:sz w:val="22"/>
+          <w:color w:val="000000"/>
+        </w:rPr>
+        <w:t>, proved the treatment 1(100% CF) are the most efficient compared to treatment 2 where 50% commercial feeds and 50% rice bran mixed with water spinach and treatment 3 where 50% commercial feeds and 50% rice bran mixed with golden apple snail. It can (EC) also be concluded that D1 rice bran mixed with water spinach and with golden apple snail used in the study can (FP-Cap) help minimize the cost of production, specifically the feed cost.</w:t>
       </w:r>
     </w:p>
     <w:p>
@@ -29344,148 +27851,32 @@
       <w:r>
         <w:rPr>
           <w:rFonts w:ascii="Georgia" w:hAnsi="Georgia" w:cs="Georgia" w:eastAsia="Georgia"/>
-          <w:sz w:val="22"/>
-          <w:szCs w:val="22"/>
-          <w:b w:val="0"/>
-          <w:bCs w:val="0"/>
-          <w:color w:val="000000"/>
-        </w:rPr>
-        <w:t xml:space="preserve">This study was conducted over a 35-day period from May 10, 2023, to June 14, 2023, at [REDACTED]. The present study aimed to determine the growth response of crossbred New Zealand rabbits as influenced by varying levels of fermented Madre De Agua leaves. Eighteen (18), 2 months of crossbreed New Zealand rabbits were used in the study which were divided into three (3) treatments: T1 = 70% concentrate + 30% paragrass, T2 = 70% concentrate + 20% paragrass + 10% fermented Madre De Agua, T3 = 60% concentrate + 20% paragrass + 20% fermented Madre De Agua. A Completely Randomized Design was employed, and data was analyzed through ANOVA by Statistical Tool for Agricultural Research (STAR). Statistical analysis showed that there was no significant difference but showed numerical trends among the treatments in relation to initial weight, final weight, gain in weight, average daily gain, dry matter intake, and feed conversion ratio of the experimental rabbits In conclusion (DO), all treatments are comparable in terms of growth, implying (EC) that Fermented Madre de Agua is a viable feed component under these conditions. Feeding 20% fermented Madre De Agua may (EC) improve final weight, while feeding 10% fermented Madre De Agua may (EC) reduce dry matter intake.</w:t>
-      </w:r>
-      <w:r>
-        <w:rPr>
-          <w:rFonts w:ascii="Georgia" w:hAnsi="Georgia" w:cs="Georgia" w:eastAsia="Georgia"/>
-          <w:sz w:val="22"/>
-          <w:szCs w:val="22"/>
-          <w:b w:val="0"/>
-          <w:bCs w:val="0"/>
-          <w:highlight w:val="red"/>
-          <w:color w:val="FFFFFF"/>
-        </w:rPr>
-        <w:t xml:space="preserve"/>
-      </w:r>
-      <w:r>
-        <w:rPr>
-          <w:rFonts w:ascii="Georgia" w:hAnsi="Georgia" w:cs="Georgia" w:eastAsia="Georgia"/>
-          <w:sz w:val="22"/>
-          <w:szCs w:val="22"/>
-          <w:b w:val="0"/>
-          <w:bCs w:val="0"/>
-          <w:color w:val="000000"/>
-        </w:rPr>
-        <w:t xml:space="preserve"/>
-      </w:r>
-      <w:r>
-        <w:rPr>
-          <w:rFonts w:ascii="Georgia" w:hAnsi="Georgia" w:cs="Georgia" w:eastAsia="Georgia"/>
-          <w:sz w:val="22"/>
-          <w:szCs w:val="22"/>
-          <w:b w:val="0"/>
-          <w:bCs w:val="0"/>
-          <w:color w:val="ED7D31"/>
-        </w:rPr>
-        <w:t xml:space="preserve"/>
-      </w:r>
-      <w:r>
-        <w:rPr>
-          <w:rFonts w:ascii="Georgia" w:hAnsi="Georgia" w:cs="Georgia" w:eastAsia="Georgia"/>
-          <w:sz w:val="22"/>
-          <w:szCs w:val="22"/>
-          <w:b w:val="0"/>
-          <w:bCs w:val="0"/>
-          <w:color w:val="000000"/>
-        </w:rPr>
-        <w:t xml:space="preserve"/>
-      </w:r>
-      <w:r>
-        <w:rPr>
-          <w:rFonts w:ascii="Georgia" w:hAnsi="Georgia" w:cs="Georgia" w:eastAsia="Georgia"/>
-          <w:sz w:val="22"/>
-          <w:szCs w:val="22"/>
-          <w:b w:val="0"/>
-          <w:bCs w:val="0"/>
-          <w:shd w:val="clear" w:color="auto" w:fill="00B0F0"/>
-          <w:color w:val="000000"/>
-        </w:rPr>
-        <w:t xml:space="preserve"/>
-      </w:r>
-      <w:r>
-        <w:rPr>
-          <w:rFonts w:ascii="Georgia" w:hAnsi="Georgia" w:cs="Georgia" w:eastAsia="Georgia"/>
-          <w:sz w:val="22"/>
-          <w:szCs w:val="22"/>
-          <w:b w:val="0"/>
-          <w:bCs w:val="0"/>
-          <w:color w:val="000000"/>
-        </w:rPr>
-        <w:t xml:space="preserve"/>
-      </w:r>
-      <w:r>
-        <w:rPr>
-          <w:rFonts w:ascii="Georgia" w:hAnsi="Georgia" w:cs="Georgia" w:eastAsia="Georgia"/>
-          <w:sz w:val="22"/>
-          <w:szCs w:val="22"/>
-          <w:b w:val="0"/>
-          <w:bCs w:val="0"/>
-          <w:color w:val="ED7D31"/>
-        </w:rPr>
-        <w:t xml:space="preserve"/>
-      </w:r>
-      <w:r>
-        <w:rPr>
-          <w:rFonts w:ascii="Georgia" w:hAnsi="Georgia" w:cs="Georgia" w:eastAsia="Georgia"/>
-          <w:sz w:val="22"/>
-          <w:szCs w:val="22"/>
-          <w:b w:val="0"/>
-          <w:bCs w:val="0"/>
-          <w:color w:val="000000"/>
-        </w:rPr>
-        <w:t xml:space="preserve"/>
-      </w:r>
-      <w:r>
-        <w:rPr>
-          <w:rFonts w:ascii="Georgia" w:hAnsi="Georgia" w:cs="Georgia" w:eastAsia="Georgia"/>
-          <w:sz w:val="22"/>
-          <w:szCs w:val="22"/>
-          <w:b w:val="0"/>
-          <w:bCs w:val="0"/>
-          <w:shd w:val="clear" w:color="auto" w:fill="00B0F0"/>
-          <w:color w:val="000000"/>
-        </w:rPr>
-        <w:t xml:space="preserve"/>
-      </w:r>
-      <w:r>
-        <w:rPr>
-          <w:rFonts w:ascii="Georgia" w:hAnsi="Georgia" w:cs="Georgia" w:eastAsia="Georgia"/>
-          <w:sz w:val="22"/>
-          <w:szCs w:val="22"/>
-          <w:b w:val="0"/>
-          <w:bCs w:val="0"/>
-          <w:color w:val="000000"/>
-        </w:rPr>
-        <w:t xml:space="preserve"/>
-      </w:r>
-      <w:r>
-        <w:rPr>
-          <w:rFonts w:ascii="Georgia" w:hAnsi="Georgia" w:cs="Georgia" w:eastAsia="Georgia"/>
-          <w:sz w:val="22"/>
-          <w:szCs w:val="22"/>
-          <w:b w:val="0"/>
-          <w:bCs w:val="0"/>
-          <w:color w:val="ED7D31"/>
-        </w:rPr>
-        <w:t xml:space="preserve"/>
-      </w:r>
-      <w:r>
-        <w:rPr>
-          <w:rFonts w:ascii="Georgia" w:hAnsi="Georgia" w:cs="Georgia" w:eastAsia="Georgia"/>
-          <w:sz w:val="22"/>
-          <w:szCs w:val="22"/>
-          <w:b w:val="0"/>
-          <w:bCs w:val="0"/>
-          <w:color w:val="000000"/>
-        </w:rPr>
-        <w:t xml:space="preserve"/>
+          <w:b w:val="0"/>
+          <w:i w:val="0"/>
+          <w:sz w:val="22"/>
+          <w:color w:val="000000"/>
+        </w:rPr>
+        <w:t xml:space="preserve">This study was conducted over a 35-day period from May 10, 2023, to June 14, 2023, at [REDACTED]. The present study aimed to determine the growth response of crossbred New Zealand rabbits as influenced by varying levels of fermented Madre De Agua leaves. Eighteen (18), 2 months of crossbreed New Zealand rabbits were used in the study which were divided into three (3) treatments: T1 = 70% concentrate + 30% paragrass, T2 = 70% concentrate + 20% paragrass + 10% fermented Madre De Agua, T3 = 60% concentrate + 20% paragrass + 20% fermented Madre De Agua. A Completely Randomized Design was employed, and data was analyzed through ANOVA by Statistical Tool for Agricultural Research (STAR). Statistical analysis showed that there was no significant difference but showed numerical trends among the treatments in relation to initial weight, final weight, gain in weight, average daily gain, dry matter intake, and feed conversion ratio of the experimental rabbits In conclusion </w:t>
+      </w:r>
+      <w:r>
+        <w:rPr>
+          <w:rFonts w:ascii="Georgia" w:hAnsi="Georgia" w:cs="Georgia" w:eastAsia="Georgia"/>
+          <w:b w:val="0"/>
+          <w:i w:val="0"/>
+          <w:sz w:val="22"/>
+          <w:color w:val="8B4513"/>
+        </w:rPr>
+        <w:t>(DO)</w:t>
+      </w:r>
+      <w:r>
+        <w:rPr>
+          <w:rFonts w:ascii="Georgia" w:hAnsi="Georgia" w:cs="Georgia" w:eastAsia="Georgia"/>
+          <w:b w:val="0"/>
+          <w:i w:val="0"/>
+          <w:sz w:val="22"/>
+          <w:color w:val="000000"/>
+        </w:rPr>
+        <w:t>, all treatments are comparable in terms of growth, implying (EC) that Fermented Madre de Agua is a viable feed component under these conditions. Feeding 20% fermented Madre De Agua may (EC) improve final weight, while feeding 10% fermented Madre De Agua may (EC) reduce dry matter intake.</w:t>
       </w:r>
     </w:p>
     <w:p>
@@ -29702,58 +28093,32 @@
       <w:r>
         <w:rPr>
           <w:rFonts w:ascii="Georgia" w:hAnsi="Georgia" w:cs="Georgia" w:eastAsia="Georgia"/>
-          <w:sz w:val="22"/>
-          <w:szCs w:val="22"/>
-          <w:b w:val="0"/>
-          <w:bCs w:val="0"/>
-          <w:color w:val="000000"/>
-        </w:rPr>
-        <w:t xml:space="preserve">The study was conducted at [REDACTED] from April 25 to April 30, 2023 to find out the [TITLE REDACTED] where a total of nine hundred maggots (900) were used. The experiment was laid out using Complete Randomized Design (CRD) with three (3) treatments, namely, T1 –Carbonated rice hull and saw dust, T2 – Diatomaceous Earth, and T3 –Neem tree extract. The nine hundred maggots were divided into three (3) treatments at one hundred maggots (100) per treatment each treatment was replicated three (3) times with one hundred maggots (100) per replication. The results disclosed that the percentage of mortality and moisture content were statistically significant at 1% (P&lt;0.01) and (P&lt;0.05) level with 48 hours after the post-treatment. However, mortality rate and moisture content were not significant after 6 hours and 24 hours. Therefore (DO), it is recommended (FP-Rec) for future researchers to add Diatomaceous earth and neem tree extract and check the humidity. Extend data collection for 72 hours and 96 hours for future study.</w:t>
-      </w:r>
-      <w:r>
-        <w:rPr>
-          <w:rFonts w:ascii="Georgia" w:hAnsi="Georgia" w:cs="Georgia" w:eastAsia="Georgia"/>
-          <w:sz w:val="22"/>
-          <w:szCs w:val="22"/>
-          <w:b w:val="0"/>
-          <w:bCs w:val="0"/>
-          <w:strike/>
-          <w:color w:val="000000"/>
-        </w:rPr>
-        <w:t xml:space="preserve"/>
-      </w:r>
-      <w:r>
-        <w:rPr>
-          <w:rFonts w:ascii="Georgia" w:hAnsi="Georgia" w:cs="Georgia" w:eastAsia="Georgia"/>
-          <w:sz w:val="22"/>
-          <w:szCs w:val="22"/>
-          <w:b w:val="0"/>
-          <w:bCs w:val="0"/>
-          <w:color w:val="000000"/>
-        </w:rPr>
-        <w:t xml:space="preserve"/>
-      </w:r>
-      <w:r>
-        <w:rPr>
-          <w:rFonts w:ascii="Georgia" w:hAnsi="Georgia" w:cs="Georgia" w:eastAsia="Georgia"/>
-          <w:sz w:val="22"/>
-          <w:szCs w:val="22"/>
-          <w:b w:val="0"/>
-          <w:bCs w:val="0"/>
-          <w:color w:val="808080"/>
-        </w:rPr>
-        <w:t xml:space="preserve"/>
-      </w:r>
-      <w:r>
-        <w:rPr>
-          <w:rFonts w:ascii="Georgia" w:hAnsi="Georgia" w:cs="Georgia" w:eastAsia="Georgia"/>
-          <w:sz w:val="22"/>
-          <w:szCs w:val="22"/>
-          <w:b w:val="0"/>
-          <w:bCs w:val="0"/>
-          <w:color w:val="000000"/>
-        </w:rPr>
-        <w:t xml:space="preserve"/>
+          <w:b w:val="0"/>
+          <w:i w:val="0"/>
+          <w:sz w:val="22"/>
+          <w:color w:val="000000"/>
+        </w:rPr>
+        <w:t xml:space="preserve">The study was conducted at [REDACTED] from April 25 to April 30, 2023 to find out the [TITLE REDACTED] where a total of nine hundred maggots (900) were used. The experiment was laid out using Complete Randomized Design (CRD) with three (3) treatments, namely, T1 –Carbonated rice hull and saw dust, T2 – Diatomaceous Earth, and T3 –Neem tree extract. The nine hundred maggots were divided into three (3) treatments at one hundred maggots (100) per treatment each treatment was replicated three (3) times with one hundred maggots (100) per replication. The results disclosed that the percentage of mortality and moisture content were statistically significant at 1% (P&lt;0.01) and (P&lt;0.05) level with 48 hours after the post-treatment. However, mortality rate and moisture content were not significant after 6 hours and 24 hours. Therefore </w:t>
+      </w:r>
+      <w:r>
+        <w:rPr>
+          <w:rFonts w:ascii="Georgia" w:hAnsi="Georgia" w:cs="Georgia" w:eastAsia="Georgia"/>
+          <w:b w:val="0"/>
+          <w:i w:val="0"/>
+          <w:sz w:val="22"/>
+          <w:color w:val="8B4513"/>
+        </w:rPr>
+        <w:t>(DO)</w:t>
+      </w:r>
+      <w:r>
+        <w:rPr>
+          <w:rFonts w:ascii="Georgia" w:hAnsi="Georgia" w:cs="Georgia" w:eastAsia="Georgia"/>
+          <w:b w:val="0"/>
+          <w:i w:val="0"/>
+          <w:sz w:val="22"/>
+          <w:color w:val="000000"/>
+        </w:rPr>
+        <w:t>, it is recommended (FP-Rec) for future researchers to add Diatomaceous earth and neem tree extract and check the humidity. Extend data collection for 72 hours and 96 hours for future study.</w:t>
       </w:r>
     </w:p>
     <w:p>
@@ -29791,193 +28156,32 @@
       <w:r>
         <w:rPr>
           <w:rFonts w:ascii="Georgia" w:hAnsi="Georgia" w:cs="Georgia" w:eastAsia="Georgia"/>
-          <w:sz w:val="22"/>
-          <w:szCs w:val="22"/>
-          <w:b w:val="0"/>
-          <w:bCs w:val="0"/>
-          <w:color w:val="000000"/>
-        </w:rPr>
-        <w:t xml:space="preserve">The study was conducted at [REDACTED], for 35 days, from April 16 to May 20, 2023. The study was carried out to search for alternatives to protein sources. The objective of the study was to determine the growth response of F1 New Zealand white rabbits as influenced by the roughage-to-concentrate ratio. A total of eighteen (18) heads of six (6)-week-old female New Zealand White Rabbits were selected and distributed into three (3) groups, each treatment replicated thrice with 2 rabbits per replication. Results showed no significant difference (P&lt;0.05) in final weight, gain in weight, and average daily gain in all the treatment groups. The control group (T1) was fed 70% guinea grass and 30% concentrates. For T2 and T3, the guinea grass was replaced with fresh azolla on an equi-weight basis at levels of 10 and 20 percent, respectively. In conclusion (DO), based on the results, it can (EC) be stated that the ratio of 70% guinea grass (GG) + 30% concentrate (C), the control group, had a significantly higher (P&lt;0.01) feed conversion ratio, while rabbits in treatment T3 (50% guinea grass, 20% azolla, and 30% concentrate) had a significantly higher (P&lt;0.01) dry matter intake. The researchers still recommended (FP-Rec) incorporating 50% Guinea grass + 20% Azolla + 30% concentrates for rabbit growth performance, considering the results show that this treatment performs well and doesn't differ from treatment 1, which is the farmer practice. The researchers also saw that the treatment of 50% Guinea grass + 20% Azolla + 30% concentrates has potential (EC) as an alternative feed ration for rabbits without adverse effects, and considering that azolla can (FP-Cap) help breeders to lessen the feed cost in production.</w:t>
-      </w:r>
-      <w:r>
-        <w:rPr>
-          <w:rFonts w:ascii="Georgia" w:hAnsi="Georgia" w:cs="Georgia" w:eastAsia="Georgia"/>
-          <w:sz w:val="22"/>
-          <w:szCs w:val="22"/>
-          <w:b w:val="0"/>
-          <w:bCs w:val="0"/>
-          <w:shd w:val="clear" w:color="auto" w:fill="00B0F0"/>
-          <w:color w:val="000000"/>
-        </w:rPr>
-        <w:t xml:space="preserve"/>
-      </w:r>
-      <w:r>
-        <w:rPr>
-          <w:rFonts w:ascii="Georgia" w:hAnsi="Georgia" w:cs="Georgia" w:eastAsia="Georgia"/>
-          <w:sz w:val="22"/>
-          <w:szCs w:val="22"/>
-          <w:b w:val="0"/>
-          <w:bCs w:val="0"/>
-          <w:color w:val="000000"/>
-        </w:rPr>
-        <w:t xml:space="preserve"/>
-      </w:r>
-      <w:r>
-        <w:rPr>
-          <w:rFonts w:ascii="Georgia" w:hAnsi="Georgia" w:cs="Georgia" w:eastAsia="Georgia"/>
-          <w:sz w:val="22"/>
-          <w:szCs w:val="22"/>
-          <w:b w:val="0"/>
-          <w:bCs w:val="0"/>
-          <w:color w:val="ED7D31"/>
-        </w:rPr>
-        <w:t xml:space="preserve"/>
-      </w:r>
-      <w:r>
-        <w:rPr>
-          <w:rFonts w:ascii="Georgia" w:hAnsi="Georgia" w:cs="Georgia" w:eastAsia="Georgia"/>
-          <w:sz w:val="22"/>
-          <w:szCs w:val="22"/>
-          <w:b w:val="0"/>
-          <w:bCs w:val="0"/>
-          <w:color w:val="000000"/>
-        </w:rPr>
-        <w:t xml:space="preserve"/>
-      </w:r>
-      <w:r>
-        <w:rPr>
-          <w:rFonts w:ascii="Georgia" w:hAnsi="Georgia" w:cs="Georgia" w:eastAsia="Georgia"/>
-          <w:sz w:val="22"/>
-          <w:szCs w:val="22"/>
-          <w:b w:val="0"/>
-          <w:bCs w:val="0"/>
-          <w:strike/>
-          <w:color w:val="000000"/>
-        </w:rPr>
-        <w:t xml:space="preserve"/>
-      </w:r>
-      <w:r>
-        <w:rPr>
-          <w:rFonts w:ascii="Georgia" w:hAnsi="Georgia" w:cs="Georgia" w:eastAsia="Georgia"/>
-          <w:sz w:val="22"/>
-          <w:szCs w:val="22"/>
-          <w:b w:val="0"/>
-          <w:bCs w:val="0"/>
-          <w:color w:val="000000"/>
-        </w:rPr>
-        <w:t xml:space="preserve"/>
-      </w:r>
-      <w:r>
-        <w:rPr>
-          <w:rFonts w:ascii="Georgia" w:hAnsi="Georgia" w:cs="Georgia" w:eastAsia="Georgia"/>
-          <w:sz w:val="22"/>
-          <w:szCs w:val="22"/>
-          <w:b w:val="0"/>
-          <w:bCs w:val="0"/>
-          <w:color w:val="808080"/>
-        </w:rPr>
-        <w:t xml:space="preserve"/>
-      </w:r>
-      <w:r>
-        <w:rPr>
-          <w:rFonts w:ascii="Georgia" w:hAnsi="Georgia" w:cs="Georgia" w:eastAsia="Georgia"/>
-          <w:sz w:val="22"/>
-          <w:szCs w:val="22"/>
-          <w:b w:val="0"/>
-          <w:bCs w:val="0"/>
-          <w:color w:val="000000"/>
-        </w:rPr>
-        <w:t xml:space="preserve"/>
-      </w:r>
-      <w:r>
-        <w:rPr>
-          <w:rFonts w:ascii="Georgia" w:hAnsi="Georgia" w:cs="Georgia" w:eastAsia="Georgia"/>
-          <w:sz w:val="22"/>
-          <w:szCs w:val="22"/>
-          <w:b w:val="0"/>
-          <w:bCs w:val="0"/>
-          <w:highlight w:val="red"/>
-          <w:color w:val="FFFFFF"/>
-        </w:rPr>
-        <w:t xml:space="preserve"/>
-      </w:r>
-      <w:r>
-        <w:rPr>
-          <w:rFonts w:ascii="Georgia" w:hAnsi="Georgia" w:cs="Georgia" w:eastAsia="Georgia"/>
-          <w:sz w:val="22"/>
-          <w:szCs w:val="22"/>
-          <w:b w:val="0"/>
-          <w:bCs w:val="0"/>
-          <w:color w:val="000000"/>
-        </w:rPr>
-        <w:t xml:space="preserve"/>
-      </w:r>
-      <w:r>
-        <w:rPr>
-          <w:rFonts w:ascii="Georgia" w:hAnsi="Georgia" w:cs="Georgia" w:eastAsia="Georgia"/>
-          <w:sz w:val="22"/>
-          <w:szCs w:val="22"/>
-          <w:b w:val="0"/>
-          <w:bCs w:val="0"/>
-          <w:color w:val="ED7D31"/>
-        </w:rPr>
-        <w:t xml:space="preserve"/>
-      </w:r>
-      <w:r>
-        <w:rPr>
-          <w:rFonts w:ascii="Georgia" w:hAnsi="Georgia" w:cs="Georgia" w:eastAsia="Georgia"/>
-          <w:sz w:val="22"/>
-          <w:szCs w:val="22"/>
-          <w:b w:val="0"/>
-          <w:bCs w:val="0"/>
-          <w:color w:val="000000"/>
-        </w:rPr>
-        <w:t xml:space="preserve"/>
-      </w:r>
-      <w:r>
-        <w:rPr>
-          <w:rFonts w:ascii="Georgia" w:hAnsi="Georgia" w:cs="Georgia" w:eastAsia="Georgia"/>
-          <w:sz w:val="22"/>
-          <w:szCs w:val="22"/>
-          <w:b w:val="0"/>
-          <w:bCs w:val="0"/>
-          <w:strike/>
-          <w:color w:val="000000"/>
-        </w:rPr>
-        <w:t xml:space="preserve"/>
-      </w:r>
-      <w:r>
-        <w:rPr>
-          <w:rFonts w:ascii="Georgia" w:hAnsi="Georgia" w:cs="Georgia" w:eastAsia="Georgia"/>
-          <w:sz w:val="22"/>
-          <w:szCs w:val="22"/>
-          <w:b w:val="0"/>
-          <w:bCs w:val="0"/>
-          <w:color w:val="000000"/>
-        </w:rPr>
-        <w:t xml:space="preserve"/>
-      </w:r>
-      <w:r>
-        <w:rPr>
-          <w:rFonts w:ascii="Georgia" w:hAnsi="Georgia" w:cs="Georgia" w:eastAsia="Georgia"/>
-          <w:sz w:val="22"/>
-          <w:szCs w:val="22"/>
-          <w:b w:val="0"/>
-          <w:bCs w:val="0"/>
-          <w:color w:val="808080"/>
-        </w:rPr>
-        <w:t xml:space="preserve"/>
-      </w:r>
-      <w:r>
-        <w:rPr>
-          <w:rFonts w:ascii="Georgia" w:hAnsi="Georgia" w:cs="Georgia" w:eastAsia="Georgia"/>
-          <w:sz w:val="22"/>
-          <w:szCs w:val="22"/>
-          <w:b w:val="0"/>
-          <w:bCs w:val="0"/>
-          <w:color w:val="000000"/>
-        </w:rPr>
-        <w:t xml:space="preserve"/>
+          <w:b w:val="0"/>
+          <w:i w:val="0"/>
+          <w:sz w:val="22"/>
+          <w:color w:val="000000"/>
+        </w:rPr>
+        <w:t xml:space="preserve">The study was conducted at [REDACTED], for 35 days, from April 16 to May 20, 2023. The study was carried out to search for alternatives to protein sources. The objective of the study was to determine the growth response of F1 New Zealand white rabbits as influenced by the roughage-to-concentrate ratio. A total of eighteen (18) heads of six (6)-week-old female New Zealand White Rabbits were selected and distributed into three (3) groups, each treatment replicated thrice with 2 rabbits per replication. Results showed no significant difference (P&lt;0.05) in final weight, gain in weight, and average daily gain in all the treatment groups. The control group (T1) was fed 70% guinea grass and 30% concentrates. For T2 and T3, the guinea grass was replaced with fresh azolla on an equi-weight basis at levels of 10 and 20 percent, respectively. In conclusion </w:t>
+      </w:r>
+      <w:r>
+        <w:rPr>
+          <w:rFonts w:ascii="Georgia" w:hAnsi="Georgia" w:cs="Georgia" w:eastAsia="Georgia"/>
+          <w:b w:val="0"/>
+          <w:i w:val="0"/>
+          <w:sz w:val="22"/>
+          <w:color w:val="8B4513"/>
+        </w:rPr>
+        <w:t>(DO)</w:t>
+      </w:r>
+      <w:r>
+        <w:rPr>
+          <w:rFonts w:ascii="Georgia" w:hAnsi="Georgia" w:cs="Georgia" w:eastAsia="Georgia"/>
+          <w:b w:val="0"/>
+          <w:i w:val="0"/>
+          <w:sz w:val="22"/>
+          <w:color w:val="000000"/>
+        </w:rPr>
+        <w:t>, based on the results, it can (EC) be stated that the ratio of 70% guinea grass (GG) + 30% concentrate (C), the control group, had a significantly higher (P&lt;0.01) feed conversion ratio, while rabbits in treatment T3 (50% guinea grass, 20% azolla, and 30% concentrate) had a significantly higher (P&lt;0.01) dry matter intake. The researchers still recommended (FP-Rec) incorporating 50% Guinea grass + 20% Azolla + 30% concentrates for rabbit growth performance, considering the results show that this treatment performs well and doesn't differ from treatment 1, which is the farmer practice. The researchers also saw that the treatment of 50% Guinea grass + 20% Azolla + 30% concentrates has potential (EC) as an alternative feed ration for rabbits without adverse effects, and considering that azolla can (FP-Cap) help breeders to lessen the feed cost in production.</w:t>
       </w:r>
     </w:p>
     <w:sectPr>

</xml_diff>

<commit_message>
Draft_080: scope DO brown to codebook example and Appendix C only
Revert main-text (DO) to black. Corpus and Table 12 stay 8B4513.
</commit_message>
<xml_diff>
--- a/thesis/003_ThesisProposal_Draft_080.docx
+++ b/thesis/003_ThesisProposal_Draft_080.docx
@@ -2321,7 +2321,7 @@
           <w:b w:val="0"/>
           <w:i w:val="0"/>
           <w:sz w:val="22"/>
-          <w:color w:val="8B4513"/>
+          <w:color w:val="000000"/>
         </w:rPr>
         <w:t>(DO)</w:t>
       </w:r>
@@ -9820,7 +9820,7 @@
           <w:b w:val="0"/>
           <w:i w:val="0"/>
           <w:sz w:val="22"/>
-          <w:color w:val="8B4513"/>
+          <w:color w:val="000000"/>
         </w:rPr>
         <w:t>(DO)</w:t>
       </w:r>
@@ -9839,7 +9839,7 @@
           <w:b w:val="0"/>
           <w:i w:val="0"/>
           <w:sz w:val="22"/>
-          <w:color w:val="8B4513"/>
+          <w:color w:val="000000"/>
         </w:rPr>
         <w:t>(DO)</w:t>
       </w:r>
@@ -17879,10 +17879,10 @@
                 <w:bCs w:val="1"/>
                 <w:i w:val="0"/>
                 <w:iCs w:val="0"/>
-                <w:color w:val="8B4513"/>
                 <w:sz w:val="20"/>
                 <w:szCs w:val="20"/>
                 <w:rtl w:val="0"/>
+                <w:color w:val="8B4513"/>
               </w:rPr>
               <w:t xml:space="preserve">(DO)</w:t>
             </w:r>
@@ -21343,7 +21343,7 @@
           <w:b w:val="0"/>
           <w:i w:val="0"/>
           <w:sz w:val="22"/>
-          <w:color w:val="8B4513"/>
+          <w:color w:val="000000"/>
         </w:rPr>
         <w:t>(DO)</w:t>
       </w:r>

</xml_diff>